<commit_message>
Finalize report details and repository link
</commit_message>
<xml_diff>
--- a/report/CSA0312_Final_Assignment_Report.docx
+++ b/report/CSA0312_Final_Assignment_Report.docx
@@ -361,23 +361,8 @@
             <w:hideMark/>
           </w:tcPr>
           <w:p>
-            <w:pPr>
-              <w:spacing w:before="160" w:after="160"/>
-              <w:rPr>
-                <w:rFonts w:ascii="Calibri" w:eastAsia="Times New Roman" w:hAnsi="Calibri" w:cs="Calibri"/>
-                <w:color w:val="1A1A1A"/>
-                <w:sz w:val="20"/>
-                <w:szCs w:val="20"/>
-              </w:rPr>
-            </w:pPr>
-            <w:r>
-              <w:rPr>
-                <w:rFonts w:ascii="Calibri" w:eastAsia="Times New Roman" w:hAnsi="Calibri" w:cs="Calibri"/>
-                <w:color w:val="1A1A1A"/>
-                <w:sz w:val="20"/>
-                <w:szCs w:val="20"/>
-              </w:rPr>
-              <w:t>_________________________</w:t>
+            <w:r>
+              <w:t>Athisaya U</w:t>
             </w:r>
           </w:p>
         </w:tc>
@@ -442,23 +427,8 @@
             <w:hideMark/>
           </w:tcPr>
           <w:p>
-            <w:pPr>
-              <w:spacing w:before="160" w:after="160"/>
-              <w:rPr>
-                <w:rFonts w:ascii="Calibri" w:eastAsia="Times New Roman" w:hAnsi="Calibri" w:cs="Calibri"/>
-                <w:color w:val="1A1A1A"/>
-                <w:sz w:val="20"/>
-                <w:szCs w:val="20"/>
-              </w:rPr>
-            </w:pPr>
-            <w:r>
-              <w:rPr>
-                <w:rFonts w:ascii="Calibri" w:eastAsia="Times New Roman" w:hAnsi="Calibri" w:cs="Calibri"/>
-                <w:color w:val="1A1A1A"/>
-                <w:sz w:val="20"/>
-                <w:szCs w:val="20"/>
-              </w:rPr>
-              <w:t>_________________________</w:t>
+            <w:r>
+              <w:t>192571001</w:t>
             </w:r>
           </w:p>
         </w:tc>
@@ -523,23 +493,8 @@
             <w:hideMark/>
           </w:tcPr>
           <w:p>
-            <w:pPr>
-              <w:spacing w:before="160" w:after="160"/>
-              <w:rPr>
-                <w:rFonts w:ascii="Calibri" w:eastAsia="Times New Roman" w:hAnsi="Calibri" w:cs="Calibri"/>
-                <w:color w:val="1A1A1A"/>
-                <w:sz w:val="20"/>
-                <w:szCs w:val="20"/>
-              </w:rPr>
-            </w:pPr>
-            <w:r>
-              <w:rPr>
-                <w:rFonts w:ascii="Calibri" w:eastAsia="Times New Roman" w:hAnsi="Calibri" w:cs="Calibri"/>
-                <w:color w:val="1A1A1A"/>
-                <w:sz w:val="20"/>
-                <w:szCs w:val="20"/>
-              </w:rPr>
-              <w:t>_________________________</w:t>
+            <w:r>
+              <w:t>MONIKA B (192571002); PAPAGARI PUSHPA CHARITHA (192525371)</w:t>
             </w:r>
           </w:p>
         </w:tc>
@@ -604,23 +559,8 @@
             <w:hideMark/>
           </w:tcPr>
           <w:p>
-            <w:pPr>
-              <w:spacing w:before="160" w:after="160"/>
-              <w:rPr>
-                <w:rFonts w:ascii="Calibri" w:eastAsia="Times New Roman" w:hAnsi="Calibri" w:cs="Calibri"/>
-                <w:color w:val="1A1A1A"/>
-                <w:sz w:val="20"/>
-                <w:szCs w:val="20"/>
-              </w:rPr>
-            </w:pPr>
-            <w:r>
-              <w:rPr>
-                <w:rFonts w:ascii="Calibri" w:eastAsia="Times New Roman" w:hAnsi="Calibri" w:cs="Calibri"/>
-                <w:color w:val="1A1A1A"/>
-                <w:sz w:val="20"/>
-                <w:szCs w:val="20"/>
-              </w:rPr>
-              <w:t>_________________________</w:t>
+            <w:r>
+              <w:t>31/08/2026</w:t>
             </w:r>
           </w:p>
         </w:tc>
@@ -701,7 +641,7 @@
                 <w:sz w:val="20"/>
                 <w:szCs w:val="20"/>
               </w:rPr>
-              <w:t>[Insert repository link after upload]</w:t>
+              <w:t>https://github.com/athisayaprema2007-hue/CSA0312-Intelligent-Evacuation-Routing-System</w:t>
             </w:r>
           </w:p>
         </w:tc>
@@ -17406,7 +17346,7 @@
           <w:sz w:val="22"/>
           <w:szCs w:val="22"/>
         </w:rPr>
-        <w:t>GitHub Repository: [Insert repository link after upload] (A local Git repository with the full history is prepared in the project folder; the link above is to be filled in once the repository is published.)</w:t>
+        <w:t>GitHub Repository: https://github.com/athisayaprema2007-hue/CSA0312-Intelligent-Evacuation-Routing-System (A local Git repository with the full history is prepared in the project folder; the link above is to be filled in once the repository is published.)</w:t>
       </w:r>
     </w:p>
     <w:sectPr>

</xml_diff>

<commit_message>
Add polished interactive console interface
New src/console_ui module (colours via SetConsoleTextAttribute on
Windows with ANSI fallback, disabled when redirected; ASCII borders;
safe numeric input) and a no-argument interactive dashboard in main.c:
route planner on a demo city, guided demo, benchmark, 30% failure
simulation and architecture screens. Engine, tests and CLI modes are
unchanged; results and report timing figures refreshed from the final
verification runs.
</commit_message>
<xml_diff>
--- a/report/CSA0312_Final_Assignment_Report.docx
+++ b/report/CSA0312_Final_Assignment_Report.docx
@@ -5,7 +5,7 @@
     <w:p>
       <w:pPr>
         <w:pStyle w:val="Heading1"/>
-        <w:divId w:val="2026667695"/>
+        <w:divId w:val="1625111436"/>
         <w:rPr>
           <w:rFonts w:ascii="Calibri" w:eastAsia="Times New Roman" w:hAnsi="Calibri" w:cs="Calibri"/>
         </w:rPr>
@@ -20,7 +20,7 @@
     <w:p>
       <w:pPr>
         <w:pStyle w:val="Heading2"/>
-        <w:divId w:val="2026667695"/>
+        <w:divId w:val="1625111436"/>
         <w:rPr>
           <w:rFonts w:ascii="Calibri" w:eastAsia="Times New Roman" w:hAnsi="Calibri" w:cs="Calibri"/>
         </w:rPr>
@@ -49,7 +49,7 @@
       </w:tblGrid>
       <w:tr>
         <w:trPr>
-          <w:divId w:val="2026667695"/>
+          <w:divId w:val="1625111436"/>
           <w:tblHeader/>
         </w:trPr>
         <w:tc>
@@ -141,7 +141,7 @@
       </w:tr>
       <w:tr>
         <w:trPr>
-          <w:divId w:val="2026667695"/>
+          <w:divId w:val="1625111436"/>
         </w:trPr>
         <w:tc>
           <w:tcPr>
@@ -222,7 +222,7 @@
       </w:tr>
       <w:tr>
         <w:trPr>
-          <w:divId w:val="2026667695"/>
+          <w:divId w:val="1625111436"/>
         </w:trPr>
         <w:tc>
           <w:tcPr>
@@ -303,7 +303,7 @@
       </w:tr>
       <w:tr>
         <w:trPr>
-          <w:divId w:val="2026667695"/>
+          <w:divId w:val="1625111436"/>
         </w:trPr>
         <w:tc>
           <w:tcPr>
@@ -384,7 +384,7 @@
       </w:tr>
       <w:tr>
         <w:trPr>
-          <w:divId w:val="2026667695"/>
+          <w:divId w:val="1625111436"/>
         </w:trPr>
         <w:tc>
           <w:tcPr>
@@ -465,7 +465,7 @@
       </w:tr>
       <w:tr>
         <w:trPr>
-          <w:divId w:val="2026667695"/>
+          <w:divId w:val="1625111436"/>
         </w:trPr>
         <w:tc>
           <w:tcPr>
@@ -546,7 +546,7 @@
       </w:tr>
       <w:tr>
         <w:trPr>
-          <w:divId w:val="2026667695"/>
+          <w:divId w:val="1625111436"/>
         </w:trPr>
         <w:tc>
           <w:tcPr>
@@ -627,7 +627,7 @@
       </w:tr>
       <w:tr>
         <w:trPr>
-          <w:divId w:val="2026667695"/>
+          <w:divId w:val="1625111436"/>
         </w:trPr>
         <w:tc>
           <w:tcPr>
@@ -710,7 +710,7 @@
     <w:p>
       <w:pPr>
         <w:pStyle w:val="NormalWeb"/>
-        <w:divId w:val="1682781724"/>
+        <w:divId w:val="1869485225"/>
         <w:rPr>
           <w:rFonts w:ascii="Calibri" w:hAnsi="Calibri" w:cs="Calibri"/>
           <w:color w:val="444444"/>
@@ -730,22 +730,22 @@
     </w:p>
     <w:p>
       <w:pPr>
-        <w:divId w:val="2026667695"/>
-        <w:rPr>
-          <w:rFonts w:ascii="Calibri" w:eastAsia="Times New Roman" w:hAnsi="Calibri" w:cs="Calibri"/>
-          <w:color w:val="1A1A1A"/>
-          <w:sz w:val="22"/>
-          <w:szCs w:val="22"/>
-        </w:rPr>
-      </w:pPr>
-      <w:r>
-        <w:rPr>
-          <w:rFonts w:ascii="Calibri" w:eastAsia="Times New Roman" w:hAnsi="Calibri" w:cs="Calibri"/>
-          <w:color w:val="1A1A1A"/>
-          <w:sz w:val="22"/>
-          <w:szCs w:val="22"/>
-        </w:rPr>
-        <w:pict w14:anchorId="75D9D8EE">
+        <w:divId w:val="1625111436"/>
+        <w:rPr>
+          <w:rFonts w:ascii="Calibri" w:eastAsia="Times New Roman" w:hAnsi="Calibri" w:cs="Calibri"/>
+          <w:color w:val="1A1A1A"/>
+          <w:sz w:val="22"/>
+          <w:szCs w:val="22"/>
+        </w:rPr>
+      </w:pPr>
+      <w:r>
+        <w:rPr>
+          <w:rFonts w:ascii="Calibri" w:eastAsia="Times New Roman" w:hAnsi="Calibri" w:cs="Calibri"/>
+          <w:color w:val="1A1A1A"/>
+          <w:sz w:val="22"/>
+          <w:szCs w:val="22"/>
+        </w:rPr>
+        <w:pict w14:anchorId="06B241C0">
           <v:rect id="_x0000_i1025" style="width:0;height:1.5pt" o:hralign="center" o:hrstd="t" o:hr="t" fillcolor="#a0a0a0" stroked="f"/>
         </w:pict>
       </w:r>
@@ -753,7 +753,7 @@
     <w:p>
       <w:pPr>
         <w:pStyle w:val="Heading2"/>
-        <w:divId w:val="2026667695"/>
+        <w:divId w:val="1625111436"/>
         <w:rPr>
           <w:rFonts w:ascii="Calibri" w:eastAsia="Times New Roman" w:hAnsi="Calibri" w:cs="Calibri"/>
         </w:rPr>
@@ -768,7 +768,7 @@
     <w:p>
       <w:pPr>
         <w:pStyle w:val="NormalWeb"/>
-        <w:divId w:val="2026667695"/>
+        <w:divId w:val="1625111436"/>
         <w:rPr>
           <w:rFonts w:ascii="Calibri" w:hAnsi="Calibri" w:cs="Calibri"/>
           <w:color w:val="1A1A1A"/>
@@ -799,7 +799,7 @@
     <w:p>
       <w:pPr>
         <w:pStyle w:val="NormalWeb"/>
-        <w:divId w:val="2026667695"/>
+        <w:divId w:val="1625111436"/>
         <w:rPr>
           <w:rFonts w:ascii="Calibri" w:hAnsi="Calibri" w:cs="Calibri"/>
           <w:color w:val="1A1A1A"/>
@@ -843,7 +843,7 @@
           <w:numId w:val="1"/>
         </w:numPr>
         <w:spacing w:before="100" w:beforeAutospacing="1" w:after="100" w:afterAutospacing="1"/>
-        <w:divId w:val="2026667695"/>
+        <w:divId w:val="1625111436"/>
         <w:rPr>
           <w:rFonts w:ascii="Calibri" w:eastAsia="Times New Roman" w:hAnsi="Calibri" w:cs="Calibri"/>
           <w:color w:val="1A1A1A"/>
@@ -868,7 +868,7 @@
           <w:numId w:val="1"/>
         </w:numPr>
         <w:spacing w:before="100" w:beforeAutospacing="1" w:after="100" w:afterAutospacing="1"/>
-        <w:divId w:val="2026667695"/>
+        <w:divId w:val="1625111436"/>
         <w:rPr>
           <w:rFonts w:ascii="Calibri" w:eastAsia="Times New Roman" w:hAnsi="Calibri" w:cs="Calibri"/>
           <w:color w:val="1A1A1A"/>
@@ -912,7 +912,7 @@
           <w:numId w:val="1"/>
         </w:numPr>
         <w:spacing w:before="100" w:beforeAutospacing="1" w:after="100" w:afterAutospacing="1"/>
-        <w:divId w:val="2026667695"/>
+        <w:divId w:val="1625111436"/>
         <w:rPr>
           <w:rFonts w:ascii="Calibri" w:eastAsia="Times New Roman" w:hAnsi="Calibri" w:cs="Calibri"/>
           <w:color w:val="1A1A1A"/>
@@ -937,7 +937,7 @@
           <w:numId w:val="1"/>
         </w:numPr>
         <w:spacing w:before="100" w:beforeAutospacing="1" w:after="100" w:afterAutospacing="1"/>
-        <w:divId w:val="2026667695"/>
+        <w:divId w:val="1625111436"/>
         <w:rPr>
           <w:rFonts w:ascii="Calibri" w:eastAsia="Times New Roman" w:hAnsi="Calibri" w:cs="Calibri"/>
           <w:color w:val="1A1A1A"/>
@@ -981,7 +981,7 @@
           <w:numId w:val="1"/>
         </w:numPr>
         <w:spacing w:before="100" w:beforeAutospacing="1" w:after="100" w:afterAutospacing="1"/>
-        <w:divId w:val="2026667695"/>
+        <w:divId w:val="1625111436"/>
         <w:rPr>
           <w:rFonts w:ascii="Calibri" w:eastAsia="Times New Roman" w:hAnsi="Calibri" w:cs="Calibri"/>
           <w:color w:val="1A1A1A"/>
@@ -1006,7 +1006,7 @@
           <w:numId w:val="1"/>
         </w:numPr>
         <w:spacing w:before="100" w:beforeAutospacing="1" w:after="100" w:afterAutospacing="1"/>
-        <w:divId w:val="2026667695"/>
+        <w:divId w:val="1625111436"/>
         <w:rPr>
           <w:rFonts w:ascii="Calibri" w:eastAsia="Times New Roman" w:hAnsi="Calibri" w:cs="Calibri"/>
           <w:color w:val="1A1A1A"/>
@@ -1027,7 +1027,7 @@
     <w:p>
       <w:pPr>
         <w:pStyle w:val="Heading2"/>
-        <w:divId w:val="2026667695"/>
+        <w:divId w:val="1625111436"/>
         <w:rPr>
           <w:rFonts w:ascii="Calibri" w:eastAsia="Times New Roman" w:hAnsi="Calibri" w:cs="Calibri"/>
         </w:rPr>
@@ -1042,7 +1042,7 @@
     <w:p>
       <w:pPr>
         <w:pStyle w:val="NormalWeb"/>
-        <w:divId w:val="2026667695"/>
+        <w:divId w:val="1625111436"/>
         <w:rPr>
           <w:rFonts w:ascii="Calibri" w:hAnsi="Calibri" w:cs="Calibri"/>
           <w:color w:val="1A1A1A"/>
@@ -1067,7 +1067,7 @@
           <w:numId w:val="2"/>
         </w:numPr>
         <w:spacing w:before="100" w:beforeAutospacing="1" w:after="100" w:afterAutospacing="1"/>
-        <w:divId w:val="2026667695"/>
+        <w:divId w:val="1625111436"/>
         <w:rPr>
           <w:rFonts w:ascii="Calibri" w:eastAsia="Times New Roman" w:hAnsi="Calibri" w:cs="Calibri"/>
           <w:color w:val="1A1A1A"/>
@@ -1092,7 +1092,7 @@
           <w:numId w:val="2"/>
         </w:numPr>
         <w:spacing w:before="100" w:beforeAutospacing="1" w:after="100" w:afterAutospacing="1"/>
-        <w:divId w:val="2026667695"/>
+        <w:divId w:val="1625111436"/>
         <w:rPr>
           <w:rFonts w:ascii="Calibri" w:eastAsia="Times New Roman" w:hAnsi="Calibri" w:cs="Calibri"/>
           <w:color w:val="1A1A1A"/>
@@ -1117,7 +1117,7 @@
           <w:numId w:val="2"/>
         </w:numPr>
         <w:spacing w:before="100" w:beforeAutospacing="1" w:after="100" w:afterAutospacing="1"/>
-        <w:divId w:val="2026667695"/>
+        <w:divId w:val="1625111436"/>
         <w:rPr>
           <w:rFonts w:ascii="Calibri" w:eastAsia="Times New Roman" w:hAnsi="Calibri" w:cs="Calibri"/>
           <w:color w:val="1A1A1A"/>
@@ -1142,7 +1142,7 @@
           <w:numId w:val="2"/>
         </w:numPr>
         <w:spacing w:before="100" w:beforeAutospacing="1" w:after="100" w:afterAutospacing="1"/>
-        <w:divId w:val="2026667695"/>
+        <w:divId w:val="1625111436"/>
         <w:rPr>
           <w:rFonts w:ascii="Calibri" w:eastAsia="Times New Roman" w:hAnsi="Calibri" w:cs="Calibri"/>
           <w:color w:val="1A1A1A"/>
@@ -1167,7 +1167,7 @@
           <w:numId w:val="2"/>
         </w:numPr>
         <w:spacing w:before="100" w:beforeAutospacing="1" w:after="100" w:afterAutospacing="1"/>
-        <w:divId w:val="2026667695"/>
+        <w:divId w:val="1625111436"/>
         <w:rPr>
           <w:rFonts w:ascii="Calibri" w:eastAsia="Times New Roman" w:hAnsi="Calibri" w:cs="Calibri"/>
           <w:color w:val="1A1A1A"/>
@@ -1192,7 +1192,7 @@
           <w:numId w:val="2"/>
         </w:numPr>
         <w:spacing w:before="100" w:beforeAutospacing="1" w:after="100" w:afterAutospacing="1"/>
-        <w:divId w:val="2026667695"/>
+        <w:divId w:val="1625111436"/>
         <w:rPr>
           <w:rFonts w:ascii="Calibri" w:eastAsia="Times New Roman" w:hAnsi="Calibri" w:cs="Calibri"/>
           <w:color w:val="1A1A1A"/>
@@ -1217,7 +1217,7 @@
           <w:numId w:val="2"/>
         </w:numPr>
         <w:spacing w:before="100" w:beforeAutospacing="1" w:after="100" w:afterAutospacing="1"/>
-        <w:divId w:val="2026667695"/>
+        <w:divId w:val="1625111436"/>
         <w:rPr>
           <w:rFonts w:ascii="Calibri" w:eastAsia="Times New Roman" w:hAnsi="Calibri" w:cs="Calibri"/>
           <w:color w:val="1A1A1A"/>
@@ -1242,7 +1242,7 @@
           <w:numId w:val="2"/>
         </w:numPr>
         <w:spacing w:before="100" w:beforeAutospacing="1" w:after="100" w:afterAutospacing="1"/>
-        <w:divId w:val="2026667695"/>
+        <w:divId w:val="1625111436"/>
         <w:rPr>
           <w:rFonts w:ascii="Calibri" w:eastAsia="Times New Roman" w:hAnsi="Calibri" w:cs="Calibri"/>
           <w:color w:val="1A1A1A"/>
@@ -1267,7 +1267,7 @@
           <w:numId w:val="2"/>
         </w:numPr>
         <w:spacing w:before="100" w:beforeAutospacing="1" w:after="100" w:afterAutospacing="1"/>
-        <w:divId w:val="2026667695"/>
+        <w:divId w:val="1625111436"/>
         <w:rPr>
           <w:rFonts w:ascii="Calibri" w:eastAsia="Times New Roman" w:hAnsi="Calibri" w:cs="Calibri"/>
           <w:color w:val="1A1A1A"/>
@@ -1292,7 +1292,7 @@
           <w:numId w:val="2"/>
         </w:numPr>
         <w:spacing w:before="100" w:beforeAutospacing="1" w:after="100" w:afterAutospacing="1"/>
-        <w:divId w:val="2026667695"/>
+        <w:divId w:val="1625111436"/>
         <w:rPr>
           <w:rFonts w:ascii="Calibri" w:eastAsia="Times New Roman" w:hAnsi="Calibri" w:cs="Calibri"/>
           <w:color w:val="1A1A1A"/>
@@ -1317,7 +1317,7 @@
           <w:numId w:val="2"/>
         </w:numPr>
         <w:spacing w:before="100" w:beforeAutospacing="1" w:after="100" w:afterAutospacing="1"/>
-        <w:divId w:val="2026667695"/>
+        <w:divId w:val="1625111436"/>
         <w:rPr>
           <w:rFonts w:ascii="Calibri" w:eastAsia="Times New Roman" w:hAnsi="Calibri" w:cs="Calibri"/>
           <w:color w:val="1A1A1A"/>
@@ -1342,7 +1342,7 @@
           <w:numId w:val="2"/>
         </w:numPr>
         <w:spacing w:before="100" w:beforeAutospacing="1" w:after="100" w:afterAutospacing="1"/>
-        <w:divId w:val="2026667695"/>
+        <w:divId w:val="1625111436"/>
         <w:rPr>
           <w:rFonts w:ascii="Calibri" w:eastAsia="Times New Roman" w:hAnsi="Calibri" w:cs="Calibri"/>
           <w:color w:val="1A1A1A"/>
@@ -1363,7 +1363,7 @@
     <w:p>
       <w:pPr>
         <w:pStyle w:val="Heading2"/>
-        <w:divId w:val="2026667695"/>
+        <w:divId w:val="1625111436"/>
         <w:rPr>
           <w:rFonts w:ascii="Calibri" w:eastAsia="Times New Roman" w:hAnsi="Calibri" w:cs="Calibri"/>
         </w:rPr>
@@ -1382,7 +1382,7 @@
           <w:numId w:val="3"/>
         </w:numPr>
         <w:spacing w:before="100" w:beforeAutospacing="1" w:after="100" w:afterAutospacing="1"/>
-        <w:divId w:val="2026667695"/>
+        <w:divId w:val="1625111436"/>
         <w:rPr>
           <w:rFonts w:ascii="Calibri" w:eastAsia="Times New Roman" w:hAnsi="Calibri" w:cs="Calibri"/>
           <w:color w:val="1A1A1A"/>
@@ -1446,7 +1446,7 @@
           <w:numId w:val="3"/>
         </w:numPr>
         <w:spacing w:before="100" w:beforeAutospacing="1" w:after="100" w:afterAutospacing="1"/>
-        <w:divId w:val="2026667695"/>
+        <w:divId w:val="1625111436"/>
         <w:rPr>
           <w:rFonts w:ascii="Calibri" w:eastAsia="Times New Roman" w:hAnsi="Calibri" w:cs="Calibri"/>
           <w:color w:val="1A1A1A"/>
@@ -1509,7 +1509,7 @@
           <w:numId w:val="3"/>
         </w:numPr>
         <w:spacing w:before="100" w:beforeAutospacing="1" w:after="100" w:afterAutospacing="1"/>
-        <w:divId w:val="2026667695"/>
+        <w:divId w:val="1625111436"/>
         <w:rPr>
           <w:rFonts w:ascii="Calibri" w:eastAsia="Times New Roman" w:hAnsi="Calibri" w:cs="Calibri"/>
           <w:color w:val="1A1A1A"/>
@@ -1534,7 +1534,7 @@
           <w:numId w:val="3"/>
         </w:numPr>
         <w:spacing w:before="100" w:beforeAutospacing="1" w:after="100" w:afterAutospacing="1"/>
-        <w:divId w:val="2026667695"/>
+        <w:divId w:val="1625111436"/>
         <w:rPr>
           <w:rFonts w:ascii="Calibri" w:eastAsia="Times New Roman" w:hAnsi="Calibri" w:cs="Calibri"/>
           <w:color w:val="1A1A1A"/>
@@ -1575,7 +1575,7 @@
           <w:numId w:val="3"/>
         </w:numPr>
         <w:spacing w:before="100" w:beforeAutospacing="1" w:after="100" w:afterAutospacing="1"/>
-        <w:divId w:val="2026667695"/>
+        <w:divId w:val="1625111436"/>
         <w:rPr>
           <w:rFonts w:ascii="Calibri" w:eastAsia="Times New Roman" w:hAnsi="Calibri" w:cs="Calibri"/>
           <w:color w:val="1A1A1A"/>
@@ -1628,7 +1628,7 @@
     <w:p>
       <w:pPr>
         <w:pStyle w:val="Heading2"/>
-        <w:divId w:val="2026667695"/>
+        <w:divId w:val="1625111436"/>
         <w:rPr>
           <w:rFonts w:ascii="Calibri" w:eastAsia="Times New Roman" w:hAnsi="Calibri" w:cs="Calibri"/>
         </w:rPr>
@@ -1643,7 +1643,7 @@
     <w:p>
       <w:pPr>
         <w:pStyle w:val="NormalWeb"/>
-        <w:divId w:val="2026667695"/>
+        <w:divId w:val="1625111436"/>
         <w:rPr>
           <w:rFonts w:ascii="Calibri" w:hAnsi="Calibri" w:cs="Calibri"/>
           <w:color w:val="1A1A1A"/>
@@ -1674,7 +1674,7 @@
     <w:p>
       <w:pPr>
         <w:pStyle w:val="NormalWeb"/>
-        <w:divId w:val="2026667695"/>
+        <w:divId w:val="1625111436"/>
         <w:rPr>
           <w:rFonts w:ascii="Calibri" w:hAnsi="Calibri" w:cs="Calibri"/>
           <w:color w:val="1A1A1A"/>
@@ -1709,7 +1709,7 @@
           <w:numId w:val="4"/>
         </w:numPr>
         <w:spacing w:before="100" w:beforeAutospacing="1" w:after="100" w:afterAutospacing="1"/>
-        <w:divId w:val="2026667695"/>
+        <w:divId w:val="1625111436"/>
         <w:rPr>
           <w:rFonts w:ascii="Calibri" w:eastAsia="Times New Roman" w:hAnsi="Calibri" w:cs="Calibri"/>
           <w:color w:val="1A1A1A"/>
@@ -1743,7 +1743,7 @@
           <w:numId w:val="4"/>
         </w:numPr>
         <w:spacing w:before="100" w:beforeAutospacing="1" w:after="100" w:afterAutospacing="1"/>
-        <w:divId w:val="2026667695"/>
+        <w:divId w:val="1625111436"/>
         <w:rPr>
           <w:rFonts w:ascii="Calibri" w:eastAsia="Times New Roman" w:hAnsi="Calibri" w:cs="Calibri"/>
           <w:color w:val="1A1A1A"/>
@@ -1768,7 +1768,7 @@
           <w:numId w:val="4"/>
         </w:numPr>
         <w:spacing w:before="100" w:beforeAutospacing="1" w:after="100" w:afterAutospacing="1"/>
-        <w:divId w:val="2026667695"/>
+        <w:divId w:val="1625111436"/>
         <w:rPr>
           <w:rFonts w:ascii="Calibri" w:eastAsia="Times New Roman" w:hAnsi="Calibri" w:cs="Calibri"/>
           <w:color w:val="1A1A1A"/>
@@ -1805,7 +1805,7 @@
     <w:p>
       <w:pPr>
         <w:pStyle w:val="NormalWeb"/>
-        <w:divId w:val="2026667695"/>
+        <w:divId w:val="1625111436"/>
         <w:rPr>
           <w:rFonts w:ascii="Calibri" w:hAnsi="Calibri" w:cs="Calibri"/>
           <w:color w:val="1A1A1A"/>
@@ -1841,7 +1841,7 @@
       </w:tblGrid>
       <w:tr>
         <w:trPr>
-          <w:divId w:val="2026667695"/>
+          <w:divId w:val="1625111436"/>
           <w:tblHeader/>
         </w:trPr>
         <w:tc>
@@ -1976,7 +1976,7 @@
       </w:tr>
       <w:tr>
         <w:trPr>
-          <w:divId w:val="2026667695"/>
+          <w:divId w:val="1625111436"/>
         </w:trPr>
         <w:tc>
           <w:tcPr>
@@ -2109,7 +2109,7 @@
       </w:tr>
       <w:tr>
         <w:trPr>
-          <w:divId w:val="2026667695"/>
+          <w:divId w:val="1625111436"/>
         </w:trPr>
         <w:tc>
           <w:tcPr>
@@ -2242,7 +2242,7 @@
       </w:tr>
       <w:tr>
         <w:trPr>
-          <w:divId w:val="2026667695"/>
+          <w:divId w:val="1625111436"/>
         </w:trPr>
         <w:tc>
           <w:tcPr>
@@ -2359,7 +2359,7 @@
       </w:tr>
       <w:tr>
         <w:trPr>
-          <w:divId w:val="2026667695"/>
+          <w:divId w:val="1625111436"/>
         </w:trPr>
         <w:tc>
           <w:tcPr>
@@ -2476,7 +2476,7 @@
       </w:tr>
       <w:tr>
         <w:trPr>
-          <w:divId w:val="2026667695"/>
+          <w:divId w:val="1625111436"/>
         </w:trPr>
         <w:tc>
           <w:tcPr>
@@ -2595,7 +2595,7 @@
     <w:p>
       <w:pPr>
         <w:pStyle w:val="Heading2"/>
-        <w:divId w:val="2026667695"/>
+        <w:divId w:val="1625111436"/>
         <w:rPr>
           <w:rFonts w:ascii="Calibri" w:eastAsia="Times New Roman" w:hAnsi="Calibri" w:cs="Calibri"/>
         </w:rPr>
@@ -2610,7 +2610,7 @@
     <w:p>
       <w:pPr>
         <w:pStyle w:val="NormalWeb"/>
-        <w:divId w:val="2026667695"/>
+        <w:divId w:val="1625111436"/>
         <w:rPr>
           <w:rFonts w:ascii="Calibri" w:hAnsi="Calibri" w:cs="Calibri"/>
           <w:color w:val="1A1A1A"/>
@@ -2647,7 +2647,7 @@
     <w:p>
       <w:pPr>
         <w:pStyle w:val="HTMLPreformatted"/>
-        <w:divId w:val="2026667695"/>
+        <w:divId w:val="1625111436"/>
         <w:rPr>
           <w:rStyle w:val="HTMLCode"/>
           <w:color w:val="1A1A1A"/>
@@ -2664,7 +2664,7 @@
     <w:p>
       <w:pPr>
         <w:pStyle w:val="HTMLPreformatted"/>
-        <w:divId w:val="2026667695"/>
+        <w:divId w:val="1625111436"/>
         <w:rPr>
           <w:rStyle w:val="HTMLCode"/>
           <w:color w:val="1A1A1A"/>
@@ -2688,7 +2688,7 @@
     <w:p>
       <w:pPr>
         <w:pStyle w:val="HTMLPreformatted"/>
-        <w:divId w:val="2026667695"/>
+        <w:divId w:val="1625111436"/>
         <w:rPr>
           <w:rStyle w:val="HTMLCode"/>
           <w:color w:val="1A1A1A"/>
@@ -2705,7 +2705,7 @@
     <w:p>
       <w:pPr>
         <w:pStyle w:val="HTMLPreformatted"/>
-        <w:divId w:val="2026667695"/>
+        <w:divId w:val="1625111436"/>
         <w:rPr>
           <w:rStyle w:val="HTMLCode"/>
           <w:color w:val="1A1A1A"/>
@@ -2722,7 +2722,7 @@
     <w:p>
       <w:pPr>
         <w:pStyle w:val="HTMLPreformatted"/>
-        <w:divId w:val="2026667695"/>
+        <w:divId w:val="1625111436"/>
         <w:rPr>
           <w:rStyle w:val="HTMLCode"/>
           <w:color w:val="1A1A1A"/>
@@ -2739,7 +2739,7 @@
     <w:p>
       <w:pPr>
         <w:pStyle w:val="HTMLPreformatted"/>
-        <w:divId w:val="2026667695"/>
+        <w:divId w:val="1625111436"/>
         <w:rPr>
           <w:rStyle w:val="HTMLCode"/>
           <w:color w:val="1A1A1A"/>
@@ -2756,7 +2756,7 @@
     <w:p>
       <w:pPr>
         <w:pStyle w:val="HTMLPreformatted"/>
-        <w:divId w:val="2026667695"/>
+        <w:divId w:val="1625111436"/>
         <w:rPr>
           <w:rStyle w:val="HTMLCode"/>
           <w:color w:val="1A1A1A"/>
@@ -2766,7 +2766,7 @@
     <w:p>
       <w:pPr>
         <w:pStyle w:val="HTMLPreformatted"/>
-        <w:divId w:val="2026667695"/>
+        <w:divId w:val="1625111436"/>
         <w:rPr>
           <w:rStyle w:val="HTMLCode"/>
           <w:color w:val="1A1A1A"/>
@@ -2783,7 +2783,7 @@
     <w:p>
       <w:pPr>
         <w:pStyle w:val="HTMLPreformatted"/>
-        <w:divId w:val="2026667695"/>
+        <w:divId w:val="1625111436"/>
         <w:rPr>
           <w:rStyle w:val="HTMLCode"/>
           <w:color w:val="1A1A1A"/>
@@ -2800,7 +2800,7 @@
     <w:p>
       <w:pPr>
         <w:pStyle w:val="HTMLPreformatted"/>
-        <w:divId w:val="2026667695"/>
+        <w:divId w:val="1625111436"/>
         <w:rPr>
           <w:rStyle w:val="HTMLCode"/>
           <w:color w:val="1A1A1A"/>
@@ -2817,7 +2817,7 @@
     <w:p>
       <w:pPr>
         <w:pStyle w:val="HTMLPreformatted"/>
-        <w:divId w:val="2026667695"/>
+        <w:divId w:val="1625111436"/>
         <w:rPr>
           <w:rStyle w:val="HTMLCode"/>
           <w:color w:val="1A1A1A"/>
@@ -2834,7 +2834,7 @@
     <w:p>
       <w:pPr>
         <w:pStyle w:val="HTMLPreformatted"/>
-        <w:divId w:val="2026667695"/>
+        <w:divId w:val="1625111436"/>
         <w:rPr>
           <w:rStyle w:val="HTMLCode"/>
           <w:color w:val="1A1A1A"/>
@@ -2851,7 +2851,7 @@
     <w:p>
       <w:pPr>
         <w:pStyle w:val="HTMLPreformatted"/>
-        <w:divId w:val="2026667695"/>
+        <w:divId w:val="1625111436"/>
         <w:rPr>
           <w:rStyle w:val="HTMLCode"/>
           <w:color w:val="1A1A1A"/>
@@ -2868,7 +2868,7 @@
     <w:p>
       <w:pPr>
         <w:pStyle w:val="HTMLPreformatted"/>
-        <w:divId w:val="2026667695"/>
+        <w:divId w:val="1625111436"/>
         <w:rPr>
           <w:rStyle w:val="HTMLCode"/>
           <w:color w:val="1A1A1A"/>
@@ -2878,7 +2878,7 @@
     <w:p>
       <w:pPr>
         <w:pStyle w:val="HTMLPreformatted"/>
-        <w:divId w:val="2026667695"/>
+        <w:divId w:val="1625111436"/>
         <w:rPr>
           <w:rStyle w:val="HTMLCode"/>
           <w:color w:val="1A1A1A"/>
@@ -2895,7 +2895,7 @@
     <w:p>
       <w:pPr>
         <w:pStyle w:val="HTMLPreformatted"/>
-        <w:divId w:val="2026667695"/>
+        <w:divId w:val="1625111436"/>
         <w:rPr>
           <w:rStyle w:val="HTMLCode"/>
           <w:color w:val="1A1A1A"/>
@@ -2912,7 +2912,7 @@
     <w:p>
       <w:pPr>
         <w:pStyle w:val="HTMLPreformatted"/>
-        <w:divId w:val="2026667695"/>
+        <w:divId w:val="1625111436"/>
         <w:rPr>
           <w:rStyle w:val="HTMLCode"/>
           <w:color w:val="1A1A1A"/>
@@ -2929,7 +2929,7 @@
     <w:p>
       <w:pPr>
         <w:pStyle w:val="HTMLPreformatted"/>
-        <w:divId w:val="2026667695"/>
+        <w:divId w:val="1625111436"/>
         <w:rPr>
           <w:rStyle w:val="HTMLCode"/>
           <w:color w:val="1A1A1A"/>
@@ -2946,7 +2946,7 @@
     <w:p>
       <w:pPr>
         <w:pStyle w:val="HTMLPreformatted"/>
-        <w:divId w:val="2026667695"/>
+        <w:divId w:val="1625111436"/>
         <w:rPr>
           <w:rStyle w:val="HTMLCode"/>
           <w:color w:val="1A1A1A"/>
@@ -2963,7 +2963,7 @@
     <w:p>
       <w:pPr>
         <w:pStyle w:val="HTMLPreformatted"/>
-        <w:divId w:val="2026667695"/>
+        <w:divId w:val="1625111436"/>
         <w:rPr>
           <w:rStyle w:val="HTMLCode"/>
           <w:color w:val="1A1A1A"/>
@@ -2980,7 +2980,7 @@
     <w:p>
       <w:pPr>
         <w:pStyle w:val="HTMLPreformatted"/>
-        <w:divId w:val="2026667695"/>
+        <w:divId w:val="1625111436"/>
         <w:rPr>
           <w:rStyle w:val="HTMLCode"/>
           <w:color w:val="1A1A1A"/>
@@ -2997,7 +2997,7 @@
     <w:p>
       <w:pPr>
         <w:pStyle w:val="HTMLPreformatted"/>
-        <w:divId w:val="2026667695"/>
+        <w:divId w:val="1625111436"/>
         <w:rPr>
           <w:rStyle w:val="HTMLCode"/>
           <w:color w:val="1A1A1A"/>
@@ -3014,7 +3014,7 @@
     <w:p>
       <w:pPr>
         <w:pStyle w:val="HTMLPreformatted"/>
-        <w:divId w:val="2026667695"/>
+        <w:divId w:val="1625111436"/>
         <w:rPr>
           <w:rStyle w:val="HTMLCode"/>
           <w:color w:val="1A1A1A"/>
@@ -3024,7 +3024,7 @@
     <w:p>
       <w:pPr>
         <w:pStyle w:val="HTMLPreformatted"/>
-        <w:divId w:val="2026667695"/>
+        <w:divId w:val="1625111436"/>
         <w:rPr>
           <w:rStyle w:val="HTMLCode"/>
           <w:color w:val="1A1A1A"/>
@@ -3041,7 +3041,7 @@
     <w:p>
       <w:pPr>
         <w:pStyle w:val="HTMLPreformatted"/>
-        <w:divId w:val="2026667695"/>
+        <w:divId w:val="1625111436"/>
         <w:rPr>
           <w:rStyle w:val="HTMLCode"/>
           <w:color w:val="1A1A1A"/>
@@ -3058,7 +3058,7 @@
     <w:p>
       <w:pPr>
         <w:pStyle w:val="HTMLPreformatted"/>
-        <w:divId w:val="2026667695"/>
+        <w:divId w:val="1625111436"/>
         <w:rPr>
           <w:rStyle w:val="HTMLCode"/>
           <w:color w:val="1A1A1A"/>
@@ -3075,7 +3075,7 @@
     <w:p>
       <w:pPr>
         <w:pStyle w:val="HTMLPreformatted"/>
-        <w:divId w:val="2026667695"/>
+        <w:divId w:val="1625111436"/>
         <w:rPr>
           <w:rStyle w:val="HTMLCode"/>
           <w:color w:val="1A1A1A"/>
@@ -3092,7 +3092,7 @@
     <w:p>
       <w:pPr>
         <w:pStyle w:val="HTMLPreformatted"/>
-        <w:divId w:val="2026667695"/>
+        <w:divId w:val="1625111436"/>
         <w:rPr>
           <w:rStyle w:val="HTMLCode"/>
           <w:color w:val="1A1A1A"/>
@@ -3109,7 +3109,7 @@
     <w:p>
       <w:pPr>
         <w:pStyle w:val="HTMLPreformatted"/>
-        <w:divId w:val="2026667695"/>
+        <w:divId w:val="1625111436"/>
         <w:rPr>
           <w:rStyle w:val="HTMLCode"/>
           <w:color w:val="1A1A1A"/>
@@ -3126,7 +3126,7 @@
     <w:p>
       <w:pPr>
         <w:pStyle w:val="HTMLPreformatted"/>
-        <w:divId w:val="2026667695"/>
+        <w:divId w:val="1625111436"/>
         <w:rPr>
           <w:rStyle w:val="HTMLCode"/>
           <w:color w:val="1A1A1A"/>
@@ -3136,7 +3136,7 @@
     <w:p>
       <w:pPr>
         <w:pStyle w:val="HTMLPreformatted"/>
-        <w:divId w:val="2026667695"/>
+        <w:divId w:val="1625111436"/>
         <w:rPr>
           <w:rStyle w:val="HTMLCode"/>
           <w:color w:val="1A1A1A"/>
@@ -3153,7 +3153,7 @@
     <w:p>
       <w:pPr>
         <w:pStyle w:val="HTMLPreformatted"/>
-        <w:divId w:val="2026667695"/>
+        <w:divId w:val="1625111436"/>
         <w:rPr>
           <w:rStyle w:val="HTMLCode"/>
           <w:color w:val="1A1A1A"/>
@@ -3170,7 +3170,7 @@
     <w:p>
       <w:pPr>
         <w:pStyle w:val="HTMLPreformatted"/>
-        <w:divId w:val="2026667695"/>
+        <w:divId w:val="1625111436"/>
         <w:rPr>
           <w:rStyle w:val="HTMLCode"/>
           <w:color w:val="1A1A1A"/>
@@ -3187,7 +3187,7 @@
     <w:p>
       <w:pPr>
         <w:pStyle w:val="HTMLPreformatted"/>
-        <w:divId w:val="2026667695"/>
+        <w:divId w:val="1625111436"/>
         <w:rPr>
           <w:rStyle w:val="HTMLCode"/>
           <w:color w:val="1A1A1A"/>
@@ -3204,7 +3204,7 @@
     <w:p>
       <w:pPr>
         <w:pStyle w:val="HTMLPreformatted"/>
-        <w:divId w:val="2026667695"/>
+        <w:divId w:val="1625111436"/>
         <w:rPr>
           <w:rStyle w:val="HTMLCode"/>
           <w:color w:val="1A1A1A"/>
@@ -3221,7 +3221,7 @@
     <w:p>
       <w:pPr>
         <w:pStyle w:val="HTMLPreformatted"/>
-        <w:divId w:val="2026667695"/>
+        <w:divId w:val="1625111436"/>
         <w:rPr>
           <w:rStyle w:val="HTMLCode"/>
           <w:color w:val="1A1A1A"/>
@@ -3238,7 +3238,7 @@
     <w:p>
       <w:pPr>
         <w:pStyle w:val="HTMLPreformatted"/>
-        <w:divId w:val="2026667695"/>
+        <w:divId w:val="1625111436"/>
         <w:rPr>
           <w:rStyle w:val="HTMLCode"/>
           <w:color w:val="1A1A1A"/>
@@ -3248,7 +3248,7 @@
     <w:p>
       <w:pPr>
         <w:pStyle w:val="HTMLPreformatted"/>
-        <w:divId w:val="2026667695"/>
+        <w:divId w:val="1625111436"/>
         <w:rPr>
           <w:rStyle w:val="HTMLCode"/>
           <w:color w:val="1A1A1A"/>
@@ -3265,7 +3265,7 @@
     <w:p>
       <w:pPr>
         <w:pStyle w:val="HTMLPreformatted"/>
-        <w:divId w:val="2026667695"/>
+        <w:divId w:val="1625111436"/>
         <w:rPr>
           <w:rStyle w:val="HTMLCode"/>
           <w:color w:val="1A1A1A"/>
@@ -3282,7 +3282,7 @@
     <w:p>
       <w:pPr>
         <w:pStyle w:val="HTMLPreformatted"/>
-        <w:divId w:val="2026667695"/>
+        <w:divId w:val="1625111436"/>
         <w:rPr>
           <w:rStyle w:val="HTMLCode"/>
           <w:color w:val="1A1A1A"/>
@@ -3299,7 +3299,7 @@
     <w:p>
       <w:pPr>
         <w:pStyle w:val="HTMLPreformatted"/>
-        <w:divId w:val="2026667695"/>
+        <w:divId w:val="1625111436"/>
         <w:rPr>
           <w:rStyle w:val="HTMLCode"/>
           <w:color w:val="1A1A1A"/>
@@ -3316,7 +3316,7 @@
     <w:p>
       <w:pPr>
         <w:pStyle w:val="HTMLPreformatted"/>
-        <w:divId w:val="2026667695"/>
+        <w:divId w:val="1625111436"/>
         <w:rPr>
           <w:rStyle w:val="HTMLCode"/>
           <w:color w:val="1A1A1A"/>
@@ -3326,7 +3326,7 @@
     <w:p>
       <w:pPr>
         <w:pStyle w:val="HTMLPreformatted"/>
-        <w:divId w:val="2026667695"/>
+        <w:divId w:val="1625111436"/>
         <w:rPr>
           <w:rStyle w:val="HTMLCode"/>
           <w:color w:val="1A1A1A"/>
@@ -3343,7 +3343,7 @@
     <w:p>
       <w:pPr>
         <w:pStyle w:val="HTMLPreformatted"/>
-        <w:divId w:val="2026667695"/>
+        <w:divId w:val="1625111436"/>
         <w:rPr>
           <w:rStyle w:val="HTMLCode"/>
           <w:color w:val="1A1A1A"/>
@@ -3360,7 +3360,7 @@
     <w:p>
       <w:pPr>
         <w:pStyle w:val="HTMLPreformatted"/>
-        <w:divId w:val="2026667695"/>
+        <w:divId w:val="1625111436"/>
         <w:rPr>
           <w:rStyle w:val="HTMLCode"/>
           <w:color w:val="1A1A1A"/>
@@ -3377,7 +3377,7 @@
     <w:p>
       <w:pPr>
         <w:pStyle w:val="HTMLPreformatted"/>
-        <w:divId w:val="2026667695"/>
+        <w:divId w:val="1625111436"/>
         <w:rPr>
           <w:rStyle w:val="HTMLCode"/>
           <w:color w:val="1A1A1A"/>
@@ -3394,7 +3394,7 @@
     <w:p>
       <w:pPr>
         <w:pStyle w:val="HTMLPreformatted"/>
-        <w:divId w:val="2026667695"/>
+        <w:divId w:val="1625111436"/>
         <w:rPr>
           <w:rStyle w:val="HTMLCode"/>
           <w:color w:val="1A1A1A"/>
@@ -3418,7 +3418,7 @@
     <w:p>
       <w:pPr>
         <w:pStyle w:val="HTMLPreformatted"/>
-        <w:divId w:val="2026667695"/>
+        <w:divId w:val="1625111436"/>
         <w:rPr>
           <w:rStyle w:val="HTMLCode"/>
           <w:color w:val="1A1A1A"/>
@@ -3435,7 +3435,7 @@
     <w:p>
       <w:pPr>
         <w:pStyle w:val="HTMLPreformatted"/>
-        <w:divId w:val="2026667695"/>
+        <w:divId w:val="1625111436"/>
         <w:rPr>
           <w:rStyle w:val="HTMLCode"/>
           <w:color w:val="1A1A1A"/>
@@ -3452,7 +3452,7 @@
     <w:p>
       <w:pPr>
         <w:pStyle w:val="HTMLPreformatted"/>
-        <w:divId w:val="2026667695"/>
+        <w:divId w:val="1625111436"/>
         <w:rPr>
           <w:rStyle w:val="HTMLCode"/>
           <w:color w:val="1A1A1A"/>
@@ -3462,7 +3462,7 @@
     <w:p>
       <w:pPr>
         <w:pStyle w:val="HTMLPreformatted"/>
-        <w:divId w:val="2026667695"/>
+        <w:divId w:val="1625111436"/>
         <w:rPr>
           <w:rStyle w:val="HTMLCode"/>
           <w:color w:val="1A1A1A"/>
@@ -3479,7 +3479,7 @@
     <w:p>
       <w:pPr>
         <w:pStyle w:val="HTMLPreformatted"/>
-        <w:divId w:val="2026667695"/>
+        <w:divId w:val="1625111436"/>
         <w:rPr>
           <w:rStyle w:val="HTMLCode"/>
           <w:color w:val="1A1A1A"/>
@@ -3496,7 +3496,7 @@
     <w:p>
       <w:pPr>
         <w:pStyle w:val="HTMLPreformatted"/>
-        <w:divId w:val="2026667695"/>
+        <w:divId w:val="1625111436"/>
         <w:rPr>
           <w:rStyle w:val="HTMLCode"/>
           <w:color w:val="1A1A1A"/>
@@ -3513,7 +3513,7 @@
     <w:p>
       <w:pPr>
         <w:pStyle w:val="HTMLPreformatted"/>
-        <w:divId w:val="2026667695"/>
+        <w:divId w:val="1625111436"/>
         <w:rPr>
           <w:rStyle w:val="HTMLCode"/>
           <w:color w:val="1A1A1A"/>
@@ -3530,7 +3530,7 @@
     <w:p>
       <w:pPr>
         <w:pStyle w:val="HTMLPreformatted"/>
-        <w:divId w:val="2026667695"/>
+        <w:divId w:val="1625111436"/>
         <w:rPr>
           <w:rStyle w:val="HTMLCode"/>
           <w:color w:val="1A1A1A"/>
@@ -3547,7 +3547,7 @@
     <w:p>
       <w:pPr>
         <w:pStyle w:val="HTMLPreformatted"/>
-        <w:divId w:val="2026667695"/>
+        <w:divId w:val="1625111436"/>
         <w:rPr>
           <w:rStyle w:val="HTMLCode"/>
           <w:color w:val="1A1A1A"/>
@@ -3564,7 +3564,7 @@
     <w:p>
       <w:pPr>
         <w:pStyle w:val="HTMLPreformatted"/>
-        <w:divId w:val="2026667695"/>
+        <w:divId w:val="1625111436"/>
         <w:rPr>
           <w:rStyle w:val="HTMLCode"/>
           <w:color w:val="1A1A1A"/>
@@ -3574,7 +3574,7 @@
     <w:p>
       <w:pPr>
         <w:pStyle w:val="HTMLPreformatted"/>
-        <w:divId w:val="2026667695"/>
+        <w:divId w:val="1625111436"/>
         <w:rPr>
           <w:rStyle w:val="HTMLCode"/>
           <w:color w:val="1A1A1A"/>
@@ -3591,7 +3591,7 @@
     <w:p>
       <w:pPr>
         <w:pStyle w:val="HTMLPreformatted"/>
-        <w:divId w:val="2026667695"/>
+        <w:divId w:val="1625111436"/>
         <w:rPr>
           <w:rStyle w:val="HTMLCode"/>
           <w:color w:val="1A1A1A"/>
@@ -3608,7 +3608,7 @@
     <w:p>
       <w:pPr>
         <w:pStyle w:val="HTMLPreformatted"/>
-        <w:divId w:val="2026667695"/>
+        <w:divId w:val="1625111436"/>
         <w:rPr>
           <w:rStyle w:val="HTMLCode"/>
           <w:color w:val="1A1A1A"/>
@@ -3625,7 +3625,7 @@
     <w:p>
       <w:pPr>
         <w:pStyle w:val="HTMLPreformatted"/>
-        <w:divId w:val="2026667695"/>
+        <w:divId w:val="1625111436"/>
         <w:rPr>
           <w:color w:val="1A1A1A"/>
         </w:rPr>
@@ -3641,7 +3641,7 @@
     <w:p>
       <w:pPr>
         <w:pStyle w:val="NormalWeb"/>
-        <w:divId w:val="2026667695"/>
+        <w:divId w:val="1625111436"/>
         <w:rPr>
           <w:rFonts w:ascii="Calibri" w:hAnsi="Calibri" w:cs="Calibri"/>
           <w:color w:val="1A1A1A"/>
@@ -3735,7 +3735,7 @@
     <w:p>
       <w:pPr>
         <w:pStyle w:val="Heading2"/>
-        <w:divId w:val="2026667695"/>
+        <w:divId w:val="1625111436"/>
         <w:rPr>
           <w:rFonts w:ascii="Calibri" w:eastAsia="Times New Roman" w:hAnsi="Calibri" w:cs="Calibri"/>
         </w:rPr>
@@ -3750,7 +3750,7 @@
     <w:p>
       <w:pPr>
         <w:pStyle w:val="NormalWeb"/>
-        <w:divId w:val="2026667695"/>
+        <w:divId w:val="1625111436"/>
         <w:rPr>
           <w:rFonts w:ascii="Calibri" w:hAnsi="Calibri" w:cs="Calibri"/>
           <w:color w:val="1A1A1A"/>
@@ -3810,7 +3810,7 @@
           <w:numId w:val="5"/>
         </w:numPr>
         <w:spacing w:before="100" w:beforeAutospacing="1" w:after="100" w:afterAutospacing="1"/>
-        <w:divId w:val="2026667695"/>
+        <w:divId w:val="1625111436"/>
         <w:rPr>
           <w:rFonts w:ascii="Calibri" w:eastAsia="Times New Roman" w:hAnsi="Calibri" w:cs="Calibri"/>
           <w:color w:val="1A1A1A"/>
@@ -3929,7 +3929,7 @@
           <w:numId w:val="5"/>
         </w:numPr>
         <w:spacing w:before="100" w:beforeAutospacing="1" w:after="100" w:afterAutospacing="1"/>
-        <w:divId w:val="2026667695"/>
+        <w:divId w:val="1625111436"/>
         <w:rPr>
           <w:rFonts w:ascii="Calibri" w:eastAsia="Times New Roman" w:hAnsi="Calibri" w:cs="Calibri"/>
           <w:color w:val="1A1A1A"/>
@@ -4027,7 +4027,7 @@
     <w:p>
       <w:pPr>
         <w:pStyle w:val="Heading2"/>
-        <w:divId w:val="2026667695"/>
+        <w:divId w:val="1625111436"/>
         <w:rPr>
           <w:rFonts w:ascii="Calibri" w:eastAsia="Times New Roman" w:hAnsi="Calibri" w:cs="Calibri"/>
         </w:rPr>
@@ -4042,7 +4042,7 @@
     <w:p>
       <w:pPr>
         <w:pStyle w:val="NormalWeb"/>
-        <w:divId w:val="2026667695"/>
+        <w:divId w:val="1625111436"/>
         <w:rPr>
           <w:rFonts w:ascii="Calibri" w:hAnsi="Calibri" w:cs="Calibri"/>
           <w:color w:val="1A1A1A"/>
@@ -4083,7 +4083,7 @@
           <w:numId w:val="6"/>
         </w:numPr>
         <w:spacing w:before="100" w:beforeAutospacing="1" w:after="100" w:afterAutospacing="1"/>
-        <w:divId w:val="2026667695"/>
+        <w:divId w:val="1625111436"/>
         <w:rPr>
           <w:rFonts w:ascii="Calibri" w:eastAsia="Times New Roman" w:hAnsi="Calibri" w:cs="Calibri"/>
           <w:color w:val="1A1A1A"/>
@@ -4127,7 +4127,7 @@
           <w:numId w:val="6"/>
         </w:numPr>
         <w:spacing w:before="100" w:beforeAutospacing="1" w:after="100" w:afterAutospacing="1"/>
-        <w:divId w:val="2026667695"/>
+        <w:divId w:val="1625111436"/>
         <w:rPr>
           <w:rFonts w:ascii="Calibri" w:eastAsia="Times New Roman" w:hAnsi="Calibri" w:cs="Calibri"/>
           <w:color w:val="1A1A1A"/>
@@ -4181,7 +4181,7 @@
           <w:numId w:val="6"/>
         </w:numPr>
         <w:spacing w:before="100" w:beforeAutospacing="1" w:after="100" w:afterAutospacing="1"/>
-        <w:divId w:val="2026667695"/>
+        <w:divId w:val="1625111436"/>
         <w:rPr>
           <w:rFonts w:ascii="Calibri" w:eastAsia="Times New Roman" w:hAnsi="Calibri" w:cs="Calibri"/>
           <w:color w:val="1A1A1A"/>
@@ -4248,7 +4248,7 @@
           <w:numId w:val="6"/>
         </w:numPr>
         <w:spacing w:before="100" w:beforeAutospacing="1" w:after="100" w:afterAutospacing="1"/>
-        <w:divId w:val="2026667695"/>
+        <w:divId w:val="1625111436"/>
         <w:rPr>
           <w:rFonts w:ascii="Calibri" w:eastAsia="Times New Roman" w:hAnsi="Calibri" w:cs="Calibri"/>
           <w:color w:val="1A1A1A"/>
@@ -4295,7 +4295,7 @@
     <w:p>
       <w:pPr>
         <w:pStyle w:val="NormalWeb"/>
-        <w:divId w:val="2026667695"/>
+        <w:divId w:val="1625111436"/>
         <w:rPr>
           <w:rFonts w:ascii="Calibri" w:hAnsi="Calibri" w:cs="Calibri"/>
           <w:color w:val="1A1A1A"/>
@@ -4341,7 +4341,7 @@
     <w:p>
       <w:pPr>
         <w:pStyle w:val="Heading2"/>
-        <w:divId w:val="2026667695"/>
+        <w:divId w:val="1625111436"/>
         <w:rPr>
           <w:rFonts w:ascii="Calibri" w:eastAsia="Times New Roman" w:hAnsi="Calibri" w:cs="Calibri"/>
         </w:rPr>
@@ -4360,7 +4360,7 @@
           <w:numId w:val="7"/>
         </w:numPr>
         <w:spacing w:before="100" w:beforeAutospacing="1" w:after="100" w:afterAutospacing="1"/>
-        <w:divId w:val="2026667695"/>
+        <w:divId w:val="1625111436"/>
         <w:rPr>
           <w:rFonts w:ascii="Calibri" w:eastAsia="Times New Roman" w:hAnsi="Calibri" w:cs="Calibri"/>
           <w:color w:val="1A1A1A"/>
@@ -4443,7 +4443,7 @@
           <w:numId w:val="7"/>
         </w:numPr>
         <w:spacing w:before="100" w:beforeAutospacing="1" w:after="100" w:afterAutospacing="1"/>
-        <w:divId w:val="2026667695"/>
+        <w:divId w:val="1625111436"/>
         <w:rPr>
           <w:rFonts w:ascii="Calibri" w:eastAsia="Times New Roman" w:hAnsi="Calibri" w:cs="Calibri"/>
           <w:color w:val="1A1A1A"/>
@@ -4523,7 +4523,7 @@
           <w:numId w:val="7"/>
         </w:numPr>
         <w:spacing w:before="100" w:beforeAutospacing="1" w:after="100" w:afterAutospacing="1"/>
-        <w:divId w:val="2026667695"/>
+        <w:divId w:val="1625111436"/>
         <w:rPr>
           <w:rFonts w:ascii="Calibri" w:eastAsia="Times New Roman" w:hAnsi="Calibri" w:cs="Calibri"/>
           <w:color w:val="1A1A1A"/>
@@ -4551,7 +4551,7 @@
     <w:p>
       <w:pPr>
         <w:pStyle w:val="NormalWeb"/>
-        <w:divId w:val="2026667695"/>
+        <w:divId w:val="1625111436"/>
         <w:rPr>
           <w:rFonts w:ascii="Calibri" w:hAnsi="Calibri" w:cs="Calibri"/>
           <w:color w:val="1A1A1A"/>
@@ -4588,7 +4588,7 @@
     <w:p>
       <w:pPr>
         <w:pStyle w:val="Heading2"/>
-        <w:divId w:val="2026667695"/>
+        <w:divId w:val="1625111436"/>
         <w:rPr>
           <w:rFonts w:ascii="Calibri" w:eastAsia="Times New Roman" w:hAnsi="Calibri" w:cs="Calibri"/>
         </w:rPr>
@@ -4603,7 +4603,7 @@
     <w:p>
       <w:pPr>
         <w:pStyle w:val="NormalWeb"/>
-        <w:divId w:val="2026667695"/>
+        <w:divId w:val="1625111436"/>
         <w:rPr>
           <w:rFonts w:ascii="Calibri" w:hAnsi="Calibri" w:cs="Calibri"/>
           <w:color w:val="1A1A1A"/>
@@ -4651,7 +4651,7 @@
           <w:numId w:val="8"/>
         </w:numPr>
         <w:spacing w:before="100" w:beforeAutospacing="1" w:after="100" w:afterAutospacing="1"/>
-        <w:divId w:val="2026667695"/>
+        <w:divId w:val="1625111436"/>
         <w:rPr>
           <w:rFonts w:ascii="Calibri" w:eastAsia="Times New Roman" w:hAnsi="Calibri" w:cs="Calibri"/>
           <w:color w:val="1A1A1A"/>
@@ -4676,7 +4676,7 @@
           <w:numId w:val="8"/>
         </w:numPr>
         <w:spacing w:before="100" w:beforeAutospacing="1" w:after="100" w:afterAutospacing="1"/>
-        <w:divId w:val="2026667695"/>
+        <w:divId w:val="1625111436"/>
         <w:rPr>
           <w:rFonts w:ascii="Calibri" w:eastAsia="Times New Roman" w:hAnsi="Calibri" w:cs="Calibri"/>
           <w:color w:val="1A1A1A"/>
@@ -4749,7 +4749,7 @@
           <w:numId w:val="8"/>
         </w:numPr>
         <w:spacing w:before="100" w:beforeAutospacing="1" w:after="100" w:afterAutospacing="1"/>
-        <w:divId w:val="2026667695"/>
+        <w:divId w:val="1625111436"/>
         <w:rPr>
           <w:rFonts w:ascii="Calibri" w:eastAsia="Times New Roman" w:hAnsi="Calibri" w:cs="Calibri"/>
           <w:color w:val="1A1A1A"/>
@@ -4774,7 +4774,7 @@
           <w:numId w:val="8"/>
         </w:numPr>
         <w:spacing w:before="100" w:beforeAutospacing="1" w:after="100" w:afterAutospacing="1"/>
-        <w:divId w:val="2026667695"/>
+        <w:divId w:val="1625111436"/>
         <w:rPr>
           <w:rFonts w:ascii="Calibri" w:eastAsia="Times New Roman" w:hAnsi="Calibri" w:cs="Calibri"/>
           <w:color w:val="1A1A1A"/>
@@ -4850,7 +4850,7 @@
           <w:numId w:val="8"/>
         </w:numPr>
         <w:spacing w:before="100" w:beforeAutospacing="1" w:after="100" w:afterAutospacing="1"/>
-        <w:divId w:val="2026667695"/>
+        <w:divId w:val="1625111436"/>
         <w:rPr>
           <w:rFonts w:ascii="Calibri" w:eastAsia="Times New Roman" w:hAnsi="Calibri" w:cs="Calibri"/>
           <w:color w:val="1A1A1A"/>
@@ -4942,7 +4942,7 @@
           <w:numId w:val="8"/>
         </w:numPr>
         <w:spacing w:before="100" w:beforeAutospacing="1" w:after="100" w:afterAutospacing="1"/>
-        <w:divId w:val="2026667695"/>
+        <w:divId w:val="1625111436"/>
         <w:rPr>
           <w:rFonts w:ascii="Calibri" w:eastAsia="Times New Roman" w:hAnsi="Calibri" w:cs="Calibri"/>
           <w:color w:val="1A1A1A"/>
@@ -5005,7 +5005,7 @@
     <w:p>
       <w:pPr>
         <w:pStyle w:val="Heading2"/>
-        <w:divId w:val="2026667695"/>
+        <w:divId w:val="1625111436"/>
         <w:rPr>
           <w:rFonts w:ascii="Calibri" w:eastAsia="Times New Roman" w:hAnsi="Calibri" w:cs="Calibri"/>
         </w:rPr>
@@ -5020,7 +5020,7 @@
     <w:p>
       <w:pPr>
         <w:pStyle w:val="NormalWeb"/>
-        <w:divId w:val="2026667695"/>
+        <w:divId w:val="1625111436"/>
         <w:rPr>
           <w:rFonts w:ascii="Calibri" w:hAnsi="Calibri" w:cs="Calibri"/>
           <w:color w:val="1A1A1A"/>
@@ -5099,7 +5099,7 @@
           <w:numId w:val="9"/>
         </w:numPr>
         <w:spacing w:before="100" w:beforeAutospacing="1" w:after="100" w:afterAutospacing="1"/>
-        <w:divId w:val="2026667695"/>
+        <w:divId w:val="1625111436"/>
         <w:rPr>
           <w:rFonts w:ascii="Calibri" w:eastAsia="Times New Roman" w:hAnsi="Calibri" w:cs="Calibri"/>
           <w:color w:val="1A1A1A"/>
@@ -5188,7 +5188,7 @@
           <w:numId w:val="9"/>
         </w:numPr>
         <w:spacing w:before="100" w:beforeAutospacing="1" w:after="100" w:afterAutospacing="1"/>
-        <w:divId w:val="2026667695"/>
+        <w:divId w:val="1625111436"/>
         <w:rPr>
           <w:rFonts w:ascii="Calibri" w:eastAsia="Times New Roman" w:hAnsi="Calibri" w:cs="Calibri"/>
           <w:color w:val="1A1A1A"/>
@@ -5238,7 +5238,7 @@
     <w:p>
       <w:pPr>
         <w:pStyle w:val="NormalWeb"/>
-        <w:divId w:val="2026667695"/>
+        <w:divId w:val="1625111436"/>
         <w:rPr>
           <w:rFonts w:ascii="Calibri" w:hAnsi="Calibri" w:cs="Calibri"/>
           <w:color w:val="1A1A1A"/>
@@ -5259,7 +5259,7 @@
     <w:p>
       <w:pPr>
         <w:pStyle w:val="Heading2"/>
-        <w:divId w:val="2026667695"/>
+        <w:divId w:val="1625111436"/>
         <w:rPr>
           <w:rFonts w:ascii="Calibri" w:eastAsia="Times New Roman" w:hAnsi="Calibri" w:cs="Calibri"/>
         </w:rPr>
@@ -5289,7 +5289,7 @@
       </w:tblGrid>
       <w:tr>
         <w:trPr>
-          <w:divId w:val="2026667695"/>
+          <w:divId w:val="1625111436"/>
           <w:tblHeader/>
         </w:trPr>
         <w:tc>
@@ -5424,7 +5424,7 @@
       </w:tr>
       <w:tr>
         <w:trPr>
-          <w:divId w:val="2026667695"/>
+          <w:divId w:val="1625111436"/>
         </w:trPr>
         <w:tc>
           <w:tcPr>
@@ -5566,7 +5566,7 @@
       </w:tr>
       <w:tr>
         <w:trPr>
-          <w:divId w:val="2026667695"/>
+          <w:divId w:val="1625111436"/>
         </w:trPr>
         <w:tc>
           <w:tcPr>
@@ -5683,7 +5683,7 @@
       </w:tr>
       <w:tr>
         <w:trPr>
-          <w:divId w:val="2026667695"/>
+          <w:divId w:val="1625111436"/>
         </w:trPr>
         <w:tc>
           <w:tcPr>
@@ -5809,7 +5809,7 @@
       </w:tr>
       <w:tr>
         <w:trPr>
-          <w:divId w:val="2026667695"/>
+          <w:divId w:val="1625111436"/>
         </w:trPr>
         <w:tc>
           <w:tcPr>
@@ -5924,7 +5924,7 @@
       </w:tr>
       <w:tr>
         <w:trPr>
-          <w:divId w:val="2026667695"/>
+          <w:divId w:val="1625111436"/>
         </w:trPr>
         <w:tc>
           <w:tcPr>
@@ -6050,7 +6050,7 @@
       </w:tr>
       <w:tr>
         <w:trPr>
-          <w:divId w:val="2026667695"/>
+          <w:divId w:val="1625111436"/>
         </w:trPr>
         <w:tc>
           <w:tcPr>
@@ -6165,7 +6165,7 @@
       </w:tr>
       <w:tr>
         <w:trPr>
-          <w:divId w:val="2026667695"/>
+          <w:divId w:val="1625111436"/>
         </w:trPr>
         <w:tc>
           <w:tcPr>
@@ -6280,7 +6280,7 @@
       </w:tr>
       <w:tr>
         <w:trPr>
-          <w:divId w:val="2026667695"/>
+          <w:divId w:val="1625111436"/>
         </w:trPr>
         <w:tc>
           <w:tcPr>
@@ -6406,7 +6406,7 @@
       </w:tr>
       <w:tr>
         <w:trPr>
-          <w:divId w:val="2026667695"/>
+          <w:divId w:val="1625111436"/>
         </w:trPr>
         <w:tc>
           <w:tcPr>
@@ -6525,7 +6525,7 @@
       </w:tr>
       <w:tr>
         <w:trPr>
-          <w:divId w:val="2026667695"/>
+          <w:divId w:val="1625111436"/>
         </w:trPr>
         <w:tc>
           <w:tcPr>
@@ -6644,7 +6644,7 @@
       </w:tr>
       <w:tr>
         <w:trPr>
-          <w:divId w:val="2026667695"/>
+          <w:divId w:val="1625111436"/>
         </w:trPr>
         <w:tc>
           <w:tcPr>
@@ -6852,7 +6852,7 @@
     <w:p>
       <w:pPr>
         <w:pStyle w:val="Heading2"/>
-        <w:divId w:val="2026667695"/>
+        <w:divId w:val="1625111436"/>
         <w:rPr>
           <w:rFonts w:ascii="Calibri" w:eastAsia="Times New Roman" w:hAnsi="Calibri" w:cs="Calibri"/>
         </w:rPr>
@@ -6867,7 +6867,7 @@
     <w:p>
       <w:pPr>
         <w:pStyle w:val="NormalWeb"/>
-        <w:divId w:val="2026667695"/>
+        <w:divId w:val="1625111436"/>
         <w:rPr>
           <w:rFonts w:ascii="Calibri" w:hAnsi="Calibri" w:cs="Calibri"/>
           <w:color w:val="1A1A1A"/>
@@ -6888,7 +6888,7 @@
     <w:p>
       <w:pPr>
         <w:pStyle w:val="Heading3"/>
-        <w:divId w:val="2026667695"/>
+        <w:divId w:val="1625111436"/>
         <w:rPr>
           <w:rFonts w:ascii="Calibri" w:eastAsia="Times New Roman" w:hAnsi="Calibri" w:cs="Calibri"/>
         </w:rPr>
@@ -6915,7 +6915,7 @@
     <w:p>
       <w:pPr>
         <w:pStyle w:val="HTMLPreformatted"/>
-        <w:divId w:val="2026667695"/>
+        <w:divId w:val="1625111436"/>
         <w:rPr>
           <w:rStyle w:val="HTMLCode"/>
           <w:color w:val="1A1A1A"/>
@@ -6932,7 +6932,7 @@
     <w:p>
       <w:pPr>
         <w:pStyle w:val="HTMLPreformatted"/>
-        <w:divId w:val="2026667695"/>
+        <w:divId w:val="1625111436"/>
         <w:rPr>
           <w:rStyle w:val="HTMLCode"/>
           <w:color w:val="1A1A1A"/>
@@ -6949,7 +6949,7 @@
     <w:p>
       <w:pPr>
         <w:pStyle w:val="HTMLPreformatted"/>
-        <w:divId w:val="2026667695"/>
+        <w:divId w:val="1625111436"/>
         <w:rPr>
           <w:rStyle w:val="HTMLCode"/>
           <w:color w:val="1A1A1A"/>
@@ -6973,7 +6973,7 @@
     <w:p>
       <w:pPr>
         <w:pStyle w:val="HTMLPreformatted"/>
-        <w:divId w:val="2026667695"/>
+        <w:divId w:val="1625111436"/>
         <w:rPr>
           <w:rStyle w:val="HTMLCode"/>
           <w:color w:val="1A1A1A"/>
@@ -6990,7 +6990,7 @@
     <w:p>
       <w:pPr>
         <w:pStyle w:val="HTMLPreformatted"/>
-        <w:divId w:val="2026667695"/>
+        <w:divId w:val="1625111436"/>
         <w:rPr>
           <w:rStyle w:val="HTMLCode"/>
           <w:color w:val="1A1A1A"/>
@@ -7007,7 +7007,7 @@
     <w:p>
       <w:pPr>
         <w:pStyle w:val="HTMLPreformatted"/>
-        <w:divId w:val="2026667695"/>
+        <w:divId w:val="1625111436"/>
         <w:rPr>
           <w:rStyle w:val="HTMLCode"/>
           <w:color w:val="1A1A1A"/>
@@ -7017,7 +7017,7 @@
     <w:p>
       <w:pPr>
         <w:pStyle w:val="HTMLPreformatted"/>
-        <w:divId w:val="2026667695"/>
+        <w:divId w:val="1625111436"/>
         <w:rPr>
           <w:rStyle w:val="HTMLCode"/>
           <w:color w:val="1A1A1A"/>
@@ -7034,7 +7034,7 @@
     <w:p>
       <w:pPr>
         <w:pStyle w:val="HTMLPreformatted"/>
-        <w:divId w:val="2026667695"/>
+        <w:divId w:val="1625111436"/>
         <w:rPr>
           <w:rStyle w:val="HTMLCode"/>
           <w:color w:val="1A1A1A"/>
@@ -7051,7 +7051,7 @@
     <w:p>
       <w:pPr>
         <w:pStyle w:val="HTMLPreformatted"/>
-        <w:divId w:val="2026667695"/>
+        <w:divId w:val="1625111436"/>
         <w:rPr>
           <w:rStyle w:val="HTMLCode"/>
           <w:color w:val="1A1A1A"/>
@@ -7068,7 +7068,7 @@
     <w:p>
       <w:pPr>
         <w:pStyle w:val="HTMLPreformatted"/>
-        <w:divId w:val="2026667695"/>
+        <w:divId w:val="1625111436"/>
         <w:rPr>
           <w:rStyle w:val="HTMLCode"/>
           <w:color w:val="1A1A1A"/>
@@ -7085,7 +7085,7 @@
     <w:p>
       <w:pPr>
         <w:pStyle w:val="HTMLPreformatted"/>
-        <w:divId w:val="2026667695"/>
+        <w:divId w:val="1625111436"/>
         <w:rPr>
           <w:rStyle w:val="HTMLCode"/>
           <w:color w:val="1A1A1A"/>
@@ -7102,7 +7102,7 @@
     <w:p>
       <w:pPr>
         <w:pStyle w:val="HTMLPreformatted"/>
-        <w:divId w:val="2026667695"/>
+        <w:divId w:val="1625111436"/>
         <w:rPr>
           <w:rStyle w:val="HTMLCode"/>
           <w:color w:val="1A1A1A"/>
@@ -7119,7 +7119,7 @@
     <w:p>
       <w:pPr>
         <w:pStyle w:val="HTMLPreformatted"/>
-        <w:divId w:val="2026667695"/>
+        <w:divId w:val="1625111436"/>
         <w:rPr>
           <w:rStyle w:val="HTMLCode"/>
           <w:color w:val="1A1A1A"/>
@@ -7136,7 +7136,7 @@
     <w:p>
       <w:pPr>
         <w:pStyle w:val="HTMLPreformatted"/>
-        <w:divId w:val="2026667695"/>
+        <w:divId w:val="1625111436"/>
         <w:rPr>
           <w:rStyle w:val="HTMLCode"/>
           <w:color w:val="1A1A1A"/>
@@ -7153,7 +7153,7 @@
     <w:p>
       <w:pPr>
         <w:pStyle w:val="HTMLPreformatted"/>
-        <w:divId w:val="2026667695"/>
+        <w:divId w:val="1625111436"/>
         <w:rPr>
           <w:color w:val="1A1A1A"/>
         </w:rPr>
@@ -7169,7 +7169,7 @@
     <w:p>
       <w:pPr>
         <w:pStyle w:val="Heading3"/>
-        <w:divId w:val="2026667695"/>
+        <w:divId w:val="1625111436"/>
         <w:rPr>
           <w:rFonts w:ascii="Calibri" w:eastAsia="Times New Roman" w:hAnsi="Calibri" w:cs="Calibri"/>
         </w:rPr>
@@ -7196,7 +7196,7 @@
     <w:p>
       <w:pPr>
         <w:pStyle w:val="HTMLPreformatted"/>
-        <w:divId w:val="2026667695"/>
+        <w:divId w:val="1625111436"/>
         <w:rPr>
           <w:rStyle w:val="HTMLCode"/>
           <w:color w:val="1A1A1A"/>
@@ -7213,7 +7213,7 @@
     <w:p>
       <w:pPr>
         <w:pStyle w:val="HTMLPreformatted"/>
-        <w:divId w:val="2026667695"/>
+        <w:divId w:val="1625111436"/>
         <w:rPr>
           <w:rStyle w:val="HTMLCode"/>
           <w:color w:val="1A1A1A"/>
@@ -7230,7 +7230,7 @@
     <w:p>
       <w:pPr>
         <w:pStyle w:val="HTMLPreformatted"/>
-        <w:divId w:val="2026667695"/>
+        <w:divId w:val="1625111436"/>
         <w:rPr>
           <w:rStyle w:val="HTMLCode"/>
           <w:color w:val="1A1A1A"/>
@@ -7247,7 +7247,7 @@
     <w:p>
       <w:pPr>
         <w:pStyle w:val="HTMLPreformatted"/>
-        <w:divId w:val="2026667695"/>
+        <w:divId w:val="1625111436"/>
         <w:rPr>
           <w:rStyle w:val="HTMLCode"/>
           <w:color w:val="1A1A1A"/>
@@ -7264,7 +7264,7 @@
     <w:p>
       <w:pPr>
         <w:pStyle w:val="HTMLPreformatted"/>
-        <w:divId w:val="2026667695"/>
+        <w:divId w:val="1625111436"/>
         <w:rPr>
           <w:rStyle w:val="HTMLCode"/>
           <w:color w:val="1A1A1A"/>
@@ -7281,7 +7281,7 @@
     <w:p>
       <w:pPr>
         <w:pStyle w:val="HTMLPreformatted"/>
-        <w:divId w:val="2026667695"/>
+        <w:divId w:val="1625111436"/>
         <w:rPr>
           <w:rStyle w:val="HTMLCode"/>
           <w:color w:val="1A1A1A"/>
@@ -7298,7 +7298,7 @@
     <w:p>
       <w:pPr>
         <w:pStyle w:val="HTMLPreformatted"/>
-        <w:divId w:val="2026667695"/>
+        <w:divId w:val="1625111436"/>
         <w:rPr>
           <w:rStyle w:val="HTMLCode"/>
           <w:color w:val="1A1A1A"/>
@@ -7315,7 +7315,7 @@
     <w:p>
       <w:pPr>
         <w:pStyle w:val="HTMLPreformatted"/>
-        <w:divId w:val="2026667695"/>
+        <w:divId w:val="1625111436"/>
         <w:rPr>
           <w:color w:val="1A1A1A"/>
         </w:rPr>
@@ -7331,7 +7331,7 @@
     <w:p>
       <w:pPr>
         <w:pStyle w:val="Heading3"/>
-        <w:divId w:val="2026667695"/>
+        <w:divId w:val="1625111436"/>
         <w:rPr>
           <w:rFonts w:ascii="Calibri" w:eastAsia="Times New Roman" w:hAnsi="Calibri" w:cs="Calibri"/>
         </w:rPr>
@@ -7358,7 +7358,7 @@
     <w:p>
       <w:pPr>
         <w:pStyle w:val="HTMLPreformatted"/>
-        <w:divId w:val="2026667695"/>
+        <w:divId w:val="1625111436"/>
         <w:rPr>
           <w:rStyle w:val="HTMLCode"/>
           <w:color w:val="1A1A1A"/>
@@ -7375,7 +7375,7 @@
     <w:p>
       <w:pPr>
         <w:pStyle w:val="HTMLPreformatted"/>
-        <w:divId w:val="2026667695"/>
+        <w:divId w:val="1625111436"/>
         <w:rPr>
           <w:rStyle w:val="HTMLCode"/>
           <w:color w:val="1A1A1A"/>
@@ -7392,7 +7392,7 @@
     <w:p>
       <w:pPr>
         <w:pStyle w:val="HTMLPreformatted"/>
-        <w:divId w:val="2026667695"/>
+        <w:divId w:val="1625111436"/>
         <w:rPr>
           <w:rStyle w:val="HTMLCode"/>
           <w:color w:val="1A1A1A"/>
@@ -7416,7 +7416,7 @@
     <w:p>
       <w:pPr>
         <w:pStyle w:val="HTMLPreformatted"/>
-        <w:divId w:val="2026667695"/>
+        <w:divId w:val="1625111436"/>
         <w:rPr>
           <w:rStyle w:val="HTMLCode"/>
           <w:color w:val="1A1A1A"/>
@@ -7433,7 +7433,7 @@
     <w:p>
       <w:pPr>
         <w:pStyle w:val="HTMLPreformatted"/>
-        <w:divId w:val="2026667695"/>
+        <w:divId w:val="1625111436"/>
         <w:rPr>
           <w:rStyle w:val="HTMLCode"/>
           <w:color w:val="1A1A1A"/>
@@ -7450,7 +7450,7 @@
     <w:p>
       <w:pPr>
         <w:pStyle w:val="HTMLPreformatted"/>
-        <w:divId w:val="2026667695"/>
+        <w:divId w:val="1625111436"/>
         <w:rPr>
           <w:rStyle w:val="HTMLCode"/>
           <w:color w:val="1A1A1A"/>
@@ -7467,7 +7467,7 @@
     <w:p>
       <w:pPr>
         <w:pStyle w:val="HTMLPreformatted"/>
-        <w:divId w:val="2026667695"/>
+        <w:divId w:val="1625111436"/>
         <w:rPr>
           <w:color w:val="1A1A1A"/>
         </w:rPr>
@@ -7483,7 +7483,7 @@
     <w:p>
       <w:pPr>
         <w:pStyle w:val="Heading3"/>
-        <w:divId w:val="2026667695"/>
+        <w:divId w:val="1625111436"/>
         <w:rPr>
           <w:rFonts w:ascii="Calibri" w:eastAsia="Times New Roman" w:hAnsi="Calibri" w:cs="Calibri"/>
         </w:rPr>
@@ -7510,7 +7510,7 @@
     <w:p>
       <w:pPr>
         <w:pStyle w:val="HTMLPreformatted"/>
-        <w:divId w:val="2026667695"/>
+        <w:divId w:val="1625111436"/>
         <w:rPr>
           <w:rStyle w:val="HTMLCode"/>
           <w:color w:val="1A1A1A"/>
@@ -7527,7 +7527,7 @@
     <w:p>
       <w:pPr>
         <w:pStyle w:val="HTMLPreformatted"/>
-        <w:divId w:val="2026667695"/>
+        <w:divId w:val="1625111436"/>
         <w:rPr>
           <w:rStyle w:val="HTMLCode"/>
           <w:color w:val="1A1A1A"/>
@@ -7537,7 +7537,7 @@
     <w:p>
       <w:pPr>
         <w:pStyle w:val="HTMLPreformatted"/>
-        <w:divId w:val="2026667695"/>
+        <w:divId w:val="1625111436"/>
         <w:rPr>
           <w:rStyle w:val="HTMLCode"/>
           <w:color w:val="1A1A1A"/>
@@ -7554,7 +7554,7 @@
     <w:p>
       <w:pPr>
         <w:pStyle w:val="HTMLPreformatted"/>
-        <w:divId w:val="2026667695"/>
+        <w:divId w:val="1625111436"/>
         <w:rPr>
           <w:rStyle w:val="HTMLCode"/>
           <w:color w:val="1A1A1A"/>
@@ -7571,7 +7571,7 @@
     <w:p>
       <w:pPr>
         <w:pStyle w:val="HTMLPreformatted"/>
-        <w:divId w:val="2026667695"/>
+        <w:divId w:val="1625111436"/>
         <w:rPr>
           <w:rStyle w:val="HTMLCode"/>
           <w:color w:val="1A1A1A"/>
@@ -7588,7 +7588,7 @@
     <w:p>
       <w:pPr>
         <w:pStyle w:val="HTMLPreformatted"/>
-        <w:divId w:val="2026667695"/>
+        <w:divId w:val="1625111436"/>
         <w:rPr>
           <w:rStyle w:val="HTMLCode"/>
           <w:color w:val="1A1A1A"/>
@@ -7605,7 +7605,7 @@
     <w:p>
       <w:pPr>
         <w:pStyle w:val="HTMLPreformatted"/>
-        <w:divId w:val="2026667695"/>
+        <w:divId w:val="1625111436"/>
         <w:rPr>
           <w:rStyle w:val="HTMLCode"/>
           <w:color w:val="1A1A1A"/>
@@ -7622,7 +7622,7 @@
     <w:p>
       <w:pPr>
         <w:pStyle w:val="HTMLPreformatted"/>
-        <w:divId w:val="2026667695"/>
+        <w:divId w:val="1625111436"/>
         <w:rPr>
           <w:rStyle w:val="HTMLCode"/>
           <w:color w:val="1A1A1A"/>
@@ -7646,7 +7646,7 @@
     <w:p>
       <w:pPr>
         <w:pStyle w:val="HTMLPreformatted"/>
-        <w:divId w:val="2026667695"/>
+        <w:divId w:val="1625111436"/>
         <w:rPr>
           <w:rStyle w:val="HTMLCode"/>
           <w:color w:val="1A1A1A"/>
@@ -7663,7 +7663,7 @@
     <w:p>
       <w:pPr>
         <w:pStyle w:val="HTMLPreformatted"/>
-        <w:divId w:val="2026667695"/>
+        <w:divId w:val="1625111436"/>
         <w:rPr>
           <w:rStyle w:val="HTMLCode"/>
           <w:color w:val="1A1A1A"/>
@@ -7673,7 +7673,7 @@
     <w:p>
       <w:pPr>
         <w:pStyle w:val="HTMLPreformatted"/>
-        <w:divId w:val="2026667695"/>
+        <w:divId w:val="1625111436"/>
         <w:rPr>
           <w:rStyle w:val="HTMLCode"/>
           <w:color w:val="1A1A1A"/>
@@ -7690,7 +7690,7 @@
     <w:p>
       <w:pPr>
         <w:pStyle w:val="HTMLPreformatted"/>
-        <w:divId w:val="2026667695"/>
+        <w:divId w:val="1625111436"/>
         <w:rPr>
           <w:rStyle w:val="HTMLCode"/>
           <w:color w:val="1A1A1A"/>
@@ -7707,7 +7707,7 @@
     <w:p>
       <w:pPr>
         <w:pStyle w:val="HTMLPreformatted"/>
-        <w:divId w:val="2026667695"/>
+        <w:divId w:val="1625111436"/>
         <w:rPr>
           <w:rStyle w:val="HTMLCode"/>
           <w:color w:val="1A1A1A"/>
@@ -7724,7 +7724,7 @@
     <w:p>
       <w:pPr>
         <w:pStyle w:val="HTMLPreformatted"/>
-        <w:divId w:val="2026667695"/>
+        <w:divId w:val="1625111436"/>
         <w:rPr>
           <w:rStyle w:val="HTMLCode"/>
           <w:color w:val="1A1A1A"/>
@@ -7741,7 +7741,7 @@
     <w:p>
       <w:pPr>
         <w:pStyle w:val="HTMLPreformatted"/>
-        <w:divId w:val="2026667695"/>
+        <w:divId w:val="1625111436"/>
         <w:rPr>
           <w:color w:val="1A1A1A"/>
         </w:rPr>
@@ -7757,7 +7757,7 @@
     <w:p>
       <w:pPr>
         <w:pStyle w:val="Heading3"/>
-        <w:divId w:val="2026667695"/>
+        <w:divId w:val="1625111436"/>
         <w:rPr>
           <w:rFonts w:ascii="Calibri" w:eastAsia="Times New Roman" w:hAnsi="Calibri" w:cs="Calibri"/>
         </w:rPr>
@@ -7784,7 +7784,7 @@
     <w:p>
       <w:pPr>
         <w:pStyle w:val="HTMLPreformatted"/>
-        <w:divId w:val="2026667695"/>
+        <w:divId w:val="1625111436"/>
         <w:rPr>
           <w:rStyle w:val="HTMLCode"/>
           <w:color w:val="1A1A1A"/>
@@ -7801,7 +7801,7 @@
     <w:p>
       <w:pPr>
         <w:pStyle w:val="HTMLPreformatted"/>
-        <w:divId w:val="2026667695"/>
+        <w:divId w:val="1625111436"/>
         <w:rPr>
           <w:rStyle w:val="HTMLCode"/>
           <w:color w:val="1A1A1A"/>
@@ -7818,7 +7818,7 @@
     <w:p>
       <w:pPr>
         <w:pStyle w:val="HTMLPreformatted"/>
-        <w:divId w:val="2026667695"/>
+        <w:divId w:val="1625111436"/>
         <w:rPr>
           <w:rStyle w:val="HTMLCode"/>
           <w:color w:val="1A1A1A"/>
@@ -7835,7 +7835,7 @@
     <w:p>
       <w:pPr>
         <w:pStyle w:val="HTMLPreformatted"/>
-        <w:divId w:val="2026667695"/>
+        <w:divId w:val="1625111436"/>
         <w:rPr>
           <w:rStyle w:val="HTMLCode"/>
           <w:color w:val="1A1A1A"/>
@@ -7852,7 +7852,7 @@
     <w:p>
       <w:pPr>
         <w:pStyle w:val="HTMLPreformatted"/>
-        <w:divId w:val="2026667695"/>
+        <w:divId w:val="1625111436"/>
         <w:rPr>
           <w:rStyle w:val="HTMLCode"/>
           <w:color w:val="1A1A1A"/>
@@ -7869,7 +7869,7 @@
     <w:p>
       <w:pPr>
         <w:pStyle w:val="HTMLPreformatted"/>
-        <w:divId w:val="2026667695"/>
+        <w:divId w:val="1625111436"/>
         <w:rPr>
           <w:rStyle w:val="HTMLCode"/>
           <w:color w:val="1A1A1A"/>
@@ -7879,7 +7879,7 @@
     <w:p>
       <w:pPr>
         <w:pStyle w:val="HTMLPreformatted"/>
-        <w:divId w:val="2026667695"/>
+        <w:divId w:val="1625111436"/>
         <w:rPr>
           <w:rStyle w:val="HTMLCode"/>
           <w:color w:val="1A1A1A"/>
@@ -7896,7 +7896,7 @@
     <w:p>
       <w:pPr>
         <w:pStyle w:val="HTMLPreformatted"/>
-        <w:divId w:val="2026667695"/>
+        <w:divId w:val="1625111436"/>
         <w:rPr>
           <w:rStyle w:val="HTMLCode"/>
           <w:color w:val="1A1A1A"/>
@@ -7913,7 +7913,7 @@
     <w:p>
       <w:pPr>
         <w:pStyle w:val="HTMLPreformatted"/>
-        <w:divId w:val="2026667695"/>
+        <w:divId w:val="1625111436"/>
         <w:rPr>
           <w:color w:val="1A1A1A"/>
         </w:rPr>
@@ -7929,7 +7929,7 @@
     <w:p>
       <w:pPr>
         <w:pStyle w:val="Heading3"/>
-        <w:divId w:val="2026667695"/>
+        <w:divId w:val="1625111436"/>
         <w:rPr>
           <w:rFonts w:ascii="Calibri" w:eastAsia="Times New Roman" w:hAnsi="Calibri" w:cs="Calibri"/>
         </w:rPr>
@@ -7956,7 +7956,7 @@
     <w:p>
       <w:pPr>
         <w:pStyle w:val="HTMLPreformatted"/>
-        <w:divId w:val="2026667695"/>
+        <w:divId w:val="1625111436"/>
         <w:rPr>
           <w:rStyle w:val="HTMLCode"/>
           <w:color w:val="1A1A1A"/>
@@ -7973,7 +7973,7 @@
     <w:p>
       <w:pPr>
         <w:pStyle w:val="HTMLPreformatted"/>
-        <w:divId w:val="2026667695"/>
+        <w:divId w:val="1625111436"/>
         <w:rPr>
           <w:rStyle w:val="HTMLCode"/>
           <w:color w:val="1A1A1A"/>
@@ -7990,7 +7990,7 @@
     <w:p>
       <w:pPr>
         <w:pStyle w:val="HTMLPreformatted"/>
-        <w:divId w:val="2026667695"/>
+        <w:divId w:val="1625111436"/>
         <w:rPr>
           <w:rStyle w:val="HTMLCode"/>
           <w:color w:val="1A1A1A"/>
@@ -8007,7 +8007,7 @@
     <w:p>
       <w:pPr>
         <w:pStyle w:val="HTMLPreformatted"/>
-        <w:divId w:val="2026667695"/>
+        <w:divId w:val="1625111436"/>
         <w:rPr>
           <w:rStyle w:val="HTMLCode"/>
           <w:color w:val="1A1A1A"/>
@@ -8017,7 +8017,7 @@
     <w:p>
       <w:pPr>
         <w:pStyle w:val="HTMLPreformatted"/>
-        <w:divId w:val="2026667695"/>
+        <w:divId w:val="1625111436"/>
         <w:rPr>
           <w:rStyle w:val="HTMLCode"/>
           <w:color w:val="1A1A1A"/>
@@ -8034,7 +8034,7 @@
     <w:p>
       <w:pPr>
         <w:pStyle w:val="HTMLPreformatted"/>
-        <w:divId w:val="2026667695"/>
+        <w:divId w:val="1625111436"/>
         <w:rPr>
           <w:rStyle w:val="HTMLCode"/>
           <w:color w:val="1A1A1A"/>
@@ -8051,7 +8051,7 @@
     <w:p>
       <w:pPr>
         <w:pStyle w:val="HTMLPreformatted"/>
-        <w:divId w:val="2026667695"/>
+        <w:divId w:val="1625111436"/>
         <w:rPr>
           <w:rStyle w:val="HTMLCode"/>
           <w:color w:val="1A1A1A"/>
@@ -8068,7 +8068,7 @@
     <w:p>
       <w:pPr>
         <w:pStyle w:val="HTMLPreformatted"/>
-        <w:divId w:val="2026667695"/>
+        <w:divId w:val="1625111436"/>
         <w:rPr>
           <w:rStyle w:val="HTMLCode"/>
           <w:color w:val="1A1A1A"/>
@@ -8085,7 +8085,7 @@
     <w:p>
       <w:pPr>
         <w:pStyle w:val="HTMLPreformatted"/>
-        <w:divId w:val="2026667695"/>
+        <w:divId w:val="1625111436"/>
         <w:rPr>
           <w:rStyle w:val="HTMLCode"/>
           <w:color w:val="1A1A1A"/>
@@ -8102,7 +8102,7 @@
     <w:p>
       <w:pPr>
         <w:pStyle w:val="HTMLPreformatted"/>
-        <w:divId w:val="2026667695"/>
+        <w:divId w:val="1625111436"/>
         <w:rPr>
           <w:rStyle w:val="HTMLCode"/>
           <w:color w:val="1A1A1A"/>
@@ -8119,7 +8119,7 @@
     <w:p>
       <w:pPr>
         <w:pStyle w:val="HTMLPreformatted"/>
-        <w:divId w:val="2026667695"/>
+        <w:divId w:val="1625111436"/>
         <w:rPr>
           <w:rStyle w:val="HTMLCode"/>
           <w:color w:val="1A1A1A"/>
@@ -8129,7 +8129,7 @@
     <w:p>
       <w:pPr>
         <w:pStyle w:val="HTMLPreformatted"/>
-        <w:divId w:val="2026667695"/>
+        <w:divId w:val="1625111436"/>
         <w:rPr>
           <w:rStyle w:val="HTMLCode"/>
           <w:color w:val="1A1A1A"/>
@@ -8153,7 +8153,7 @@
     <w:p>
       <w:pPr>
         <w:pStyle w:val="HTMLPreformatted"/>
-        <w:divId w:val="2026667695"/>
+        <w:divId w:val="1625111436"/>
         <w:rPr>
           <w:rStyle w:val="HTMLCode"/>
           <w:color w:val="1A1A1A"/>
@@ -8170,7 +8170,7 @@
     <w:p>
       <w:pPr>
         <w:pStyle w:val="HTMLPreformatted"/>
-        <w:divId w:val="2026667695"/>
+        <w:divId w:val="1625111436"/>
         <w:rPr>
           <w:rStyle w:val="HTMLCode"/>
           <w:color w:val="1A1A1A"/>
@@ -8187,7 +8187,7 @@
     <w:p>
       <w:pPr>
         <w:pStyle w:val="HTMLPreformatted"/>
-        <w:divId w:val="2026667695"/>
+        <w:divId w:val="1625111436"/>
         <w:rPr>
           <w:rStyle w:val="HTMLCode"/>
           <w:color w:val="1A1A1A"/>
@@ -8204,7 +8204,7 @@
     <w:p>
       <w:pPr>
         <w:pStyle w:val="HTMLPreformatted"/>
-        <w:divId w:val="2026667695"/>
+        <w:divId w:val="1625111436"/>
         <w:rPr>
           <w:rStyle w:val="HTMLCode"/>
           <w:color w:val="1A1A1A"/>
@@ -8221,7 +8221,7 @@
     <w:p>
       <w:pPr>
         <w:pStyle w:val="HTMLPreformatted"/>
-        <w:divId w:val="2026667695"/>
+        <w:divId w:val="1625111436"/>
         <w:rPr>
           <w:rStyle w:val="HTMLCode"/>
           <w:color w:val="1A1A1A"/>
@@ -8238,7 +8238,7 @@
     <w:p>
       <w:pPr>
         <w:pStyle w:val="HTMLPreformatted"/>
-        <w:divId w:val="2026667695"/>
+        <w:divId w:val="1625111436"/>
         <w:rPr>
           <w:rStyle w:val="HTMLCode"/>
           <w:color w:val="1A1A1A"/>
@@ -8255,7 +8255,7 @@
     <w:p>
       <w:pPr>
         <w:pStyle w:val="HTMLPreformatted"/>
-        <w:divId w:val="2026667695"/>
+        <w:divId w:val="1625111436"/>
         <w:rPr>
           <w:rStyle w:val="HTMLCode"/>
           <w:color w:val="1A1A1A"/>
@@ -8265,7 +8265,7 @@
     <w:p>
       <w:pPr>
         <w:pStyle w:val="HTMLPreformatted"/>
-        <w:divId w:val="2026667695"/>
+        <w:divId w:val="1625111436"/>
         <w:rPr>
           <w:rStyle w:val="HTMLCode"/>
           <w:color w:val="1A1A1A"/>
@@ -8282,7 +8282,7 @@
     <w:p>
       <w:pPr>
         <w:pStyle w:val="HTMLPreformatted"/>
-        <w:divId w:val="2026667695"/>
+        <w:divId w:val="1625111436"/>
         <w:rPr>
           <w:rStyle w:val="HTMLCode"/>
           <w:color w:val="1A1A1A"/>
@@ -8299,7 +8299,7 @@
     <w:p>
       <w:pPr>
         <w:pStyle w:val="HTMLPreformatted"/>
-        <w:divId w:val="2026667695"/>
+        <w:divId w:val="1625111436"/>
         <w:rPr>
           <w:rStyle w:val="HTMLCode"/>
           <w:color w:val="1A1A1A"/>
@@ -8316,7 +8316,7 @@
     <w:p>
       <w:pPr>
         <w:pStyle w:val="HTMLPreformatted"/>
-        <w:divId w:val="2026667695"/>
+        <w:divId w:val="1625111436"/>
         <w:rPr>
           <w:color w:val="1A1A1A"/>
         </w:rPr>
@@ -8332,7 +8332,7 @@
     <w:p>
       <w:pPr>
         <w:pStyle w:val="Heading3"/>
-        <w:divId w:val="2026667695"/>
+        <w:divId w:val="1625111436"/>
         <w:rPr>
           <w:rFonts w:ascii="Calibri" w:eastAsia="Times New Roman" w:hAnsi="Calibri" w:cs="Calibri"/>
         </w:rPr>
@@ -8359,7 +8359,7 @@
     <w:p>
       <w:pPr>
         <w:pStyle w:val="HTMLPreformatted"/>
-        <w:divId w:val="2026667695"/>
+        <w:divId w:val="1625111436"/>
         <w:rPr>
           <w:rStyle w:val="HTMLCode"/>
           <w:color w:val="1A1A1A"/>
@@ -8383,7 +8383,7 @@
     <w:p>
       <w:pPr>
         <w:pStyle w:val="HTMLPreformatted"/>
-        <w:divId w:val="2026667695"/>
+        <w:divId w:val="1625111436"/>
         <w:rPr>
           <w:rStyle w:val="HTMLCode"/>
           <w:color w:val="1A1A1A"/>
@@ -8400,7 +8400,7 @@
     <w:p>
       <w:pPr>
         <w:pStyle w:val="HTMLPreformatted"/>
-        <w:divId w:val="2026667695"/>
+        <w:divId w:val="1625111436"/>
         <w:rPr>
           <w:rStyle w:val="HTMLCode"/>
           <w:color w:val="1A1A1A"/>
@@ -8417,7 +8417,7 @@
     <w:p>
       <w:pPr>
         <w:pStyle w:val="HTMLPreformatted"/>
-        <w:divId w:val="2026667695"/>
+        <w:divId w:val="1625111436"/>
         <w:rPr>
           <w:rStyle w:val="HTMLCode"/>
           <w:color w:val="1A1A1A"/>
@@ -8434,7 +8434,7 @@
     <w:p>
       <w:pPr>
         <w:pStyle w:val="HTMLPreformatted"/>
-        <w:divId w:val="2026667695"/>
+        <w:divId w:val="1625111436"/>
         <w:rPr>
           <w:rStyle w:val="HTMLCode"/>
           <w:color w:val="1A1A1A"/>
@@ -8451,7 +8451,7 @@
     <w:p>
       <w:pPr>
         <w:pStyle w:val="HTMLPreformatted"/>
-        <w:divId w:val="2026667695"/>
+        <w:divId w:val="1625111436"/>
         <w:rPr>
           <w:rStyle w:val="HTMLCode"/>
           <w:color w:val="1A1A1A"/>
@@ -8468,7 +8468,7 @@
     <w:p>
       <w:pPr>
         <w:pStyle w:val="HTMLPreformatted"/>
-        <w:divId w:val="2026667695"/>
+        <w:divId w:val="1625111436"/>
         <w:rPr>
           <w:rStyle w:val="HTMLCode"/>
           <w:color w:val="1A1A1A"/>
@@ -8485,7 +8485,7 @@
     <w:p>
       <w:pPr>
         <w:pStyle w:val="HTMLPreformatted"/>
-        <w:divId w:val="2026667695"/>
+        <w:divId w:val="1625111436"/>
         <w:rPr>
           <w:rStyle w:val="HTMLCode"/>
           <w:color w:val="1A1A1A"/>
@@ -8502,7 +8502,7 @@
     <w:p>
       <w:pPr>
         <w:pStyle w:val="HTMLPreformatted"/>
-        <w:divId w:val="2026667695"/>
+        <w:divId w:val="1625111436"/>
         <w:rPr>
           <w:rStyle w:val="HTMLCode"/>
           <w:color w:val="1A1A1A"/>
@@ -8519,7 +8519,7 @@
     <w:p>
       <w:pPr>
         <w:pStyle w:val="HTMLPreformatted"/>
-        <w:divId w:val="2026667695"/>
+        <w:divId w:val="1625111436"/>
         <w:rPr>
           <w:rStyle w:val="HTMLCode"/>
           <w:color w:val="1A1A1A"/>
@@ -8536,7 +8536,7 @@
     <w:p>
       <w:pPr>
         <w:pStyle w:val="HTMLPreformatted"/>
-        <w:divId w:val="2026667695"/>
+        <w:divId w:val="1625111436"/>
         <w:rPr>
           <w:rStyle w:val="HTMLCode"/>
           <w:color w:val="1A1A1A"/>
@@ -8553,7 +8553,7 @@
     <w:p>
       <w:pPr>
         <w:pStyle w:val="HTMLPreformatted"/>
-        <w:divId w:val="2026667695"/>
+        <w:divId w:val="1625111436"/>
         <w:rPr>
           <w:rStyle w:val="HTMLCode"/>
           <w:color w:val="1A1A1A"/>
@@ -8570,7 +8570,7 @@
     <w:p>
       <w:pPr>
         <w:pStyle w:val="HTMLPreformatted"/>
-        <w:divId w:val="2026667695"/>
+        <w:divId w:val="1625111436"/>
         <w:rPr>
           <w:rStyle w:val="HTMLCode"/>
           <w:color w:val="1A1A1A"/>
@@ -8594,7 +8594,7 @@
     <w:p>
       <w:pPr>
         <w:pStyle w:val="HTMLPreformatted"/>
-        <w:divId w:val="2026667695"/>
+        <w:divId w:val="1625111436"/>
         <w:rPr>
           <w:rStyle w:val="HTMLCode"/>
           <w:color w:val="1A1A1A"/>
@@ -8611,7 +8611,7 @@
     <w:p>
       <w:pPr>
         <w:pStyle w:val="HTMLPreformatted"/>
-        <w:divId w:val="2026667695"/>
+        <w:divId w:val="1625111436"/>
         <w:rPr>
           <w:rStyle w:val="HTMLCode"/>
           <w:color w:val="1A1A1A"/>
@@ -8628,7 +8628,7 @@
     <w:p>
       <w:pPr>
         <w:pStyle w:val="HTMLPreformatted"/>
-        <w:divId w:val="2026667695"/>
+        <w:divId w:val="1625111436"/>
         <w:rPr>
           <w:rStyle w:val="HTMLCode"/>
           <w:color w:val="1A1A1A"/>
@@ -8645,7 +8645,7 @@
     <w:p>
       <w:pPr>
         <w:pStyle w:val="HTMLPreformatted"/>
-        <w:divId w:val="2026667695"/>
+        <w:divId w:val="1625111436"/>
         <w:rPr>
           <w:rStyle w:val="HTMLCode"/>
           <w:color w:val="1A1A1A"/>
@@ -8662,7 +8662,7 @@
     <w:p>
       <w:pPr>
         <w:pStyle w:val="HTMLPreformatted"/>
-        <w:divId w:val="2026667695"/>
+        <w:divId w:val="1625111436"/>
         <w:rPr>
           <w:rStyle w:val="HTMLCode"/>
           <w:color w:val="1A1A1A"/>
@@ -8679,7 +8679,7 @@
     <w:p>
       <w:pPr>
         <w:pStyle w:val="HTMLPreformatted"/>
-        <w:divId w:val="2026667695"/>
+        <w:divId w:val="1625111436"/>
         <w:rPr>
           <w:color w:val="1A1A1A"/>
         </w:rPr>
@@ -8695,7 +8695,7 @@
     <w:p>
       <w:pPr>
         <w:pStyle w:val="Heading3"/>
-        <w:divId w:val="2026667695"/>
+        <w:divId w:val="1625111436"/>
         <w:rPr>
           <w:rFonts w:ascii="Calibri" w:eastAsia="Times New Roman" w:hAnsi="Calibri" w:cs="Calibri"/>
         </w:rPr>
@@ -8722,7 +8722,7 @@
     <w:p>
       <w:pPr>
         <w:pStyle w:val="HTMLPreformatted"/>
-        <w:divId w:val="2026667695"/>
+        <w:divId w:val="1625111436"/>
         <w:rPr>
           <w:rStyle w:val="HTMLCode"/>
           <w:color w:val="1A1A1A"/>
@@ -8739,7 +8739,7 @@
     <w:p>
       <w:pPr>
         <w:pStyle w:val="HTMLPreformatted"/>
-        <w:divId w:val="2026667695"/>
+        <w:divId w:val="1625111436"/>
         <w:rPr>
           <w:rStyle w:val="HTMLCode"/>
           <w:color w:val="1A1A1A"/>
@@ -8756,7 +8756,7 @@
     <w:p>
       <w:pPr>
         <w:pStyle w:val="HTMLPreformatted"/>
-        <w:divId w:val="2026667695"/>
+        <w:divId w:val="1625111436"/>
         <w:rPr>
           <w:rStyle w:val="HTMLCode"/>
           <w:color w:val="1A1A1A"/>
@@ -8773,7 +8773,7 @@
     <w:p>
       <w:pPr>
         <w:pStyle w:val="HTMLPreformatted"/>
-        <w:divId w:val="2026667695"/>
+        <w:divId w:val="1625111436"/>
         <w:rPr>
           <w:rStyle w:val="HTMLCode"/>
           <w:color w:val="1A1A1A"/>
@@ -8797,7 +8797,7 @@
     <w:p>
       <w:pPr>
         <w:pStyle w:val="HTMLPreformatted"/>
-        <w:divId w:val="2026667695"/>
+        <w:divId w:val="1625111436"/>
         <w:rPr>
           <w:rStyle w:val="HTMLCode"/>
           <w:color w:val="1A1A1A"/>
@@ -8814,7 +8814,7 @@
     <w:p>
       <w:pPr>
         <w:pStyle w:val="HTMLPreformatted"/>
-        <w:divId w:val="2026667695"/>
+        <w:divId w:val="1625111436"/>
         <w:rPr>
           <w:rStyle w:val="HTMLCode"/>
           <w:color w:val="1A1A1A"/>
@@ -8831,7 +8831,7 @@
     <w:p>
       <w:pPr>
         <w:pStyle w:val="HTMLPreformatted"/>
-        <w:divId w:val="2026667695"/>
+        <w:divId w:val="1625111436"/>
         <w:rPr>
           <w:color w:val="1A1A1A"/>
         </w:rPr>
@@ -8847,7 +8847,7 @@
     <w:p>
       <w:pPr>
         <w:pStyle w:val="Heading3"/>
-        <w:divId w:val="2026667695"/>
+        <w:divId w:val="1625111436"/>
         <w:rPr>
           <w:rFonts w:ascii="Calibri" w:eastAsia="Times New Roman" w:hAnsi="Calibri" w:cs="Calibri"/>
         </w:rPr>
@@ -8874,7 +8874,7 @@
     <w:p>
       <w:pPr>
         <w:pStyle w:val="HTMLPreformatted"/>
-        <w:divId w:val="2026667695"/>
+        <w:divId w:val="1625111436"/>
         <w:rPr>
           <w:rStyle w:val="HTMLCode"/>
           <w:color w:val="1A1A1A"/>
@@ -8891,7 +8891,7 @@
     <w:p>
       <w:pPr>
         <w:pStyle w:val="HTMLPreformatted"/>
-        <w:divId w:val="2026667695"/>
+        <w:divId w:val="1625111436"/>
         <w:rPr>
           <w:rStyle w:val="HTMLCode"/>
           <w:color w:val="1A1A1A"/>
@@ -8908,7 +8908,7 @@
     <w:p>
       <w:pPr>
         <w:pStyle w:val="HTMLPreformatted"/>
-        <w:divId w:val="2026667695"/>
+        <w:divId w:val="1625111436"/>
         <w:rPr>
           <w:rStyle w:val="HTMLCode"/>
           <w:color w:val="1A1A1A"/>
@@ -8925,7 +8925,7 @@
     <w:p>
       <w:pPr>
         <w:pStyle w:val="HTMLPreformatted"/>
-        <w:divId w:val="2026667695"/>
+        <w:divId w:val="1625111436"/>
         <w:rPr>
           <w:rStyle w:val="HTMLCode"/>
           <w:color w:val="1A1A1A"/>
@@ -8942,7 +8942,7 @@
     <w:p>
       <w:pPr>
         <w:pStyle w:val="HTMLPreformatted"/>
-        <w:divId w:val="2026667695"/>
+        <w:divId w:val="1625111436"/>
         <w:rPr>
           <w:rStyle w:val="HTMLCode"/>
           <w:color w:val="1A1A1A"/>
@@ -8966,7 +8966,7 @@
     <w:p>
       <w:pPr>
         <w:pStyle w:val="HTMLPreformatted"/>
-        <w:divId w:val="2026667695"/>
+        <w:divId w:val="1625111436"/>
         <w:rPr>
           <w:rStyle w:val="HTMLCode"/>
           <w:color w:val="1A1A1A"/>
@@ -8983,7 +8983,7 @@
     <w:p>
       <w:pPr>
         <w:pStyle w:val="HTMLPreformatted"/>
-        <w:divId w:val="2026667695"/>
+        <w:divId w:val="1625111436"/>
         <w:rPr>
           <w:rStyle w:val="HTMLCode"/>
           <w:color w:val="1A1A1A"/>
@@ -9000,7 +9000,7 @@
     <w:p>
       <w:pPr>
         <w:pStyle w:val="HTMLPreformatted"/>
-        <w:divId w:val="2026667695"/>
+        <w:divId w:val="1625111436"/>
         <w:rPr>
           <w:rStyle w:val="HTMLCode"/>
           <w:color w:val="1A1A1A"/>
@@ -9017,7 +9017,7 @@
     <w:p>
       <w:pPr>
         <w:pStyle w:val="HTMLPreformatted"/>
-        <w:divId w:val="2026667695"/>
+        <w:divId w:val="1625111436"/>
         <w:rPr>
           <w:rStyle w:val="HTMLCode"/>
           <w:color w:val="1A1A1A"/>
@@ -9027,7 +9027,7 @@
     <w:p>
       <w:pPr>
         <w:pStyle w:val="HTMLPreformatted"/>
-        <w:divId w:val="2026667695"/>
+        <w:divId w:val="1625111436"/>
         <w:rPr>
           <w:rStyle w:val="HTMLCode"/>
           <w:color w:val="1A1A1A"/>
@@ -9044,7 +9044,7 @@
     <w:p>
       <w:pPr>
         <w:pStyle w:val="HTMLPreformatted"/>
-        <w:divId w:val="2026667695"/>
+        <w:divId w:val="1625111436"/>
         <w:rPr>
           <w:rStyle w:val="HTMLCode"/>
           <w:color w:val="1A1A1A"/>
@@ -9061,7 +9061,7 @@
     <w:p>
       <w:pPr>
         <w:pStyle w:val="HTMLPreformatted"/>
-        <w:divId w:val="2026667695"/>
+        <w:divId w:val="1625111436"/>
         <w:rPr>
           <w:color w:val="1A1A1A"/>
         </w:rPr>
@@ -9077,7 +9077,7 @@
     <w:p>
       <w:pPr>
         <w:pStyle w:val="Heading3"/>
-        <w:divId w:val="2026667695"/>
+        <w:divId w:val="1625111436"/>
         <w:rPr>
           <w:rFonts w:ascii="Calibri" w:eastAsia="Times New Roman" w:hAnsi="Calibri" w:cs="Calibri"/>
         </w:rPr>
@@ -9092,7 +9092,7 @@
     <w:p>
       <w:pPr>
         <w:pStyle w:val="HTMLPreformatted"/>
-        <w:divId w:val="2026667695"/>
+        <w:divId w:val="1625111436"/>
         <w:rPr>
           <w:rStyle w:val="HTMLCode"/>
           <w:color w:val="1A1A1A"/>
@@ -9109,7 +9109,7 @@
     <w:p>
       <w:pPr>
         <w:pStyle w:val="HTMLPreformatted"/>
-        <w:divId w:val="2026667695"/>
+        <w:divId w:val="1625111436"/>
         <w:rPr>
           <w:rStyle w:val="HTMLCode"/>
           <w:color w:val="1A1A1A"/>
@@ -9126,7 +9126,7 @@
     <w:p>
       <w:pPr>
         <w:pStyle w:val="HTMLPreformatted"/>
-        <w:divId w:val="2026667695"/>
+        <w:divId w:val="1625111436"/>
         <w:rPr>
           <w:rStyle w:val="HTMLCode"/>
           <w:color w:val="1A1A1A"/>
@@ -9143,7 +9143,7 @@
     <w:p>
       <w:pPr>
         <w:pStyle w:val="HTMLPreformatted"/>
-        <w:divId w:val="2026667695"/>
+        <w:divId w:val="1625111436"/>
         <w:rPr>
           <w:rStyle w:val="HTMLCode"/>
           <w:color w:val="1A1A1A"/>
@@ -9160,7 +9160,7 @@
     <w:p>
       <w:pPr>
         <w:pStyle w:val="HTMLPreformatted"/>
-        <w:divId w:val="2026667695"/>
+        <w:divId w:val="1625111436"/>
         <w:rPr>
           <w:color w:val="1A1A1A"/>
         </w:rPr>
@@ -9176,7 +9176,7 @@
     <w:p>
       <w:pPr>
         <w:pStyle w:val="Heading3"/>
-        <w:divId w:val="2026667695"/>
+        <w:divId w:val="1625111436"/>
         <w:rPr>
           <w:rFonts w:ascii="Calibri" w:eastAsia="Times New Roman" w:hAnsi="Calibri" w:cs="Calibri"/>
         </w:rPr>
@@ -9203,7 +9203,7 @@
     <w:p>
       <w:pPr>
         <w:pStyle w:val="HTMLPreformatted"/>
-        <w:divId w:val="2026667695"/>
+        <w:divId w:val="1625111436"/>
         <w:rPr>
           <w:rStyle w:val="HTMLCode"/>
           <w:color w:val="1A1A1A"/>
@@ -9220,7 +9220,7 @@
     <w:p>
       <w:pPr>
         <w:pStyle w:val="HTMLPreformatted"/>
-        <w:divId w:val="2026667695"/>
+        <w:divId w:val="1625111436"/>
         <w:rPr>
           <w:rStyle w:val="HTMLCode"/>
           <w:color w:val="1A1A1A"/>
@@ -9237,7 +9237,7 @@
     <w:p>
       <w:pPr>
         <w:pStyle w:val="HTMLPreformatted"/>
-        <w:divId w:val="2026667695"/>
+        <w:divId w:val="1625111436"/>
         <w:rPr>
           <w:rStyle w:val="HTMLCode"/>
           <w:color w:val="1A1A1A"/>
@@ -9254,7 +9254,7 @@
     <w:p>
       <w:pPr>
         <w:pStyle w:val="HTMLPreformatted"/>
-        <w:divId w:val="2026667695"/>
+        <w:divId w:val="1625111436"/>
         <w:rPr>
           <w:rStyle w:val="HTMLCode"/>
           <w:color w:val="1A1A1A"/>
@@ -9271,7 +9271,7 @@
     <w:p>
       <w:pPr>
         <w:pStyle w:val="HTMLPreformatted"/>
-        <w:divId w:val="2026667695"/>
+        <w:divId w:val="1625111436"/>
         <w:rPr>
           <w:rStyle w:val="HTMLCode"/>
           <w:color w:val="1A1A1A"/>
@@ -9288,7 +9288,7 @@
     <w:p>
       <w:pPr>
         <w:pStyle w:val="HTMLPreformatted"/>
-        <w:divId w:val="2026667695"/>
+        <w:divId w:val="1625111436"/>
         <w:rPr>
           <w:rStyle w:val="HTMLCode"/>
           <w:color w:val="1A1A1A"/>
@@ -9305,7 +9305,7 @@
     <w:p>
       <w:pPr>
         <w:pStyle w:val="HTMLPreformatted"/>
-        <w:divId w:val="2026667695"/>
+        <w:divId w:val="1625111436"/>
         <w:rPr>
           <w:rStyle w:val="HTMLCode"/>
           <w:color w:val="1A1A1A"/>
@@ -9322,7 +9322,7 @@
     <w:p>
       <w:pPr>
         <w:pStyle w:val="HTMLPreformatted"/>
-        <w:divId w:val="2026667695"/>
+        <w:divId w:val="1625111436"/>
         <w:rPr>
           <w:color w:val="1A1A1A"/>
         </w:rPr>
@@ -9338,7 +9338,7 @@
     <w:p>
       <w:pPr>
         <w:pStyle w:val="Heading2"/>
-        <w:divId w:val="2026667695"/>
+        <w:divId w:val="1625111436"/>
         <w:rPr>
           <w:rFonts w:ascii="Calibri" w:eastAsia="Times New Roman" w:hAnsi="Calibri" w:cs="Calibri"/>
         </w:rPr>
@@ -9353,7 +9353,7 @@
     <w:p>
       <w:pPr>
         <w:pStyle w:val="NormalWeb"/>
-        <w:divId w:val="2026667695"/>
+        <w:divId w:val="1625111436"/>
         <w:rPr>
           <w:rFonts w:ascii="Calibri" w:hAnsi="Calibri" w:cs="Calibri"/>
           <w:color w:val="1A1A1A"/>
@@ -9440,7 +9440,7 @@
       </w:tblGrid>
       <w:tr>
         <w:trPr>
-          <w:divId w:val="2026667695"/>
+          <w:divId w:val="1625111436"/>
           <w:tblHeader/>
         </w:trPr>
         <w:tc>
@@ -9575,7 +9575,7 @@
       </w:tr>
       <w:tr>
         <w:trPr>
-          <w:divId w:val="2026667695"/>
+          <w:divId w:val="1625111436"/>
         </w:trPr>
         <w:tc>
           <w:tcPr>
@@ -9694,7 +9694,7 @@
       </w:tr>
       <w:tr>
         <w:trPr>
-          <w:divId w:val="2026667695"/>
+          <w:divId w:val="1625111436"/>
         </w:trPr>
         <w:tc>
           <w:tcPr>
@@ -9813,7 +9813,7 @@
       </w:tr>
       <w:tr>
         <w:trPr>
-          <w:divId w:val="2026667695"/>
+          <w:divId w:val="1625111436"/>
         </w:trPr>
         <w:tc>
           <w:tcPr>
@@ -9932,7 +9932,7 @@
       </w:tr>
       <w:tr>
         <w:trPr>
-          <w:divId w:val="2026667695"/>
+          <w:divId w:val="1625111436"/>
         </w:trPr>
         <w:tc>
           <w:tcPr>
@@ -10051,7 +10051,7 @@
       </w:tr>
       <w:tr>
         <w:trPr>
-          <w:divId w:val="2026667695"/>
+          <w:divId w:val="1625111436"/>
         </w:trPr>
         <w:tc>
           <w:tcPr>
@@ -10170,7 +10170,7 @@
       </w:tr>
       <w:tr>
         <w:trPr>
-          <w:divId w:val="2026667695"/>
+          <w:divId w:val="1625111436"/>
         </w:trPr>
         <w:tc>
           <w:tcPr>
@@ -10289,7 +10289,7 @@
       </w:tr>
       <w:tr>
         <w:trPr>
-          <w:divId w:val="2026667695"/>
+          <w:divId w:val="1625111436"/>
         </w:trPr>
         <w:tc>
           <w:tcPr>
@@ -10408,7 +10408,7 @@
       </w:tr>
       <w:tr>
         <w:trPr>
-          <w:divId w:val="2026667695"/>
+          <w:divId w:val="1625111436"/>
         </w:trPr>
         <w:tc>
           <w:tcPr>
@@ -10527,7 +10527,7 @@
       </w:tr>
       <w:tr>
         <w:trPr>
-          <w:divId w:val="2026667695"/>
+          <w:divId w:val="1625111436"/>
         </w:trPr>
         <w:tc>
           <w:tcPr>
@@ -10646,7 +10646,7 @@
       </w:tr>
       <w:tr>
         <w:trPr>
-          <w:divId w:val="2026667695"/>
+          <w:divId w:val="1625111436"/>
         </w:trPr>
         <w:tc>
           <w:tcPr>
@@ -10765,7 +10765,7 @@
       </w:tr>
       <w:tr>
         <w:trPr>
-          <w:divId w:val="2026667695"/>
+          <w:divId w:val="1625111436"/>
         </w:trPr>
         <w:tc>
           <w:tcPr>
@@ -10884,7 +10884,7 @@
       </w:tr>
       <w:tr>
         <w:trPr>
-          <w:divId w:val="2026667695"/>
+          <w:divId w:val="1625111436"/>
         </w:trPr>
         <w:tc>
           <w:tcPr>
@@ -11003,7 +11003,7 @@
       </w:tr>
       <w:tr>
         <w:trPr>
-          <w:divId w:val="2026667695"/>
+          <w:divId w:val="1625111436"/>
         </w:trPr>
         <w:tc>
           <w:tcPr>
@@ -11122,7 +11122,7 @@
       </w:tr>
       <w:tr>
         <w:trPr>
-          <w:divId w:val="2026667695"/>
+          <w:divId w:val="1625111436"/>
         </w:trPr>
         <w:tc>
           <w:tcPr>
@@ -11241,7 +11241,7 @@
       </w:tr>
       <w:tr>
         <w:trPr>
-          <w:divId w:val="2026667695"/>
+          <w:divId w:val="1625111436"/>
         </w:trPr>
         <w:tc>
           <w:tcPr>
@@ -11360,7 +11360,7 @@
       </w:tr>
       <w:tr>
         <w:trPr>
-          <w:divId w:val="2026667695"/>
+          <w:divId w:val="1625111436"/>
         </w:trPr>
         <w:tc>
           <w:tcPr>
@@ -11481,7 +11481,7 @@
     <w:p>
       <w:pPr>
         <w:pStyle w:val="Heading2"/>
-        <w:divId w:val="2026667695"/>
+        <w:divId w:val="1625111436"/>
         <w:rPr>
           <w:rFonts w:ascii="Calibri" w:eastAsia="Times New Roman" w:hAnsi="Calibri" w:cs="Calibri"/>
         </w:rPr>
@@ -11496,7 +11496,7 @@
     <w:p>
       <w:pPr>
         <w:pStyle w:val="NormalWeb"/>
-        <w:divId w:val="2026667695"/>
+        <w:divId w:val="1625111436"/>
         <w:rPr>
           <w:rFonts w:ascii="Calibri" w:hAnsi="Calibri" w:cs="Calibri"/>
           <w:color w:val="1A1A1A"/>
@@ -11540,7 +11540,7 @@
           <w:numId w:val="10"/>
         </w:numPr>
         <w:spacing w:before="100" w:beforeAutospacing="1" w:after="100" w:afterAutospacing="1"/>
-        <w:divId w:val="2026667695"/>
+        <w:divId w:val="1625111436"/>
         <w:rPr>
           <w:rFonts w:ascii="Calibri" w:eastAsia="Times New Roman" w:hAnsi="Calibri" w:cs="Calibri"/>
           <w:color w:val="1A1A1A"/>
@@ -11575,7 +11575,7 @@
           <w:numId w:val="10"/>
         </w:numPr>
         <w:spacing w:before="100" w:beforeAutospacing="1" w:after="100" w:afterAutospacing="1"/>
-        <w:divId w:val="2026667695"/>
+        <w:divId w:val="1625111436"/>
         <w:rPr>
           <w:rFonts w:ascii="Calibri" w:eastAsia="Times New Roman" w:hAnsi="Calibri" w:cs="Calibri"/>
           <w:color w:val="1A1A1A"/>
@@ -11610,7 +11610,7 @@
           <w:numId w:val="10"/>
         </w:numPr>
         <w:spacing w:before="100" w:beforeAutospacing="1" w:after="100" w:afterAutospacing="1"/>
-        <w:divId w:val="2026667695"/>
+        <w:divId w:val="1625111436"/>
         <w:rPr>
           <w:rFonts w:ascii="Calibri" w:eastAsia="Times New Roman" w:hAnsi="Calibri" w:cs="Calibri"/>
           <w:color w:val="1A1A1A"/>
@@ -11635,7 +11635,7 @@
           <w:numId w:val="10"/>
         </w:numPr>
         <w:spacing w:before="100" w:beforeAutospacing="1" w:after="100" w:afterAutospacing="1"/>
-        <w:divId w:val="2026667695"/>
+        <w:divId w:val="1625111436"/>
         <w:rPr>
           <w:rFonts w:ascii="Calibri" w:eastAsia="Times New Roman" w:hAnsi="Calibri" w:cs="Calibri"/>
           <w:color w:val="1A1A1A"/>
@@ -11660,7 +11660,7 @@
           <w:numId w:val="10"/>
         </w:numPr>
         <w:spacing w:before="100" w:beforeAutospacing="1" w:after="100" w:afterAutospacing="1"/>
-        <w:divId w:val="2026667695"/>
+        <w:divId w:val="1625111436"/>
         <w:rPr>
           <w:rFonts w:ascii="Calibri" w:eastAsia="Times New Roman" w:hAnsi="Calibri" w:cs="Calibri"/>
           <w:color w:val="1A1A1A"/>
@@ -11681,7 +11681,7 @@
     <w:p>
       <w:pPr>
         <w:pStyle w:val="NormalWeb"/>
-        <w:divId w:val="2026667695"/>
+        <w:divId w:val="1625111436"/>
         <w:rPr>
           <w:rFonts w:ascii="Calibri" w:hAnsi="Calibri" w:cs="Calibri"/>
           <w:color w:val="1A1A1A"/>
@@ -11768,7 +11768,7 @@
       </w:tblGrid>
       <w:tr>
         <w:trPr>
-          <w:divId w:val="2026667695"/>
+          <w:divId w:val="1625111436"/>
           <w:tblHeader/>
         </w:trPr>
         <w:tc>
@@ -11903,7 +11903,7 @@
       </w:tr>
       <w:tr>
         <w:trPr>
-          <w:divId w:val="2026667695"/>
+          <w:divId w:val="1625111436"/>
         </w:trPr>
         <w:tc>
           <w:tcPr>
@@ -12022,7 +12022,7 @@
       </w:tr>
       <w:tr>
         <w:trPr>
-          <w:divId w:val="2026667695"/>
+          <w:divId w:val="1625111436"/>
         </w:trPr>
         <w:tc>
           <w:tcPr>
@@ -12096,7 +12096,7 @@
                 <w:sz w:val="20"/>
                 <w:szCs w:val="20"/>
               </w:rPr>
-              <w:t>≈ 2.95 ms</w:t>
+              <w:t>≈ 3.91 ms</w:t>
             </w:r>
           </w:p>
         </w:tc>
@@ -12141,7 +12141,7 @@
       </w:tr>
       <w:tr>
         <w:trPr>
-          <w:divId w:val="2026667695"/>
+          <w:divId w:val="1625111436"/>
         </w:trPr>
         <w:tc>
           <w:tcPr>
@@ -12215,45 +12215,45 @@
                 <w:sz w:val="20"/>
                 <w:szCs w:val="20"/>
               </w:rPr>
-              <w:t>5.667 ms</w:t>
-            </w:r>
-          </w:p>
-        </w:tc>
-        <w:tc>
-          <w:tcPr>
-            <w:tcW w:w="0" w:type="auto"/>
-            <w:tcBorders>
-              <w:top w:val="single" w:sz="6" w:space="0" w:color="8F9BB3"/>
-              <w:left w:val="single" w:sz="6" w:space="0" w:color="8F9BB3"/>
-              <w:bottom w:val="single" w:sz="6" w:space="0" w:color="8F9BB3"/>
-              <w:right w:val="single" w:sz="6" w:space="0" w:color="8F9BB3"/>
-            </w:tcBorders>
-            <w:tcMar>
-              <w:top w:w="80" w:type="dxa"/>
-              <w:left w:w="120" w:type="dxa"/>
-              <w:bottom w:w="80" w:type="dxa"/>
-              <w:right w:w="120" w:type="dxa"/>
-            </w:tcMar>
-            <w:hideMark/>
-          </w:tcPr>
-          <w:p>
-            <w:pPr>
-              <w:spacing w:before="160" w:after="160"/>
-              <w:rPr>
-                <w:rFonts w:ascii="Calibri" w:eastAsia="Times New Roman" w:hAnsi="Calibri" w:cs="Calibri"/>
-                <w:color w:val="1A1A1A"/>
-                <w:sz w:val="20"/>
-                <w:szCs w:val="20"/>
-              </w:rPr>
-            </w:pPr>
-            <w:r>
-              <w:rPr>
-                <w:rFonts w:ascii="Calibri" w:eastAsia="Times New Roman" w:hAnsi="Calibri" w:cs="Calibri"/>
-                <w:color w:val="1A1A1A"/>
-                <w:sz w:val="20"/>
-                <w:szCs w:val="20"/>
-              </w:rPr>
-              <w:t>0.0004 ms</w:t>
+              <w:t>7.000 ms</w:t>
+            </w:r>
+          </w:p>
+        </w:tc>
+        <w:tc>
+          <w:tcPr>
+            <w:tcW w:w="0" w:type="auto"/>
+            <w:tcBorders>
+              <w:top w:val="single" w:sz="6" w:space="0" w:color="8F9BB3"/>
+              <w:left w:val="single" w:sz="6" w:space="0" w:color="8F9BB3"/>
+              <w:bottom w:val="single" w:sz="6" w:space="0" w:color="8F9BB3"/>
+              <w:right w:val="single" w:sz="6" w:space="0" w:color="8F9BB3"/>
+            </w:tcBorders>
+            <w:tcMar>
+              <w:top w:w="80" w:type="dxa"/>
+              <w:left w:w="120" w:type="dxa"/>
+              <w:bottom w:w="80" w:type="dxa"/>
+              <w:right w:w="120" w:type="dxa"/>
+            </w:tcMar>
+            <w:hideMark/>
+          </w:tcPr>
+          <w:p>
+            <w:pPr>
+              <w:spacing w:before="160" w:after="160"/>
+              <w:rPr>
+                <w:rFonts w:ascii="Calibri" w:eastAsia="Times New Roman" w:hAnsi="Calibri" w:cs="Calibri"/>
+                <w:color w:val="1A1A1A"/>
+                <w:sz w:val="20"/>
+                <w:szCs w:val="20"/>
+              </w:rPr>
+            </w:pPr>
+            <w:r>
+              <w:rPr>
+                <w:rFonts w:ascii="Calibri" w:eastAsia="Times New Roman" w:hAnsi="Calibri" w:cs="Calibri"/>
+                <w:color w:val="1A1A1A"/>
+                <w:sz w:val="20"/>
+                <w:szCs w:val="20"/>
+              </w:rPr>
+              <w:t>0.0006 ms</w:t>
             </w:r>
           </w:p>
         </w:tc>
@@ -12262,7 +12262,7 @@
     <w:p>
       <w:pPr>
         <w:pStyle w:val="NormalWeb"/>
-        <w:divId w:val="2026667695"/>
+        <w:divId w:val="1625111436"/>
         <w:rPr>
           <w:rFonts w:ascii="Calibri" w:hAnsi="Calibri" w:cs="Calibri"/>
           <w:color w:val="1A1A1A"/>
@@ -12283,7 +12283,7 @@
     <w:p>
       <w:pPr>
         <w:pStyle w:val="Heading2"/>
-        <w:divId w:val="2026667695"/>
+        <w:divId w:val="1625111436"/>
         <w:rPr>
           <w:rFonts w:ascii="Calibri" w:eastAsia="Times New Roman" w:hAnsi="Calibri" w:cs="Calibri"/>
         </w:rPr>
@@ -12302,7 +12302,7 @@
           <w:numId w:val="11"/>
         </w:numPr>
         <w:spacing w:before="100" w:beforeAutospacing="1" w:after="100" w:afterAutospacing="1"/>
-        <w:divId w:val="2026667695"/>
+        <w:divId w:val="1625111436"/>
         <w:rPr>
           <w:rFonts w:ascii="Calibri" w:eastAsia="Times New Roman" w:hAnsi="Calibri" w:cs="Calibri"/>
           <w:color w:val="1A1A1A"/>
@@ -12337,7 +12337,7 @@
           <w:numId w:val="11"/>
         </w:numPr>
         <w:spacing w:before="100" w:beforeAutospacing="1" w:after="100" w:afterAutospacing="1"/>
-        <w:divId w:val="2026667695"/>
+        <w:divId w:val="1625111436"/>
         <w:rPr>
           <w:rFonts w:ascii="Calibri" w:eastAsia="Times New Roman" w:hAnsi="Calibri" w:cs="Calibri"/>
           <w:color w:val="1A1A1A"/>
@@ -12429,7 +12429,7 @@
           <w:numId w:val="11"/>
         </w:numPr>
         <w:spacing w:before="100" w:beforeAutospacing="1" w:after="100" w:afterAutospacing="1"/>
-        <w:divId w:val="2026667695"/>
+        <w:divId w:val="1625111436"/>
         <w:rPr>
           <w:rFonts w:ascii="Calibri" w:eastAsia="Times New Roman" w:hAnsi="Calibri" w:cs="Calibri"/>
           <w:color w:val="1A1A1A"/>
@@ -12451,7 +12451,7 @@
     <w:p>
       <w:pPr>
         <w:pStyle w:val="HTMLPreformatted"/>
-        <w:divId w:val="2026667695"/>
+        <w:divId w:val="1625111436"/>
         <w:rPr>
           <w:rStyle w:val="HTMLCode"/>
           <w:color w:val="1A1A1A"/>
@@ -12468,7 +12468,7 @@
     <w:p>
       <w:pPr>
         <w:pStyle w:val="HTMLPreformatted"/>
-        <w:divId w:val="2026667695"/>
+        <w:divId w:val="1625111436"/>
         <w:rPr>
           <w:rStyle w:val="HTMLCode"/>
           <w:color w:val="1A1A1A"/>
@@ -12485,7 +12485,7 @@
     <w:p>
       <w:pPr>
         <w:pStyle w:val="HTMLPreformatted"/>
-        <w:divId w:val="2026667695"/>
+        <w:divId w:val="1625111436"/>
         <w:rPr>
           <w:color w:val="1A1A1A"/>
         </w:rPr>
@@ -12505,7 +12505,7 @@
           <w:numId w:val="12"/>
         </w:numPr>
         <w:spacing w:before="100" w:beforeAutospacing="1" w:after="100" w:afterAutospacing="1"/>
-        <w:divId w:val="2026667695"/>
+        <w:divId w:val="1625111436"/>
         <w:rPr>
           <w:rFonts w:ascii="Calibri" w:eastAsia="Times New Roman" w:hAnsi="Calibri" w:cs="Calibri"/>
           <w:color w:val="1A1A1A"/>
@@ -12689,7 +12689,7 @@
     <w:p>
       <w:pPr>
         <w:pStyle w:val="Heading2"/>
-        <w:divId w:val="2026667695"/>
+        <w:divId w:val="1625111436"/>
         <w:rPr>
           <w:rFonts w:ascii="Calibri" w:eastAsia="Times New Roman" w:hAnsi="Calibri" w:cs="Calibri"/>
         </w:rPr>
@@ -12704,7 +12704,7 @@
     <w:p>
       <w:pPr>
         <w:pStyle w:val="NormalWeb"/>
-        <w:divId w:val="2026667695"/>
+        <w:divId w:val="1625111436"/>
         <w:rPr>
           <w:rFonts w:ascii="Calibri" w:hAnsi="Calibri" w:cs="Calibri"/>
           <w:color w:val="1A1A1A"/>
@@ -12739,7 +12739,7 @@
           <w:sz w:val="22"/>
           <w:szCs w:val="22"/>
         </w:rPr>
-        <w:t>5.667 ms</w:t>
+        <w:t>7.000 ms</w:t>
       </w:r>
       <w:r>
         <w:rPr>
@@ -12758,7 +12758,7 @@
           <w:sz w:val="22"/>
           <w:szCs w:val="22"/>
         </w:rPr>
-        <w:t>≈ 2.95 ms</w:t>
+        <w:t>≈ 3.91 ms</w:t>
       </w:r>
       <w:r>
         <w:rPr>
@@ -12767,7 +12767,7 @@
           <w:sz w:val="22"/>
           <w:szCs w:val="22"/>
         </w:rPr>
-        <w:t xml:space="preserve"> — roughly 35× under the 200 ms budget; cache hits are ~5 orders of magnitude faster still. Configuration: the machine above, GCC 3.4.2 at </w:t>
+        <w:t xml:space="preserve"> — roughly 28× under the 200 ms budget; cache hits are ~5 orders of magnitude faster still. Configuration: the machine above, GCC 3.4.2 at </w:t>
       </w:r>
       <w:r>
         <w:rPr>
@@ -12805,7 +12805,7 @@
     <w:p>
       <w:pPr>
         <w:pStyle w:val="NormalWeb"/>
-        <w:divId w:val="2026667695"/>
+        <w:divId w:val="1625111436"/>
         <w:rPr>
           <w:rFonts w:ascii="Calibri" w:hAnsi="Calibri" w:cs="Calibri"/>
           <w:color w:val="1A1A1A"/>
@@ -12842,7 +12842,7 @@
     <w:p>
       <w:pPr>
         <w:pStyle w:val="Heading2"/>
-        <w:divId w:val="2026667695"/>
+        <w:divId w:val="1625111436"/>
         <w:rPr>
           <w:rFonts w:ascii="Calibri" w:eastAsia="Times New Roman" w:hAnsi="Calibri" w:cs="Calibri"/>
         </w:rPr>
@@ -12857,7 +12857,7 @@
     <w:p>
       <w:pPr>
         <w:pStyle w:val="NormalWeb"/>
-        <w:divId w:val="2026667695"/>
+        <w:divId w:val="1625111436"/>
         <w:rPr>
           <w:rFonts w:ascii="Calibri" w:hAnsi="Calibri" w:cs="Calibri"/>
           <w:color w:val="1A1A1A"/>
@@ -12898,7 +12898,7 @@
           <w:numId w:val="13"/>
         </w:numPr>
         <w:spacing w:before="100" w:beforeAutospacing="1" w:after="100" w:afterAutospacing="1"/>
-        <w:divId w:val="2026667695"/>
+        <w:divId w:val="1625111436"/>
         <w:rPr>
           <w:rFonts w:ascii="Calibri" w:eastAsia="Times New Roman" w:hAnsi="Calibri" w:cs="Calibri"/>
           <w:color w:val="1A1A1A"/>
@@ -12961,7 +12961,7 @@
           <w:numId w:val="13"/>
         </w:numPr>
         <w:spacing w:before="100" w:beforeAutospacing="1" w:after="100" w:afterAutospacing="1"/>
-        <w:divId w:val="2026667695"/>
+        <w:divId w:val="1625111436"/>
         <w:rPr>
           <w:rFonts w:ascii="Calibri" w:eastAsia="Times New Roman" w:hAnsi="Calibri" w:cs="Calibri"/>
           <w:color w:val="1A1A1A"/>
@@ -12996,7 +12996,7 @@
           <w:numId w:val="13"/>
         </w:numPr>
         <w:spacing w:before="100" w:beforeAutospacing="1" w:after="100" w:afterAutospacing="1"/>
-        <w:divId w:val="2026667695"/>
+        <w:divId w:val="1625111436"/>
         <w:rPr>
           <w:rFonts w:ascii="Calibri" w:eastAsia="Times New Roman" w:hAnsi="Calibri" w:cs="Calibri"/>
           <w:color w:val="1A1A1A"/>
@@ -13050,7 +13050,7 @@
           <w:numId w:val="13"/>
         </w:numPr>
         <w:spacing w:before="100" w:beforeAutospacing="1" w:after="100" w:afterAutospacing="1"/>
-        <w:divId w:val="2026667695"/>
+        <w:divId w:val="1625111436"/>
         <w:rPr>
           <w:rFonts w:ascii="Calibri" w:eastAsia="Times New Roman" w:hAnsi="Calibri" w:cs="Calibri"/>
           <w:color w:val="1A1A1A"/>
@@ -13084,7 +13084,7 @@
           <w:sz w:val="22"/>
           <w:szCs w:val="22"/>
         </w:rPr>
-        <w:t xml:space="preserve">(per-query averages 0.0–7.7 ms, vs 0.0–6.0 ms before). Dijkstra still scans blocked edges' </w:t>
+        <w:t xml:space="preserve">(per-query averages 0.0–10.0 ms, vs 0.0–8.3 ms before). Dijkstra still scans blocked edges' </w:t>
       </w:r>
       <w:r>
         <w:rPr>
@@ -13110,7 +13110,7 @@
           <w:numId w:val="13"/>
         </w:numPr>
         <w:spacing w:before="100" w:beforeAutospacing="1" w:after="100" w:afterAutospacing="1"/>
-        <w:divId w:val="2026667695"/>
+        <w:divId w:val="1625111436"/>
         <w:rPr>
           <w:rFonts w:ascii="Calibri" w:eastAsia="Times New Roman" w:hAnsi="Calibri" w:cs="Calibri"/>
           <w:color w:val="1A1A1A"/>
@@ -13145,7 +13145,7 @@
           <w:numId w:val="13"/>
         </w:numPr>
         <w:spacing w:before="100" w:beforeAutospacing="1" w:after="100" w:afterAutospacing="1"/>
-        <w:divId w:val="2026667695"/>
+        <w:divId w:val="1625111436"/>
         <w:rPr>
           <w:rFonts w:ascii="Calibri" w:eastAsia="Times New Roman" w:hAnsi="Calibri" w:cs="Calibri"/>
           <w:color w:val="1A1A1A"/>
@@ -13185,7 +13185,7 @@
     <w:p>
       <w:pPr>
         <w:pStyle w:val="Heading2"/>
-        <w:divId w:val="2026667695"/>
+        <w:divId w:val="1625111436"/>
         <w:rPr>
           <w:rFonts w:ascii="Calibri" w:eastAsia="Times New Roman" w:hAnsi="Calibri" w:cs="Calibri"/>
         </w:rPr>
@@ -13215,7 +13215,7 @@
       </w:tblGrid>
       <w:tr>
         <w:trPr>
-          <w:divId w:val="2026667695"/>
+          <w:divId w:val="1625111436"/>
           <w:tblHeader/>
         </w:trPr>
         <w:tc>
@@ -13350,7 +13350,7 @@
       </w:tr>
       <w:tr>
         <w:trPr>
-          <w:divId w:val="2026667695"/>
+          <w:divId w:val="1625111436"/>
         </w:trPr>
         <w:tc>
           <w:tcPr>
@@ -13469,7 +13469,7 @@
       </w:tr>
       <w:tr>
         <w:trPr>
-          <w:divId w:val="2026667695"/>
+          <w:divId w:val="1625111436"/>
         </w:trPr>
         <w:tc>
           <w:tcPr>
@@ -13588,7 +13588,7 @@
       </w:tr>
       <w:tr>
         <w:trPr>
-          <w:divId w:val="2026667695"/>
+          <w:divId w:val="1625111436"/>
         </w:trPr>
         <w:tc>
           <w:tcPr>
@@ -13707,7 +13707,7 @@
       </w:tr>
       <w:tr>
         <w:trPr>
-          <w:divId w:val="2026667695"/>
+          <w:divId w:val="1625111436"/>
         </w:trPr>
         <w:tc>
           <w:tcPr>
@@ -13853,7 +13853,7 @@
       </w:tr>
       <w:tr>
         <w:trPr>
-          <w:divId w:val="2026667695"/>
+          <w:divId w:val="1625111436"/>
         </w:trPr>
         <w:tc>
           <w:tcPr>
@@ -13972,7 +13972,7 @@
       </w:tr>
       <w:tr>
         <w:trPr>
-          <w:divId w:val="2026667695"/>
+          <w:divId w:val="1625111436"/>
         </w:trPr>
         <w:tc>
           <w:tcPr>
@@ -14110,7 +14110,7 @@
       </w:tr>
       <w:tr>
         <w:trPr>
-          <w:divId w:val="2026667695"/>
+          <w:divId w:val="1625111436"/>
         </w:trPr>
         <w:tc>
           <w:tcPr>
@@ -14229,7 +14229,7 @@
       </w:tr>
       <w:tr>
         <w:trPr>
-          <w:divId w:val="2026667695"/>
+          <w:divId w:val="1625111436"/>
         </w:trPr>
         <w:tc>
           <w:tcPr>
@@ -14352,7 +14352,7 @@
     <w:p>
       <w:pPr>
         <w:pStyle w:val="NormalWeb"/>
-        <w:divId w:val="2026667695"/>
+        <w:divId w:val="1625111436"/>
         <w:rPr>
           <w:rFonts w:ascii="Calibri" w:hAnsi="Calibri" w:cs="Calibri"/>
           <w:color w:val="1A1A1A"/>
@@ -14401,7 +14401,7 @@
     <w:p>
       <w:pPr>
         <w:pStyle w:val="Heading2"/>
-        <w:divId w:val="2026667695"/>
+        <w:divId w:val="1625111436"/>
         <w:rPr>
           <w:rFonts w:ascii="Calibri" w:eastAsia="Times New Roman" w:hAnsi="Calibri" w:cs="Calibri"/>
         </w:rPr>
@@ -14416,7 +14416,7 @@
     <w:p>
       <w:pPr>
         <w:pStyle w:val="NormalWeb"/>
-        <w:divId w:val="2026667695"/>
+        <w:divId w:val="1625111436"/>
         <w:rPr>
           <w:rFonts w:ascii="Calibri" w:hAnsi="Calibri" w:cs="Calibri"/>
           <w:color w:val="1A1A1A"/>
@@ -14452,7 +14452,7 @@
       </w:tblGrid>
       <w:tr>
         <w:trPr>
-          <w:divId w:val="2026667695"/>
+          <w:divId w:val="1625111436"/>
           <w:tblHeader/>
         </w:trPr>
         <w:tc>
@@ -14587,7 +14587,7 @@
       </w:tr>
       <w:tr>
         <w:trPr>
-          <w:divId w:val="2026667695"/>
+          <w:divId w:val="1625111436"/>
         </w:trPr>
         <w:tc>
           <w:tcPr>
@@ -14706,7 +14706,7 @@
       </w:tr>
       <w:tr>
         <w:trPr>
-          <w:divId w:val="2026667695"/>
+          <w:divId w:val="1625111436"/>
         </w:trPr>
         <w:tc>
           <w:tcPr>
@@ -14825,7 +14825,7 @@
       </w:tr>
       <w:tr>
         <w:trPr>
-          <w:divId w:val="2026667695"/>
+          <w:divId w:val="1625111436"/>
         </w:trPr>
         <w:tc>
           <w:tcPr>
@@ -14944,7 +14944,7 @@
       </w:tr>
       <w:tr>
         <w:trPr>
-          <w:divId w:val="2026667695"/>
+          <w:divId w:val="1625111436"/>
         </w:trPr>
         <w:tc>
           <w:tcPr>
@@ -15063,7 +15063,7 @@
       </w:tr>
       <w:tr>
         <w:trPr>
-          <w:divId w:val="2026667695"/>
+          <w:divId w:val="1625111436"/>
         </w:trPr>
         <w:tc>
           <w:tcPr>
@@ -15182,7 +15182,7 @@
       </w:tr>
       <w:tr>
         <w:trPr>
-          <w:divId w:val="2026667695"/>
+          <w:divId w:val="1625111436"/>
         </w:trPr>
         <w:tc>
           <w:tcPr>
@@ -15301,7 +15301,7 @@
       </w:tr>
       <w:tr>
         <w:trPr>
-          <w:divId w:val="2026667695"/>
+          <w:divId w:val="1625111436"/>
         </w:trPr>
         <w:tc>
           <w:tcPr>
@@ -15420,7 +15420,7 @@
       </w:tr>
       <w:tr>
         <w:trPr>
-          <w:divId w:val="2026667695"/>
+          <w:divId w:val="1625111436"/>
         </w:trPr>
         <w:tc>
           <w:tcPr>
@@ -15539,7 +15539,7 @@
       </w:tr>
       <w:tr>
         <w:trPr>
-          <w:divId w:val="2026667695"/>
+          <w:divId w:val="1625111436"/>
         </w:trPr>
         <w:tc>
           <w:tcPr>
@@ -15658,7 +15658,7 @@
       </w:tr>
       <w:tr>
         <w:trPr>
-          <w:divId w:val="2026667695"/>
+          <w:divId w:val="1625111436"/>
         </w:trPr>
         <w:tc>
           <w:tcPr>
@@ -15777,7 +15777,7 @@
       </w:tr>
       <w:tr>
         <w:trPr>
-          <w:divId w:val="2026667695"/>
+          <w:divId w:val="1625111436"/>
         </w:trPr>
         <w:tc>
           <w:tcPr>
@@ -15898,7 +15898,7 @@
     <w:p>
       <w:pPr>
         <w:pStyle w:val="NormalWeb"/>
-        <w:divId w:val="2026667695"/>
+        <w:divId w:val="1625111436"/>
         <w:rPr>
           <w:rFonts w:ascii="Calibri" w:hAnsi="Calibri" w:cs="Calibri"/>
           <w:color w:val="1A1A1A"/>
@@ -15919,7 +15919,7 @@
     <w:p>
       <w:pPr>
         <w:pStyle w:val="Heading2"/>
-        <w:divId w:val="2026667695"/>
+        <w:divId w:val="1625111436"/>
         <w:rPr>
           <w:rFonts w:ascii="Calibri" w:eastAsia="Times New Roman" w:hAnsi="Calibri" w:cs="Calibri"/>
         </w:rPr>
@@ -15934,7 +15934,7 @@
     <w:p>
       <w:pPr>
         <w:pStyle w:val="NormalWeb"/>
-        <w:divId w:val="2026667695"/>
+        <w:divId w:val="1625111436"/>
         <w:rPr>
           <w:rFonts w:ascii="Calibri" w:hAnsi="Calibri" w:cs="Calibri"/>
           <w:color w:val="1A1A1A"/>
@@ -15980,7 +15980,7 @@
     <w:p>
       <w:pPr>
         <w:pStyle w:val="NormalWeb"/>
-        <w:divId w:val="2026667695"/>
+        <w:divId w:val="1625111436"/>
         <w:rPr>
           <w:rFonts w:ascii="Calibri" w:hAnsi="Calibri" w:cs="Calibri"/>
           <w:color w:val="1A1A1A"/>
@@ -16001,7 +16001,7 @@
     <w:p>
       <w:pPr>
         <w:pStyle w:val="Heading2"/>
-        <w:divId w:val="2026667695"/>
+        <w:divId w:val="1625111436"/>
         <w:rPr>
           <w:rFonts w:ascii="Calibri" w:eastAsia="Times New Roman" w:hAnsi="Calibri" w:cs="Calibri"/>
         </w:rPr>
@@ -16016,7 +16016,7 @@
     <w:p>
       <w:pPr>
         <w:pStyle w:val="NormalWeb"/>
-        <w:divId w:val="2026667695"/>
+        <w:divId w:val="1625111436"/>
         <w:rPr>
           <w:rFonts w:ascii="Calibri" w:hAnsi="Calibri" w:cs="Calibri"/>
           <w:color w:val="1A1A1A"/>
@@ -16100,7 +16100,7 @@
     <w:p>
       <w:pPr>
         <w:pStyle w:val="Heading2"/>
-        <w:divId w:val="2026667695"/>
+        <w:divId w:val="1625111436"/>
         <w:rPr>
           <w:rFonts w:ascii="Calibri" w:eastAsia="Times New Roman" w:hAnsi="Calibri" w:cs="Calibri"/>
         </w:rPr>
@@ -16119,7 +16119,7 @@
           <w:numId w:val="14"/>
         </w:numPr>
         <w:spacing w:before="100" w:beforeAutospacing="1" w:after="100" w:afterAutospacing="1"/>
-        <w:divId w:val="2026667695"/>
+        <w:divId w:val="1625111436"/>
         <w:rPr>
           <w:rFonts w:ascii="Calibri" w:eastAsia="Times New Roman" w:hAnsi="Calibri" w:cs="Calibri"/>
           <w:color w:val="1A1A1A"/>
@@ -16154,7 +16154,7 @@
           <w:numId w:val="14"/>
         </w:numPr>
         <w:spacing w:before="100" w:beforeAutospacing="1" w:after="100" w:afterAutospacing="1"/>
-        <w:divId w:val="2026667695"/>
+        <w:divId w:val="1625111436"/>
         <w:rPr>
           <w:rFonts w:ascii="Calibri" w:eastAsia="Times New Roman" w:hAnsi="Calibri" w:cs="Calibri"/>
           <w:color w:val="1A1A1A"/>
@@ -16198,7 +16198,7 @@
           <w:numId w:val="14"/>
         </w:numPr>
         <w:spacing w:before="100" w:beforeAutospacing="1" w:after="100" w:afterAutospacing="1"/>
-        <w:divId w:val="2026667695"/>
+        <w:divId w:val="1625111436"/>
         <w:rPr>
           <w:rFonts w:ascii="Calibri" w:eastAsia="Times New Roman" w:hAnsi="Calibri" w:cs="Calibri"/>
           <w:color w:val="1A1A1A"/>
@@ -16238,7 +16238,7 @@
     <w:p>
       <w:pPr>
         <w:pStyle w:val="Heading2"/>
-        <w:divId w:val="2026667695"/>
+        <w:divId w:val="1625111436"/>
         <w:rPr>
           <w:rFonts w:ascii="Calibri" w:eastAsia="Times New Roman" w:hAnsi="Calibri" w:cs="Calibri"/>
         </w:rPr>
@@ -16253,7 +16253,7 @@
     <w:p>
       <w:pPr>
         <w:pStyle w:val="NormalWeb"/>
-        <w:divId w:val="2026667695"/>
+        <w:divId w:val="1625111436"/>
         <w:rPr>
           <w:rFonts w:ascii="Calibri" w:hAnsi="Calibri" w:cs="Calibri"/>
           <w:color w:val="1A1A1A"/>
@@ -16268,7 +16268,7 @@
           <w:sz w:val="22"/>
           <w:szCs w:val="22"/>
         </w:rPr>
-        <w:t>The delivered prototype meets every stated constraint: a HashMap-based adjacency list stores an 8,200-intersection / 21,000-road city in O(V+E) memory; a min-heap with a working decrease-key drives Dijkstra to answer minimum-cost queries in ≈ 3 ms (worst measured 5.7 ms, budget 200 ms); a HashSet guarantees each intersection is processed once even in cyclic networks; dynamic weight updates and road blocking/reopening take effect immediately and invalidate the version-stamped route cache correctly; unreachab</w:t>
+        <w:t>The delivered prototype meets every stated constraint: a HashMap-based adjacency list stores an 8,200-intersection / 21,000-road city in O(V+E) memory; a min-heap with a working decrease-key drives Dijkstra to answer minimum-cost queries in ≈ 4 ms (worst measured 7.0 ms, budget 200 ms); a HashSet guarantees each intersection is processed once even in cyclic networks; dynamic weight updates and road blocking/reopening take effect immediately and invalidate the version-stamped route cache correctly; unreachab</w:t>
       </w:r>
       <w:r>
         <w:rPr>
@@ -16283,7 +16283,7 @@
     <w:p>
       <w:pPr>
         <w:pStyle w:val="Heading2"/>
-        <w:divId w:val="2026667695"/>
+        <w:divId w:val="1625111436"/>
         <w:rPr>
           <w:rFonts w:ascii="Calibri" w:eastAsia="Times New Roman" w:hAnsi="Calibri" w:cs="Calibri"/>
         </w:rPr>
@@ -16302,7 +16302,7 @@
           <w:numId w:val="15"/>
         </w:numPr>
         <w:spacing w:before="100" w:beforeAutospacing="1" w:after="100" w:afterAutospacing="1"/>
-        <w:divId w:val="2026667695"/>
+        <w:divId w:val="1625111436"/>
         <w:rPr>
           <w:rFonts w:ascii="Calibri" w:eastAsia="Times New Roman" w:hAnsi="Calibri" w:cs="Calibri"/>
           <w:color w:val="1A1A1A"/>
@@ -16346,7 +16346,7 @@
           <w:numId w:val="15"/>
         </w:numPr>
         <w:spacing w:before="100" w:beforeAutospacing="1" w:after="100" w:afterAutospacing="1"/>
-        <w:divId w:val="2026667695"/>
+        <w:divId w:val="1625111436"/>
         <w:rPr>
           <w:rFonts w:ascii="Calibri" w:eastAsia="Times New Roman" w:hAnsi="Calibri" w:cs="Calibri"/>
           <w:color w:val="1A1A1A"/>
@@ -16390,7 +16390,7 @@
           <w:numId w:val="15"/>
         </w:numPr>
         <w:spacing w:before="100" w:beforeAutospacing="1" w:after="100" w:afterAutospacing="1"/>
-        <w:divId w:val="2026667695"/>
+        <w:divId w:val="1625111436"/>
         <w:rPr>
           <w:rFonts w:ascii="Calibri" w:eastAsia="Times New Roman" w:hAnsi="Calibri" w:cs="Calibri"/>
           <w:color w:val="1A1A1A"/>
@@ -16434,7 +16434,7 @@
           <w:numId w:val="15"/>
         </w:numPr>
         <w:spacing w:before="100" w:beforeAutospacing="1" w:after="100" w:afterAutospacing="1"/>
-        <w:divId w:val="2026667695"/>
+        <w:divId w:val="1625111436"/>
         <w:rPr>
           <w:rFonts w:ascii="Calibri" w:eastAsia="Times New Roman" w:hAnsi="Calibri" w:cs="Calibri"/>
           <w:color w:val="1A1A1A"/>
@@ -16478,7 +16478,7 @@
           <w:numId w:val="15"/>
         </w:numPr>
         <w:spacing w:before="100" w:beforeAutospacing="1" w:after="100" w:afterAutospacing="1"/>
-        <w:divId w:val="2026667695"/>
+        <w:divId w:val="1625111436"/>
         <w:rPr>
           <w:rFonts w:ascii="Calibri" w:eastAsia="Times New Roman" w:hAnsi="Calibri" w:cs="Calibri"/>
           <w:color w:val="1A1A1A"/>
@@ -16522,7 +16522,7 @@
           <w:numId w:val="15"/>
         </w:numPr>
         <w:spacing w:before="100" w:beforeAutospacing="1" w:after="100" w:afterAutospacing="1"/>
-        <w:divId w:val="2026667695"/>
+        <w:divId w:val="1625111436"/>
         <w:rPr>
           <w:rFonts w:ascii="Calibri" w:eastAsia="Times New Roman" w:hAnsi="Calibri" w:cs="Calibri"/>
           <w:color w:val="1A1A1A"/>
@@ -16577,7 +16577,7 @@
           <w:numId w:val="15"/>
         </w:numPr>
         <w:spacing w:before="100" w:beforeAutospacing="1" w:after="100" w:afterAutospacing="1"/>
-        <w:divId w:val="2026667695"/>
+        <w:divId w:val="1625111436"/>
         <w:rPr>
           <w:rFonts w:ascii="Calibri" w:eastAsia="Times New Roman" w:hAnsi="Calibri" w:cs="Calibri"/>
           <w:color w:val="1A1A1A"/>
@@ -16617,7 +16617,7 @@
     <w:p>
       <w:pPr>
         <w:pStyle w:val="Heading2"/>
-        <w:divId w:val="2026667695"/>
+        <w:divId w:val="1625111436"/>
         <w:rPr>
           <w:rFonts w:ascii="Calibri" w:eastAsia="Times New Roman" w:hAnsi="Calibri" w:cs="Calibri"/>
         </w:rPr>
@@ -16632,7 +16632,7 @@
     <w:p>
       <w:pPr>
         <w:pStyle w:val="NormalWeb"/>
-        <w:divId w:val="2026667695"/>
+        <w:divId w:val="1625111436"/>
         <w:rPr>
           <w:rFonts w:ascii="Calibri" w:hAnsi="Calibri" w:cs="Calibri"/>
           <w:color w:val="1A1A1A"/>
@@ -16683,7 +16683,7 @@
       </w:tblGrid>
       <w:tr>
         <w:trPr>
-          <w:divId w:val="2026667695"/>
+          <w:divId w:val="1625111436"/>
           <w:tblHeader/>
         </w:trPr>
         <w:tc>
@@ -16775,7 +16775,7 @@
       </w:tr>
       <w:tr>
         <w:trPr>
-          <w:divId w:val="2026667695"/>
+          <w:divId w:val="1625111436"/>
         </w:trPr>
         <w:tc>
           <w:tcPr>
@@ -16872,7 +16872,7 @@
       </w:tr>
       <w:tr>
         <w:trPr>
-          <w:divId w:val="2026667695"/>
+          <w:divId w:val="1625111436"/>
         </w:trPr>
         <w:tc>
           <w:tcPr>
@@ -17001,7 +17001,7 @@
       </w:tr>
       <w:tr>
         <w:trPr>
-          <w:divId w:val="2026667695"/>
+          <w:divId w:val="1625111436"/>
         </w:trPr>
         <w:tc>
           <w:tcPr>
@@ -17105,7 +17105,7 @@
       </w:tr>
       <w:tr>
         <w:trPr>
-          <w:divId w:val="2026667695"/>
+          <w:divId w:val="1625111436"/>
         </w:trPr>
         <w:tc>
           <w:tcPr>
@@ -17202,7 +17202,7 @@
       </w:tr>
       <w:tr>
         <w:trPr>
-          <w:divId w:val="2026667695"/>
+          <w:divId w:val="1625111436"/>
         </w:trPr>
         <w:tc>
           <w:tcPr>
@@ -17299,7 +17299,7 @@
       </w:tr>
       <w:tr>
         <w:trPr>
-          <w:divId w:val="2026667695"/>
+          <w:divId w:val="1625111436"/>
         </w:trPr>
         <w:tc>
           <w:tcPr>
@@ -17391,7 +17391,7 @@
     <w:p>
       <w:pPr>
         <w:pStyle w:val="NormalWeb"/>
-        <w:divId w:val="2026667695"/>
+        <w:divId w:val="1625111436"/>
         <w:rPr>
           <w:rFonts w:ascii="Calibri" w:hAnsi="Calibri" w:cs="Calibri"/>
           <w:color w:val="1A1A1A"/>
@@ -17599,9 +17599,9 @@
 <file path=word/numbering.xml><?xml version="1.0" encoding="utf-8"?>
 <w:numbering xmlns:wpc="http://schemas.microsoft.com/office/word/2010/wordprocessingCanvas" xmlns:cx="http://schemas.microsoft.com/office/drawing/2014/chartex" xmlns:cx1="http://schemas.microsoft.com/office/drawing/2015/9/8/chartex" xmlns:cx2="http://schemas.microsoft.com/office/drawing/2015/10/21/chartex" xmlns:cx3="http://schemas.microsoft.com/office/drawing/2016/5/9/chartex" xmlns:cx4="http://schemas.microsoft.com/office/drawing/2016/5/10/chartex" xmlns:cx5="http://schemas.microsoft.com/office/drawing/2016/5/11/chartex" xmlns:cx6="http://schemas.microsoft.com/office/drawing/2016/5/12/chartex" xmlns:cx7="http://schemas.microsoft.com/office/drawing/2016/5/13/chartex" xmlns:cx8="http://schemas.microsoft.com/office/drawing/2016/5/14/chartex" xmlns:mc="http://schemas.openxmlformats.org/markup-compatibility/2006" xmlns:aink="http://schemas.microsoft.com/office/drawing/2016/ink" xmlns:am3d="http://schemas.microsoft.com/office/drawing/2017/model3d" xmlns:o="urn:schemas-microsoft-com:office:office" xmlns:oel="http://schemas.microsoft.com/office/2019/extlst" xmlns:r="http://schemas.openxmlformats.org/officeDocument/2006/relationships" xmlns:m="http://schemas.openxmlformats.org/officeDocument/2006/math" xmlns:v="urn:schemas-microsoft-com:vml" xmlns:wp14="http://schemas.microsoft.com/office/word/2010/wordprocessingDrawing" xmlns:wp="http://schemas.openxmlformats.org/drawingml/2006/wordprocessingDrawing" xmlns:w10="urn:schemas-microsoft-com:office:word" xmlns:w="http://schemas.openxmlformats.org/wordprocessingml/2006/main" xmlns:w14="http://schemas.microsoft.com/office/word/2010/wordml" xmlns:w15="http://schemas.microsoft.com/office/word/2012/wordml" xmlns:w16cex="http://schemas.microsoft.com/office/word/2018/wordml/cex" xmlns:w16cid="http://schemas.microsoft.com/office/word/2016/wordml/cid" xmlns:w16="http://schemas.microsoft.com/office/word/2018/wordml" xmlns:w16du="http://schemas.microsoft.com/office/word/2023/wordml/word16du" xmlns:w16sdtdh="http://schemas.microsoft.com/office/word/2020/wordml/sdtdatahash" xmlns:w16sdtfl="http://schemas.microsoft.com/office/word/2024/wordml/sdtformatlock" xmlns:w16se="http://schemas.microsoft.com/office/word/2015/wordml/symex" xmlns:wpg="http://schemas.microsoft.com/office/word/2010/wordprocessingGroup" xmlns:wpi="http://schemas.microsoft.com/office/word/2010/wordprocessingInk" xmlns:wne="http://schemas.microsoft.com/office/word/2006/wordml" xmlns:wps="http://schemas.microsoft.com/office/word/2010/wordprocessingShape" mc:Ignorable="w14 w15 w16se w16cid w16 w16cex w16sdtdh w16sdtfl w16du wp14">
   <w:abstractNum w:abstractNumId="0" w15:restartNumberingAfterBreak="0">
-    <w:nsid w:val="03E22FA6"/>
+    <w:nsid w:val="11E356A7"/>
     <w:multiLevelType w:val="multilevel"/>
-    <w:tmpl w:val="4ECEC3FA"/>
+    <w:tmpl w:val="1838A1AC"/>
     <w:lvl w:ilvl="0">
       <w:start w:val="1"/>
       <w:numFmt w:val="bullet"/>
@@ -17748,122 +17748,9 @@
     </w:lvl>
   </w:abstractNum>
   <w:abstractNum w:abstractNumId="1" w15:restartNumberingAfterBreak="0">
-    <w:nsid w:val="0C1D73E1"/>
+    <w:nsid w:val="134A32E7"/>
     <w:multiLevelType w:val="multilevel"/>
-    <w:tmpl w:val="ADBC7644"/>
-    <w:lvl w:ilvl="0">
-      <w:start w:val="1"/>
-      <w:numFmt w:val="decimal"/>
-      <w:lvlText w:val="%1."/>
-      <w:lvlJc w:val="left"/>
-      <w:pPr>
-        <w:tabs>
-          <w:tab w:val="num" w:pos="720"/>
-        </w:tabs>
-        <w:ind w:left="720" w:hanging="360"/>
-      </w:pPr>
-    </w:lvl>
-    <w:lvl w:ilvl="1" w:tentative="1">
-      <w:start w:val="1"/>
-      <w:numFmt w:val="decimal"/>
-      <w:lvlText w:val="%2."/>
-      <w:lvlJc w:val="left"/>
-      <w:pPr>
-        <w:tabs>
-          <w:tab w:val="num" w:pos="1440"/>
-        </w:tabs>
-        <w:ind w:left="1440" w:hanging="360"/>
-      </w:pPr>
-    </w:lvl>
-    <w:lvl w:ilvl="2" w:tentative="1">
-      <w:start w:val="1"/>
-      <w:numFmt w:val="decimal"/>
-      <w:lvlText w:val="%3."/>
-      <w:lvlJc w:val="left"/>
-      <w:pPr>
-        <w:tabs>
-          <w:tab w:val="num" w:pos="2160"/>
-        </w:tabs>
-        <w:ind w:left="2160" w:hanging="360"/>
-      </w:pPr>
-    </w:lvl>
-    <w:lvl w:ilvl="3" w:tentative="1">
-      <w:start w:val="1"/>
-      <w:numFmt w:val="decimal"/>
-      <w:lvlText w:val="%4."/>
-      <w:lvlJc w:val="left"/>
-      <w:pPr>
-        <w:tabs>
-          <w:tab w:val="num" w:pos="2880"/>
-        </w:tabs>
-        <w:ind w:left="2880" w:hanging="360"/>
-      </w:pPr>
-    </w:lvl>
-    <w:lvl w:ilvl="4" w:tentative="1">
-      <w:start w:val="1"/>
-      <w:numFmt w:val="decimal"/>
-      <w:lvlText w:val="%5."/>
-      <w:lvlJc w:val="left"/>
-      <w:pPr>
-        <w:tabs>
-          <w:tab w:val="num" w:pos="3600"/>
-        </w:tabs>
-        <w:ind w:left="3600" w:hanging="360"/>
-      </w:pPr>
-    </w:lvl>
-    <w:lvl w:ilvl="5" w:tentative="1">
-      <w:start w:val="1"/>
-      <w:numFmt w:val="decimal"/>
-      <w:lvlText w:val="%6."/>
-      <w:lvlJc w:val="left"/>
-      <w:pPr>
-        <w:tabs>
-          <w:tab w:val="num" w:pos="4320"/>
-        </w:tabs>
-        <w:ind w:left="4320" w:hanging="360"/>
-      </w:pPr>
-    </w:lvl>
-    <w:lvl w:ilvl="6" w:tentative="1">
-      <w:start w:val="1"/>
-      <w:numFmt w:val="decimal"/>
-      <w:lvlText w:val="%7."/>
-      <w:lvlJc w:val="left"/>
-      <w:pPr>
-        <w:tabs>
-          <w:tab w:val="num" w:pos="5040"/>
-        </w:tabs>
-        <w:ind w:left="5040" w:hanging="360"/>
-      </w:pPr>
-    </w:lvl>
-    <w:lvl w:ilvl="7" w:tentative="1">
-      <w:start w:val="1"/>
-      <w:numFmt w:val="decimal"/>
-      <w:lvlText w:val="%8."/>
-      <w:lvlJc w:val="left"/>
-      <w:pPr>
-        <w:tabs>
-          <w:tab w:val="num" w:pos="5760"/>
-        </w:tabs>
-        <w:ind w:left="5760" w:hanging="360"/>
-      </w:pPr>
-    </w:lvl>
-    <w:lvl w:ilvl="8" w:tentative="1">
-      <w:start w:val="1"/>
-      <w:numFmt w:val="decimal"/>
-      <w:lvlText w:val="%9."/>
-      <w:lvlJc w:val="left"/>
-      <w:pPr>
-        <w:tabs>
-          <w:tab w:val="num" w:pos="6480"/>
-        </w:tabs>
-        <w:ind w:left="6480" w:hanging="360"/>
-      </w:pPr>
-    </w:lvl>
-  </w:abstractNum>
-  <w:abstractNum w:abstractNumId="2" w15:restartNumberingAfterBreak="0">
-    <w:nsid w:val="1AC40145"/>
-    <w:multiLevelType w:val="multilevel"/>
-    <w:tmpl w:val="C0EA7F60"/>
+    <w:tmpl w:val="256E69DA"/>
     <w:lvl w:ilvl="0">
       <w:start w:val="1"/>
       <w:numFmt w:val="bullet"/>
@@ -18009,10 +17896,10 @@
       </w:rPr>
     </w:lvl>
   </w:abstractNum>
-  <w:abstractNum w:abstractNumId="3" w15:restartNumberingAfterBreak="0">
-    <w:nsid w:val="2FE3670B"/>
+  <w:abstractNum w:abstractNumId="2" w15:restartNumberingAfterBreak="0">
+    <w:nsid w:val="15906CDF"/>
     <w:multiLevelType w:val="multilevel"/>
-    <w:tmpl w:val="9BCA17A8"/>
+    <w:tmpl w:val="C688C346"/>
     <w:lvl w:ilvl="0">
       <w:start w:val="1"/>
       <w:numFmt w:val="bullet"/>
@@ -18158,10 +18045,236 @@
       </w:rPr>
     </w:lvl>
   </w:abstractNum>
+  <w:abstractNum w:abstractNumId="3" w15:restartNumberingAfterBreak="0">
+    <w:nsid w:val="1A013FCB"/>
+    <w:multiLevelType w:val="multilevel"/>
+    <w:tmpl w:val="10BEB386"/>
+    <w:lvl w:ilvl="0">
+      <w:start w:val="1"/>
+      <w:numFmt w:val="decimal"/>
+      <w:lvlText w:val="%1."/>
+      <w:lvlJc w:val="left"/>
+      <w:pPr>
+        <w:tabs>
+          <w:tab w:val="num" w:pos="720"/>
+        </w:tabs>
+        <w:ind w:left="720" w:hanging="360"/>
+      </w:pPr>
+    </w:lvl>
+    <w:lvl w:ilvl="1" w:tentative="1">
+      <w:start w:val="1"/>
+      <w:numFmt w:val="decimal"/>
+      <w:lvlText w:val="%2."/>
+      <w:lvlJc w:val="left"/>
+      <w:pPr>
+        <w:tabs>
+          <w:tab w:val="num" w:pos="1440"/>
+        </w:tabs>
+        <w:ind w:left="1440" w:hanging="360"/>
+      </w:pPr>
+    </w:lvl>
+    <w:lvl w:ilvl="2" w:tentative="1">
+      <w:start w:val="1"/>
+      <w:numFmt w:val="decimal"/>
+      <w:lvlText w:val="%3."/>
+      <w:lvlJc w:val="left"/>
+      <w:pPr>
+        <w:tabs>
+          <w:tab w:val="num" w:pos="2160"/>
+        </w:tabs>
+        <w:ind w:left="2160" w:hanging="360"/>
+      </w:pPr>
+    </w:lvl>
+    <w:lvl w:ilvl="3" w:tentative="1">
+      <w:start w:val="1"/>
+      <w:numFmt w:val="decimal"/>
+      <w:lvlText w:val="%4."/>
+      <w:lvlJc w:val="left"/>
+      <w:pPr>
+        <w:tabs>
+          <w:tab w:val="num" w:pos="2880"/>
+        </w:tabs>
+        <w:ind w:left="2880" w:hanging="360"/>
+      </w:pPr>
+    </w:lvl>
+    <w:lvl w:ilvl="4" w:tentative="1">
+      <w:start w:val="1"/>
+      <w:numFmt w:val="decimal"/>
+      <w:lvlText w:val="%5."/>
+      <w:lvlJc w:val="left"/>
+      <w:pPr>
+        <w:tabs>
+          <w:tab w:val="num" w:pos="3600"/>
+        </w:tabs>
+        <w:ind w:left="3600" w:hanging="360"/>
+      </w:pPr>
+    </w:lvl>
+    <w:lvl w:ilvl="5" w:tentative="1">
+      <w:start w:val="1"/>
+      <w:numFmt w:val="decimal"/>
+      <w:lvlText w:val="%6."/>
+      <w:lvlJc w:val="left"/>
+      <w:pPr>
+        <w:tabs>
+          <w:tab w:val="num" w:pos="4320"/>
+        </w:tabs>
+        <w:ind w:left="4320" w:hanging="360"/>
+      </w:pPr>
+    </w:lvl>
+    <w:lvl w:ilvl="6" w:tentative="1">
+      <w:start w:val="1"/>
+      <w:numFmt w:val="decimal"/>
+      <w:lvlText w:val="%7."/>
+      <w:lvlJc w:val="left"/>
+      <w:pPr>
+        <w:tabs>
+          <w:tab w:val="num" w:pos="5040"/>
+        </w:tabs>
+        <w:ind w:left="5040" w:hanging="360"/>
+      </w:pPr>
+    </w:lvl>
+    <w:lvl w:ilvl="7" w:tentative="1">
+      <w:start w:val="1"/>
+      <w:numFmt w:val="decimal"/>
+      <w:lvlText w:val="%8."/>
+      <w:lvlJc w:val="left"/>
+      <w:pPr>
+        <w:tabs>
+          <w:tab w:val="num" w:pos="5760"/>
+        </w:tabs>
+        <w:ind w:left="5760" w:hanging="360"/>
+      </w:pPr>
+    </w:lvl>
+    <w:lvl w:ilvl="8" w:tentative="1">
+      <w:start w:val="1"/>
+      <w:numFmt w:val="decimal"/>
+      <w:lvlText w:val="%9."/>
+      <w:lvlJc w:val="left"/>
+      <w:pPr>
+        <w:tabs>
+          <w:tab w:val="num" w:pos="6480"/>
+        </w:tabs>
+        <w:ind w:left="6480" w:hanging="360"/>
+      </w:pPr>
+    </w:lvl>
+  </w:abstractNum>
   <w:abstractNum w:abstractNumId="4" w15:restartNumberingAfterBreak="0">
-    <w:nsid w:val="3AD659D5"/>
+    <w:nsid w:val="1A3F18DD"/>
     <w:multiLevelType w:val="multilevel"/>
-    <w:tmpl w:val="26A601D4"/>
+    <w:tmpl w:val="20360FB0"/>
+    <w:lvl w:ilvl="0">
+      <w:start w:val="1"/>
+      <w:numFmt w:val="decimal"/>
+      <w:lvlText w:val="%1."/>
+      <w:lvlJc w:val="left"/>
+      <w:pPr>
+        <w:tabs>
+          <w:tab w:val="num" w:pos="720"/>
+        </w:tabs>
+        <w:ind w:left="720" w:hanging="360"/>
+      </w:pPr>
+    </w:lvl>
+    <w:lvl w:ilvl="1" w:tentative="1">
+      <w:start w:val="1"/>
+      <w:numFmt w:val="decimal"/>
+      <w:lvlText w:val="%2."/>
+      <w:lvlJc w:val="left"/>
+      <w:pPr>
+        <w:tabs>
+          <w:tab w:val="num" w:pos="1440"/>
+        </w:tabs>
+        <w:ind w:left="1440" w:hanging="360"/>
+      </w:pPr>
+    </w:lvl>
+    <w:lvl w:ilvl="2" w:tentative="1">
+      <w:start w:val="1"/>
+      <w:numFmt w:val="decimal"/>
+      <w:lvlText w:val="%3."/>
+      <w:lvlJc w:val="left"/>
+      <w:pPr>
+        <w:tabs>
+          <w:tab w:val="num" w:pos="2160"/>
+        </w:tabs>
+        <w:ind w:left="2160" w:hanging="360"/>
+      </w:pPr>
+    </w:lvl>
+    <w:lvl w:ilvl="3" w:tentative="1">
+      <w:start w:val="1"/>
+      <w:numFmt w:val="decimal"/>
+      <w:lvlText w:val="%4."/>
+      <w:lvlJc w:val="left"/>
+      <w:pPr>
+        <w:tabs>
+          <w:tab w:val="num" w:pos="2880"/>
+        </w:tabs>
+        <w:ind w:left="2880" w:hanging="360"/>
+      </w:pPr>
+    </w:lvl>
+    <w:lvl w:ilvl="4" w:tentative="1">
+      <w:start w:val="1"/>
+      <w:numFmt w:val="decimal"/>
+      <w:lvlText w:val="%5."/>
+      <w:lvlJc w:val="left"/>
+      <w:pPr>
+        <w:tabs>
+          <w:tab w:val="num" w:pos="3600"/>
+        </w:tabs>
+        <w:ind w:left="3600" w:hanging="360"/>
+      </w:pPr>
+    </w:lvl>
+    <w:lvl w:ilvl="5" w:tentative="1">
+      <w:start w:val="1"/>
+      <w:numFmt w:val="decimal"/>
+      <w:lvlText w:val="%6."/>
+      <w:lvlJc w:val="left"/>
+      <w:pPr>
+        <w:tabs>
+          <w:tab w:val="num" w:pos="4320"/>
+        </w:tabs>
+        <w:ind w:left="4320" w:hanging="360"/>
+      </w:pPr>
+    </w:lvl>
+    <w:lvl w:ilvl="6" w:tentative="1">
+      <w:start w:val="1"/>
+      <w:numFmt w:val="decimal"/>
+      <w:lvlText w:val="%7."/>
+      <w:lvlJc w:val="left"/>
+      <w:pPr>
+        <w:tabs>
+          <w:tab w:val="num" w:pos="5040"/>
+        </w:tabs>
+        <w:ind w:left="5040" w:hanging="360"/>
+      </w:pPr>
+    </w:lvl>
+    <w:lvl w:ilvl="7" w:tentative="1">
+      <w:start w:val="1"/>
+      <w:numFmt w:val="decimal"/>
+      <w:lvlText w:val="%8."/>
+      <w:lvlJc w:val="left"/>
+      <w:pPr>
+        <w:tabs>
+          <w:tab w:val="num" w:pos="5760"/>
+        </w:tabs>
+        <w:ind w:left="5760" w:hanging="360"/>
+      </w:pPr>
+    </w:lvl>
+    <w:lvl w:ilvl="8" w:tentative="1">
+      <w:start w:val="1"/>
+      <w:numFmt w:val="decimal"/>
+      <w:lvlText w:val="%9."/>
+      <w:lvlJc w:val="left"/>
+      <w:pPr>
+        <w:tabs>
+          <w:tab w:val="num" w:pos="6480"/>
+        </w:tabs>
+        <w:ind w:left="6480" w:hanging="360"/>
+      </w:pPr>
+    </w:lvl>
+  </w:abstractNum>
+  <w:abstractNum w:abstractNumId="5" w15:restartNumberingAfterBreak="0">
+    <w:nsid w:val="1BCA5AAC"/>
+    <w:multiLevelType w:val="multilevel"/>
+    <w:tmpl w:val="8C4E2F3E"/>
     <w:lvl w:ilvl="0">
       <w:start w:val="1"/>
       <w:numFmt w:val="bullet"/>
@@ -18307,10 +18420,10 @@
       </w:rPr>
     </w:lvl>
   </w:abstractNum>
-  <w:abstractNum w:abstractNumId="5" w15:restartNumberingAfterBreak="0">
-    <w:nsid w:val="4BFF36DA"/>
+  <w:abstractNum w:abstractNumId="6" w15:restartNumberingAfterBreak="0">
+    <w:nsid w:val="2FEB761D"/>
     <w:multiLevelType w:val="multilevel"/>
-    <w:tmpl w:val="EF0C36FC"/>
+    <w:tmpl w:val="E7C2BC96"/>
     <w:lvl w:ilvl="0">
       <w:start w:val="1"/>
       <w:numFmt w:val="bullet"/>
@@ -18456,10 +18569,10 @@
       </w:rPr>
     </w:lvl>
   </w:abstractNum>
-  <w:abstractNum w:abstractNumId="6" w15:restartNumberingAfterBreak="0">
-    <w:nsid w:val="4ECD4DA2"/>
+  <w:abstractNum w:abstractNumId="7" w15:restartNumberingAfterBreak="0">
+    <w:nsid w:val="40AB1E19"/>
     <w:multiLevelType w:val="multilevel"/>
-    <w:tmpl w:val="2A4E7668"/>
+    <w:tmpl w:val="932466FC"/>
     <w:lvl w:ilvl="0">
       <w:start w:val="1"/>
       <w:numFmt w:val="bullet"/>
@@ -18605,10 +18718,10 @@
       </w:rPr>
     </w:lvl>
   </w:abstractNum>
-  <w:abstractNum w:abstractNumId="7" w15:restartNumberingAfterBreak="0">
-    <w:nsid w:val="58FD3A9B"/>
+  <w:abstractNum w:abstractNumId="8" w15:restartNumberingAfterBreak="0">
+    <w:nsid w:val="47D27B54"/>
     <w:multiLevelType w:val="multilevel"/>
-    <w:tmpl w:val="0A663184"/>
+    <w:tmpl w:val="30F45F78"/>
     <w:lvl w:ilvl="0">
       <w:start w:val="1"/>
       <w:numFmt w:val="bullet"/>
@@ -18754,10 +18867,10 @@
       </w:rPr>
     </w:lvl>
   </w:abstractNum>
-  <w:abstractNum w:abstractNumId="8" w15:restartNumberingAfterBreak="0">
-    <w:nsid w:val="64BD7E72"/>
+  <w:abstractNum w:abstractNumId="9" w15:restartNumberingAfterBreak="0">
+    <w:nsid w:val="590B3FE6"/>
     <w:multiLevelType w:val="multilevel"/>
-    <w:tmpl w:val="47DC528E"/>
+    <w:tmpl w:val="3A66DF38"/>
     <w:lvl w:ilvl="0">
       <w:start w:val="1"/>
       <w:numFmt w:val="bullet"/>
@@ -18903,123 +19016,10 @@
       </w:rPr>
     </w:lvl>
   </w:abstractNum>
-  <w:abstractNum w:abstractNumId="9" w15:restartNumberingAfterBreak="0">
-    <w:nsid w:val="68DF063C"/>
+  <w:abstractNum w:abstractNumId="10" w15:restartNumberingAfterBreak="0">
+    <w:nsid w:val="60822794"/>
     <w:multiLevelType w:val="multilevel"/>
-    <w:tmpl w:val="A8FC6FD4"/>
-    <w:lvl w:ilvl="0">
-      <w:start w:val="1"/>
-      <w:numFmt w:val="decimal"/>
-      <w:lvlText w:val="%1."/>
-      <w:lvlJc w:val="left"/>
-      <w:pPr>
-        <w:tabs>
-          <w:tab w:val="num" w:pos="720"/>
-        </w:tabs>
-        <w:ind w:left="720" w:hanging="360"/>
-      </w:pPr>
-    </w:lvl>
-    <w:lvl w:ilvl="1" w:tentative="1">
-      <w:start w:val="1"/>
-      <w:numFmt w:val="decimal"/>
-      <w:lvlText w:val="%2."/>
-      <w:lvlJc w:val="left"/>
-      <w:pPr>
-        <w:tabs>
-          <w:tab w:val="num" w:pos="1440"/>
-        </w:tabs>
-        <w:ind w:left="1440" w:hanging="360"/>
-      </w:pPr>
-    </w:lvl>
-    <w:lvl w:ilvl="2" w:tentative="1">
-      <w:start w:val="1"/>
-      <w:numFmt w:val="decimal"/>
-      <w:lvlText w:val="%3."/>
-      <w:lvlJc w:val="left"/>
-      <w:pPr>
-        <w:tabs>
-          <w:tab w:val="num" w:pos="2160"/>
-        </w:tabs>
-        <w:ind w:left="2160" w:hanging="360"/>
-      </w:pPr>
-    </w:lvl>
-    <w:lvl w:ilvl="3" w:tentative="1">
-      <w:start w:val="1"/>
-      <w:numFmt w:val="decimal"/>
-      <w:lvlText w:val="%4."/>
-      <w:lvlJc w:val="left"/>
-      <w:pPr>
-        <w:tabs>
-          <w:tab w:val="num" w:pos="2880"/>
-        </w:tabs>
-        <w:ind w:left="2880" w:hanging="360"/>
-      </w:pPr>
-    </w:lvl>
-    <w:lvl w:ilvl="4" w:tentative="1">
-      <w:start w:val="1"/>
-      <w:numFmt w:val="decimal"/>
-      <w:lvlText w:val="%5."/>
-      <w:lvlJc w:val="left"/>
-      <w:pPr>
-        <w:tabs>
-          <w:tab w:val="num" w:pos="3600"/>
-        </w:tabs>
-        <w:ind w:left="3600" w:hanging="360"/>
-      </w:pPr>
-    </w:lvl>
-    <w:lvl w:ilvl="5" w:tentative="1">
-      <w:start w:val="1"/>
-      <w:numFmt w:val="decimal"/>
-      <w:lvlText w:val="%6."/>
-      <w:lvlJc w:val="left"/>
-      <w:pPr>
-        <w:tabs>
-          <w:tab w:val="num" w:pos="4320"/>
-        </w:tabs>
-        <w:ind w:left="4320" w:hanging="360"/>
-      </w:pPr>
-    </w:lvl>
-    <w:lvl w:ilvl="6" w:tentative="1">
-      <w:start w:val="1"/>
-      <w:numFmt w:val="decimal"/>
-      <w:lvlText w:val="%7."/>
-      <w:lvlJc w:val="left"/>
-      <w:pPr>
-        <w:tabs>
-          <w:tab w:val="num" w:pos="5040"/>
-        </w:tabs>
-        <w:ind w:left="5040" w:hanging="360"/>
-      </w:pPr>
-    </w:lvl>
-    <w:lvl w:ilvl="7" w:tentative="1">
-      <w:start w:val="1"/>
-      <w:numFmt w:val="decimal"/>
-      <w:lvlText w:val="%8."/>
-      <w:lvlJc w:val="left"/>
-      <w:pPr>
-        <w:tabs>
-          <w:tab w:val="num" w:pos="5760"/>
-        </w:tabs>
-        <w:ind w:left="5760" w:hanging="360"/>
-      </w:pPr>
-    </w:lvl>
-    <w:lvl w:ilvl="8" w:tentative="1">
-      <w:start w:val="1"/>
-      <w:numFmt w:val="decimal"/>
-      <w:lvlText w:val="%9."/>
-      <w:lvlJc w:val="left"/>
-      <w:pPr>
-        <w:tabs>
-          <w:tab w:val="num" w:pos="6480"/>
-        </w:tabs>
-        <w:ind w:left="6480" w:hanging="360"/>
-      </w:pPr>
-    </w:lvl>
-  </w:abstractNum>
-  <w:abstractNum w:abstractNumId="10" w15:restartNumberingAfterBreak="0">
-    <w:nsid w:val="6E5506A5"/>
-    <w:multiLevelType w:val="multilevel"/>
-    <w:tmpl w:val="44B43EDE"/>
+    <w:tmpl w:val="389AC8BE"/>
     <w:lvl w:ilvl="0">
       <w:start w:val="1"/>
       <w:numFmt w:val="bullet"/>
@@ -19166,9 +19166,9 @@
     </w:lvl>
   </w:abstractNum>
   <w:abstractNum w:abstractNumId="11" w15:restartNumberingAfterBreak="0">
-    <w:nsid w:val="78CE566A"/>
+    <w:nsid w:val="6492088D"/>
     <w:multiLevelType w:val="multilevel"/>
-    <w:tmpl w:val="ADBED4B8"/>
+    <w:tmpl w:val="5DC4B610"/>
     <w:lvl w:ilvl="0">
       <w:start w:val="1"/>
       <w:numFmt w:val="bullet"/>
@@ -19315,9 +19315,9 @@
     </w:lvl>
   </w:abstractNum>
   <w:abstractNum w:abstractNumId="12" w15:restartNumberingAfterBreak="0">
-    <w:nsid w:val="794804FF"/>
+    <w:nsid w:val="68887322"/>
     <w:multiLevelType w:val="multilevel"/>
-    <w:tmpl w:val="7E7CEA9E"/>
+    <w:tmpl w:val="8646C50E"/>
     <w:lvl w:ilvl="0">
       <w:start w:val="1"/>
       <w:numFmt w:val="bullet"/>
@@ -19464,9 +19464,9 @@
     </w:lvl>
   </w:abstractNum>
   <w:abstractNum w:abstractNumId="13" w15:restartNumberingAfterBreak="0">
-    <w:nsid w:val="7AB71966"/>
+    <w:nsid w:val="7561557F"/>
     <w:multiLevelType w:val="multilevel"/>
-    <w:tmpl w:val="4AD8A448"/>
+    <w:tmpl w:val="4A2A934C"/>
     <w:lvl w:ilvl="0">
       <w:start w:val="1"/>
       <w:numFmt w:val="decimal"/>
@@ -19577,9 +19577,9 @@
     </w:lvl>
   </w:abstractNum>
   <w:abstractNum w:abstractNumId="14" w15:restartNumberingAfterBreak="0">
-    <w:nsid w:val="7B071010"/>
+    <w:nsid w:val="79660D83"/>
     <w:multiLevelType w:val="multilevel"/>
-    <w:tmpl w:val="B5EA6372"/>
+    <w:tmpl w:val="F8E4CD9A"/>
     <w:lvl w:ilvl="0">
       <w:start w:val="1"/>
       <w:numFmt w:val="bullet"/>
@@ -19725,50 +19725,50 @@
       </w:rPr>
     </w:lvl>
   </w:abstractNum>
-  <w:num w:numId="1" w16cid:durableId="795441646">
+  <w:num w:numId="1" w16cid:durableId="620263806">
+    <w:abstractNumId w:val="6"/>
+  </w:num>
+  <w:num w:numId="2" w16cid:durableId="274409744">
+    <w:abstractNumId w:val="4"/>
+  </w:num>
+  <w:num w:numId="3" w16cid:durableId="308679324">
+    <w:abstractNumId w:val="14"/>
+  </w:num>
+  <w:num w:numId="4" w16cid:durableId="1740519452">
+    <w:abstractNumId w:val="0"/>
+  </w:num>
+  <w:num w:numId="5" w16cid:durableId="596443250">
     <w:abstractNumId w:val="12"/>
   </w:num>
-  <w:num w:numId="2" w16cid:durableId="1673331430">
+  <w:num w:numId="6" w16cid:durableId="28604981">
+    <w:abstractNumId w:val="8"/>
+  </w:num>
+  <w:num w:numId="7" w16cid:durableId="1734035993">
+    <w:abstractNumId w:val="2"/>
+  </w:num>
+  <w:num w:numId="8" w16cid:durableId="924874598">
     <w:abstractNumId w:val="13"/>
   </w:num>
-  <w:num w:numId="3" w16cid:durableId="338966410">
+  <w:num w:numId="9" w16cid:durableId="1793861422">
     <w:abstractNumId w:val="10"/>
   </w:num>
-  <w:num w:numId="4" w16cid:durableId="1399018531">
-    <w:abstractNumId w:val="8"/>
+  <w:num w:numId="10" w16cid:durableId="5522483">
+    <w:abstractNumId w:val="9"/>
   </w:num>
-  <w:num w:numId="5" w16cid:durableId="202786897">
+  <w:num w:numId="11" w16cid:durableId="846332092">
+    <w:abstractNumId w:val="7"/>
+  </w:num>
+  <w:num w:numId="12" w16cid:durableId="2097094284">
     <w:abstractNumId w:val="11"/>
   </w:num>
-  <w:num w:numId="6" w16cid:durableId="1768043654">
-    <w:abstractNumId w:val="0"/>
-  </w:num>
-  <w:num w:numId="7" w16cid:durableId="1018432561">
-    <w:abstractNumId w:val="4"/>
-  </w:num>
-  <w:num w:numId="8" w16cid:durableId="1368064640">
-    <w:abstractNumId w:val="9"/>
-  </w:num>
-  <w:num w:numId="9" w16cid:durableId="49886394">
-    <w:abstractNumId w:val="2"/>
-  </w:num>
-  <w:num w:numId="10" w16cid:durableId="935283973">
-    <w:abstractNumId w:val="14"/>
-  </w:num>
-  <w:num w:numId="11" w16cid:durableId="1998682338">
-    <w:abstractNumId w:val="3"/>
-  </w:num>
-  <w:num w:numId="12" w16cid:durableId="1759323660">
+  <w:num w:numId="13" w16cid:durableId="1861233157">
     <w:abstractNumId w:val="5"/>
   </w:num>
-  <w:num w:numId="13" w16cid:durableId="2111505451">
-    <w:abstractNumId w:val="6"/>
+  <w:num w:numId="14" w16cid:durableId="811946626">
+    <w:abstractNumId w:val="1"/>
   </w:num>
-  <w:num w:numId="14" w16cid:durableId="1939214627">
-    <w:abstractNumId w:val="7"/>
-  </w:num>
-  <w:num w:numId="15" w16cid:durableId="1140928011">
-    <w:abstractNumId w:val="1"/>
+  <w:num w:numId="15" w16cid:durableId="1534685411">
+    <w:abstractNumId w:val="3"/>
   </w:num>
 </w:numbering>
 </file>
@@ -20419,7 +20419,7 @@
     <w:link w:val="HeaderChar"/>
     <w:uiPriority w:val="99"/>
     <w:unhideWhenUsed/>
-    <w:rsid w:val="00731552"/>
+    <w:rsid w:val="00DC5942"/>
     <w:pPr>
       <w:tabs>
         <w:tab w:val="center" w:pos="4680"/>
@@ -20432,7 +20432,7 @@
     <w:basedOn w:val="DefaultParagraphFont"/>
     <w:link w:val="Header"/>
     <w:uiPriority w:val="99"/>
-    <w:rsid w:val="00731552"/>
+    <w:rsid w:val="00DC5942"/>
     <w:rPr>
       <w:rFonts w:eastAsiaTheme="minorEastAsia"/>
       <w:sz w:val="24"/>
@@ -20445,7 +20445,7 @@
     <w:link w:val="FooterChar"/>
     <w:uiPriority w:val="99"/>
     <w:unhideWhenUsed/>
-    <w:rsid w:val="00731552"/>
+    <w:rsid w:val="00DC5942"/>
     <w:pPr>
       <w:tabs>
         <w:tab w:val="center" w:pos="4680"/>
@@ -20458,7 +20458,7 @@
     <w:basedOn w:val="DefaultParagraphFont"/>
     <w:link w:val="Footer"/>
     <w:uiPriority w:val="99"/>
-    <w:rsid w:val="00731552"/>
+    <w:rsid w:val="00DC5942"/>
     <w:rPr>
       <w:rFonts w:eastAsiaTheme="minorEastAsia"/>
       <w:sz w:val="24"/>
@@ -20471,7 +20471,7 @@
     <w:uiPriority w:val="99"/>
     <w:semiHidden/>
     <w:unhideWhenUsed/>
-    <w:rsid w:val="00731552"/>
+    <w:rsid w:val="00DC5942"/>
   </w:style>
 </w:styles>
 </file>

</xml_diff>

<commit_message>
Adopt submission metadata from the published repository
Carries the student/team identity, submission date and repository URL
that were filled in on GitHub into the local report and rubric
checklist, and regenerates the DOCX/PDF so they match.
</commit_message>
<xml_diff>
--- a/report/CSA0312_Final_Assignment_Report.docx
+++ b/report/CSA0312_Final_Assignment_Report.docx
@@ -5,7 +5,7 @@
     <w:p>
       <w:pPr>
         <w:pStyle w:val="Heading1"/>
-        <w:divId w:val="1625111436"/>
+        <w:divId w:val="1332218290"/>
         <w:rPr>
           <w:rFonts w:ascii="Calibri" w:eastAsia="Times New Roman" w:hAnsi="Calibri" w:cs="Calibri"/>
         </w:rPr>
@@ -20,7 +20,7 @@
     <w:p>
       <w:pPr>
         <w:pStyle w:val="Heading2"/>
-        <w:divId w:val="1625111436"/>
+        <w:divId w:val="1332218290"/>
         <w:rPr>
           <w:rFonts w:ascii="Calibri" w:eastAsia="Times New Roman" w:hAnsi="Calibri" w:cs="Calibri"/>
         </w:rPr>
@@ -44,12 +44,12 @@
         <w:tblLook w:val="04A0" w:firstRow="1" w:lastRow="0" w:firstColumn="1" w:lastColumn="0" w:noHBand="0" w:noVBand="1"/>
       </w:tblPr>
       <w:tblGrid>
-        <w:gridCol w:w="2185"/>
-        <w:gridCol w:w="7159"/>
+        <w:gridCol w:w="2127"/>
+        <w:gridCol w:w="7217"/>
       </w:tblGrid>
       <w:tr>
         <w:trPr>
-          <w:divId w:val="1625111436"/>
+          <w:divId w:val="1332218290"/>
           <w:tblHeader/>
         </w:trPr>
         <w:tc>
@@ -141,7 +141,7 @@
       </w:tr>
       <w:tr>
         <w:trPr>
-          <w:divId w:val="1625111436"/>
+          <w:divId w:val="1332218290"/>
         </w:trPr>
         <w:tc>
           <w:tcPr>
@@ -222,7 +222,7 @@
       </w:tr>
       <w:tr>
         <w:trPr>
-          <w:divId w:val="1625111436"/>
+          <w:divId w:val="1332218290"/>
         </w:trPr>
         <w:tc>
           <w:tcPr>
@@ -303,7 +303,7 @@
       </w:tr>
       <w:tr>
         <w:trPr>
-          <w:divId w:val="1625111436"/>
+          <w:divId w:val="1332218290"/>
         </w:trPr>
         <w:tc>
           <w:tcPr>
@@ -377,14 +377,14 @@
                 <w:sz w:val="20"/>
                 <w:szCs w:val="20"/>
               </w:rPr>
-              <w:t>_________________________</w:t>
+              <w:t>Athisaya U</w:t>
             </w:r>
           </w:p>
         </w:tc>
       </w:tr>
       <w:tr>
         <w:trPr>
-          <w:divId w:val="1625111436"/>
+          <w:divId w:val="1332218290"/>
         </w:trPr>
         <w:tc>
           <w:tcPr>
@@ -458,14 +458,14 @@
                 <w:sz w:val="20"/>
                 <w:szCs w:val="20"/>
               </w:rPr>
-              <w:t>_________________________</w:t>
+              <w:t>192571001</w:t>
             </w:r>
           </w:p>
         </w:tc>
       </w:tr>
       <w:tr>
         <w:trPr>
-          <w:divId w:val="1625111436"/>
+          <w:divId w:val="1332218290"/>
         </w:trPr>
         <w:tc>
           <w:tcPr>
@@ -539,14 +539,14 @@
                 <w:sz w:val="20"/>
                 <w:szCs w:val="20"/>
               </w:rPr>
-              <w:t>_________________________</w:t>
+              <w:t>MONIKA B (192571002); PAPAGARI PUSHPA CHARITHA (192525371)</w:t>
             </w:r>
           </w:p>
         </w:tc>
       </w:tr>
       <w:tr>
         <w:trPr>
-          <w:divId w:val="1625111436"/>
+          <w:divId w:val="1332218290"/>
         </w:trPr>
         <w:tc>
           <w:tcPr>
@@ -620,14 +620,14 @@
                 <w:sz w:val="20"/>
                 <w:szCs w:val="20"/>
               </w:rPr>
-              <w:t>_________________________</w:t>
+              <w:t>31/08/2026</w:t>
             </w:r>
           </w:p>
         </w:tc>
       </w:tr>
       <w:tr>
         <w:trPr>
-          <w:divId w:val="1625111436"/>
+          <w:divId w:val="1332218290"/>
         </w:trPr>
         <w:tc>
           <w:tcPr>
@@ -694,15 +694,17 @@
                 <w:szCs w:val="20"/>
               </w:rPr>
             </w:pPr>
-            <w:r>
-              <w:rPr>
-                <w:rFonts w:ascii="Calibri" w:eastAsia="Times New Roman" w:hAnsi="Calibri" w:cs="Calibri"/>
-                <w:color w:val="1A1A1A"/>
-                <w:sz w:val="20"/>
-                <w:szCs w:val="20"/>
-              </w:rPr>
-              <w:t>[Insert repository link after upload]</w:t>
-            </w:r>
+            <w:hyperlink r:id="rId7" w:history="1">
+              <w:r>
+                <w:rPr>
+                  <w:rStyle w:val="Hyperlink"/>
+                  <w:rFonts w:ascii="Calibri" w:eastAsia="Times New Roman" w:hAnsi="Calibri" w:cs="Calibri"/>
+                  <w:sz w:val="20"/>
+                  <w:szCs w:val="20"/>
+                </w:rPr>
+                <w:t>https://github.com/athisayaprema2007-hue/CSA0312-Intelligent-Evacuation-Routing-System</w:t>
+              </w:r>
+            </w:hyperlink>
           </w:p>
         </w:tc>
       </w:tr>
@@ -710,7 +712,7 @@
     <w:p>
       <w:pPr>
         <w:pStyle w:val="NormalWeb"/>
-        <w:divId w:val="1869485225"/>
+        <w:divId w:val="1084111977"/>
         <w:rPr>
           <w:rFonts w:ascii="Calibri" w:hAnsi="Calibri" w:cs="Calibri"/>
           <w:color w:val="444444"/>
@@ -730,22 +732,22 @@
     </w:p>
     <w:p>
       <w:pPr>
-        <w:divId w:val="1625111436"/>
-        <w:rPr>
-          <w:rFonts w:ascii="Calibri" w:eastAsia="Times New Roman" w:hAnsi="Calibri" w:cs="Calibri"/>
-          <w:color w:val="1A1A1A"/>
-          <w:sz w:val="22"/>
-          <w:szCs w:val="22"/>
-        </w:rPr>
-      </w:pPr>
-      <w:r>
-        <w:rPr>
-          <w:rFonts w:ascii="Calibri" w:eastAsia="Times New Roman" w:hAnsi="Calibri" w:cs="Calibri"/>
-          <w:color w:val="1A1A1A"/>
-          <w:sz w:val="22"/>
-          <w:szCs w:val="22"/>
-        </w:rPr>
-        <w:pict w14:anchorId="06B241C0">
+        <w:divId w:val="1332218290"/>
+        <w:rPr>
+          <w:rFonts w:ascii="Calibri" w:eastAsia="Times New Roman" w:hAnsi="Calibri" w:cs="Calibri"/>
+          <w:color w:val="1A1A1A"/>
+          <w:sz w:val="22"/>
+          <w:szCs w:val="22"/>
+        </w:rPr>
+      </w:pPr>
+      <w:r>
+        <w:rPr>
+          <w:rFonts w:ascii="Calibri" w:eastAsia="Times New Roman" w:hAnsi="Calibri" w:cs="Calibri"/>
+          <w:color w:val="1A1A1A"/>
+          <w:sz w:val="22"/>
+          <w:szCs w:val="22"/>
+        </w:rPr>
+        <w:pict w14:anchorId="1459B709">
           <v:rect id="_x0000_i1025" style="width:0;height:1.5pt" o:hralign="center" o:hrstd="t" o:hr="t" fillcolor="#a0a0a0" stroked="f"/>
         </w:pict>
       </w:r>
@@ -753,7 +755,7 @@
     <w:p>
       <w:pPr>
         <w:pStyle w:val="Heading2"/>
-        <w:divId w:val="1625111436"/>
+        <w:divId w:val="1332218290"/>
         <w:rPr>
           <w:rFonts w:ascii="Calibri" w:eastAsia="Times New Roman" w:hAnsi="Calibri" w:cs="Calibri"/>
         </w:rPr>
@@ -768,7 +770,7 @@
     <w:p>
       <w:pPr>
         <w:pStyle w:val="NormalWeb"/>
-        <w:divId w:val="1625111436"/>
+        <w:divId w:val="1332218290"/>
         <w:rPr>
           <w:rFonts w:ascii="Calibri" w:hAnsi="Calibri" w:cs="Calibri"/>
           <w:color w:val="1A1A1A"/>
@@ -783,7 +785,7 @@
           <w:sz w:val="22"/>
           <w:szCs w:val="22"/>
         </w:rPr>
-        <w:t xml:space="preserve">A smart-city disaster management authority needs a routing service that guides evacuees from disaster locations to evacuation centers. The road network is large (more than 8,000 intersections, more than 20,000 weighted </w:t>
+        <w:t xml:space="preserve">A smart-city disaster management authority needs a routing service that guides evacuees from disaster locations to evacuation centers. The road </w:t>
       </w:r>
       <w:r>
         <w:rPr>
@@ -793,13 +795,13 @@
           <w:szCs w:val="22"/>
         </w:rPr>
         <w:lastRenderedPageBreak/>
-        <w:t>roads) and, during a disaster, it is unstable: congestion and damage change road costs continuously, and some roads become impassable.</w:t>
+        <w:t>network is large (more than 8,000 intersections, more than 20,000 weighted roads) and, during a disaster, it is unstable: congestion and damage change road costs continuously, and some roads become impassable.</w:t>
       </w:r>
     </w:p>
     <w:p>
       <w:pPr>
         <w:pStyle w:val="NormalWeb"/>
-        <w:divId w:val="1625111436"/>
+        <w:divId w:val="1332218290"/>
         <w:rPr>
           <w:rFonts w:ascii="Calibri" w:hAnsi="Calibri" w:cs="Calibri"/>
           <w:color w:val="1A1A1A"/>
@@ -843,7 +845,7 @@
           <w:numId w:val="1"/>
         </w:numPr>
         <w:spacing w:before="100" w:beforeAutospacing="1" w:after="100" w:afterAutospacing="1"/>
-        <w:divId w:val="1625111436"/>
+        <w:divId w:val="1332218290"/>
         <w:rPr>
           <w:rFonts w:ascii="Calibri" w:eastAsia="Times New Roman" w:hAnsi="Calibri" w:cs="Calibri"/>
           <w:color w:val="1A1A1A"/>
@@ -868,7 +870,7 @@
           <w:numId w:val="1"/>
         </w:numPr>
         <w:spacing w:before="100" w:beforeAutospacing="1" w:after="100" w:afterAutospacing="1"/>
-        <w:divId w:val="1625111436"/>
+        <w:divId w:val="1332218290"/>
         <w:rPr>
           <w:rFonts w:ascii="Calibri" w:eastAsia="Times New Roman" w:hAnsi="Calibri" w:cs="Calibri"/>
           <w:color w:val="1A1A1A"/>
@@ -912,7 +914,7 @@
           <w:numId w:val="1"/>
         </w:numPr>
         <w:spacing w:before="100" w:beforeAutospacing="1" w:after="100" w:afterAutospacing="1"/>
-        <w:divId w:val="1625111436"/>
+        <w:divId w:val="1332218290"/>
         <w:rPr>
           <w:rFonts w:ascii="Calibri" w:eastAsia="Times New Roman" w:hAnsi="Calibri" w:cs="Calibri"/>
           <w:color w:val="1A1A1A"/>
@@ -937,7 +939,7 @@
           <w:numId w:val="1"/>
         </w:numPr>
         <w:spacing w:before="100" w:beforeAutospacing="1" w:after="100" w:afterAutospacing="1"/>
-        <w:divId w:val="1625111436"/>
+        <w:divId w:val="1332218290"/>
         <w:rPr>
           <w:rFonts w:ascii="Calibri" w:eastAsia="Times New Roman" w:hAnsi="Calibri" w:cs="Calibri"/>
           <w:color w:val="1A1A1A"/>
@@ -981,7 +983,7 @@
           <w:numId w:val="1"/>
         </w:numPr>
         <w:spacing w:before="100" w:beforeAutospacing="1" w:after="100" w:afterAutospacing="1"/>
-        <w:divId w:val="1625111436"/>
+        <w:divId w:val="1332218290"/>
         <w:rPr>
           <w:rFonts w:ascii="Calibri" w:eastAsia="Times New Roman" w:hAnsi="Calibri" w:cs="Calibri"/>
           <w:color w:val="1A1A1A"/>
@@ -1006,7 +1008,7 @@
           <w:numId w:val="1"/>
         </w:numPr>
         <w:spacing w:before="100" w:beforeAutospacing="1" w:after="100" w:afterAutospacing="1"/>
-        <w:divId w:val="1625111436"/>
+        <w:divId w:val="1332218290"/>
         <w:rPr>
           <w:rFonts w:ascii="Calibri" w:eastAsia="Times New Roman" w:hAnsi="Calibri" w:cs="Calibri"/>
           <w:color w:val="1A1A1A"/>
@@ -1027,7 +1029,7 @@
     <w:p>
       <w:pPr>
         <w:pStyle w:val="Heading2"/>
-        <w:divId w:val="1625111436"/>
+        <w:divId w:val="1332218290"/>
         <w:rPr>
           <w:rFonts w:ascii="Calibri" w:eastAsia="Times New Roman" w:hAnsi="Calibri" w:cs="Calibri"/>
         </w:rPr>
@@ -1042,7 +1044,7 @@
     <w:p>
       <w:pPr>
         <w:pStyle w:val="NormalWeb"/>
-        <w:divId w:val="1625111436"/>
+        <w:divId w:val="1332218290"/>
         <w:rPr>
           <w:rFonts w:ascii="Calibri" w:hAnsi="Calibri" w:cs="Calibri"/>
           <w:color w:val="1A1A1A"/>
@@ -1067,7 +1069,7 @@
           <w:numId w:val="2"/>
         </w:numPr>
         <w:spacing w:before="100" w:beforeAutospacing="1" w:after="100" w:afterAutospacing="1"/>
-        <w:divId w:val="1625111436"/>
+        <w:divId w:val="1332218290"/>
         <w:rPr>
           <w:rFonts w:ascii="Calibri" w:eastAsia="Times New Roman" w:hAnsi="Calibri" w:cs="Calibri"/>
           <w:color w:val="1A1A1A"/>
@@ -1092,7 +1094,7 @@
           <w:numId w:val="2"/>
         </w:numPr>
         <w:spacing w:before="100" w:beforeAutospacing="1" w:after="100" w:afterAutospacing="1"/>
-        <w:divId w:val="1625111436"/>
+        <w:divId w:val="1332218290"/>
         <w:rPr>
           <w:rFonts w:ascii="Calibri" w:eastAsia="Times New Roman" w:hAnsi="Calibri" w:cs="Calibri"/>
           <w:color w:val="1A1A1A"/>
@@ -1117,7 +1119,7 @@
           <w:numId w:val="2"/>
         </w:numPr>
         <w:spacing w:before="100" w:beforeAutospacing="1" w:after="100" w:afterAutospacing="1"/>
-        <w:divId w:val="1625111436"/>
+        <w:divId w:val="1332218290"/>
         <w:rPr>
           <w:rFonts w:ascii="Calibri" w:eastAsia="Times New Roman" w:hAnsi="Calibri" w:cs="Calibri"/>
           <w:color w:val="1A1A1A"/>
@@ -1142,7 +1144,7 @@
           <w:numId w:val="2"/>
         </w:numPr>
         <w:spacing w:before="100" w:beforeAutospacing="1" w:after="100" w:afterAutospacing="1"/>
-        <w:divId w:val="1625111436"/>
+        <w:divId w:val="1332218290"/>
         <w:rPr>
           <w:rFonts w:ascii="Calibri" w:eastAsia="Times New Roman" w:hAnsi="Calibri" w:cs="Calibri"/>
           <w:color w:val="1A1A1A"/>
@@ -1167,7 +1169,7 @@
           <w:numId w:val="2"/>
         </w:numPr>
         <w:spacing w:before="100" w:beforeAutospacing="1" w:after="100" w:afterAutospacing="1"/>
-        <w:divId w:val="1625111436"/>
+        <w:divId w:val="1332218290"/>
         <w:rPr>
           <w:rFonts w:ascii="Calibri" w:eastAsia="Times New Roman" w:hAnsi="Calibri" w:cs="Calibri"/>
           <w:color w:val="1A1A1A"/>
@@ -1192,7 +1194,7 @@
           <w:numId w:val="2"/>
         </w:numPr>
         <w:spacing w:before="100" w:beforeAutospacing="1" w:after="100" w:afterAutospacing="1"/>
-        <w:divId w:val="1625111436"/>
+        <w:divId w:val="1332218290"/>
         <w:rPr>
           <w:rFonts w:ascii="Calibri" w:eastAsia="Times New Roman" w:hAnsi="Calibri" w:cs="Calibri"/>
           <w:color w:val="1A1A1A"/>
@@ -1217,7 +1219,7 @@
           <w:numId w:val="2"/>
         </w:numPr>
         <w:spacing w:before="100" w:beforeAutospacing="1" w:after="100" w:afterAutospacing="1"/>
-        <w:divId w:val="1625111436"/>
+        <w:divId w:val="1332218290"/>
         <w:rPr>
           <w:rFonts w:ascii="Calibri" w:eastAsia="Times New Roman" w:hAnsi="Calibri" w:cs="Calibri"/>
           <w:color w:val="1A1A1A"/>
@@ -1242,7 +1244,7 @@
           <w:numId w:val="2"/>
         </w:numPr>
         <w:spacing w:before="100" w:beforeAutospacing="1" w:after="100" w:afterAutospacing="1"/>
-        <w:divId w:val="1625111436"/>
+        <w:divId w:val="1332218290"/>
         <w:rPr>
           <w:rFonts w:ascii="Calibri" w:eastAsia="Times New Roman" w:hAnsi="Calibri" w:cs="Calibri"/>
           <w:color w:val="1A1A1A"/>
@@ -1267,7 +1269,7 @@
           <w:numId w:val="2"/>
         </w:numPr>
         <w:spacing w:before="100" w:beforeAutospacing="1" w:after="100" w:afterAutospacing="1"/>
-        <w:divId w:val="1625111436"/>
+        <w:divId w:val="1332218290"/>
         <w:rPr>
           <w:rFonts w:ascii="Calibri" w:eastAsia="Times New Roman" w:hAnsi="Calibri" w:cs="Calibri"/>
           <w:color w:val="1A1A1A"/>
@@ -1292,7 +1294,7 @@
           <w:numId w:val="2"/>
         </w:numPr>
         <w:spacing w:before="100" w:beforeAutospacing="1" w:after="100" w:afterAutospacing="1"/>
-        <w:divId w:val="1625111436"/>
+        <w:divId w:val="1332218290"/>
         <w:rPr>
           <w:rFonts w:ascii="Calibri" w:eastAsia="Times New Roman" w:hAnsi="Calibri" w:cs="Calibri"/>
           <w:color w:val="1A1A1A"/>
@@ -1317,7 +1319,7 @@
           <w:numId w:val="2"/>
         </w:numPr>
         <w:spacing w:before="100" w:beforeAutospacing="1" w:after="100" w:afterAutospacing="1"/>
-        <w:divId w:val="1625111436"/>
+        <w:divId w:val="1332218290"/>
         <w:rPr>
           <w:rFonts w:ascii="Calibri" w:eastAsia="Times New Roman" w:hAnsi="Calibri" w:cs="Calibri"/>
           <w:color w:val="1A1A1A"/>
@@ -1342,7 +1344,7 @@
           <w:numId w:val="2"/>
         </w:numPr>
         <w:spacing w:before="100" w:beforeAutospacing="1" w:after="100" w:afterAutospacing="1"/>
-        <w:divId w:val="1625111436"/>
+        <w:divId w:val="1332218290"/>
         <w:rPr>
           <w:rFonts w:ascii="Calibri" w:eastAsia="Times New Roman" w:hAnsi="Calibri" w:cs="Calibri"/>
           <w:color w:val="1A1A1A"/>
@@ -1363,7 +1365,7 @@
     <w:p>
       <w:pPr>
         <w:pStyle w:val="Heading2"/>
-        <w:divId w:val="1625111436"/>
+        <w:divId w:val="1332218290"/>
         <w:rPr>
           <w:rFonts w:ascii="Calibri" w:eastAsia="Times New Roman" w:hAnsi="Calibri" w:cs="Calibri"/>
         </w:rPr>
@@ -1382,7 +1384,7 @@
           <w:numId w:val="3"/>
         </w:numPr>
         <w:spacing w:before="100" w:beforeAutospacing="1" w:after="100" w:afterAutospacing="1"/>
-        <w:divId w:val="1625111436"/>
+        <w:divId w:val="1332218290"/>
         <w:rPr>
           <w:rFonts w:ascii="Calibri" w:eastAsia="Times New Roman" w:hAnsi="Calibri" w:cs="Calibri"/>
           <w:color w:val="1A1A1A"/>
@@ -1426,7 +1428,7 @@
           <w:sz w:val="22"/>
           <w:szCs w:val="22"/>
         </w:rPr>
-        <w:t xml:space="preserve"> that already folds in distance, congestion, damage and emergency restrictions. Minimizing total weight therefore </w:t>
+        <w:t xml:space="preserve"> that already folds in distance, congestion, </w:t>
       </w:r>
       <w:r>
         <w:rPr>
@@ -1436,7 +1438,7 @@
           <w:szCs w:val="22"/>
         </w:rPr>
         <w:lastRenderedPageBreak/>
-        <w:t>minimizes a combined safety-and-time objective, and the authority expresses changing conditions by updating weights.</w:t>
+        <w:t>damage and emergency restrictions. Minimizing total weight therefore minimizes a combined safety-and-time objective, and the authority expresses changing conditions by updating weights.</w:t>
       </w:r>
     </w:p>
     <w:p>
@@ -1446,7 +1448,7 @@
           <w:numId w:val="3"/>
         </w:numPr>
         <w:spacing w:before="100" w:beforeAutospacing="1" w:after="100" w:afterAutospacing="1"/>
-        <w:divId w:val="1625111436"/>
+        <w:divId w:val="1332218290"/>
         <w:rPr>
           <w:rFonts w:ascii="Calibri" w:eastAsia="Times New Roman" w:hAnsi="Calibri" w:cs="Calibri"/>
           <w:color w:val="1A1A1A"/>
@@ -1509,7 +1511,7 @@
           <w:numId w:val="3"/>
         </w:numPr>
         <w:spacing w:before="100" w:beforeAutospacing="1" w:after="100" w:afterAutospacing="1"/>
-        <w:divId w:val="1625111436"/>
+        <w:divId w:val="1332218290"/>
         <w:rPr>
           <w:rFonts w:ascii="Calibri" w:eastAsia="Times New Roman" w:hAnsi="Calibri" w:cs="Calibri"/>
           <w:color w:val="1A1A1A"/>
@@ -1534,7 +1536,7 @@
           <w:numId w:val="3"/>
         </w:numPr>
         <w:spacing w:before="100" w:beforeAutospacing="1" w:after="100" w:afterAutospacing="1"/>
-        <w:divId w:val="1625111436"/>
+        <w:divId w:val="1332218290"/>
         <w:rPr>
           <w:rFonts w:ascii="Calibri" w:eastAsia="Times New Roman" w:hAnsi="Calibri" w:cs="Calibri"/>
           <w:color w:val="1A1A1A"/>
@@ -1575,7 +1577,7 @@
           <w:numId w:val="3"/>
         </w:numPr>
         <w:spacing w:before="100" w:beforeAutospacing="1" w:after="100" w:afterAutospacing="1"/>
-        <w:divId w:val="1625111436"/>
+        <w:divId w:val="1332218290"/>
         <w:rPr>
           <w:rFonts w:ascii="Calibri" w:eastAsia="Times New Roman" w:hAnsi="Calibri" w:cs="Calibri"/>
           <w:color w:val="1A1A1A"/>
@@ -1628,7 +1630,7 @@
     <w:p>
       <w:pPr>
         <w:pStyle w:val="Heading2"/>
-        <w:divId w:val="1625111436"/>
+        <w:divId w:val="1332218290"/>
         <w:rPr>
           <w:rFonts w:ascii="Calibri" w:eastAsia="Times New Roman" w:hAnsi="Calibri" w:cs="Calibri"/>
         </w:rPr>
@@ -1643,7 +1645,7 @@
     <w:p>
       <w:pPr>
         <w:pStyle w:val="NormalWeb"/>
-        <w:divId w:val="1625111436"/>
+        <w:divId w:val="1332218290"/>
         <w:rPr>
           <w:rFonts w:ascii="Calibri" w:hAnsi="Calibri" w:cs="Calibri"/>
           <w:color w:val="1A1A1A"/>
@@ -1674,7 +1676,7 @@
     <w:p>
       <w:pPr>
         <w:pStyle w:val="NormalWeb"/>
-        <w:divId w:val="1625111436"/>
+        <w:divId w:val="1332218290"/>
         <w:rPr>
           <w:rFonts w:ascii="Calibri" w:hAnsi="Calibri" w:cs="Calibri"/>
           <w:color w:val="1A1A1A"/>
@@ -1709,7 +1711,7 @@
           <w:numId w:val="4"/>
         </w:numPr>
         <w:spacing w:before="100" w:beforeAutospacing="1" w:after="100" w:afterAutospacing="1"/>
-        <w:divId w:val="1625111436"/>
+        <w:divId w:val="1332218290"/>
         <w:rPr>
           <w:rFonts w:ascii="Calibri" w:eastAsia="Times New Roman" w:hAnsi="Calibri" w:cs="Calibri"/>
           <w:color w:val="1A1A1A"/>
@@ -1743,7 +1745,7 @@
           <w:numId w:val="4"/>
         </w:numPr>
         <w:spacing w:before="100" w:beforeAutospacing="1" w:after="100" w:afterAutospacing="1"/>
-        <w:divId w:val="1625111436"/>
+        <w:divId w:val="1332218290"/>
         <w:rPr>
           <w:rFonts w:ascii="Calibri" w:eastAsia="Times New Roman" w:hAnsi="Calibri" w:cs="Calibri"/>
           <w:color w:val="1A1A1A"/>
@@ -1768,7 +1770,7 @@
           <w:numId w:val="4"/>
         </w:numPr>
         <w:spacing w:before="100" w:beforeAutospacing="1" w:after="100" w:afterAutospacing="1"/>
-        <w:divId w:val="1625111436"/>
+        <w:divId w:val="1332218290"/>
         <w:rPr>
           <w:rFonts w:ascii="Calibri" w:eastAsia="Times New Roman" w:hAnsi="Calibri" w:cs="Calibri"/>
           <w:color w:val="1A1A1A"/>
@@ -1805,7 +1807,7 @@
     <w:p>
       <w:pPr>
         <w:pStyle w:val="NormalWeb"/>
-        <w:divId w:val="1625111436"/>
+        <w:divId w:val="1332218290"/>
         <w:rPr>
           <w:rFonts w:ascii="Calibri" w:hAnsi="Calibri" w:cs="Calibri"/>
           <w:color w:val="1A1A1A"/>
@@ -1841,7 +1843,7 @@
       </w:tblGrid>
       <w:tr>
         <w:trPr>
-          <w:divId w:val="1625111436"/>
+          <w:divId w:val="1332218290"/>
           <w:tblHeader/>
         </w:trPr>
         <w:tc>
@@ -1976,7 +1978,7 @@
       </w:tr>
       <w:tr>
         <w:trPr>
-          <w:divId w:val="1625111436"/>
+          <w:divId w:val="1332218290"/>
         </w:trPr>
         <w:tc>
           <w:tcPr>
@@ -2109,7 +2111,7 @@
       </w:tr>
       <w:tr>
         <w:trPr>
-          <w:divId w:val="1625111436"/>
+          <w:divId w:val="1332218290"/>
         </w:trPr>
         <w:tc>
           <w:tcPr>
@@ -2242,7 +2244,7 @@
       </w:tr>
       <w:tr>
         <w:trPr>
-          <w:divId w:val="1625111436"/>
+          <w:divId w:val="1332218290"/>
         </w:trPr>
         <w:tc>
           <w:tcPr>
@@ -2359,7 +2361,7 @@
       </w:tr>
       <w:tr>
         <w:trPr>
-          <w:divId w:val="1625111436"/>
+          <w:divId w:val="1332218290"/>
         </w:trPr>
         <w:tc>
           <w:tcPr>
@@ -2476,7 +2478,7 @@
       </w:tr>
       <w:tr>
         <w:trPr>
-          <w:divId w:val="1625111436"/>
+          <w:divId w:val="1332218290"/>
         </w:trPr>
         <w:tc>
           <w:tcPr>
@@ -2595,7 +2597,7 @@
     <w:p>
       <w:pPr>
         <w:pStyle w:val="Heading2"/>
-        <w:divId w:val="1625111436"/>
+        <w:divId w:val="1332218290"/>
         <w:rPr>
           <w:rFonts w:ascii="Calibri" w:eastAsia="Times New Roman" w:hAnsi="Calibri" w:cs="Calibri"/>
         </w:rPr>
@@ -2610,7 +2612,7 @@
     <w:p>
       <w:pPr>
         <w:pStyle w:val="NormalWeb"/>
-        <w:divId w:val="1625111436"/>
+        <w:divId w:val="1332218290"/>
         <w:rPr>
           <w:rFonts w:ascii="Calibri" w:hAnsi="Calibri" w:cs="Calibri"/>
           <w:color w:val="1A1A1A"/>
@@ -2647,7 +2649,7 @@
     <w:p>
       <w:pPr>
         <w:pStyle w:val="HTMLPreformatted"/>
-        <w:divId w:val="1625111436"/>
+        <w:divId w:val="1332218290"/>
         <w:rPr>
           <w:rStyle w:val="HTMLCode"/>
           <w:color w:val="1A1A1A"/>
@@ -2664,7 +2666,7 @@
     <w:p>
       <w:pPr>
         <w:pStyle w:val="HTMLPreformatted"/>
-        <w:divId w:val="1625111436"/>
+        <w:divId w:val="1332218290"/>
         <w:rPr>
           <w:rStyle w:val="HTMLCode"/>
           <w:color w:val="1A1A1A"/>
@@ -2688,7 +2690,7 @@
     <w:p>
       <w:pPr>
         <w:pStyle w:val="HTMLPreformatted"/>
-        <w:divId w:val="1625111436"/>
+        <w:divId w:val="1332218290"/>
         <w:rPr>
           <w:rStyle w:val="HTMLCode"/>
           <w:color w:val="1A1A1A"/>
@@ -2705,7 +2707,7 @@
     <w:p>
       <w:pPr>
         <w:pStyle w:val="HTMLPreformatted"/>
-        <w:divId w:val="1625111436"/>
+        <w:divId w:val="1332218290"/>
         <w:rPr>
           <w:rStyle w:val="HTMLCode"/>
           <w:color w:val="1A1A1A"/>
@@ -2722,7 +2724,7 @@
     <w:p>
       <w:pPr>
         <w:pStyle w:val="HTMLPreformatted"/>
-        <w:divId w:val="1625111436"/>
+        <w:divId w:val="1332218290"/>
         <w:rPr>
           <w:rStyle w:val="HTMLCode"/>
           <w:color w:val="1A1A1A"/>
@@ -2739,7 +2741,7 @@
     <w:p>
       <w:pPr>
         <w:pStyle w:val="HTMLPreformatted"/>
-        <w:divId w:val="1625111436"/>
+        <w:divId w:val="1332218290"/>
         <w:rPr>
           <w:rStyle w:val="HTMLCode"/>
           <w:color w:val="1A1A1A"/>
@@ -2756,7 +2758,7 @@
     <w:p>
       <w:pPr>
         <w:pStyle w:val="HTMLPreformatted"/>
-        <w:divId w:val="1625111436"/>
+        <w:divId w:val="1332218290"/>
         <w:rPr>
           <w:rStyle w:val="HTMLCode"/>
           <w:color w:val="1A1A1A"/>
@@ -2766,7 +2768,7 @@
     <w:p>
       <w:pPr>
         <w:pStyle w:val="HTMLPreformatted"/>
-        <w:divId w:val="1625111436"/>
+        <w:divId w:val="1332218290"/>
         <w:rPr>
           <w:rStyle w:val="HTMLCode"/>
           <w:color w:val="1A1A1A"/>
@@ -2783,7 +2785,7 @@
     <w:p>
       <w:pPr>
         <w:pStyle w:val="HTMLPreformatted"/>
-        <w:divId w:val="1625111436"/>
+        <w:divId w:val="1332218290"/>
         <w:rPr>
           <w:rStyle w:val="HTMLCode"/>
           <w:color w:val="1A1A1A"/>
@@ -2800,7 +2802,7 @@
     <w:p>
       <w:pPr>
         <w:pStyle w:val="HTMLPreformatted"/>
-        <w:divId w:val="1625111436"/>
+        <w:divId w:val="1332218290"/>
         <w:rPr>
           <w:rStyle w:val="HTMLCode"/>
           <w:color w:val="1A1A1A"/>
@@ -2817,7 +2819,7 @@
     <w:p>
       <w:pPr>
         <w:pStyle w:val="HTMLPreformatted"/>
-        <w:divId w:val="1625111436"/>
+        <w:divId w:val="1332218290"/>
         <w:rPr>
           <w:rStyle w:val="HTMLCode"/>
           <w:color w:val="1A1A1A"/>
@@ -2834,7 +2836,7 @@
     <w:p>
       <w:pPr>
         <w:pStyle w:val="HTMLPreformatted"/>
-        <w:divId w:val="1625111436"/>
+        <w:divId w:val="1332218290"/>
         <w:rPr>
           <w:rStyle w:val="HTMLCode"/>
           <w:color w:val="1A1A1A"/>
@@ -2851,7 +2853,7 @@
     <w:p>
       <w:pPr>
         <w:pStyle w:val="HTMLPreformatted"/>
-        <w:divId w:val="1625111436"/>
+        <w:divId w:val="1332218290"/>
         <w:rPr>
           <w:rStyle w:val="HTMLCode"/>
           <w:color w:val="1A1A1A"/>
@@ -2868,7 +2870,7 @@
     <w:p>
       <w:pPr>
         <w:pStyle w:val="HTMLPreformatted"/>
-        <w:divId w:val="1625111436"/>
+        <w:divId w:val="1332218290"/>
         <w:rPr>
           <w:rStyle w:val="HTMLCode"/>
           <w:color w:val="1A1A1A"/>
@@ -2878,7 +2880,7 @@
     <w:p>
       <w:pPr>
         <w:pStyle w:val="HTMLPreformatted"/>
-        <w:divId w:val="1625111436"/>
+        <w:divId w:val="1332218290"/>
         <w:rPr>
           <w:rStyle w:val="HTMLCode"/>
           <w:color w:val="1A1A1A"/>
@@ -2895,7 +2897,7 @@
     <w:p>
       <w:pPr>
         <w:pStyle w:val="HTMLPreformatted"/>
-        <w:divId w:val="1625111436"/>
+        <w:divId w:val="1332218290"/>
         <w:rPr>
           <w:rStyle w:val="HTMLCode"/>
           <w:color w:val="1A1A1A"/>
@@ -2912,7 +2914,7 @@
     <w:p>
       <w:pPr>
         <w:pStyle w:val="HTMLPreformatted"/>
-        <w:divId w:val="1625111436"/>
+        <w:divId w:val="1332218290"/>
         <w:rPr>
           <w:rStyle w:val="HTMLCode"/>
           <w:color w:val="1A1A1A"/>
@@ -2929,7 +2931,7 @@
     <w:p>
       <w:pPr>
         <w:pStyle w:val="HTMLPreformatted"/>
-        <w:divId w:val="1625111436"/>
+        <w:divId w:val="1332218290"/>
         <w:rPr>
           <w:rStyle w:val="HTMLCode"/>
           <w:color w:val="1A1A1A"/>
@@ -2946,7 +2948,7 @@
     <w:p>
       <w:pPr>
         <w:pStyle w:val="HTMLPreformatted"/>
-        <w:divId w:val="1625111436"/>
+        <w:divId w:val="1332218290"/>
         <w:rPr>
           <w:rStyle w:val="HTMLCode"/>
           <w:color w:val="1A1A1A"/>
@@ -2963,7 +2965,7 @@
     <w:p>
       <w:pPr>
         <w:pStyle w:val="HTMLPreformatted"/>
-        <w:divId w:val="1625111436"/>
+        <w:divId w:val="1332218290"/>
         <w:rPr>
           <w:rStyle w:val="HTMLCode"/>
           <w:color w:val="1A1A1A"/>
@@ -2980,7 +2982,7 @@
     <w:p>
       <w:pPr>
         <w:pStyle w:val="HTMLPreformatted"/>
-        <w:divId w:val="1625111436"/>
+        <w:divId w:val="1332218290"/>
         <w:rPr>
           <w:rStyle w:val="HTMLCode"/>
           <w:color w:val="1A1A1A"/>
@@ -2997,7 +2999,7 @@
     <w:p>
       <w:pPr>
         <w:pStyle w:val="HTMLPreformatted"/>
-        <w:divId w:val="1625111436"/>
+        <w:divId w:val="1332218290"/>
         <w:rPr>
           <w:rStyle w:val="HTMLCode"/>
           <w:color w:val="1A1A1A"/>
@@ -3014,7 +3016,7 @@
     <w:p>
       <w:pPr>
         <w:pStyle w:val="HTMLPreformatted"/>
-        <w:divId w:val="1625111436"/>
+        <w:divId w:val="1332218290"/>
         <w:rPr>
           <w:rStyle w:val="HTMLCode"/>
           <w:color w:val="1A1A1A"/>
@@ -3024,7 +3026,7 @@
     <w:p>
       <w:pPr>
         <w:pStyle w:val="HTMLPreformatted"/>
-        <w:divId w:val="1625111436"/>
+        <w:divId w:val="1332218290"/>
         <w:rPr>
           <w:rStyle w:val="HTMLCode"/>
           <w:color w:val="1A1A1A"/>
@@ -3041,7 +3043,7 @@
     <w:p>
       <w:pPr>
         <w:pStyle w:val="HTMLPreformatted"/>
-        <w:divId w:val="1625111436"/>
+        <w:divId w:val="1332218290"/>
         <w:rPr>
           <w:rStyle w:val="HTMLCode"/>
           <w:color w:val="1A1A1A"/>
@@ -3058,7 +3060,7 @@
     <w:p>
       <w:pPr>
         <w:pStyle w:val="HTMLPreformatted"/>
-        <w:divId w:val="1625111436"/>
+        <w:divId w:val="1332218290"/>
         <w:rPr>
           <w:rStyle w:val="HTMLCode"/>
           <w:color w:val="1A1A1A"/>
@@ -3075,7 +3077,7 @@
     <w:p>
       <w:pPr>
         <w:pStyle w:val="HTMLPreformatted"/>
-        <w:divId w:val="1625111436"/>
+        <w:divId w:val="1332218290"/>
         <w:rPr>
           <w:rStyle w:val="HTMLCode"/>
           <w:color w:val="1A1A1A"/>
@@ -3092,7 +3094,7 @@
     <w:p>
       <w:pPr>
         <w:pStyle w:val="HTMLPreformatted"/>
-        <w:divId w:val="1625111436"/>
+        <w:divId w:val="1332218290"/>
         <w:rPr>
           <w:rStyle w:val="HTMLCode"/>
           <w:color w:val="1A1A1A"/>
@@ -3109,7 +3111,7 @@
     <w:p>
       <w:pPr>
         <w:pStyle w:val="HTMLPreformatted"/>
-        <w:divId w:val="1625111436"/>
+        <w:divId w:val="1332218290"/>
         <w:rPr>
           <w:rStyle w:val="HTMLCode"/>
           <w:color w:val="1A1A1A"/>
@@ -3126,7 +3128,7 @@
     <w:p>
       <w:pPr>
         <w:pStyle w:val="HTMLPreformatted"/>
-        <w:divId w:val="1625111436"/>
+        <w:divId w:val="1332218290"/>
         <w:rPr>
           <w:rStyle w:val="HTMLCode"/>
           <w:color w:val="1A1A1A"/>
@@ -3136,7 +3138,7 @@
     <w:p>
       <w:pPr>
         <w:pStyle w:val="HTMLPreformatted"/>
-        <w:divId w:val="1625111436"/>
+        <w:divId w:val="1332218290"/>
         <w:rPr>
           <w:rStyle w:val="HTMLCode"/>
           <w:color w:val="1A1A1A"/>
@@ -3153,7 +3155,7 @@
     <w:p>
       <w:pPr>
         <w:pStyle w:val="HTMLPreformatted"/>
-        <w:divId w:val="1625111436"/>
+        <w:divId w:val="1332218290"/>
         <w:rPr>
           <w:rStyle w:val="HTMLCode"/>
           <w:color w:val="1A1A1A"/>
@@ -3170,7 +3172,7 @@
     <w:p>
       <w:pPr>
         <w:pStyle w:val="HTMLPreformatted"/>
-        <w:divId w:val="1625111436"/>
+        <w:divId w:val="1332218290"/>
         <w:rPr>
           <w:rStyle w:val="HTMLCode"/>
           <w:color w:val="1A1A1A"/>
@@ -3187,7 +3189,7 @@
     <w:p>
       <w:pPr>
         <w:pStyle w:val="HTMLPreformatted"/>
-        <w:divId w:val="1625111436"/>
+        <w:divId w:val="1332218290"/>
         <w:rPr>
           <w:rStyle w:val="HTMLCode"/>
           <w:color w:val="1A1A1A"/>
@@ -3204,7 +3206,7 @@
     <w:p>
       <w:pPr>
         <w:pStyle w:val="HTMLPreformatted"/>
-        <w:divId w:val="1625111436"/>
+        <w:divId w:val="1332218290"/>
         <w:rPr>
           <w:rStyle w:val="HTMLCode"/>
           <w:color w:val="1A1A1A"/>
@@ -3221,7 +3223,7 @@
     <w:p>
       <w:pPr>
         <w:pStyle w:val="HTMLPreformatted"/>
-        <w:divId w:val="1625111436"/>
+        <w:divId w:val="1332218290"/>
         <w:rPr>
           <w:rStyle w:val="HTMLCode"/>
           <w:color w:val="1A1A1A"/>
@@ -3238,7 +3240,7 @@
     <w:p>
       <w:pPr>
         <w:pStyle w:val="HTMLPreformatted"/>
-        <w:divId w:val="1625111436"/>
+        <w:divId w:val="1332218290"/>
         <w:rPr>
           <w:rStyle w:val="HTMLCode"/>
           <w:color w:val="1A1A1A"/>
@@ -3248,7 +3250,7 @@
     <w:p>
       <w:pPr>
         <w:pStyle w:val="HTMLPreformatted"/>
-        <w:divId w:val="1625111436"/>
+        <w:divId w:val="1332218290"/>
         <w:rPr>
           <w:rStyle w:val="HTMLCode"/>
           <w:color w:val="1A1A1A"/>
@@ -3265,7 +3267,7 @@
     <w:p>
       <w:pPr>
         <w:pStyle w:val="HTMLPreformatted"/>
-        <w:divId w:val="1625111436"/>
+        <w:divId w:val="1332218290"/>
         <w:rPr>
           <w:rStyle w:val="HTMLCode"/>
           <w:color w:val="1A1A1A"/>
@@ -3282,7 +3284,7 @@
     <w:p>
       <w:pPr>
         <w:pStyle w:val="HTMLPreformatted"/>
-        <w:divId w:val="1625111436"/>
+        <w:divId w:val="1332218290"/>
         <w:rPr>
           <w:rStyle w:val="HTMLCode"/>
           <w:color w:val="1A1A1A"/>
@@ -3299,7 +3301,7 @@
     <w:p>
       <w:pPr>
         <w:pStyle w:val="HTMLPreformatted"/>
-        <w:divId w:val="1625111436"/>
+        <w:divId w:val="1332218290"/>
         <w:rPr>
           <w:rStyle w:val="HTMLCode"/>
           <w:color w:val="1A1A1A"/>
@@ -3316,7 +3318,7 @@
     <w:p>
       <w:pPr>
         <w:pStyle w:val="HTMLPreformatted"/>
-        <w:divId w:val="1625111436"/>
+        <w:divId w:val="1332218290"/>
         <w:rPr>
           <w:rStyle w:val="HTMLCode"/>
           <w:color w:val="1A1A1A"/>
@@ -3326,7 +3328,7 @@
     <w:p>
       <w:pPr>
         <w:pStyle w:val="HTMLPreformatted"/>
-        <w:divId w:val="1625111436"/>
+        <w:divId w:val="1332218290"/>
         <w:rPr>
           <w:rStyle w:val="HTMLCode"/>
           <w:color w:val="1A1A1A"/>
@@ -3343,7 +3345,7 @@
     <w:p>
       <w:pPr>
         <w:pStyle w:val="HTMLPreformatted"/>
-        <w:divId w:val="1625111436"/>
+        <w:divId w:val="1332218290"/>
         <w:rPr>
           <w:rStyle w:val="HTMLCode"/>
           <w:color w:val="1A1A1A"/>
@@ -3360,7 +3362,7 @@
     <w:p>
       <w:pPr>
         <w:pStyle w:val="HTMLPreformatted"/>
-        <w:divId w:val="1625111436"/>
+        <w:divId w:val="1332218290"/>
         <w:rPr>
           <w:rStyle w:val="HTMLCode"/>
           <w:color w:val="1A1A1A"/>
@@ -3377,7 +3379,7 @@
     <w:p>
       <w:pPr>
         <w:pStyle w:val="HTMLPreformatted"/>
-        <w:divId w:val="1625111436"/>
+        <w:divId w:val="1332218290"/>
         <w:rPr>
           <w:rStyle w:val="HTMLCode"/>
           <w:color w:val="1A1A1A"/>
@@ -3394,7 +3396,7 @@
     <w:p>
       <w:pPr>
         <w:pStyle w:val="HTMLPreformatted"/>
-        <w:divId w:val="1625111436"/>
+        <w:divId w:val="1332218290"/>
         <w:rPr>
           <w:rStyle w:val="HTMLCode"/>
           <w:color w:val="1A1A1A"/>
@@ -3418,7 +3420,7 @@
     <w:p>
       <w:pPr>
         <w:pStyle w:val="HTMLPreformatted"/>
-        <w:divId w:val="1625111436"/>
+        <w:divId w:val="1332218290"/>
         <w:rPr>
           <w:rStyle w:val="HTMLCode"/>
           <w:color w:val="1A1A1A"/>
@@ -3435,7 +3437,7 @@
     <w:p>
       <w:pPr>
         <w:pStyle w:val="HTMLPreformatted"/>
-        <w:divId w:val="1625111436"/>
+        <w:divId w:val="1332218290"/>
         <w:rPr>
           <w:rStyle w:val="HTMLCode"/>
           <w:color w:val="1A1A1A"/>
@@ -3452,7 +3454,7 @@
     <w:p>
       <w:pPr>
         <w:pStyle w:val="HTMLPreformatted"/>
-        <w:divId w:val="1625111436"/>
+        <w:divId w:val="1332218290"/>
         <w:rPr>
           <w:rStyle w:val="HTMLCode"/>
           <w:color w:val="1A1A1A"/>
@@ -3462,7 +3464,7 @@
     <w:p>
       <w:pPr>
         <w:pStyle w:val="HTMLPreformatted"/>
-        <w:divId w:val="1625111436"/>
+        <w:divId w:val="1332218290"/>
         <w:rPr>
           <w:rStyle w:val="HTMLCode"/>
           <w:color w:val="1A1A1A"/>
@@ -3479,7 +3481,7 @@
     <w:p>
       <w:pPr>
         <w:pStyle w:val="HTMLPreformatted"/>
-        <w:divId w:val="1625111436"/>
+        <w:divId w:val="1332218290"/>
         <w:rPr>
           <w:rStyle w:val="HTMLCode"/>
           <w:color w:val="1A1A1A"/>
@@ -3496,7 +3498,7 @@
     <w:p>
       <w:pPr>
         <w:pStyle w:val="HTMLPreformatted"/>
-        <w:divId w:val="1625111436"/>
+        <w:divId w:val="1332218290"/>
         <w:rPr>
           <w:rStyle w:val="HTMLCode"/>
           <w:color w:val="1A1A1A"/>
@@ -3513,7 +3515,7 @@
     <w:p>
       <w:pPr>
         <w:pStyle w:val="HTMLPreformatted"/>
-        <w:divId w:val="1625111436"/>
+        <w:divId w:val="1332218290"/>
         <w:rPr>
           <w:rStyle w:val="HTMLCode"/>
           <w:color w:val="1A1A1A"/>
@@ -3530,7 +3532,7 @@
     <w:p>
       <w:pPr>
         <w:pStyle w:val="HTMLPreformatted"/>
-        <w:divId w:val="1625111436"/>
+        <w:divId w:val="1332218290"/>
         <w:rPr>
           <w:rStyle w:val="HTMLCode"/>
           <w:color w:val="1A1A1A"/>
@@ -3547,7 +3549,7 @@
     <w:p>
       <w:pPr>
         <w:pStyle w:val="HTMLPreformatted"/>
-        <w:divId w:val="1625111436"/>
+        <w:divId w:val="1332218290"/>
         <w:rPr>
           <w:rStyle w:val="HTMLCode"/>
           <w:color w:val="1A1A1A"/>
@@ -3564,7 +3566,7 @@
     <w:p>
       <w:pPr>
         <w:pStyle w:val="HTMLPreformatted"/>
-        <w:divId w:val="1625111436"/>
+        <w:divId w:val="1332218290"/>
         <w:rPr>
           <w:rStyle w:val="HTMLCode"/>
           <w:color w:val="1A1A1A"/>
@@ -3574,7 +3576,7 @@
     <w:p>
       <w:pPr>
         <w:pStyle w:val="HTMLPreformatted"/>
-        <w:divId w:val="1625111436"/>
+        <w:divId w:val="1332218290"/>
         <w:rPr>
           <w:rStyle w:val="HTMLCode"/>
           <w:color w:val="1A1A1A"/>
@@ -3591,7 +3593,7 @@
     <w:p>
       <w:pPr>
         <w:pStyle w:val="HTMLPreformatted"/>
-        <w:divId w:val="1625111436"/>
+        <w:divId w:val="1332218290"/>
         <w:rPr>
           <w:rStyle w:val="HTMLCode"/>
           <w:color w:val="1A1A1A"/>
@@ -3608,7 +3610,7 @@
     <w:p>
       <w:pPr>
         <w:pStyle w:val="HTMLPreformatted"/>
-        <w:divId w:val="1625111436"/>
+        <w:divId w:val="1332218290"/>
         <w:rPr>
           <w:rStyle w:val="HTMLCode"/>
           <w:color w:val="1A1A1A"/>
@@ -3625,7 +3627,7 @@
     <w:p>
       <w:pPr>
         <w:pStyle w:val="HTMLPreformatted"/>
-        <w:divId w:val="1625111436"/>
+        <w:divId w:val="1332218290"/>
         <w:rPr>
           <w:color w:val="1A1A1A"/>
         </w:rPr>
@@ -3641,7 +3643,7 @@
     <w:p>
       <w:pPr>
         <w:pStyle w:val="NormalWeb"/>
-        <w:divId w:val="1625111436"/>
+        <w:divId w:val="1332218290"/>
         <w:rPr>
           <w:rFonts w:ascii="Calibri" w:hAnsi="Calibri" w:cs="Calibri"/>
           <w:color w:val="1A1A1A"/>
@@ -3735,7 +3737,7 @@
     <w:p>
       <w:pPr>
         <w:pStyle w:val="Heading2"/>
-        <w:divId w:val="1625111436"/>
+        <w:divId w:val="1332218290"/>
         <w:rPr>
           <w:rFonts w:ascii="Calibri" w:eastAsia="Times New Roman" w:hAnsi="Calibri" w:cs="Calibri"/>
         </w:rPr>
@@ -3750,7 +3752,7 @@
     <w:p>
       <w:pPr>
         <w:pStyle w:val="NormalWeb"/>
-        <w:divId w:val="1625111436"/>
+        <w:divId w:val="1332218290"/>
         <w:rPr>
           <w:rFonts w:ascii="Calibri" w:hAnsi="Calibri" w:cs="Calibri"/>
           <w:color w:val="1A1A1A"/>
@@ -3810,7 +3812,7 @@
           <w:numId w:val="5"/>
         </w:numPr>
         <w:spacing w:before="100" w:beforeAutospacing="1" w:after="100" w:afterAutospacing="1"/>
-        <w:divId w:val="1625111436"/>
+        <w:divId w:val="1332218290"/>
         <w:rPr>
           <w:rFonts w:ascii="Calibri" w:eastAsia="Times New Roman" w:hAnsi="Calibri" w:cs="Calibri"/>
           <w:color w:val="1A1A1A"/>
@@ -3929,7 +3931,7 @@
           <w:numId w:val="5"/>
         </w:numPr>
         <w:spacing w:before="100" w:beforeAutospacing="1" w:after="100" w:afterAutospacing="1"/>
-        <w:divId w:val="1625111436"/>
+        <w:divId w:val="1332218290"/>
         <w:rPr>
           <w:rFonts w:ascii="Calibri" w:eastAsia="Times New Roman" w:hAnsi="Calibri" w:cs="Calibri"/>
           <w:color w:val="1A1A1A"/>
@@ -4027,7 +4029,7 @@
     <w:p>
       <w:pPr>
         <w:pStyle w:val="Heading2"/>
-        <w:divId w:val="1625111436"/>
+        <w:divId w:val="1332218290"/>
         <w:rPr>
           <w:rFonts w:ascii="Calibri" w:eastAsia="Times New Roman" w:hAnsi="Calibri" w:cs="Calibri"/>
         </w:rPr>
@@ -4042,7 +4044,7 @@
     <w:p>
       <w:pPr>
         <w:pStyle w:val="NormalWeb"/>
-        <w:divId w:val="1625111436"/>
+        <w:divId w:val="1332218290"/>
         <w:rPr>
           <w:rFonts w:ascii="Calibri" w:hAnsi="Calibri" w:cs="Calibri"/>
           <w:color w:val="1A1A1A"/>
@@ -4083,7 +4085,7 @@
           <w:numId w:val="6"/>
         </w:numPr>
         <w:spacing w:before="100" w:beforeAutospacing="1" w:after="100" w:afterAutospacing="1"/>
-        <w:divId w:val="1625111436"/>
+        <w:divId w:val="1332218290"/>
         <w:rPr>
           <w:rFonts w:ascii="Calibri" w:eastAsia="Times New Roman" w:hAnsi="Calibri" w:cs="Calibri"/>
           <w:color w:val="1A1A1A"/>
@@ -4127,7 +4129,7 @@
           <w:numId w:val="6"/>
         </w:numPr>
         <w:spacing w:before="100" w:beforeAutospacing="1" w:after="100" w:afterAutospacing="1"/>
-        <w:divId w:val="1625111436"/>
+        <w:divId w:val="1332218290"/>
         <w:rPr>
           <w:rFonts w:ascii="Calibri" w:eastAsia="Times New Roman" w:hAnsi="Calibri" w:cs="Calibri"/>
           <w:color w:val="1A1A1A"/>
@@ -4181,7 +4183,7 @@
           <w:numId w:val="6"/>
         </w:numPr>
         <w:spacing w:before="100" w:beforeAutospacing="1" w:after="100" w:afterAutospacing="1"/>
-        <w:divId w:val="1625111436"/>
+        <w:divId w:val="1332218290"/>
         <w:rPr>
           <w:rFonts w:ascii="Calibri" w:eastAsia="Times New Roman" w:hAnsi="Calibri" w:cs="Calibri"/>
           <w:color w:val="1A1A1A"/>
@@ -4248,7 +4250,7 @@
           <w:numId w:val="6"/>
         </w:numPr>
         <w:spacing w:before="100" w:beforeAutospacing="1" w:after="100" w:afterAutospacing="1"/>
-        <w:divId w:val="1625111436"/>
+        <w:divId w:val="1332218290"/>
         <w:rPr>
           <w:rFonts w:ascii="Calibri" w:eastAsia="Times New Roman" w:hAnsi="Calibri" w:cs="Calibri"/>
           <w:color w:val="1A1A1A"/>
@@ -4295,7 +4297,7 @@
     <w:p>
       <w:pPr>
         <w:pStyle w:val="NormalWeb"/>
-        <w:divId w:val="1625111436"/>
+        <w:divId w:val="1332218290"/>
         <w:rPr>
           <w:rFonts w:ascii="Calibri" w:hAnsi="Calibri" w:cs="Calibri"/>
           <w:color w:val="1A1A1A"/>
@@ -4341,7 +4343,7 @@
     <w:p>
       <w:pPr>
         <w:pStyle w:val="Heading2"/>
-        <w:divId w:val="1625111436"/>
+        <w:divId w:val="1332218290"/>
         <w:rPr>
           <w:rFonts w:ascii="Calibri" w:eastAsia="Times New Roman" w:hAnsi="Calibri" w:cs="Calibri"/>
         </w:rPr>
@@ -4360,7 +4362,7 @@
           <w:numId w:val="7"/>
         </w:numPr>
         <w:spacing w:before="100" w:beforeAutospacing="1" w:after="100" w:afterAutospacing="1"/>
-        <w:divId w:val="1625111436"/>
+        <w:divId w:val="1332218290"/>
         <w:rPr>
           <w:rFonts w:ascii="Calibri" w:eastAsia="Times New Roman" w:hAnsi="Calibri" w:cs="Calibri"/>
           <w:color w:val="1A1A1A"/>
@@ -4443,7 +4445,7 @@
           <w:numId w:val="7"/>
         </w:numPr>
         <w:spacing w:before="100" w:beforeAutospacing="1" w:after="100" w:afterAutospacing="1"/>
-        <w:divId w:val="1625111436"/>
+        <w:divId w:val="1332218290"/>
         <w:rPr>
           <w:rFonts w:ascii="Calibri" w:eastAsia="Times New Roman" w:hAnsi="Calibri" w:cs="Calibri"/>
           <w:color w:val="1A1A1A"/>
@@ -4523,7 +4525,7 @@
           <w:numId w:val="7"/>
         </w:numPr>
         <w:spacing w:before="100" w:beforeAutospacing="1" w:after="100" w:afterAutospacing="1"/>
-        <w:divId w:val="1625111436"/>
+        <w:divId w:val="1332218290"/>
         <w:rPr>
           <w:rFonts w:ascii="Calibri" w:eastAsia="Times New Roman" w:hAnsi="Calibri" w:cs="Calibri"/>
           <w:color w:val="1A1A1A"/>
@@ -4551,7 +4553,7 @@
     <w:p>
       <w:pPr>
         <w:pStyle w:val="NormalWeb"/>
-        <w:divId w:val="1625111436"/>
+        <w:divId w:val="1332218290"/>
         <w:rPr>
           <w:rFonts w:ascii="Calibri" w:hAnsi="Calibri" w:cs="Calibri"/>
           <w:color w:val="1A1A1A"/>
@@ -4588,7 +4590,7 @@
     <w:p>
       <w:pPr>
         <w:pStyle w:val="Heading2"/>
-        <w:divId w:val="1625111436"/>
+        <w:divId w:val="1332218290"/>
         <w:rPr>
           <w:rFonts w:ascii="Calibri" w:eastAsia="Times New Roman" w:hAnsi="Calibri" w:cs="Calibri"/>
         </w:rPr>
@@ -4603,7 +4605,7 @@
     <w:p>
       <w:pPr>
         <w:pStyle w:val="NormalWeb"/>
-        <w:divId w:val="1625111436"/>
+        <w:divId w:val="1332218290"/>
         <w:rPr>
           <w:rFonts w:ascii="Calibri" w:hAnsi="Calibri" w:cs="Calibri"/>
           <w:color w:val="1A1A1A"/>
@@ -4651,7 +4653,7 @@
           <w:numId w:val="8"/>
         </w:numPr>
         <w:spacing w:before="100" w:beforeAutospacing="1" w:after="100" w:afterAutospacing="1"/>
-        <w:divId w:val="1625111436"/>
+        <w:divId w:val="1332218290"/>
         <w:rPr>
           <w:rFonts w:ascii="Calibri" w:eastAsia="Times New Roman" w:hAnsi="Calibri" w:cs="Calibri"/>
           <w:color w:val="1A1A1A"/>
@@ -4676,7 +4678,7 @@
           <w:numId w:val="8"/>
         </w:numPr>
         <w:spacing w:before="100" w:beforeAutospacing="1" w:after="100" w:afterAutospacing="1"/>
-        <w:divId w:val="1625111436"/>
+        <w:divId w:val="1332218290"/>
         <w:rPr>
           <w:rFonts w:ascii="Calibri" w:eastAsia="Times New Roman" w:hAnsi="Calibri" w:cs="Calibri"/>
           <w:color w:val="1A1A1A"/>
@@ -4749,7 +4751,7 @@
           <w:numId w:val="8"/>
         </w:numPr>
         <w:spacing w:before="100" w:beforeAutospacing="1" w:after="100" w:afterAutospacing="1"/>
-        <w:divId w:val="1625111436"/>
+        <w:divId w:val="1332218290"/>
         <w:rPr>
           <w:rFonts w:ascii="Calibri" w:eastAsia="Times New Roman" w:hAnsi="Calibri" w:cs="Calibri"/>
           <w:color w:val="1A1A1A"/>
@@ -4774,7 +4776,7 @@
           <w:numId w:val="8"/>
         </w:numPr>
         <w:spacing w:before="100" w:beforeAutospacing="1" w:after="100" w:afterAutospacing="1"/>
-        <w:divId w:val="1625111436"/>
+        <w:divId w:val="1332218290"/>
         <w:rPr>
           <w:rFonts w:ascii="Calibri" w:eastAsia="Times New Roman" w:hAnsi="Calibri" w:cs="Calibri"/>
           <w:color w:val="1A1A1A"/>
@@ -4850,7 +4852,7 @@
           <w:numId w:val="8"/>
         </w:numPr>
         <w:spacing w:before="100" w:beforeAutospacing="1" w:after="100" w:afterAutospacing="1"/>
-        <w:divId w:val="1625111436"/>
+        <w:divId w:val="1332218290"/>
         <w:rPr>
           <w:rFonts w:ascii="Calibri" w:eastAsia="Times New Roman" w:hAnsi="Calibri" w:cs="Calibri"/>
           <w:color w:val="1A1A1A"/>
@@ -4942,7 +4944,7 @@
           <w:numId w:val="8"/>
         </w:numPr>
         <w:spacing w:before="100" w:beforeAutospacing="1" w:after="100" w:afterAutospacing="1"/>
-        <w:divId w:val="1625111436"/>
+        <w:divId w:val="1332218290"/>
         <w:rPr>
           <w:rFonts w:ascii="Calibri" w:eastAsia="Times New Roman" w:hAnsi="Calibri" w:cs="Calibri"/>
           <w:color w:val="1A1A1A"/>
@@ -5005,7 +5007,7 @@
     <w:p>
       <w:pPr>
         <w:pStyle w:val="Heading2"/>
-        <w:divId w:val="1625111436"/>
+        <w:divId w:val="1332218290"/>
         <w:rPr>
           <w:rFonts w:ascii="Calibri" w:eastAsia="Times New Roman" w:hAnsi="Calibri" w:cs="Calibri"/>
         </w:rPr>
@@ -5020,7 +5022,7 @@
     <w:p>
       <w:pPr>
         <w:pStyle w:val="NormalWeb"/>
-        <w:divId w:val="1625111436"/>
+        <w:divId w:val="1332218290"/>
         <w:rPr>
           <w:rFonts w:ascii="Calibri" w:hAnsi="Calibri" w:cs="Calibri"/>
           <w:color w:val="1A1A1A"/>
@@ -5099,7 +5101,7 @@
           <w:numId w:val="9"/>
         </w:numPr>
         <w:spacing w:before="100" w:beforeAutospacing="1" w:after="100" w:afterAutospacing="1"/>
-        <w:divId w:val="1625111436"/>
+        <w:divId w:val="1332218290"/>
         <w:rPr>
           <w:rFonts w:ascii="Calibri" w:eastAsia="Times New Roman" w:hAnsi="Calibri" w:cs="Calibri"/>
           <w:color w:val="1A1A1A"/>
@@ -5188,7 +5190,7 @@
           <w:numId w:val="9"/>
         </w:numPr>
         <w:spacing w:before="100" w:beforeAutospacing="1" w:after="100" w:afterAutospacing="1"/>
-        <w:divId w:val="1625111436"/>
+        <w:divId w:val="1332218290"/>
         <w:rPr>
           <w:rFonts w:ascii="Calibri" w:eastAsia="Times New Roman" w:hAnsi="Calibri" w:cs="Calibri"/>
           <w:color w:val="1A1A1A"/>
@@ -5238,7 +5240,7 @@
     <w:p>
       <w:pPr>
         <w:pStyle w:val="NormalWeb"/>
-        <w:divId w:val="1625111436"/>
+        <w:divId w:val="1332218290"/>
         <w:rPr>
           <w:rFonts w:ascii="Calibri" w:hAnsi="Calibri" w:cs="Calibri"/>
           <w:color w:val="1A1A1A"/>
@@ -5259,7 +5261,7 @@
     <w:p>
       <w:pPr>
         <w:pStyle w:val="Heading2"/>
-        <w:divId w:val="1625111436"/>
+        <w:divId w:val="1332218290"/>
         <w:rPr>
           <w:rFonts w:ascii="Calibri" w:eastAsia="Times New Roman" w:hAnsi="Calibri" w:cs="Calibri"/>
         </w:rPr>
@@ -5289,7 +5291,7 @@
       </w:tblGrid>
       <w:tr>
         <w:trPr>
-          <w:divId w:val="1625111436"/>
+          <w:divId w:val="1332218290"/>
           <w:tblHeader/>
         </w:trPr>
         <w:tc>
@@ -5424,7 +5426,7 @@
       </w:tr>
       <w:tr>
         <w:trPr>
-          <w:divId w:val="1625111436"/>
+          <w:divId w:val="1332218290"/>
         </w:trPr>
         <w:tc>
           <w:tcPr>
@@ -5566,7 +5568,7 @@
       </w:tr>
       <w:tr>
         <w:trPr>
-          <w:divId w:val="1625111436"/>
+          <w:divId w:val="1332218290"/>
         </w:trPr>
         <w:tc>
           <w:tcPr>
@@ -5683,7 +5685,7 @@
       </w:tr>
       <w:tr>
         <w:trPr>
-          <w:divId w:val="1625111436"/>
+          <w:divId w:val="1332218290"/>
         </w:trPr>
         <w:tc>
           <w:tcPr>
@@ -5809,7 +5811,7 @@
       </w:tr>
       <w:tr>
         <w:trPr>
-          <w:divId w:val="1625111436"/>
+          <w:divId w:val="1332218290"/>
         </w:trPr>
         <w:tc>
           <w:tcPr>
@@ -5924,7 +5926,7 @@
       </w:tr>
       <w:tr>
         <w:trPr>
-          <w:divId w:val="1625111436"/>
+          <w:divId w:val="1332218290"/>
         </w:trPr>
         <w:tc>
           <w:tcPr>
@@ -6050,7 +6052,7 @@
       </w:tr>
       <w:tr>
         <w:trPr>
-          <w:divId w:val="1625111436"/>
+          <w:divId w:val="1332218290"/>
         </w:trPr>
         <w:tc>
           <w:tcPr>
@@ -6165,7 +6167,7 @@
       </w:tr>
       <w:tr>
         <w:trPr>
-          <w:divId w:val="1625111436"/>
+          <w:divId w:val="1332218290"/>
         </w:trPr>
         <w:tc>
           <w:tcPr>
@@ -6280,7 +6282,7 @@
       </w:tr>
       <w:tr>
         <w:trPr>
-          <w:divId w:val="1625111436"/>
+          <w:divId w:val="1332218290"/>
         </w:trPr>
         <w:tc>
           <w:tcPr>
@@ -6406,7 +6408,7 @@
       </w:tr>
       <w:tr>
         <w:trPr>
-          <w:divId w:val="1625111436"/>
+          <w:divId w:val="1332218290"/>
         </w:trPr>
         <w:tc>
           <w:tcPr>
@@ -6525,7 +6527,7 @@
       </w:tr>
       <w:tr>
         <w:trPr>
-          <w:divId w:val="1625111436"/>
+          <w:divId w:val="1332218290"/>
         </w:trPr>
         <w:tc>
           <w:tcPr>
@@ -6644,7 +6646,7 @@
       </w:tr>
       <w:tr>
         <w:trPr>
-          <w:divId w:val="1625111436"/>
+          <w:divId w:val="1332218290"/>
         </w:trPr>
         <w:tc>
           <w:tcPr>
@@ -6852,7 +6854,7 @@
     <w:p>
       <w:pPr>
         <w:pStyle w:val="Heading2"/>
-        <w:divId w:val="1625111436"/>
+        <w:divId w:val="1332218290"/>
         <w:rPr>
           <w:rFonts w:ascii="Calibri" w:eastAsia="Times New Roman" w:hAnsi="Calibri" w:cs="Calibri"/>
         </w:rPr>
@@ -6867,7 +6869,7 @@
     <w:p>
       <w:pPr>
         <w:pStyle w:val="NormalWeb"/>
-        <w:divId w:val="1625111436"/>
+        <w:divId w:val="1332218290"/>
         <w:rPr>
           <w:rFonts w:ascii="Calibri" w:hAnsi="Calibri" w:cs="Calibri"/>
           <w:color w:val="1A1A1A"/>
@@ -6888,7 +6890,7 @@
     <w:p>
       <w:pPr>
         <w:pStyle w:val="Heading3"/>
-        <w:divId w:val="1625111436"/>
+        <w:divId w:val="1332218290"/>
         <w:rPr>
           <w:rFonts w:ascii="Calibri" w:eastAsia="Times New Roman" w:hAnsi="Calibri" w:cs="Calibri"/>
         </w:rPr>
@@ -6915,7 +6917,7 @@
     <w:p>
       <w:pPr>
         <w:pStyle w:val="HTMLPreformatted"/>
-        <w:divId w:val="1625111436"/>
+        <w:divId w:val="1332218290"/>
         <w:rPr>
           <w:rStyle w:val="HTMLCode"/>
           <w:color w:val="1A1A1A"/>
@@ -6932,7 +6934,7 @@
     <w:p>
       <w:pPr>
         <w:pStyle w:val="HTMLPreformatted"/>
-        <w:divId w:val="1625111436"/>
+        <w:divId w:val="1332218290"/>
         <w:rPr>
           <w:rStyle w:val="HTMLCode"/>
           <w:color w:val="1A1A1A"/>
@@ -6949,7 +6951,7 @@
     <w:p>
       <w:pPr>
         <w:pStyle w:val="HTMLPreformatted"/>
-        <w:divId w:val="1625111436"/>
+        <w:divId w:val="1332218290"/>
         <w:rPr>
           <w:rStyle w:val="HTMLCode"/>
           <w:color w:val="1A1A1A"/>
@@ -6973,7 +6975,7 @@
     <w:p>
       <w:pPr>
         <w:pStyle w:val="HTMLPreformatted"/>
-        <w:divId w:val="1625111436"/>
+        <w:divId w:val="1332218290"/>
         <w:rPr>
           <w:rStyle w:val="HTMLCode"/>
           <w:color w:val="1A1A1A"/>
@@ -6990,7 +6992,7 @@
     <w:p>
       <w:pPr>
         <w:pStyle w:val="HTMLPreformatted"/>
-        <w:divId w:val="1625111436"/>
+        <w:divId w:val="1332218290"/>
         <w:rPr>
           <w:rStyle w:val="HTMLCode"/>
           <w:color w:val="1A1A1A"/>
@@ -7007,7 +7009,7 @@
     <w:p>
       <w:pPr>
         <w:pStyle w:val="HTMLPreformatted"/>
-        <w:divId w:val="1625111436"/>
+        <w:divId w:val="1332218290"/>
         <w:rPr>
           <w:rStyle w:val="HTMLCode"/>
           <w:color w:val="1A1A1A"/>
@@ -7017,7 +7019,7 @@
     <w:p>
       <w:pPr>
         <w:pStyle w:val="HTMLPreformatted"/>
-        <w:divId w:val="1625111436"/>
+        <w:divId w:val="1332218290"/>
         <w:rPr>
           <w:rStyle w:val="HTMLCode"/>
           <w:color w:val="1A1A1A"/>
@@ -7034,7 +7036,7 @@
     <w:p>
       <w:pPr>
         <w:pStyle w:val="HTMLPreformatted"/>
-        <w:divId w:val="1625111436"/>
+        <w:divId w:val="1332218290"/>
         <w:rPr>
           <w:rStyle w:val="HTMLCode"/>
           <w:color w:val="1A1A1A"/>
@@ -7051,7 +7053,7 @@
     <w:p>
       <w:pPr>
         <w:pStyle w:val="HTMLPreformatted"/>
-        <w:divId w:val="1625111436"/>
+        <w:divId w:val="1332218290"/>
         <w:rPr>
           <w:rStyle w:val="HTMLCode"/>
           <w:color w:val="1A1A1A"/>
@@ -7068,7 +7070,7 @@
     <w:p>
       <w:pPr>
         <w:pStyle w:val="HTMLPreformatted"/>
-        <w:divId w:val="1625111436"/>
+        <w:divId w:val="1332218290"/>
         <w:rPr>
           <w:rStyle w:val="HTMLCode"/>
           <w:color w:val="1A1A1A"/>
@@ -7085,7 +7087,7 @@
     <w:p>
       <w:pPr>
         <w:pStyle w:val="HTMLPreformatted"/>
-        <w:divId w:val="1625111436"/>
+        <w:divId w:val="1332218290"/>
         <w:rPr>
           <w:rStyle w:val="HTMLCode"/>
           <w:color w:val="1A1A1A"/>
@@ -7102,7 +7104,7 @@
     <w:p>
       <w:pPr>
         <w:pStyle w:val="HTMLPreformatted"/>
-        <w:divId w:val="1625111436"/>
+        <w:divId w:val="1332218290"/>
         <w:rPr>
           <w:rStyle w:val="HTMLCode"/>
           <w:color w:val="1A1A1A"/>
@@ -7119,7 +7121,7 @@
     <w:p>
       <w:pPr>
         <w:pStyle w:val="HTMLPreformatted"/>
-        <w:divId w:val="1625111436"/>
+        <w:divId w:val="1332218290"/>
         <w:rPr>
           <w:rStyle w:val="HTMLCode"/>
           <w:color w:val="1A1A1A"/>
@@ -7136,7 +7138,7 @@
     <w:p>
       <w:pPr>
         <w:pStyle w:val="HTMLPreformatted"/>
-        <w:divId w:val="1625111436"/>
+        <w:divId w:val="1332218290"/>
         <w:rPr>
           <w:rStyle w:val="HTMLCode"/>
           <w:color w:val="1A1A1A"/>
@@ -7153,7 +7155,7 @@
     <w:p>
       <w:pPr>
         <w:pStyle w:val="HTMLPreformatted"/>
-        <w:divId w:val="1625111436"/>
+        <w:divId w:val="1332218290"/>
         <w:rPr>
           <w:color w:val="1A1A1A"/>
         </w:rPr>
@@ -7169,7 +7171,7 @@
     <w:p>
       <w:pPr>
         <w:pStyle w:val="Heading3"/>
-        <w:divId w:val="1625111436"/>
+        <w:divId w:val="1332218290"/>
         <w:rPr>
           <w:rFonts w:ascii="Calibri" w:eastAsia="Times New Roman" w:hAnsi="Calibri" w:cs="Calibri"/>
         </w:rPr>
@@ -7196,7 +7198,7 @@
     <w:p>
       <w:pPr>
         <w:pStyle w:val="HTMLPreformatted"/>
-        <w:divId w:val="1625111436"/>
+        <w:divId w:val="1332218290"/>
         <w:rPr>
           <w:rStyle w:val="HTMLCode"/>
           <w:color w:val="1A1A1A"/>
@@ -7213,7 +7215,7 @@
     <w:p>
       <w:pPr>
         <w:pStyle w:val="HTMLPreformatted"/>
-        <w:divId w:val="1625111436"/>
+        <w:divId w:val="1332218290"/>
         <w:rPr>
           <w:rStyle w:val="HTMLCode"/>
           <w:color w:val="1A1A1A"/>
@@ -7230,7 +7232,7 @@
     <w:p>
       <w:pPr>
         <w:pStyle w:val="HTMLPreformatted"/>
-        <w:divId w:val="1625111436"/>
+        <w:divId w:val="1332218290"/>
         <w:rPr>
           <w:rStyle w:val="HTMLCode"/>
           <w:color w:val="1A1A1A"/>
@@ -7247,7 +7249,7 @@
     <w:p>
       <w:pPr>
         <w:pStyle w:val="HTMLPreformatted"/>
-        <w:divId w:val="1625111436"/>
+        <w:divId w:val="1332218290"/>
         <w:rPr>
           <w:rStyle w:val="HTMLCode"/>
           <w:color w:val="1A1A1A"/>
@@ -7264,7 +7266,7 @@
     <w:p>
       <w:pPr>
         <w:pStyle w:val="HTMLPreformatted"/>
-        <w:divId w:val="1625111436"/>
+        <w:divId w:val="1332218290"/>
         <w:rPr>
           <w:rStyle w:val="HTMLCode"/>
           <w:color w:val="1A1A1A"/>
@@ -7281,7 +7283,7 @@
     <w:p>
       <w:pPr>
         <w:pStyle w:val="HTMLPreformatted"/>
-        <w:divId w:val="1625111436"/>
+        <w:divId w:val="1332218290"/>
         <w:rPr>
           <w:rStyle w:val="HTMLCode"/>
           <w:color w:val="1A1A1A"/>
@@ -7298,7 +7300,7 @@
     <w:p>
       <w:pPr>
         <w:pStyle w:val="HTMLPreformatted"/>
-        <w:divId w:val="1625111436"/>
+        <w:divId w:val="1332218290"/>
         <w:rPr>
           <w:rStyle w:val="HTMLCode"/>
           <w:color w:val="1A1A1A"/>
@@ -7315,7 +7317,7 @@
     <w:p>
       <w:pPr>
         <w:pStyle w:val="HTMLPreformatted"/>
-        <w:divId w:val="1625111436"/>
+        <w:divId w:val="1332218290"/>
         <w:rPr>
           <w:color w:val="1A1A1A"/>
         </w:rPr>
@@ -7331,7 +7333,7 @@
     <w:p>
       <w:pPr>
         <w:pStyle w:val="Heading3"/>
-        <w:divId w:val="1625111436"/>
+        <w:divId w:val="1332218290"/>
         <w:rPr>
           <w:rFonts w:ascii="Calibri" w:eastAsia="Times New Roman" w:hAnsi="Calibri" w:cs="Calibri"/>
         </w:rPr>
@@ -7358,7 +7360,7 @@
     <w:p>
       <w:pPr>
         <w:pStyle w:val="HTMLPreformatted"/>
-        <w:divId w:val="1625111436"/>
+        <w:divId w:val="1332218290"/>
         <w:rPr>
           <w:rStyle w:val="HTMLCode"/>
           <w:color w:val="1A1A1A"/>
@@ -7375,7 +7377,7 @@
     <w:p>
       <w:pPr>
         <w:pStyle w:val="HTMLPreformatted"/>
-        <w:divId w:val="1625111436"/>
+        <w:divId w:val="1332218290"/>
         <w:rPr>
           <w:rStyle w:val="HTMLCode"/>
           <w:color w:val="1A1A1A"/>
@@ -7392,7 +7394,7 @@
     <w:p>
       <w:pPr>
         <w:pStyle w:val="HTMLPreformatted"/>
-        <w:divId w:val="1625111436"/>
+        <w:divId w:val="1332218290"/>
         <w:rPr>
           <w:rStyle w:val="HTMLCode"/>
           <w:color w:val="1A1A1A"/>
@@ -7416,7 +7418,7 @@
     <w:p>
       <w:pPr>
         <w:pStyle w:val="HTMLPreformatted"/>
-        <w:divId w:val="1625111436"/>
+        <w:divId w:val="1332218290"/>
         <w:rPr>
           <w:rStyle w:val="HTMLCode"/>
           <w:color w:val="1A1A1A"/>
@@ -7433,7 +7435,7 @@
     <w:p>
       <w:pPr>
         <w:pStyle w:val="HTMLPreformatted"/>
-        <w:divId w:val="1625111436"/>
+        <w:divId w:val="1332218290"/>
         <w:rPr>
           <w:rStyle w:val="HTMLCode"/>
           <w:color w:val="1A1A1A"/>
@@ -7450,7 +7452,7 @@
     <w:p>
       <w:pPr>
         <w:pStyle w:val="HTMLPreformatted"/>
-        <w:divId w:val="1625111436"/>
+        <w:divId w:val="1332218290"/>
         <w:rPr>
           <w:rStyle w:val="HTMLCode"/>
           <w:color w:val="1A1A1A"/>
@@ -7467,7 +7469,7 @@
     <w:p>
       <w:pPr>
         <w:pStyle w:val="HTMLPreformatted"/>
-        <w:divId w:val="1625111436"/>
+        <w:divId w:val="1332218290"/>
         <w:rPr>
           <w:color w:val="1A1A1A"/>
         </w:rPr>
@@ -7483,7 +7485,7 @@
     <w:p>
       <w:pPr>
         <w:pStyle w:val="Heading3"/>
-        <w:divId w:val="1625111436"/>
+        <w:divId w:val="1332218290"/>
         <w:rPr>
           <w:rFonts w:ascii="Calibri" w:eastAsia="Times New Roman" w:hAnsi="Calibri" w:cs="Calibri"/>
         </w:rPr>
@@ -7510,7 +7512,7 @@
     <w:p>
       <w:pPr>
         <w:pStyle w:val="HTMLPreformatted"/>
-        <w:divId w:val="1625111436"/>
+        <w:divId w:val="1332218290"/>
         <w:rPr>
           <w:rStyle w:val="HTMLCode"/>
           <w:color w:val="1A1A1A"/>
@@ -7527,7 +7529,7 @@
     <w:p>
       <w:pPr>
         <w:pStyle w:val="HTMLPreformatted"/>
-        <w:divId w:val="1625111436"/>
+        <w:divId w:val="1332218290"/>
         <w:rPr>
           <w:rStyle w:val="HTMLCode"/>
           <w:color w:val="1A1A1A"/>
@@ -7537,7 +7539,7 @@
     <w:p>
       <w:pPr>
         <w:pStyle w:val="HTMLPreformatted"/>
-        <w:divId w:val="1625111436"/>
+        <w:divId w:val="1332218290"/>
         <w:rPr>
           <w:rStyle w:val="HTMLCode"/>
           <w:color w:val="1A1A1A"/>
@@ -7554,7 +7556,7 @@
     <w:p>
       <w:pPr>
         <w:pStyle w:val="HTMLPreformatted"/>
-        <w:divId w:val="1625111436"/>
+        <w:divId w:val="1332218290"/>
         <w:rPr>
           <w:rStyle w:val="HTMLCode"/>
           <w:color w:val="1A1A1A"/>
@@ -7571,7 +7573,7 @@
     <w:p>
       <w:pPr>
         <w:pStyle w:val="HTMLPreformatted"/>
-        <w:divId w:val="1625111436"/>
+        <w:divId w:val="1332218290"/>
         <w:rPr>
           <w:rStyle w:val="HTMLCode"/>
           <w:color w:val="1A1A1A"/>
@@ -7588,7 +7590,7 @@
     <w:p>
       <w:pPr>
         <w:pStyle w:val="HTMLPreformatted"/>
-        <w:divId w:val="1625111436"/>
+        <w:divId w:val="1332218290"/>
         <w:rPr>
           <w:rStyle w:val="HTMLCode"/>
           <w:color w:val="1A1A1A"/>
@@ -7605,7 +7607,7 @@
     <w:p>
       <w:pPr>
         <w:pStyle w:val="HTMLPreformatted"/>
-        <w:divId w:val="1625111436"/>
+        <w:divId w:val="1332218290"/>
         <w:rPr>
           <w:rStyle w:val="HTMLCode"/>
           <w:color w:val="1A1A1A"/>
@@ -7622,7 +7624,7 @@
     <w:p>
       <w:pPr>
         <w:pStyle w:val="HTMLPreformatted"/>
-        <w:divId w:val="1625111436"/>
+        <w:divId w:val="1332218290"/>
         <w:rPr>
           <w:rStyle w:val="HTMLCode"/>
           <w:color w:val="1A1A1A"/>
@@ -7646,7 +7648,7 @@
     <w:p>
       <w:pPr>
         <w:pStyle w:val="HTMLPreformatted"/>
-        <w:divId w:val="1625111436"/>
+        <w:divId w:val="1332218290"/>
         <w:rPr>
           <w:rStyle w:val="HTMLCode"/>
           <w:color w:val="1A1A1A"/>
@@ -7663,7 +7665,7 @@
     <w:p>
       <w:pPr>
         <w:pStyle w:val="HTMLPreformatted"/>
-        <w:divId w:val="1625111436"/>
+        <w:divId w:val="1332218290"/>
         <w:rPr>
           <w:rStyle w:val="HTMLCode"/>
           <w:color w:val="1A1A1A"/>
@@ -7673,7 +7675,7 @@
     <w:p>
       <w:pPr>
         <w:pStyle w:val="HTMLPreformatted"/>
-        <w:divId w:val="1625111436"/>
+        <w:divId w:val="1332218290"/>
         <w:rPr>
           <w:rStyle w:val="HTMLCode"/>
           <w:color w:val="1A1A1A"/>
@@ -7690,7 +7692,7 @@
     <w:p>
       <w:pPr>
         <w:pStyle w:val="HTMLPreformatted"/>
-        <w:divId w:val="1625111436"/>
+        <w:divId w:val="1332218290"/>
         <w:rPr>
           <w:rStyle w:val="HTMLCode"/>
           <w:color w:val="1A1A1A"/>
@@ -7707,7 +7709,7 @@
     <w:p>
       <w:pPr>
         <w:pStyle w:val="HTMLPreformatted"/>
-        <w:divId w:val="1625111436"/>
+        <w:divId w:val="1332218290"/>
         <w:rPr>
           <w:rStyle w:val="HTMLCode"/>
           <w:color w:val="1A1A1A"/>
@@ -7724,7 +7726,7 @@
     <w:p>
       <w:pPr>
         <w:pStyle w:val="HTMLPreformatted"/>
-        <w:divId w:val="1625111436"/>
+        <w:divId w:val="1332218290"/>
         <w:rPr>
           <w:rStyle w:val="HTMLCode"/>
           <w:color w:val="1A1A1A"/>
@@ -7741,7 +7743,7 @@
     <w:p>
       <w:pPr>
         <w:pStyle w:val="HTMLPreformatted"/>
-        <w:divId w:val="1625111436"/>
+        <w:divId w:val="1332218290"/>
         <w:rPr>
           <w:color w:val="1A1A1A"/>
         </w:rPr>
@@ -7757,7 +7759,7 @@
     <w:p>
       <w:pPr>
         <w:pStyle w:val="Heading3"/>
-        <w:divId w:val="1625111436"/>
+        <w:divId w:val="1332218290"/>
         <w:rPr>
           <w:rFonts w:ascii="Calibri" w:eastAsia="Times New Roman" w:hAnsi="Calibri" w:cs="Calibri"/>
         </w:rPr>
@@ -7784,7 +7786,7 @@
     <w:p>
       <w:pPr>
         <w:pStyle w:val="HTMLPreformatted"/>
-        <w:divId w:val="1625111436"/>
+        <w:divId w:val="1332218290"/>
         <w:rPr>
           <w:rStyle w:val="HTMLCode"/>
           <w:color w:val="1A1A1A"/>
@@ -7801,7 +7803,7 @@
     <w:p>
       <w:pPr>
         <w:pStyle w:val="HTMLPreformatted"/>
-        <w:divId w:val="1625111436"/>
+        <w:divId w:val="1332218290"/>
         <w:rPr>
           <w:rStyle w:val="HTMLCode"/>
           <w:color w:val="1A1A1A"/>
@@ -7818,7 +7820,7 @@
     <w:p>
       <w:pPr>
         <w:pStyle w:val="HTMLPreformatted"/>
-        <w:divId w:val="1625111436"/>
+        <w:divId w:val="1332218290"/>
         <w:rPr>
           <w:rStyle w:val="HTMLCode"/>
           <w:color w:val="1A1A1A"/>
@@ -7835,7 +7837,7 @@
     <w:p>
       <w:pPr>
         <w:pStyle w:val="HTMLPreformatted"/>
-        <w:divId w:val="1625111436"/>
+        <w:divId w:val="1332218290"/>
         <w:rPr>
           <w:rStyle w:val="HTMLCode"/>
           <w:color w:val="1A1A1A"/>
@@ -7852,7 +7854,7 @@
     <w:p>
       <w:pPr>
         <w:pStyle w:val="HTMLPreformatted"/>
-        <w:divId w:val="1625111436"/>
+        <w:divId w:val="1332218290"/>
         <w:rPr>
           <w:rStyle w:val="HTMLCode"/>
           <w:color w:val="1A1A1A"/>
@@ -7869,7 +7871,7 @@
     <w:p>
       <w:pPr>
         <w:pStyle w:val="HTMLPreformatted"/>
-        <w:divId w:val="1625111436"/>
+        <w:divId w:val="1332218290"/>
         <w:rPr>
           <w:rStyle w:val="HTMLCode"/>
           <w:color w:val="1A1A1A"/>
@@ -7879,7 +7881,7 @@
     <w:p>
       <w:pPr>
         <w:pStyle w:val="HTMLPreformatted"/>
-        <w:divId w:val="1625111436"/>
+        <w:divId w:val="1332218290"/>
         <w:rPr>
           <w:rStyle w:val="HTMLCode"/>
           <w:color w:val="1A1A1A"/>
@@ -7896,7 +7898,7 @@
     <w:p>
       <w:pPr>
         <w:pStyle w:val="HTMLPreformatted"/>
-        <w:divId w:val="1625111436"/>
+        <w:divId w:val="1332218290"/>
         <w:rPr>
           <w:rStyle w:val="HTMLCode"/>
           <w:color w:val="1A1A1A"/>
@@ -7913,7 +7915,7 @@
     <w:p>
       <w:pPr>
         <w:pStyle w:val="HTMLPreformatted"/>
-        <w:divId w:val="1625111436"/>
+        <w:divId w:val="1332218290"/>
         <w:rPr>
           <w:color w:val="1A1A1A"/>
         </w:rPr>
@@ -7929,7 +7931,7 @@
     <w:p>
       <w:pPr>
         <w:pStyle w:val="Heading3"/>
-        <w:divId w:val="1625111436"/>
+        <w:divId w:val="1332218290"/>
         <w:rPr>
           <w:rFonts w:ascii="Calibri" w:eastAsia="Times New Roman" w:hAnsi="Calibri" w:cs="Calibri"/>
         </w:rPr>
@@ -7956,7 +7958,7 @@
     <w:p>
       <w:pPr>
         <w:pStyle w:val="HTMLPreformatted"/>
-        <w:divId w:val="1625111436"/>
+        <w:divId w:val="1332218290"/>
         <w:rPr>
           <w:rStyle w:val="HTMLCode"/>
           <w:color w:val="1A1A1A"/>
@@ -7973,7 +7975,7 @@
     <w:p>
       <w:pPr>
         <w:pStyle w:val="HTMLPreformatted"/>
-        <w:divId w:val="1625111436"/>
+        <w:divId w:val="1332218290"/>
         <w:rPr>
           <w:rStyle w:val="HTMLCode"/>
           <w:color w:val="1A1A1A"/>
@@ -7990,7 +7992,7 @@
     <w:p>
       <w:pPr>
         <w:pStyle w:val="HTMLPreformatted"/>
-        <w:divId w:val="1625111436"/>
+        <w:divId w:val="1332218290"/>
         <w:rPr>
           <w:rStyle w:val="HTMLCode"/>
           <w:color w:val="1A1A1A"/>
@@ -8007,7 +8009,7 @@
     <w:p>
       <w:pPr>
         <w:pStyle w:val="HTMLPreformatted"/>
-        <w:divId w:val="1625111436"/>
+        <w:divId w:val="1332218290"/>
         <w:rPr>
           <w:rStyle w:val="HTMLCode"/>
           <w:color w:val="1A1A1A"/>
@@ -8017,7 +8019,7 @@
     <w:p>
       <w:pPr>
         <w:pStyle w:val="HTMLPreformatted"/>
-        <w:divId w:val="1625111436"/>
+        <w:divId w:val="1332218290"/>
         <w:rPr>
           <w:rStyle w:val="HTMLCode"/>
           <w:color w:val="1A1A1A"/>
@@ -8034,7 +8036,7 @@
     <w:p>
       <w:pPr>
         <w:pStyle w:val="HTMLPreformatted"/>
-        <w:divId w:val="1625111436"/>
+        <w:divId w:val="1332218290"/>
         <w:rPr>
           <w:rStyle w:val="HTMLCode"/>
           <w:color w:val="1A1A1A"/>
@@ -8051,7 +8053,7 @@
     <w:p>
       <w:pPr>
         <w:pStyle w:val="HTMLPreformatted"/>
-        <w:divId w:val="1625111436"/>
+        <w:divId w:val="1332218290"/>
         <w:rPr>
           <w:rStyle w:val="HTMLCode"/>
           <w:color w:val="1A1A1A"/>
@@ -8068,7 +8070,7 @@
     <w:p>
       <w:pPr>
         <w:pStyle w:val="HTMLPreformatted"/>
-        <w:divId w:val="1625111436"/>
+        <w:divId w:val="1332218290"/>
         <w:rPr>
           <w:rStyle w:val="HTMLCode"/>
           <w:color w:val="1A1A1A"/>
@@ -8085,7 +8087,7 @@
     <w:p>
       <w:pPr>
         <w:pStyle w:val="HTMLPreformatted"/>
-        <w:divId w:val="1625111436"/>
+        <w:divId w:val="1332218290"/>
         <w:rPr>
           <w:rStyle w:val="HTMLCode"/>
           <w:color w:val="1A1A1A"/>
@@ -8102,7 +8104,7 @@
     <w:p>
       <w:pPr>
         <w:pStyle w:val="HTMLPreformatted"/>
-        <w:divId w:val="1625111436"/>
+        <w:divId w:val="1332218290"/>
         <w:rPr>
           <w:rStyle w:val="HTMLCode"/>
           <w:color w:val="1A1A1A"/>
@@ -8119,7 +8121,7 @@
     <w:p>
       <w:pPr>
         <w:pStyle w:val="HTMLPreformatted"/>
-        <w:divId w:val="1625111436"/>
+        <w:divId w:val="1332218290"/>
         <w:rPr>
           <w:rStyle w:val="HTMLCode"/>
           <w:color w:val="1A1A1A"/>
@@ -8129,7 +8131,7 @@
     <w:p>
       <w:pPr>
         <w:pStyle w:val="HTMLPreformatted"/>
-        <w:divId w:val="1625111436"/>
+        <w:divId w:val="1332218290"/>
         <w:rPr>
           <w:rStyle w:val="HTMLCode"/>
           <w:color w:val="1A1A1A"/>
@@ -8153,7 +8155,7 @@
     <w:p>
       <w:pPr>
         <w:pStyle w:val="HTMLPreformatted"/>
-        <w:divId w:val="1625111436"/>
+        <w:divId w:val="1332218290"/>
         <w:rPr>
           <w:rStyle w:val="HTMLCode"/>
           <w:color w:val="1A1A1A"/>
@@ -8170,7 +8172,7 @@
     <w:p>
       <w:pPr>
         <w:pStyle w:val="HTMLPreformatted"/>
-        <w:divId w:val="1625111436"/>
+        <w:divId w:val="1332218290"/>
         <w:rPr>
           <w:rStyle w:val="HTMLCode"/>
           <w:color w:val="1A1A1A"/>
@@ -8187,7 +8189,7 @@
     <w:p>
       <w:pPr>
         <w:pStyle w:val="HTMLPreformatted"/>
-        <w:divId w:val="1625111436"/>
+        <w:divId w:val="1332218290"/>
         <w:rPr>
           <w:rStyle w:val="HTMLCode"/>
           <w:color w:val="1A1A1A"/>
@@ -8204,7 +8206,7 @@
     <w:p>
       <w:pPr>
         <w:pStyle w:val="HTMLPreformatted"/>
-        <w:divId w:val="1625111436"/>
+        <w:divId w:val="1332218290"/>
         <w:rPr>
           <w:rStyle w:val="HTMLCode"/>
           <w:color w:val="1A1A1A"/>
@@ -8221,7 +8223,7 @@
     <w:p>
       <w:pPr>
         <w:pStyle w:val="HTMLPreformatted"/>
-        <w:divId w:val="1625111436"/>
+        <w:divId w:val="1332218290"/>
         <w:rPr>
           <w:rStyle w:val="HTMLCode"/>
           <w:color w:val="1A1A1A"/>
@@ -8238,7 +8240,7 @@
     <w:p>
       <w:pPr>
         <w:pStyle w:val="HTMLPreformatted"/>
-        <w:divId w:val="1625111436"/>
+        <w:divId w:val="1332218290"/>
         <w:rPr>
           <w:rStyle w:val="HTMLCode"/>
           <w:color w:val="1A1A1A"/>
@@ -8255,7 +8257,7 @@
     <w:p>
       <w:pPr>
         <w:pStyle w:val="HTMLPreformatted"/>
-        <w:divId w:val="1625111436"/>
+        <w:divId w:val="1332218290"/>
         <w:rPr>
           <w:rStyle w:val="HTMLCode"/>
           <w:color w:val="1A1A1A"/>
@@ -8265,7 +8267,7 @@
     <w:p>
       <w:pPr>
         <w:pStyle w:val="HTMLPreformatted"/>
-        <w:divId w:val="1625111436"/>
+        <w:divId w:val="1332218290"/>
         <w:rPr>
           <w:rStyle w:val="HTMLCode"/>
           <w:color w:val="1A1A1A"/>
@@ -8282,7 +8284,7 @@
     <w:p>
       <w:pPr>
         <w:pStyle w:val="HTMLPreformatted"/>
-        <w:divId w:val="1625111436"/>
+        <w:divId w:val="1332218290"/>
         <w:rPr>
           <w:rStyle w:val="HTMLCode"/>
           <w:color w:val="1A1A1A"/>
@@ -8299,7 +8301,7 @@
     <w:p>
       <w:pPr>
         <w:pStyle w:val="HTMLPreformatted"/>
-        <w:divId w:val="1625111436"/>
+        <w:divId w:val="1332218290"/>
         <w:rPr>
           <w:rStyle w:val="HTMLCode"/>
           <w:color w:val="1A1A1A"/>
@@ -8316,7 +8318,7 @@
     <w:p>
       <w:pPr>
         <w:pStyle w:val="HTMLPreformatted"/>
-        <w:divId w:val="1625111436"/>
+        <w:divId w:val="1332218290"/>
         <w:rPr>
           <w:color w:val="1A1A1A"/>
         </w:rPr>
@@ -8332,7 +8334,7 @@
     <w:p>
       <w:pPr>
         <w:pStyle w:val="Heading3"/>
-        <w:divId w:val="1625111436"/>
+        <w:divId w:val="1332218290"/>
         <w:rPr>
           <w:rFonts w:ascii="Calibri" w:eastAsia="Times New Roman" w:hAnsi="Calibri" w:cs="Calibri"/>
         </w:rPr>
@@ -8359,7 +8361,7 @@
     <w:p>
       <w:pPr>
         <w:pStyle w:val="HTMLPreformatted"/>
-        <w:divId w:val="1625111436"/>
+        <w:divId w:val="1332218290"/>
         <w:rPr>
           <w:rStyle w:val="HTMLCode"/>
           <w:color w:val="1A1A1A"/>
@@ -8383,7 +8385,7 @@
     <w:p>
       <w:pPr>
         <w:pStyle w:val="HTMLPreformatted"/>
-        <w:divId w:val="1625111436"/>
+        <w:divId w:val="1332218290"/>
         <w:rPr>
           <w:rStyle w:val="HTMLCode"/>
           <w:color w:val="1A1A1A"/>
@@ -8400,7 +8402,7 @@
     <w:p>
       <w:pPr>
         <w:pStyle w:val="HTMLPreformatted"/>
-        <w:divId w:val="1625111436"/>
+        <w:divId w:val="1332218290"/>
         <w:rPr>
           <w:rStyle w:val="HTMLCode"/>
           <w:color w:val="1A1A1A"/>
@@ -8417,7 +8419,7 @@
     <w:p>
       <w:pPr>
         <w:pStyle w:val="HTMLPreformatted"/>
-        <w:divId w:val="1625111436"/>
+        <w:divId w:val="1332218290"/>
         <w:rPr>
           <w:rStyle w:val="HTMLCode"/>
           <w:color w:val="1A1A1A"/>
@@ -8434,7 +8436,7 @@
     <w:p>
       <w:pPr>
         <w:pStyle w:val="HTMLPreformatted"/>
-        <w:divId w:val="1625111436"/>
+        <w:divId w:val="1332218290"/>
         <w:rPr>
           <w:rStyle w:val="HTMLCode"/>
           <w:color w:val="1A1A1A"/>
@@ -8451,7 +8453,7 @@
     <w:p>
       <w:pPr>
         <w:pStyle w:val="HTMLPreformatted"/>
-        <w:divId w:val="1625111436"/>
+        <w:divId w:val="1332218290"/>
         <w:rPr>
           <w:rStyle w:val="HTMLCode"/>
           <w:color w:val="1A1A1A"/>
@@ -8468,7 +8470,7 @@
     <w:p>
       <w:pPr>
         <w:pStyle w:val="HTMLPreformatted"/>
-        <w:divId w:val="1625111436"/>
+        <w:divId w:val="1332218290"/>
         <w:rPr>
           <w:rStyle w:val="HTMLCode"/>
           <w:color w:val="1A1A1A"/>
@@ -8485,7 +8487,7 @@
     <w:p>
       <w:pPr>
         <w:pStyle w:val="HTMLPreformatted"/>
-        <w:divId w:val="1625111436"/>
+        <w:divId w:val="1332218290"/>
         <w:rPr>
           <w:rStyle w:val="HTMLCode"/>
           <w:color w:val="1A1A1A"/>
@@ -8502,7 +8504,7 @@
     <w:p>
       <w:pPr>
         <w:pStyle w:val="HTMLPreformatted"/>
-        <w:divId w:val="1625111436"/>
+        <w:divId w:val="1332218290"/>
         <w:rPr>
           <w:rStyle w:val="HTMLCode"/>
           <w:color w:val="1A1A1A"/>
@@ -8519,7 +8521,7 @@
     <w:p>
       <w:pPr>
         <w:pStyle w:val="HTMLPreformatted"/>
-        <w:divId w:val="1625111436"/>
+        <w:divId w:val="1332218290"/>
         <w:rPr>
           <w:rStyle w:val="HTMLCode"/>
           <w:color w:val="1A1A1A"/>
@@ -8536,7 +8538,7 @@
     <w:p>
       <w:pPr>
         <w:pStyle w:val="HTMLPreformatted"/>
-        <w:divId w:val="1625111436"/>
+        <w:divId w:val="1332218290"/>
         <w:rPr>
           <w:rStyle w:val="HTMLCode"/>
           <w:color w:val="1A1A1A"/>
@@ -8553,7 +8555,7 @@
     <w:p>
       <w:pPr>
         <w:pStyle w:val="HTMLPreformatted"/>
-        <w:divId w:val="1625111436"/>
+        <w:divId w:val="1332218290"/>
         <w:rPr>
           <w:rStyle w:val="HTMLCode"/>
           <w:color w:val="1A1A1A"/>
@@ -8570,7 +8572,7 @@
     <w:p>
       <w:pPr>
         <w:pStyle w:val="HTMLPreformatted"/>
-        <w:divId w:val="1625111436"/>
+        <w:divId w:val="1332218290"/>
         <w:rPr>
           <w:rStyle w:val="HTMLCode"/>
           <w:color w:val="1A1A1A"/>
@@ -8594,7 +8596,7 @@
     <w:p>
       <w:pPr>
         <w:pStyle w:val="HTMLPreformatted"/>
-        <w:divId w:val="1625111436"/>
+        <w:divId w:val="1332218290"/>
         <w:rPr>
           <w:rStyle w:val="HTMLCode"/>
           <w:color w:val="1A1A1A"/>
@@ -8611,7 +8613,7 @@
     <w:p>
       <w:pPr>
         <w:pStyle w:val="HTMLPreformatted"/>
-        <w:divId w:val="1625111436"/>
+        <w:divId w:val="1332218290"/>
         <w:rPr>
           <w:rStyle w:val="HTMLCode"/>
           <w:color w:val="1A1A1A"/>
@@ -8628,7 +8630,7 @@
     <w:p>
       <w:pPr>
         <w:pStyle w:val="HTMLPreformatted"/>
-        <w:divId w:val="1625111436"/>
+        <w:divId w:val="1332218290"/>
         <w:rPr>
           <w:rStyle w:val="HTMLCode"/>
           <w:color w:val="1A1A1A"/>
@@ -8645,7 +8647,7 @@
     <w:p>
       <w:pPr>
         <w:pStyle w:val="HTMLPreformatted"/>
-        <w:divId w:val="1625111436"/>
+        <w:divId w:val="1332218290"/>
         <w:rPr>
           <w:rStyle w:val="HTMLCode"/>
           <w:color w:val="1A1A1A"/>
@@ -8662,7 +8664,7 @@
     <w:p>
       <w:pPr>
         <w:pStyle w:val="HTMLPreformatted"/>
-        <w:divId w:val="1625111436"/>
+        <w:divId w:val="1332218290"/>
         <w:rPr>
           <w:rStyle w:val="HTMLCode"/>
           <w:color w:val="1A1A1A"/>
@@ -8679,7 +8681,7 @@
     <w:p>
       <w:pPr>
         <w:pStyle w:val="HTMLPreformatted"/>
-        <w:divId w:val="1625111436"/>
+        <w:divId w:val="1332218290"/>
         <w:rPr>
           <w:color w:val="1A1A1A"/>
         </w:rPr>
@@ -8695,7 +8697,7 @@
     <w:p>
       <w:pPr>
         <w:pStyle w:val="Heading3"/>
-        <w:divId w:val="1625111436"/>
+        <w:divId w:val="1332218290"/>
         <w:rPr>
           <w:rFonts w:ascii="Calibri" w:eastAsia="Times New Roman" w:hAnsi="Calibri" w:cs="Calibri"/>
         </w:rPr>
@@ -8722,7 +8724,7 @@
     <w:p>
       <w:pPr>
         <w:pStyle w:val="HTMLPreformatted"/>
-        <w:divId w:val="1625111436"/>
+        <w:divId w:val="1332218290"/>
         <w:rPr>
           <w:rStyle w:val="HTMLCode"/>
           <w:color w:val="1A1A1A"/>
@@ -8739,7 +8741,7 @@
     <w:p>
       <w:pPr>
         <w:pStyle w:val="HTMLPreformatted"/>
-        <w:divId w:val="1625111436"/>
+        <w:divId w:val="1332218290"/>
         <w:rPr>
           <w:rStyle w:val="HTMLCode"/>
           <w:color w:val="1A1A1A"/>
@@ -8756,7 +8758,7 @@
     <w:p>
       <w:pPr>
         <w:pStyle w:val="HTMLPreformatted"/>
-        <w:divId w:val="1625111436"/>
+        <w:divId w:val="1332218290"/>
         <w:rPr>
           <w:rStyle w:val="HTMLCode"/>
           <w:color w:val="1A1A1A"/>
@@ -8773,7 +8775,7 @@
     <w:p>
       <w:pPr>
         <w:pStyle w:val="HTMLPreformatted"/>
-        <w:divId w:val="1625111436"/>
+        <w:divId w:val="1332218290"/>
         <w:rPr>
           <w:rStyle w:val="HTMLCode"/>
           <w:color w:val="1A1A1A"/>
@@ -8797,7 +8799,7 @@
     <w:p>
       <w:pPr>
         <w:pStyle w:val="HTMLPreformatted"/>
-        <w:divId w:val="1625111436"/>
+        <w:divId w:val="1332218290"/>
         <w:rPr>
           <w:rStyle w:val="HTMLCode"/>
           <w:color w:val="1A1A1A"/>
@@ -8814,7 +8816,7 @@
     <w:p>
       <w:pPr>
         <w:pStyle w:val="HTMLPreformatted"/>
-        <w:divId w:val="1625111436"/>
+        <w:divId w:val="1332218290"/>
         <w:rPr>
           <w:rStyle w:val="HTMLCode"/>
           <w:color w:val="1A1A1A"/>
@@ -8831,7 +8833,7 @@
     <w:p>
       <w:pPr>
         <w:pStyle w:val="HTMLPreformatted"/>
-        <w:divId w:val="1625111436"/>
+        <w:divId w:val="1332218290"/>
         <w:rPr>
           <w:color w:val="1A1A1A"/>
         </w:rPr>
@@ -8847,7 +8849,7 @@
     <w:p>
       <w:pPr>
         <w:pStyle w:val="Heading3"/>
-        <w:divId w:val="1625111436"/>
+        <w:divId w:val="1332218290"/>
         <w:rPr>
           <w:rFonts w:ascii="Calibri" w:eastAsia="Times New Roman" w:hAnsi="Calibri" w:cs="Calibri"/>
         </w:rPr>
@@ -8874,7 +8876,7 @@
     <w:p>
       <w:pPr>
         <w:pStyle w:val="HTMLPreformatted"/>
-        <w:divId w:val="1625111436"/>
+        <w:divId w:val="1332218290"/>
         <w:rPr>
           <w:rStyle w:val="HTMLCode"/>
           <w:color w:val="1A1A1A"/>
@@ -8891,7 +8893,7 @@
     <w:p>
       <w:pPr>
         <w:pStyle w:val="HTMLPreformatted"/>
-        <w:divId w:val="1625111436"/>
+        <w:divId w:val="1332218290"/>
         <w:rPr>
           <w:rStyle w:val="HTMLCode"/>
           <w:color w:val="1A1A1A"/>
@@ -8908,7 +8910,7 @@
     <w:p>
       <w:pPr>
         <w:pStyle w:val="HTMLPreformatted"/>
-        <w:divId w:val="1625111436"/>
+        <w:divId w:val="1332218290"/>
         <w:rPr>
           <w:rStyle w:val="HTMLCode"/>
           <w:color w:val="1A1A1A"/>
@@ -8925,7 +8927,7 @@
     <w:p>
       <w:pPr>
         <w:pStyle w:val="HTMLPreformatted"/>
-        <w:divId w:val="1625111436"/>
+        <w:divId w:val="1332218290"/>
         <w:rPr>
           <w:rStyle w:val="HTMLCode"/>
           <w:color w:val="1A1A1A"/>
@@ -8942,7 +8944,7 @@
     <w:p>
       <w:pPr>
         <w:pStyle w:val="HTMLPreformatted"/>
-        <w:divId w:val="1625111436"/>
+        <w:divId w:val="1332218290"/>
         <w:rPr>
           <w:rStyle w:val="HTMLCode"/>
           <w:color w:val="1A1A1A"/>
@@ -8966,7 +8968,7 @@
     <w:p>
       <w:pPr>
         <w:pStyle w:val="HTMLPreformatted"/>
-        <w:divId w:val="1625111436"/>
+        <w:divId w:val="1332218290"/>
         <w:rPr>
           <w:rStyle w:val="HTMLCode"/>
           <w:color w:val="1A1A1A"/>
@@ -8983,7 +8985,7 @@
     <w:p>
       <w:pPr>
         <w:pStyle w:val="HTMLPreformatted"/>
-        <w:divId w:val="1625111436"/>
+        <w:divId w:val="1332218290"/>
         <w:rPr>
           <w:rStyle w:val="HTMLCode"/>
           <w:color w:val="1A1A1A"/>
@@ -9000,7 +9002,7 @@
     <w:p>
       <w:pPr>
         <w:pStyle w:val="HTMLPreformatted"/>
-        <w:divId w:val="1625111436"/>
+        <w:divId w:val="1332218290"/>
         <w:rPr>
           <w:rStyle w:val="HTMLCode"/>
           <w:color w:val="1A1A1A"/>
@@ -9017,7 +9019,7 @@
     <w:p>
       <w:pPr>
         <w:pStyle w:val="HTMLPreformatted"/>
-        <w:divId w:val="1625111436"/>
+        <w:divId w:val="1332218290"/>
         <w:rPr>
           <w:rStyle w:val="HTMLCode"/>
           <w:color w:val="1A1A1A"/>
@@ -9027,7 +9029,7 @@
     <w:p>
       <w:pPr>
         <w:pStyle w:val="HTMLPreformatted"/>
-        <w:divId w:val="1625111436"/>
+        <w:divId w:val="1332218290"/>
         <w:rPr>
           <w:rStyle w:val="HTMLCode"/>
           <w:color w:val="1A1A1A"/>
@@ -9044,7 +9046,7 @@
     <w:p>
       <w:pPr>
         <w:pStyle w:val="HTMLPreformatted"/>
-        <w:divId w:val="1625111436"/>
+        <w:divId w:val="1332218290"/>
         <w:rPr>
           <w:rStyle w:val="HTMLCode"/>
           <w:color w:val="1A1A1A"/>
@@ -9061,7 +9063,7 @@
     <w:p>
       <w:pPr>
         <w:pStyle w:val="HTMLPreformatted"/>
-        <w:divId w:val="1625111436"/>
+        <w:divId w:val="1332218290"/>
         <w:rPr>
           <w:color w:val="1A1A1A"/>
         </w:rPr>
@@ -9077,7 +9079,7 @@
     <w:p>
       <w:pPr>
         <w:pStyle w:val="Heading3"/>
-        <w:divId w:val="1625111436"/>
+        <w:divId w:val="1332218290"/>
         <w:rPr>
           <w:rFonts w:ascii="Calibri" w:eastAsia="Times New Roman" w:hAnsi="Calibri" w:cs="Calibri"/>
         </w:rPr>
@@ -9092,7 +9094,7 @@
     <w:p>
       <w:pPr>
         <w:pStyle w:val="HTMLPreformatted"/>
-        <w:divId w:val="1625111436"/>
+        <w:divId w:val="1332218290"/>
         <w:rPr>
           <w:rStyle w:val="HTMLCode"/>
           <w:color w:val="1A1A1A"/>
@@ -9109,7 +9111,7 @@
     <w:p>
       <w:pPr>
         <w:pStyle w:val="HTMLPreformatted"/>
-        <w:divId w:val="1625111436"/>
+        <w:divId w:val="1332218290"/>
         <w:rPr>
           <w:rStyle w:val="HTMLCode"/>
           <w:color w:val="1A1A1A"/>
@@ -9126,7 +9128,7 @@
     <w:p>
       <w:pPr>
         <w:pStyle w:val="HTMLPreformatted"/>
-        <w:divId w:val="1625111436"/>
+        <w:divId w:val="1332218290"/>
         <w:rPr>
           <w:rStyle w:val="HTMLCode"/>
           <w:color w:val="1A1A1A"/>
@@ -9143,7 +9145,7 @@
     <w:p>
       <w:pPr>
         <w:pStyle w:val="HTMLPreformatted"/>
-        <w:divId w:val="1625111436"/>
+        <w:divId w:val="1332218290"/>
         <w:rPr>
           <w:rStyle w:val="HTMLCode"/>
           <w:color w:val="1A1A1A"/>
@@ -9160,7 +9162,7 @@
     <w:p>
       <w:pPr>
         <w:pStyle w:val="HTMLPreformatted"/>
-        <w:divId w:val="1625111436"/>
+        <w:divId w:val="1332218290"/>
         <w:rPr>
           <w:color w:val="1A1A1A"/>
         </w:rPr>
@@ -9176,7 +9178,7 @@
     <w:p>
       <w:pPr>
         <w:pStyle w:val="Heading3"/>
-        <w:divId w:val="1625111436"/>
+        <w:divId w:val="1332218290"/>
         <w:rPr>
           <w:rFonts w:ascii="Calibri" w:eastAsia="Times New Roman" w:hAnsi="Calibri" w:cs="Calibri"/>
         </w:rPr>
@@ -9203,7 +9205,7 @@
     <w:p>
       <w:pPr>
         <w:pStyle w:val="HTMLPreformatted"/>
-        <w:divId w:val="1625111436"/>
+        <w:divId w:val="1332218290"/>
         <w:rPr>
           <w:rStyle w:val="HTMLCode"/>
           <w:color w:val="1A1A1A"/>
@@ -9220,7 +9222,7 @@
     <w:p>
       <w:pPr>
         <w:pStyle w:val="HTMLPreformatted"/>
-        <w:divId w:val="1625111436"/>
+        <w:divId w:val="1332218290"/>
         <w:rPr>
           <w:rStyle w:val="HTMLCode"/>
           <w:color w:val="1A1A1A"/>
@@ -9237,7 +9239,7 @@
     <w:p>
       <w:pPr>
         <w:pStyle w:val="HTMLPreformatted"/>
-        <w:divId w:val="1625111436"/>
+        <w:divId w:val="1332218290"/>
         <w:rPr>
           <w:rStyle w:val="HTMLCode"/>
           <w:color w:val="1A1A1A"/>
@@ -9254,7 +9256,7 @@
     <w:p>
       <w:pPr>
         <w:pStyle w:val="HTMLPreformatted"/>
-        <w:divId w:val="1625111436"/>
+        <w:divId w:val="1332218290"/>
         <w:rPr>
           <w:rStyle w:val="HTMLCode"/>
           <w:color w:val="1A1A1A"/>
@@ -9271,7 +9273,7 @@
     <w:p>
       <w:pPr>
         <w:pStyle w:val="HTMLPreformatted"/>
-        <w:divId w:val="1625111436"/>
+        <w:divId w:val="1332218290"/>
         <w:rPr>
           <w:rStyle w:val="HTMLCode"/>
           <w:color w:val="1A1A1A"/>
@@ -9288,7 +9290,7 @@
     <w:p>
       <w:pPr>
         <w:pStyle w:val="HTMLPreformatted"/>
-        <w:divId w:val="1625111436"/>
+        <w:divId w:val="1332218290"/>
         <w:rPr>
           <w:rStyle w:val="HTMLCode"/>
           <w:color w:val="1A1A1A"/>
@@ -9305,7 +9307,7 @@
     <w:p>
       <w:pPr>
         <w:pStyle w:val="HTMLPreformatted"/>
-        <w:divId w:val="1625111436"/>
+        <w:divId w:val="1332218290"/>
         <w:rPr>
           <w:rStyle w:val="HTMLCode"/>
           <w:color w:val="1A1A1A"/>
@@ -9322,7 +9324,7 @@
     <w:p>
       <w:pPr>
         <w:pStyle w:val="HTMLPreformatted"/>
-        <w:divId w:val="1625111436"/>
+        <w:divId w:val="1332218290"/>
         <w:rPr>
           <w:color w:val="1A1A1A"/>
         </w:rPr>
@@ -9338,7 +9340,7 @@
     <w:p>
       <w:pPr>
         <w:pStyle w:val="Heading2"/>
-        <w:divId w:val="1625111436"/>
+        <w:divId w:val="1332218290"/>
         <w:rPr>
           <w:rFonts w:ascii="Calibri" w:eastAsia="Times New Roman" w:hAnsi="Calibri" w:cs="Calibri"/>
         </w:rPr>
@@ -9353,7 +9355,7 @@
     <w:p>
       <w:pPr>
         <w:pStyle w:val="NormalWeb"/>
-        <w:divId w:val="1625111436"/>
+        <w:divId w:val="1332218290"/>
         <w:rPr>
           <w:rFonts w:ascii="Calibri" w:hAnsi="Calibri" w:cs="Calibri"/>
           <w:color w:val="1A1A1A"/>
@@ -9440,7 +9442,7 @@
       </w:tblGrid>
       <w:tr>
         <w:trPr>
-          <w:divId w:val="1625111436"/>
+          <w:divId w:val="1332218290"/>
           <w:tblHeader/>
         </w:trPr>
         <w:tc>
@@ -9575,7 +9577,7 @@
       </w:tr>
       <w:tr>
         <w:trPr>
-          <w:divId w:val="1625111436"/>
+          <w:divId w:val="1332218290"/>
         </w:trPr>
         <w:tc>
           <w:tcPr>
@@ -9694,7 +9696,7 @@
       </w:tr>
       <w:tr>
         <w:trPr>
-          <w:divId w:val="1625111436"/>
+          <w:divId w:val="1332218290"/>
         </w:trPr>
         <w:tc>
           <w:tcPr>
@@ -9813,7 +9815,7 @@
       </w:tr>
       <w:tr>
         <w:trPr>
-          <w:divId w:val="1625111436"/>
+          <w:divId w:val="1332218290"/>
         </w:trPr>
         <w:tc>
           <w:tcPr>
@@ -9932,7 +9934,7 @@
       </w:tr>
       <w:tr>
         <w:trPr>
-          <w:divId w:val="1625111436"/>
+          <w:divId w:val="1332218290"/>
         </w:trPr>
         <w:tc>
           <w:tcPr>
@@ -10051,7 +10053,7 @@
       </w:tr>
       <w:tr>
         <w:trPr>
-          <w:divId w:val="1625111436"/>
+          <w:divId w:val="1332218290"/>
         </w:trPr>
         <w:tc>
           <w:tcPr>
@@ -10170,7 +10172,7 @@
       </w:tr>
       <w:tr>
         <w:trPr>
-          <w:divId w:val="1625111436"/>
+          <w:divId w:val="1332218290"/>
         </w:trPr>
         <w:tc>
           <w:tcPr>
@@ -10289,7 +10291,7 @@
       </w:tr>
       <w:tr>
         <w:trPr>
-          <w:divId w:val="1625111436"/>
+          <w:divId w:val="1332218290"/>
         </w:trPr>
         <w:tc>
           <w:tcPr>
@@ -10408,7 +10410,7 @@
       </w:tr>
       <w:tr>
         <w:trPr>
-          <w:divId w:val="1625111436"/>
+          <w:divId w:val="1332218290"/>
         </w:trPr>
         <w:tc>
           <w:tcPr>
@@ -10527,7 +10529,7 @@
       </w:tr>
       <w:tr>
         <w:trPr>
-          <w:divId w:val="1625111436"/>
+          <w:divId w:val="1332218290"/>
         </w:trPr>
         <w:tc>
           <w:tcPr>
@@ -10646,7 +10648,7 @@
       </w:tr>
       <w:tr>
         <w:trPr>
-          <w:divId w:val="1625111436"/>
+          <w:divId w:val="1332218290"/>
         </w:trPr>
         <w:tc>
           <w:tcPr>
@@ -10765,7 +10767,7 @@
       </w:tr>
       <w:tr>
         <w:trPr>
-          <w:divId w:val="1625111436"/>
+          <w:divId w:val="1332218290"/>
         </w:trPr>
         <w:tc>
           <w:tcPr>
@@ -10884,7 +10886,7 @@
       </w:tr>
       <w:tr>
         <w:trPr>
-          <w:divId w:val="1625111436"/>
+          <w:divId w:val="1332218290"/>
         </w:trPr>
         <w:tc>
           <w:tcPr>
@@ -11003,7 +11005,7 @@
       </w:tr>
       <w:tr>
         <w:trPr>
-          <w:divId w:val="1625111436"/>
+          <w:divId w:val="1332218290"/>
         </w:trPr>
         <w:tc>
           <w:tcPr>
@@ -11122,7 +11124,7 @@
       </w:tr>
       <w:tr>
         <w:trPr>
-          <w:divId w:val="1625111436"/>
+          <w:divId w:val="1332218290"/>
         </w:trPr>
         <w:tc>
           <w:tcPr>
@@ -11241,7 +11243,7 @@
       </w:tr>
       <w:tr>
         <w:trPr>
-          <w:divId w:val="1625111436"/>
+          <w:divId w:val="1332218290"/>
         </w:trPr>
         <w:tc>
           <w:tcPr>
@@ -11360,7 +11362,7 @@
       </w:tr>
       <w:tr>
         <w:trPr>
-          <w:divId w:val="1625111436"/>
+          <w:divId w:val="1332218290"/>
         </w:trPr>
         <w:tc>
           <w:tcPr>
@@ -11481,7 +11483,7 @@
     <w:p>
       <w:pPr>
         <w:pStyle w:val="Heading2"/>
-        <w:divId w:val="1625111436"/>
+        <w:divId w:val="1332218290"/>
         <w:rPr>
           <w:rFonts w:ascii="Calibri" w:eastAsia="Times New Roman" w:hAnsi="Calibri" w:cs="Calibri"/>
         </w:rPr>
@@ -11496,7 +11498,7 @@
     <w:p>
       <w:pPr>
         <w:pStyle w:val="NormalWeb"/>
-        <w:divId w:val="1625111436"/>
+        <w:divId w:val="1332218290"/>
         <w:rPr>
           <w:rFonts w:ascii="Calibri" w:hAnsi="Calibri" w:cs="Calibri"/>
           <w:color w:val="1A1A1A"/>
@@ -11540,7 +11542,7 @@
           <w:numId w:val="10"/>
         </w:numPr>
         <w:spacing w:before="100" w:beforeAutospacing="1" w:after="100" w:afterAutospacing="1"/>
-        <w:divId w:val="1625111436"/>
+        <w:divId w:val="1332218290"/>
         <w:rPr>
           <w:rFonts w:ascii="Calibri" w:eastAsia="Times New Roman" w:hAnsi="Calibri" w:cs="Calibri"/>
           <w:color w:val="1A1A1A"/>
@@ -11575,7 +11577,7 @@
           <w:numId w:val="10"/>
         </w:numPr>
         <w:spacing w:before="100" w:beforeAutospacing="1" w:after="100" w:afterAutospacing="1"/>
-        <w:divId w:val="1625111436"/>
+        <w:divId w:val="1332218290"/>
         <w:rPr>
           <w:rFonts w:ascii="Calibri" w:eastAsia="Times New Roman" w:hAnsi="Calibri" w:cs="Calibri"/>
           <w:color w:val="1A1A1A"/>
@@ -11610,7 +11612,7 @@
           <w:numId w:val="10"/>
         </w:numPr>
         <w:spacing w:before="100" w:beforeAutospacing="1" w:after="100" w:afterAutospacing="1"/>
-        <w:divId w:val="1625111436"/>
+        <w:divId w:val="1332218290"/>
         <w:rPr>
           <w:rFonts w:ascii="Calibri" w:eastAsia="Times New Roman" w:hAnsi="Calibri" w:cs="Calibri"/>
           <w:color w:val="1A1A1A"/>
@@ -11635,7 +11637,7 @@
           <w:numId w:val="10"/>
         </w:numPr>
         <w:spacing w:before="100" w:beforeAutospacing="1" w:after="100" w:afterAutospacing="1"/>
-        <w:divId w:val="1625111436"/>
+        <w:divId w:val="1332218290"/>
         <w:rPr>
           <w:rFonts w:ascii="Calibri" w:eastAsia="Times New Roman" w:hAnsi="Calibri" w:cs="Calibri"/>
           <w:color w:val="1A1A1A"/>
@@ -11660,7 +11662,7 @@
           <w:numId w:val="10"/>
         </w:numPr>
         <w:spacing w:before="100" w:beforeAutospacing="1" w:after="100" w:afterAutospacing="1"/>
-        <w:divId w:val="1625111436"/>
+        <w:divId w:val="1332218290"/>
         <w:rPr>
           <w:rFonts w:ascii="Calibri" w:eastAsia="Times New Roman" w:hAnsi="Calibri" w:cs="Calibri"/>
           <w:color w:val="1A1A1A"/>
@@ -11681,7 +11683,7 @@
     <w:p>
       <w:pPr>
         <w:pStyle w:val="NormalWeb"/>
-        <w:divId w:val="1625111436"/>
+        <w:divId w:val="1332218290"/>
         <w:rPr>
           <w:rFonts w:ascii="Calibri" w:hAnsi="Calibri" w:cs="Calibri"/>
           <w:color w:val="1A1A1A"/>
@@ -11768,7 +11770,7 @@
       </w:tblGrid>
       <w:tr>
         <w:trPr>
-          <w:divId w:val="1625111436"/>
+          <w:divId w:val="1332218290"/>
           <w:tblHeader/>
         </w:trPr>
         <w:tc>
@@ -11903,7 +11905,7 @@
       </w:tr>
       <w:tr>
         <w:trPr>
-          <w:divId w:val="1625111436"/>
+          <w:divId w:val="1332218290"/>
         </w:trPr>
         <w:tc>
           <w:tcPr>
@@ -12022,7 +12024,7 @@
       </w:tr>
       <w:tr>
         <w:trPr>
-          <w:divId w:val="1625111436"/>
+          <w:divId w:val="1332218290"/>
         </w:trPr>
         <w:tc>
           <w:tcPr>
@@ -12141,7 +12143,7 @@
       </w:tr>
       <w:tr>
         <w:trPr>
-          <w:divId w:val="1625111436"/>
+          <w:divId w:val="1332218290"/>
         </w:trPr>
         <w:tc>
           <w:tcPr>
@@ -12262,7 +12264,7 @@
     <w:p>
       <w:pPr>
         <w:pStyle w:val="NormalWeb"/>
-        <w:divId w:val="1625111436"/>
+        <w:divId w:val="1332218290"/>
         <w:rPr>
           <w:rFonts w:ascii="Calibri" w:hAnsi="Calibri" w:cs="Calibri"/>
           <w:color w:val="1A1A1A"/>
@@ -12283,7 +12285,7 @@
     <w:p>
       <w:pPr>
         <w:pStyle w:val="Heading2"/>
-        <w:divId w:val="1625111436"/>
+        <w:divId w:val="1332218290"/>
         <w:rPr>
           <w:rFonts w:ascii="Calibri" w:eastAsia="Times New Roman" w:hAnsi="Calibri" w:cs="Calibri"/>
         </w:rPr>
@@ -12302,7 +12304,7 @@
           <w:numId w:val="11"/>
         </w:numPr>
         <w:spacing w:before="100" w:beforeAutospacing="1" w:after="100" w:afterAutospacing="1"/>
-        <w:divId w:val="1625111436"/>
+        <w:divId w:val="1332218290"/>
         <w:rPr>
           <w:rFonts w:ascii="Calibri" w:eastAsia="Times New Roman" w:hAnsi="Calibri" w:cs="Calibri"/>
           <w:color w:val="1A1A1A"/>
@@ -12337,7 +12339,7 @@
           <w:numId w:val="11"/>
         </w:numPr>
         <w:spacing w:before="100" w:beforeAutospacing="1" w:after="100" w:afterAutospacing="1"/>
-        <w:divId w:val="1625111436"/>
+        <w:divId w:val="1332218290"/>
         <w:rPr>
           <w:rFonts w:ascii="Calibri" w:eastAsia="Times New Roman" w:hAnsi="Calibri" w:cs="Calibri"/>
           <w:color w:val="1A1A1A"/>
@@ -12429,7 +12431,7 @@
           <w:numId w:val="11"/>
         </w:numPr>
         <w:spacing w:before="100" w:beforeAutospacing="1" w:after="100" w:afterAutospacing="1"/>
-        <w:divId w:val="1625111436"/>
+        <w:divId w:val="1332218290"/>
         <w:rPr>
           <w:rFonts w:ascii="Calibri" w:eastAsia="Times New Roman" w:hAnsi="Calibri" w:cs="Calibri"/>
           <w:color w:val="1A1A1A"/>
@@ -12451,7 +12453,7 @@
     <w:p>
       <w:pPr>
         <w:pStyle w:val="HTMLPreformatted"/>
-        <w:divId w:val="1625111436"/>
+        <w:divId w:val="1332218290"/>
         <w:rPr>
           <w:rStyle w:val="HTMLCode"/>
           <w:color w:val="1A1A1A"/>
@@ -12468,7 +12470,7 @@
     <w:p>
       <w:pPr>
         <w:pStyle w:val="HTMLPreformatted"/>
-        <w:divId w:val="1625111436"/>
+        <w:divId w:val="1332218290"/>
         <w:rPr>
           <w:rStyle w:val="HTMLCode"/>
           <w:color w:val="1A1A1A"/>
@@ -12485,7 +12487,7 @@
     <w:p>
       <w:pPr>
         <w:pStyle w:val="HTMLPreformatted"/>
-        <w:divId w:val="1625111436"/>
+        <w:divId w:val="1332218290"/>
         <w:rPr>
           <w:color w:val="1A1A1A"/>
         </w:rPr>
@@ -12505,7 +12507,7 @@
           <w:numId w:val="12"/>
         </w:numPr>
         <w:spacing w:before="100" w:beforeAutospacing="1" w:after="100" w:afterAutospacing="1"/>
-        <w:divId w:val="1625111436"/>
+        <w:divId w:val="1332218290"/>
         <w:rPr>
           <w:rFonts w:ascii="Calibri" w:eastAsia="Times New Roman" w:hAnsi="Calibri" w:cs="Calibri"/>
           <w:color w:val="1A1A1A"/>
@@ -12689,7 +12691,7 @@
     <w:p>
       <w:pPr>
         <w:pStyle w:val="Heading2"/>
-        <w:divId w:val="1625111436"/>
+        <w:divId w:val="1332218290"/>
         <w:rPr>
           <w:rFonts w:ascii="Calibri" w:eastAsia="Times New Roman" w:hAnsi="Calibri" w:cs="Calibri"/>
         </w:rPr>
@@ -12704,7 +12706,7 @@
     <w:p>
       <w:pPr>
         <w:pStyle w:val="NormalWeb"/>
-        <w:divId w:val="1625111436"/>
+        <w:divId w:val="1332218290"/>
         <w:rPr>
           <w:rFonts w:ascii="Calibri" w:hAnsi="Calibri" w:cs="Calibri"/>
           <w:color w:val="1A1A1A"/>
@@ -12805,7 +12807,7 @@
     <w:p>
       <w:pPr>
         <w:pStyle w:val="NormalWeb"/>
-        <w:divId w:val="1625111436"/>
+        <w:divId w:val="1332218290"/>
         <w:rPr>
           <w:rFonts w:ascii="Calibri" w:hAnsi="Calibri" w:cs="Calibri"/>
           <w:color w:val="1A1A1A"/>
@@ -12842,7 +12844,7 @@
     <w:p>
       <w:pPr>
         <w:pStyle w:val="Heading2"/>
-        <w:divId w:val="1625111436"/>
+        <w:divId w:val="1332218290"/>
         <w:rPr>
           <w:rFonts w:ascii="Calibri" w:eastAsia="Times New Roman" w:hAnsi="Calibri" w:cs="Calibri"/>
         </w:rPr>
@@ -12857,7 +12859,7 @@
     <w:p>
       <w:pPr>
         <w:pStyle w:val="NormalWeb"/>
-        <w:divId w:val="1625111436"/>
+        <w:divId w:val="1332218290"/>
         <w:rPr>
           <w:rFonts w:ascii="Calibri" w:hAnsi="Calibri" w:cs="Calibri"/>
           <w:color w:val="1A1A1A"/>
@@ -12898,7 +12900,7 @@
           <w:numId w:val="13"/>
         </w:numPr>
         <w:spacing w:before="100" w:beforeAutospacing="1" w:after="100" w:afterAutospacing="1"/>
-        <w:divId w:val="1625111436"/>
+        <w:divId w:val="1332218290"/>
         <w:rPr>
           <w:rFonts w:ascii="Calibri" w:eastAsia="Times New Roman" w:hAnsi="Calibri" w:cs="Calibri"/>
           <w:color w:val="1A1A1A"/>
@@ -12961,7 +12963,7 @@
           <w:numId w:val="13"/>
         </w:numPr>
         <w:spacing w:before="100" w:beforeAutospacing="1" w:after="100" w:afterAutospacing="1"/>
-        <w:divId w:val="1625111436"/>
+        <w:divId w:val="1332218290"/>
         <w:rPr>
           <w:rFonts w:ascii="Calibri" w:eastAsia="Times New Roman" w:hAnsi="Calibri" w:cs="Calibri"/>
           <w:color w:val="1A1A1A"/>
@@ -12996,7 +12998,7 @@
           <w:numId w:val="13"/>
         </w:numPr>
         <w:spacing w:before="100" w:beforeAutospacing="1" w:after="100" w:afterAutospacing="1"/>
-        <w:divId w:val="1625111436"/>
+        <w:divId w:val="1332218290"/>
         <w:rPr>
           <w:rFonts w:ascii="Calibri" w:eastAsia="Times New Roman" w:hAnsi="Calibri" w:cs="Calibri"/>
           <w:color w:val="1A1A1A"/>
@@ -13050,7 +13052,7 @@
           <w:numId w:val="13"/>
         </w:numPr>
         <w:spacing w:before="100" w:beforeAutospacing="1" w:after="100" w:afterAutospacing="1"/>
-        <w:divId w:val="1625111436"/>
+        <w:divId w:val="1332218290"/>
         <w:rPr>
           <w:rFonts w:ascii="Calibri" w:eastAsia="Times New Roman" w:hAnsi="Calibri" w:cs="Calibri"/>
           <w:color w:val="1A1A1A"/>
@@ -13110,7 +13112,7 @@
           <w:numId w:val="13"/>
         </w:numPr>
         <w:spacing w:before="100" w:beforeAutospacing="1" w:after="100" w:afterAutospacing="1"/>
-        <w:divId w:val="1625111436"/>
+        <w:divId w:val="1332218290"/>
         <w:rPr>
           <w:rFonts w:ascii="Calibri" w:eastAsia="Times New Roman" w:hAnsi="Calibri" w:cs="Calibri"/>
           <w:color w:val="1A1A1A"/>
@@ -13145,7 +13147,7 @@
           <w:numId w:val="13"/>
         </w:numPr>
         <w:spacing w:before="100" w:beforeAutospacing="1" w:after="100" w:afterAutospacing="1"/>
-        <w:divId w:val="1625111436"/>
+        <w:divId w:val="1332218290"/>
         <w:rPr>
           <w:rFonts w:ascii="Calibri" w:eastAsia="Times New Roman" w:hAnsi="Calibri" w:cs="Calibri"/>
           <w:color w:val="1A1A1A"/>
@@ -13185,7 +13187,7 @@
     <w:p>
       <w:pPr>
         <w:pStyle w:val="Heading2"/>
-        <w:divId w:val="1625111436"/>
+        <w:divId w:val="1332218290"/>
         <w:rPr>
           <w:rFonts w:ascii="Calibri" w:eastAsia="Times New Roman" w:hAnsi="Calibri" w:cs="Calibri"/>
         </w:rPr>
@@ -13215,7 +13217,7 @@
       </w:tblGrid>
       <w:tr>
         <w:trPr>
-          <w:divId w:val="1625111436"/>
+          <w:divId w:val="1332218290"/>
           <w:tblHeader/>
         </w:trPr>
         <w:tc>
@@ -13350,7 +13352,7 @@
       </w:tr>
       <w:tr>
         <w:trPr>
-          <w:divId w:val="1625111436"/>
+          <w:divId w:val="1332218290"/>
         </w:trPr>
         <w:tc>
           <w:tcPr>
@@ -13469,7 +13471,7 @@
       </w:tr>
       <w:tr>
         <w:trPr>
-          <w:divId w:val="1625111436"/>
+          <w:divId w:val="1332218290"/>
         </w:trPr>
         <w:tc>
           <w:tcPr>
@@ -13588,7 +13590,7 @@
       </w:tr>
       <w:tr>
         <w:trPr>
-          <w:divId w:val="1625111436"/>
+          <w:divId w:val="1332218290"/>
         </w:trPr>
         <w:tc>
           <w:tcPr>
@@ -13707,7 +13709,7 @@
       </w:tr>
       <w:tr>
         <w:trPr>
-          <w:divId w:val="1625111436"/>
+          <w:divId w:val="1332218290"/>
         </w:trPr>
         <w:tc>
           <w:tcPr>
@@ -13853,7 +13855,7 @@
       </w:tr>
       <w:tr>
         <w:trPr>
-          <w:divId w:val="1625111436"/>
+          <w:divId w:val="1332218290"/>
         </w:trPr>
         <w:tc>
           <w:tcPr>
@@ -13972,7 +13974,7 @@
       </w:tr>
       <w:tr>
         <w:trPr>
-          <w:divId w:val="1625111436"/>
+          <w:divId w:val="1332218290"/>
         </w:trPr>
         <w:tc>
           <w:tcPr>
@@ -14110,7 +14112,7 @@
       </w:tr>
       <w:tr>
         <w:trPr>
-          <w:divId w:val="1625111436"/>
+          <w:divId w:val="1332218290"/>
         </w:trPr>
         <w:tc>
           <w:tcPr>
@@ -14229,7 +14231,7 @@
       </w:tr>
       <w:tr>
         <w:trPr>
-          <w:divId w:val="1625111436"/>
+          <w:divId w:val="1332218290"/>
         </w:trPr>
         <w:tc>
           <w:tcPr>
@@ -14352,7 +14354,7 @@
     <w:p>
       <w:pPr>
         <w:pStyle w:val="NormalWeb"/>
-        <w:divId w:val="1625111436"/>
+        <w:divId w:val="1332218290"/>
         <w:rPr>
           <w:rFonts w:ascii="Calibri" w:hAnsi="Calibri" w:cs="Calibri"/>
           <w:color w:val="1A1A1A"/>
@@ -14401,7 +14403,7 @@
     <w:p>
       <w:pPr>
         <w:pStyle w:val="Heading2"/>
-        <w:divId w:val="1625111436"/>
+        <w:divId w:val="1332218290"/>
         <w:rPr>
           <w:rFonts w:ascii="Calibri" w:eastAsia="Times New Roman" w:hAnsi="Calibri" w:cs="Calibri"/>
         </w:rPr>
@@ -14416,7 +14418,7 @@
     <w:p>
       <w:pPr>
         <w:pStyle w:val="NormalWeb"/>
-        <w:divId w:val="1625111436"/>
+        <w:divId w:val="1332218290"/>
         <w:rPr>
           <w:rFonts w:ascii="Calibri" w:hAnsi="Calibri" w:cs="Calibri"/>
           <w:color w:val="1A1A1A"/>
@@ -14452,7 +14454,7 @@
       </w:tblGrid>
       <w:tr>
         <w:trPr>
-          <w:divId w:val="1625111436"/>
+          <w:divId w:val="1332218290"/>
           <w:tblHeader/>
         </w:trPr>
         <w:tc>
@@ -14587,7 +14589,7 @@
       </w:tr>
       <w:tr>
         <w:trPr>
-          <w:divId w:val="1625111436"/>
+          <w:divId w:val="1332218290"/>
         </w:trPr>
         <w:tc>
           <w:tcPr>
@@ -14706,7 +14708,7 @@
       </w:tr>
       <w:tr>
         <w:trPr>
-          <w:divId w:val="1625111436"/>
+          <w:divId w:val="1332218290"/>
         </w:trPr>
         <w:tc>
           <w:tcPr>
@@ -14825,7 +14827,7 @@
       </w:tr>
       <w:tr>
         <w:trPr>
-          <w:divId w:val="1625111436"/>
+          <w:divId w:val="1332218290"/>
         </w:trPr>
         <w:tc>
           <w:tcPr>
@@ -14944,7 +14946,7 @@
       </w:tr>
       <w:tr>
         <w:trPr>
-          <w:divId w:val="1625111436"/>
+          <w:divId w:val="1332218290"/>
         </w:trPr>
         <w:tc>
           <w:tcPr>
@@ -15063,7 +15065,7 @@
       </w:tr>
       <w:tr>
         <w:trPr>
-          <w:divId w:val="1625111436"/>
+          <w:divId w:val="1332218290"/>
         </w:trPr>
         <w:tc>
           <w:tcPr>
@@ -15182,7 +15184,7 @@
       </w:tr>
       <w:tr>
         <w:trPr>
-          <w:divId w:val="1625111436"/>
+          <w:divId w:val="1332218290"/>
         </w:trPr>
         <w:tc>
           <w:tcPr>
@@ -15301,7 +15303,7 @@
       </w:tr>
       <w:tr>
         <w:trPr>
-          <w:divId w:val="1625111436"/>
+          <w:divId w:val="1332218290"/>
         </w:trPr>
         <w:tc>
           <w:tcPr>
@@ -15420,7 +15422,7 @@
       </w:tr>
       <w:tr>
         <w:trPr>
-          <w:divId w:val="1625111436"/>
+          <w:divId w:val="1332218290"/>
         </w:trPr>
         <w:tc>
           <w:tcPr>
@@ -15539,7 +15541,7 @@
       </w:tr>
       <w:tr>
         <w:trPr>
-          <w:divId w:val="1625111436"/>
+          <w:divId w:val="1332218290"/>
         </w:trPr>
         <w:tc>
           <w:tcPr>
@@ -15658,7 +15660,7 @@
       </w:tr>
       <w:tr>
         <w:trPr>
-          <w:divId w:val="1625111436"/>
+          <w:divId w:val="1332218290"/>
         </w:trPr>
         <w:tc>
           <w:tcPr>
@@ -15777,7 +15779,7 @@
       </w:tr>
       <w:tr>
         <w:trPr>
-          <w:divId w:val="1625111436"/>
+          <w:divId w:val="1332218290"/>
         </w:trPr>
         <w:tc>
           <w:tcPr>
@@ -15898,7 +15900,7 @@
     <w:p>
       <w:pPr>
         <w:pStyle w:val="NormalWeb"/>
-        <w:divId w:val="1625111436"/>
+        <w:divId w:val="1332218290"/>
         <w:rPr>
           <w:rFonts w:ascii="Calibri" w:hAnsi="Calibri" w:cs="Calibri"/>
           <w:color w:val="1A1A1A"/>
@@ -15919,7 +15921,7 @@
     <w:p>
       <w:pPr>
         <w:pStyle w:val="Heading2"/>
-        <w:divId w:val="1625111436"/>
+        <w:divId w:val="1332218290"/>
         <w:rPr>
           <w:rFonts w:ascii="Calibri" w:eastAsia="Times New Roman" w:hAnsi="Calibri" w:cs="Calibri"/>
         </w:rPr>
@@ -15934,7 +15936,7 @@
     <w:p>
       <w:pPr>
         <w:pStyle w:val="NormalWeb"/>
-        <w:divId w:val="1625111436"/>
+        <w:divId w:val="1332218290"/>
         <w:rPr>
           <w:rFonts w:ascii="Calibri" w:hAnsi="Calibri" w:cs="Calibri"/>
           <w:color w:val="1A1A1A"/>
@@ -15980,7 +15982,7 @@
     <w:p>
       <w:pPr>
         <w:pStyle w:val="NormalWeb"/>
-        <w:divId w:val="1625111436"/>
+        <w:divId w:val="1332218290"/>
         <w:rPr>
           <w:rFonts w:ascii="Calibri" w:hAnsi="Calibri" w:cs="Calibri"/>
           <w:color w:val="1A1A1A"/>
@@ -16001,7 +16003,7 @@
     <w:p>
       <w:pPr>
         <w:pStyle w:val="Heading2"/>
-        <w:divId w:val="1625111436"/>
+        <w:divId w:val="1332218290"/>
         <w:rPr>
           <w:rFonts w:ascii="Calibri" w:eastAsia="Times New Roman" w:hAnsi="Calibri" w:cs="Calibri"/>
         </w:rPr>
@@ -16016,7 +16018,7 @@
     <w:p>
       <w:pPr>
         <w:pStyle w:val="NormalWeb"/>
-        <w:divId w:val="1625111436"/>
+        <w:divId w:val="1332218290"/>
         <w:rPr>
           <w:rFonts w:ascii="Calibri" w:hAnsi="Calibri" w:cs="Calibri"/>
           <w:color w:val="1A1A1A"/>
@@ -16100,7 +16102,7 @@
     <w:p>
       <w:pPr>
         <w:pStyle w:val="Heading2"/>
-        <w:divId w:val="1625111436"/>
+        <w:divId w:val="1332218290"/>
         <w:rPr>
           <w:rFonts w:ascii="Calibri" w:eastAsia="Times New Roman" w:hAnsi="Calibri" w:cs="Calibri"/>
         </w:rPr>
@@ -16119,7 +16121,7 @@
           <w:numId w:val="14"/>
         </w:numPr>
         <w:spacing w:before="100" w:beforeAutospacing="1" w:after="100" w:afterAutospacing="1"/>
-        <w:divId w:val="1625111436"/>
+        <w:divId w:val="1332218290"/>
         <w:rPr>
           <w:rFonts w:ascii="Calibri" w:eastAsia="Times New Roman" w:hAnsi="Calibri" w:cs="Calibri"/>
           <w:color w:val="1A1A1A"/>
@@ -16154,7 +16156,7 @@
           <w:numId w:val="14"/>
         </w:numPr>
         <w:spacing w:before="100" w:beforeAutospacing="1" w:after="100" w:afterAutospacing="1"/>
-        <w:divId w:val="1625111436"/>
+        <w:divId w:val="1332218290"/>
         <w:rPr>
           <w:rFonts w:ascii="Calibri" w:eastAsia="Times New Roman" w:hAnsi="Calibri" w:cs="Calibri"/>
           <w:color w:val="1A1A1A"/>
@@ -16198,7 +16200,7 @@
           <w:numId w:val="14"/>
         </w:numPr>
         <w:spacing w:before="100" w:beforeAutospacing="1" w:after="100" w:afterAutospacing="1"/>
-        <w:divId w:val="1625111436"/>
+        <w:divId w:val="1332218290"/>
         <w:rPr>
           <w:rFonts w:ascii="Calibri" w:eastAsia="Times New Roman" w:hAnsi="Calibri" w:cs="Calibri"/>
           <w:color w:val="1A1A1A"/>
@@ -16238,7 +16240,7 @@
     <w:p>
       <w:pPr>
         <w:pStyle w:val="Heading2"/>
-        <w:divId w:val="1625111436"/>
+        <w:divId w:val="1332218290"/>
         <w:rPr>
           <w:rFonts w:ascii="Calibri" w:eastAsia="Times New Roman" w:hAnsi="Calibri" w:cs="Calibri"/>
         </w:rPr>
@@ -16253,7 +16255,7 @@
     <w:p>
       <w:pPr>
         <w:pStyle w:val="NormalWeb"/>
-        <w:divId w:val="1625111436"/>
+        <w:divId w:val="1332218290"/>
         <w:rPr>
           <w:rFonts w:ascii="Calibri" w:hAnsi="Calibri" w:cs="Calibri"/>
           <w:color w:val="1A1A1A"/>
@@ -16283,7 +16285,7 @@
     <w:p>
       <w:pPr>
         <w:pStyle w:val="Heading2"/>
-        <w:divId w:val="1625111436"/>
+        <w:divId w:val="1332218290"/>
         <w:rPr>
           <w:rFonts w:ascii="Calibri" w:eastAsia="Times New Roman" w:hAnsi="Calibri" w:cs="Calibri"/>
         </w:rPr>
@@ -16302,7 +16304,7 @@
           <w:numId w:val="15"/>
         </w:numPr>
         <w:spacing w:before="100" w:beforeAutospacing="1" w:after="100" w:afterAutospacing="1"/>
-        <w:divId w:val="1625111436"/>
+        <w:divId w:val="1332218290"/>
         <w:rPr>
           <w:rFonts w:ascii="Calibri" w:eastAsia="Times New Roman" w:hAnsi="Calibri" w:cs="Calibri"/>
           <w:color w:val="1A1A1A"/>
@@ -16346,7 +16348,7 @@
           <w:numId w:val="15"/>
         </w:numPr>
         <w:spacing w:before="100" w:beforeAutospacing="1" w:after="100" w:afterAutospacing="1"/>
-        <w:divId w:val="1625111436"/>
+        <w:divId w:val="1332218290"/>
         <w:rPr>
           <w:rFonts w:ascii="Calibri" w:eastAsia="Times New Roman" w:hAnsi="Calibri" w:cs="Calibri"/>
           <w:color w:val="1A1A1A"/>
@@ -16390,7 +16392,7 @@
           <w:numId w:val="15"/>
         </w:numPr>
         <w:spacing w:before="100" w:beforeAutospacing="1" w:after="100" w:afterAutospacing="1"/>
-        <w:divId w:val="1625111436"/>
+        <w:divId w:val="1332218290"/>
         <w:rPr>
           <w:rFonts w:ascii="Calibri" w:eastAsia="Times New Roman" w:hAnsi="Calibri" w:cs="Calibri"/>
           <w:color w:val="1A1A1A"/>
@@ -16434,7 +16436,7 @@
           <w:numId w:val="15"/>
         </w:numPr>
         <w:spacing w:before="100" w:beforeAutospacing="1" w:after="100" w:afterAutospacing="1"/>
-        <w:divId w:val="1625111436"/>
+        <w:divId w:val="1332218290"/>
         <w:rPr>
           <w:rFonts w:ascii="Calibri" w:eastAsia="Times New Roman" w:hAnsi="Calibri" w:cs="Calibri"/>
           <w:color w:val="1A1A1A"/>
@@ -16478,7 +16480,7 @@
           <w:numId w:val="15"/>
         </w:numPr>
         <w:spacing w:before="100" w:beforeAutospacing="1" w:after="100" w:afterAutospacing="1"/>
-        <w:divId w:val="1625111436"/>
+        <w:divId w:val="1332218290"/>
         <w:rPr>
           <w:rFonts w:ascii="Calibri" w:eastAsia="Times New Roman" w:hAnsi="Calibri" w:cs="Calibri"/>
           <w:color w:val="1A1A1A"/>
@@ -16522,7 +16524,7 @@
           <w:numId w:val="15"/>
         </w:numPr>
         <w:spacing w:before="100" w:beforeAutospacing="1" w:after="100" w:afterAutospacing="1"/>
-        <w:divId w:val="1625111436"/>
+        <w:divId w:val="1332218290"/>
         <w:rPr>
           <w:rFonts w:ascii="Calibri" w:eastAsia="Times New Roman" w:hAnsi="Calibri" w:cs="Calibri"/>
           <w:color w:val="1A1A1A"/>
@@ -16558,7 +16560,7 @@
         </w:rPr>
         <w:t xml:space="preserve"> (SDGs 9, 11, 13), 2015. </w:t>
       </w:r>
-      <w:hyperlink r:id="rId7" w:history="1">
+      <w:hyperlink r:id="rId8" w:history="1">
         <w:r>
           <w:rPr>
             <w:rStyle w:val="Hyperlink"/>
@@ -16577,7 +16579,7 @@
           <w:numId w:val="15"/>
         </w:numPr>
         <w:spacing w:before="100" w:beforeAutospacing="1" w:after="100" w:afterAutospacing="1"/>
-        <w:divId w:val="1625111436"/>
+        <w:divId w:val="1332218290"/>
         <w:rPr>
           <w:rFonts w:ascii="Calibri" w:eastAsia="Times New Roman" w:hAnsi="Calibri" w:cs="Calibri"/>
           <w:color w:val="1A1A1A"/>
@@ -16617,7 +16619,7 @@
     <w:p>
       <w:pPr>
         <w:pStyle w:val="Heading2"/>
-        <w:divId w:val="1625111436"/>
+        <w:divId w:val="1332218290"/>
         <w:rPr>
           <w:rFonts w:ascii="Calibri" w:eastAsia="Times New Roman" w:hAnsi="Calibri" w:cs="Calibri"/>
         </w:rPr>
@@ -16632,7 +16634,7 @@
     <w:p>
       <w:pPr>
         <w:pStyle w:val="NormalWeb"/>
-        <w:divId w:val="1625111436"/>
+        <w:divId w:val="1332218290"/>
         <w:rPr>
           <w:rFonts w:ascii="Calibri" w:hAnsi="Calibri" w:cs="Calibri"/>
           <w:color w:val="1A1A1A"/>
@@ -16683,7 +16685,7 @@
       </w:tblGrid>
       <w:tr>
         <w:trPr>
-          <w:divId w:val="1625111436"/>
+          <w:divId w:val="1332218290"/>
           <w:tblHeader/>
         </w:trPr>
         <w:tc>
@@ -16775,7 +16777,7 @@
       </w:tr>
       <w:tr>
         <w:trPr>
-          <w:divId w:val="1625111436"/>
+          <w:divId w:val="1332218290"/>
         </w:trPr>
         <w:tc>
           <w:tcPr>
@@ -16872,7 +16874,7 @@
       </w:tr>
       <w:tr>
         <w:trPr>
-          <w:divId w:val="1625111436"/>
+          <w:divId w:val="1332218290"/>
         </w:trPr>
         <w:tc>
           <w:tcPr>
@@ -17001,7 +17003,7 @@
       </w:tr>
       <w:tr>
         <w:trPr>
-          <w:divId w:val="1625111436"/>
+          <w:divId w:val="1332218290"/>
         </w:trPr>
         <w:tc>
           <w:tcPr>
@@ -17105,7 +17107,7 @@
       </w:tr>
       <w:tr>
         <w:trPr>
-          <w:divId w:val="1625111436"/>
+          <w:divId w:val="1332218290"/>
         </w:trPr>
         <w:tc>
           <w:tcPr>
@@ -17202,7 +17204,7 @@
       </w:tr>
       <w:tr>
         <w:trPr>
-          <w:divId w:val="1625111436"/>
+          <w:divId w:val="1332218290"/>
         </w:trPr>
         <w:tc>
           <w:tcPr>
@@ -17299,7 +17301,7 @@
       </w:tr>
       <w:tr>
         <w:trPr>
-          <w:divId w:val="1625111436"/>
+          <w:divId w:val="1332218290"/>
         </w:trPr>
         <w:tc>
           <w:tcPr>
@@ -17391,7 +17393,7 @@
     <w:p>
       <w:pPr>
         <w:pStyle w:val="NormalWeb"/>
-        <w:divId w:val="1625111436"/>
+        <w:divId w:val="1332218290"/>
         <w:rPr>
           <w:rFonts w:ascii="Calibri" w:hAnsi="Calibri" w:cs="Calibri"/>
           <w:color w:val="1A1A1A"/>
@@ -17406,16 +17408,36 @@
           <w:sz w:val="22"/>
           <w:szCs w:val="22"/>
         </w:rPr>
-        <w:t>GitHub Repository: [Insert repository link after upload] (A local Git repository with the full history is prepared in the project folder; the link above is to be filled in once the repository is published.)</w:t>
+        <w:t xml:space="preserve">GitHub Repository: </w:t>
+      </w:r>
+      <w:hyperlink r:id="rId9" w:history="1">
+        <w:r>
+          <w:rPr>
+            <w:rStyle w:val="Hyperlink"/>
+            <w:rFonts w:ascii="Calibri" w:hAnsi="Calibri" w:cs="Calibri"/>
+            <w:sz w:val="22"/>
+            <w:szCs w:val="22"/>
+          </w:rPr>
+          <w:t>https://github.com/athisayaprema2007-hue/CSA0312-Intelligent-Evacuation-Routing-System</w:t>
+        </w:r>
+      </w:hyperlink>
+      <w:r>
+        <w:rPr>
+          <w:rFonts w:ascii="Calibri" w:hAnsi="Calibri" w:cs="Calibri"/>
+          <w:color w:val="1A1A1A"/>
+          <w:sz w:val="22"/>
+          <w:szCs w:val="22"/>
+        </w:rPr>
+        <w:t xml:space="preserve"> The repository contains the complete project files and is available at the URL above.</w:t>
       </w:r>
     </w:p>
     <w:sectPr>
-      <w:headerReference w:type="even" r:id="rId8"/>
-      <w:headerReference w:type="default" r:id="rId9"/>
-      <w:footerReference w:type="even" r:id="rId10"/>
-      <w:footerReference w:type="default" r:id="rId11"/>
-      <w:headerReference w:type="first" r:id="rId12"/>
-      <w:footerReference w:type="first" r:id="rId13"/>
+      <w:headerReference w:type="even" r:id="rId10"/>
+      <w:headerReference w:type="default" r:id="rId11"/>
+      <w:footerReference w:type="even" r:id="rId12"/>
+      <w:footerReference w:type="default" r:id="rId13"/>
+      <w:headerReference w:type="first" r:id="rId14"/>
+      <w:footerReference w:type="first" r:id="rId15"/>
       <w:pgSz w:w="12240" w:h="15840"/>
       <w:pgMar w:top="1440" w:right="1440" w:bottom="1440" w:left="1440" w:header="720" w:footer="720" w:gutter="0"/>
       <w:cols w:space="720"/>
@@ -17599,9 +17621,9 @@
 <file path=word/numbering.xml><?xml version="1.0" encoding="utf-8"?>
 <w:numbering xmlns:wpc="http://schemas.microsoft.com/office/word/2010/wordprocessingCanvas" xmlns:cx="http://schemas.microsoft.com/office/drawing/2014/chartex" xmlns:cx1="http://schemas.microsoft.com/office/drawing/2015/9/8/chartex" xmlns:cx2="http://schemas.microsoft.com/office/drawing/2015/10/21/chartex" xmlns:cx3="http://schemas.microsoft.com/office/drawing/2016/5/9/chartex" xmlns:cx4="http://schemas.microsoft.com/office/drawing/2016/5/10/chartex" xmlns:cx5="http://schemas.microsoft.com/office/drawing/2016/5/11/chartex" xmlns:cx6="http://schemas.microsoft.com/office/drawing/2016/5/12/chartex" xmlns:cx7="http://schemas.microsoft.com/office/drawing/2016/5/13/chartex" xmlns:cx8="http://schemas.microsoft.com/office/drawing/2016/5/14/chartex" xmlns:mc="http://schemas.openxmlformats.org/markup-compatibility/2006" xmlns:aink="http://schemas.microsoft.com/office/drawing/2016/ink" xmlns:am3d="http://schemas.microsoft.com/office/drawing/2017/model3d" xmlns:o="urn:schemas-microsoft-com:office:office" xmlns:oel="http://schemas.microsoft.com/office/2019/extlst" xmlns:r="http://schemas.openxmlformats.org/officeDocument/2006/relationships" xmlns:m="http://schemas.openxmlformats.org/officeDocument/2006/math" xmlns:v="urn:schemas-microsoft-com:vml" xmlns:wp14="http://schemas.microsoft.com/office/word/2010/wordprocessingDrawing" xmlns:wp="http://schemas.openxmlformats.org/drawingml/2006/wordprocessingDrawing" xmlns:w10="urn:schemas-microsoft-com:office:word" xmlns:w="http://schemas.openxmlformats.org/wordprocessingml/2006/main" xmlns:w14="http://schemas.microsoft.com/office/word/2010/wordml" xmlns:w15="http://schemas.microsoft.com/office/word/2012/wordml" xmlns:w16cex="http://schemas.microsoft.com/office/word/2018/wordml/cex" xmlns:w16cid="http://schemas.microsoft.com/office/word/2016/wordml/cid" xmlns:w16="http://schemas.microsoft.com/office/word/2018/wordml" xmlns:w16du="http://schemas.microsoft.com/office/word/2023/wordml/word16du" xmlns:w16sdtdh="http://schemas.microsoft.com/office/word/2020/wordml/sdtdatahash" xmlns:w16sdtfl="http://schemas.microsoft.com/office/word/2024/wordml/sdtformatlock" xmlns:w16se="http://schemas.microsoft.com/office/word/2015/wordml/symex" xmlns:wpg="http://schemas.microsoft.com/office/word/2010/wordprocessingGroup" xmlns:wpi="http://schemas.microsoft.com/office/word/2010/wordprocessingInk" xmlns:wne="http://schemas.microsoft.com/office/word/2006/wordml" xmlns:wps="http://schemas.microsoft.com/office/word/2010/wordprocessingShape" mc:Ignorable="w14 w15 w16se w16cid w16 w16cex w16sdtdh w16sdtfl w16du wp14">
   <w:abstractNum w:abstractNumId="0" w15:restartNumberingAfterBreak="0">
-    <w:nsid w:val="11E356A7"/>
+    <w:nsid w:val="00670CD9"/>
     <w:multiLevelType w:val="multilevel"/>
-    <w:tmpl w:val="1838A1AC"/>
+    <w:tmpl w:val="38766558"/>
     <w:lvl w:ilvl="0">
       <w:start w:val="1"/>
       <w:numFmt w:val="bullet"/>
@@ -17748,9 +17770,9 @@
     </w:lvl>
   </w:abstractNum>
   <w:abstractNum w:abstractNumId="1" w15:restartNumberingAfterBreak="0">
-    <w:nsid w:val="134A32E7"/>
+    <w:nsid w:val="0F4E4A6B"/>
     <w:multiLevelType w:val="multilevel"/>
-    <w:tmpl w:val="256E69DA"/>
+    <w:tmpl w:val="769CC30E"/>
     <w:lvl w:ilvl="0">
       <w:start w:val="1"/>
       <w:numFmt w:val="bullet"/>
@@ -17897,9 +17919,9 @@
     </w:lvl>
   </w:abstractNum>
   <w:abstractNum w:abstractNumId="2" w15:restartNumberingAfterBreak="0">
-    <w:nsid w:val="15906CDF"/>
+    <w:nsid w:val="1B6808A1"/>
     <w:multiLevelType w:val="multilevel"/>
-    <w:tmpl w:val="C688C346"/>
+    <w:tmpl w:val="88E8B41E"/>
     <w:lvl w:ilvl="0">
       <w:start w:val="1"/>
       <w:numFmt w:val="bullet"/>
@@ -18046,235 +18068,9 @@
     </w:lvl>
   </w:abstractNum>
   <w:abstractNum w:abstractNumId="3" w15:restartNumberingAfterBreak="0">
-    <w:nsid w:val="1A013FCB"/>
+    <w:nsid w:val="1CCF5E96"/>
     <w:multiLevelType w:val="multilevel"/>
-    <w:tmpl w:val="10BEB386"/>
-    <w:lvl w:ilvl="0">
-      <w:start w:val="1"/>
-      <w:numFmt w:val="decimal"/>
-      <w:lvlText w:val="%1."/>
-      <w:lvlJc w:val="left"/>
-      <w:pPr>
-        <w:tabs>
-          <w:tab w:val="num" w:pos="720"/>
-        </w:tabs>
-        <w:ind w:left="720" w:hanging="360"/>
-      </w:pPr>
-    </w:lvl>
-    <w:lvl w:ilvl="1" w:tentative="1">
-      <w:start w:val="1"/>
-      <w:numFmt w:val="decimal"/>
-      <w:lvlText w:val="%2."/>
-      <w:lvlJc w:val="left"/>
-      <w:pPr>
-        <w:tabs>
-          <w:tab w:val="num" w:pos="1440"/>
-        </w:tabs>
-        <w:ind w:left="1440" w:hanging="360"/>
-      </w:pPr>
-    </w:lvl>
-    <w:lvl w:ilvl="2" w:tentative="1">
-      <w:start w:val="1"/>
-      <w:numFmt w:val="decimal"/>
-      <w:lvlText w:val="%3."/>
-      <w:lvlJc w:val="left"/>
-      <w:pPr>
-        <w:tabs>
-          <w:tab w:val="num" w:pos="2160"/>
-        </w:tabs>
-        <w:ind w:left="2160" w:hanging="360"/>
-      </w:pPr>
-    </w:lvl>
-    <w:lvl w:ilvl="3" w:tentative="1">
-      <w:start w:val="1"/>
-      <w:numFmt w:val="decimal"/>
-      <w:lvlText w:val="%4."/>
-      <w:lvlJc w:val="left"/>
-      <w:pPr>
-        <w:tabs>
-          <w:tab w:val="num" w:pos="2880"/>
-        </w:tabs>
-        <w:ind w:left="2880" w:hanging="360"/>
-      </w:pPr>
-    </w:lvl>
-    <w:lvl w:ilvl="4" w:tentative="1">
-      <w:start w:val="1"/>
-      <w:numFmt w:val="decimal"/>
-      <w:lvlText w:val="%5."/>
-      <w:lvlJc w:val="left"/>
-      <w:pPr>
-        <w:tabs>
-          <w:tab w:val="num" w:pos="3600"/>
-        </w:tabs>
-        <w:ind w:left="3600" w:hanging="360"/>
-      </w:pPr>
-    </w:lvl>
-    <w:lvl w:ilvl="5" w:tentative="1">
-      <w:start w:val="1"/>
-      <w:numFmt w:val="decimal"/>
-      <w:lvlText w:val="%6."/>
-      <w:lvlJc w:val="left"/>
-      <w:pPr>
-        <w:tabs>
-          <w:tab w:val="num" w:pos="4320"/>
-        </w:tabs>
-        <w:ind w:left="4320" w:hanging="360"/>
-      </w:pPr>
-    </w:lvl>
-    <w:lvl w:ilvl="6" w:tentative="1">
-      <w:start w:val="1"/>
-      <w:numFmt w:val="decimal"/>
-      <w:lvlText w:val="%7."/>
-      <w:lvlJc w:val="left"/>
-      <w:pPr>
-        <w:tabs>
-          <w:tab w:val="num" w:pos="5040"/>
-        </w:tabs>
-        <w:ind w:left="5040" w:hanging="360"/>
-      </w:pPr>
-    </w:lvl>
-    <w:lvl w:ilvl="7" w:tentative="1">
-      <w:start w:val="1"/>
-      <w:numFmt w:val="decimal"/>
-      <w:lvlText w:val="%8."/>
-      <w:lvlJc w:val="left"/>
-      <w:pPr>
-        <w:tabs>
-          <w:tab w:val="num" w:pos="5760"/>
-        </w:tabs>
-        <w:ind w:left="5760" w:hanging="360"/>
-      </w:pPr>
-    </w:lvl>
-    <w:lvl w:ilvl="8" w:tentative="1">
-      <w:start w:val="1"/>
-      <w:numFmt w:val="decimal"/>
-      <w:lvlText w:val="%9."/>
-      <w:lvlJc w:val="left"/>
-      <w:pPr>
-        <w:tabs>
-          <w:tab w:val="num" w:pos="6480"/>
-        </w:tabs>
-        <w:ind w:left="6480" w:hanging="360"/>
-      </w:pPr>
-    </w:lvl>
-  </w:abstractNum>
-  <w:abstractNum w:abstractNumId="4" w15:restartNumberingAfterBreak="0">
-    <w:nsid w:val="1A3F18DD"/>
-    <w:multiLevelType w:val="multilevel"/>
-    <w:tmpl w:val="20360FB0"/>
-    <w:lvl w:ilvl="0">
-      <w:start w:val="1"/>
-      <w:numFmt w:val="decimal"/>
-      <w:lvlText w:val="%1."/>
-      <w:lvlJc w:val="left"/>
-      <w:pPr>
-        <w:tabs>
-          <w:tab w:val="num" w:pos="720"/>
-        </w:tabs>
-        <w:ind w:left="720" w:hanging="360"/>
-      </w:pPr>
-    </w:lvl>
-    <w:lvl w:ilvl="1" w:tentative="1">
-      <w:start w:val="1"/>
-      <w:numFmt w:val="decimal"/>
-      <w:lvlText w:val="%2."/>
-      <w:lvlJc w:val="left"/>
-      <w:pPr>
-        <w:tabs>
-          <w:tab w:val="num" w:pos="1440"/>
-        </w:tabs>
-        <w:ind w:left="1440" w:hanging="360"/>
-      </w:pPr>
-    </w:lvl>
-    <w:lvl w:ilvl="2" w:tentative="1">
-      <w:start w:val="1"/>
-      <w:numFmt w:val="decimal"/>
-      <w:lvlText w:val="%3."/>
-      <w:lvlJc w:val="left"/>
-      <w:pPr>
-        <w:tabs>
-          <w:tab w:val="num" w:pos="2160"/>
-        </w:tabs>
-        <w:ind w:left="2160" w:hanging="360"/>
-      </w:pPr>
-    </w:lvl>
-    <w:lvl w:ilvl="3" w:tentative="1">
-      <w:start w:val="1"/>
-      <w:numFmt w:val="decimal"/>
-      <w:lvlText w:val="%4."/>
-      <w:lvlJc w:val="left"/>
-      <w:pPr>
-        <w:tabs>
-          <w:tab w:val="num" w:pos="2880"/>
-        </w:tabs>
-        <w:ind w:left="2880" w:hanging="360"/>
-      </w:pPr>
-    </w:lvl>
-    <w:lvl w:ilvl="4" w:tentative="1">
-      <w:start w:val="1"/>
-      <w:numFmt w:val="decimal"/>
-      <w:lvlText w:val="%5."/>
-      <w:lvlJc w:val="left"/>
-      <w:pPr>
-        <w:tabs>
-          <w:tab w:val="num" w:pos="3600"/>
-        </w:tabs>
-        <w:ind w:left="3600" w:hanging="360"/>
-      </w:pPr>
-    </w:lvl>
-    <w:lvl w:ilvl="5" w:tentative="1">
-      <w:start w:val="1"/>
-      <w:numFmt w:val="decimal"/>
-      <w:lvlText w:val="%6."/>
-      <w:lvlJc w:val="left"/>
-      <w:pPr>
-        <w:tabs>
-          <w:tab w:val="num" w:pos="4320"/>
-        </w:tabs>
-        <w:ind w:left="4320" w:hanging="360"/>
-      </w:pPr>
-    </w:lvl>
-    <w:lvl w:ilvl="6" w:tentative="1">
-      <w:start w:val="1"/>
-      <w:numFmt w:val="decimal"/>
-      <w:lvlText w:val="%7."/>
-      <w:lvlJc w:val="left"/>
-      <w:pPr>
-        <w:tabs>
-          <w:tab w:val="num" w:pos="5040"/>
-        </w:tabs>
-        <w:ind w:left="5040" w:hanging="360"/>
-      </w:pPr>
-    </w:lvl>
-    <w:lvl w:ilvl="7" w:tentative="1">
-      <w:start w:val="1"/>
-      <w:numFmt w:val="decimal"/>
-      <w:lvlText w:val="%8."/>
-      <w:lvlJc w:val="left"/>
-      <w:pPr>
-        <w:tabs>
-          <w:tab w:val="num" w:pos="5760"/>
-        </w:tabs>
-        <w:ind w:left="5760" w:hanging="360"/>
-      </w:pPr>
-    </w:lvl>
-    <w:lvl w:ilvl="8" w:tentative="1">
-      <w:start w:val="1"/>
-      <w:numFmt w:val="decimal"/>
-      <w:lvlText w:val="%9."/>
-      <w:lvlJc w:val="left"/>
-      <w:pPr>
-        <w:tabs>
-          <w:tab w:val="num" w:pos="6480"/>
-        </w:tabs>
-        <w:ind w:left="6480" w:hanging="360"/>
-      </w:pPr>
-    </w:lvl>
-  </w:abstractNum>
-  <w:abstractNum w:abstractNumId="5" w15:restartNumberingAfterBreak="0">
-    <w:nsid w:val="1BCA5AAC"/>
-    <w:multiLevelType w:val="multilevel"/>
-    <w:tmpl w:val="8C4E2F3E"/>
+    <w:tmpl w:val="C7A48FB4"/>
     <w:lvl w:ilvl="0">
       <w:start w:val="1"/>
       <w:numFmt w:val="bullet"/>
@@ -18420,10 +18216,10 @@
       </w:rPr>
     </w:lvl>
   </w:abstractNum>
-  <w:abstractNum w:abstractNumId="6" w15:restartNumberingAfterBreak="0">
-    <w:nsid w:val="2FEB761D"/>
+  <w:abstractNum w:abstractNumId="4" w15:restartNumberingAfterBreak="0">
+    <w:nsid w:val="1D6678F4"/>
     <w:multiLevelType w:val="multilevel"/>
-    <w:tmpl w:val="E7C2BC96"/>
+    <w:tmpl w:val="4318763A"/>
     <w:lvl w:ilvl="0">
       <w:start w:val="1"/>
       <w:numFmt w:val="bullet"/>
@@ -18569,10 +18365,10 @@
       </w:rPr>
     </w:lvl>
   </w:abstractNum>
-  <w:abstractNum w:abstractNumId="7" w15:restartNumberingAfterBreak="0">
-    <w:nsid w:val="40AB1E19"/>
+  <w:abstractNum w:abstractNumId="5" w15:restartNumberingAfterBreak="0">
+    <w:nsid w:val="270B148F"/>
     <w:multiLevelType w:val="multilevel"/>
-    <w:tmpl w:val="932466FC"/>
+    <w:tmpl w:val="C9625DBC"/>
     <w:lvl w:ilvl="0">
       <w:start w:val="1"/>
       <w:numFmt w:val="bullet"/>
@@ -18718,10 +18514,10 @@
       </w:rPr>
     </w:lvl>
   </w:abstractNum>
-  <w:abstractNum w:abstractNumId="8" w15:restartNumberingAfterBreak="0">
-    <w:nsid w:val="47D27B54"/>
+  <w:abstractNum w:abstractNumId="6" w15:restartNumberingAfterBreak="0">
+    <w:nsid w:val="28CC5E5C"/>
     <w:multiLevelType w:val="multilevel"/>
-    <w:tmpl w:val="30F45F78"/>
+    <w:tmpl w:val="55A29E02"/>
     <w:lvl w:ilvl="0">
       <w:start w:val="1"/>
       <w:numFmt w:val="bullet"/>
@@ -18867,10 +18663,10 @@
       </w:rPr>
     </w:lvl>
   </w:abstractNum>
-  <w:abstractNum w:abstractNumId="9" w15:restartNumberingAfterBreak="0">
-    <w:nsid w:val="590B3FE6"/>
+  <w:abstractNum w:abstractNumId="7" w15:restartNumberingAfterBreak="0">
+    <w:nsid w:val="30AB5A7C"/>
     <w:multiLevelType w:val="multilevel"/>
-    <w:tmpl w:val="3A66DF38"/>
+    <w:tmpl w:val="3E3AA5BC"/>
     <w:lvl w:ilvl="0">
       <w:start w:val="1"/>
       <w:numFmt w:val="bullet"/>
@@ -19016,10 +18812,123 @@
       </w:rPr>
     </w:lvl>
   </w:abstractNum>
-  <w:abstractNum w:abstractNumId="10" w15:restartNumberingAfterBreak="0">
-    <w:nsid w:val="60822794"/>
+  <w:abstractNum w:abstractNumId="8" w15:restartNumberingAfterBreak="0">
+    <w:nsid w:val="3D1F0097"/>
     <w:multiLevelType w:val="multilevel"/>
-    <w:tmpl w:val="389AC8BE"/>
+    <w:tmpl w:val="79F87A44"/>
+    <w:lvl w:ilvl="0">
+      <w:start w:val="1"/>
+      <w:numFmt w:val="decimal"/>
+      <w:lvlText w:val="%1."/>
+      <w:lvlJc w:val="left"/>
+      <w:pPr>
+        <w:tabs>
+          <w:tab w:val="num" w:pos="720"/>
+        </w:tabs>
+        <w:ind w:left="720" w:hanging="360"/>
+      </w:pPr>
+    </w:lvl>
+    <w:lvl w:ilvl="1" w:tentative="1">
+      <w:start w:val="1"/>
+      <w:numFmt w:val="decimal"/>
+      <w:lvlText w:val="%2."/>
+      <w:lvlJc w:val="left"/>
+      <w:pPr>
+        <w:tabs>
+          <w:tab w:val="num" w:pos="1440"/>
+        </w:tabs>
+        <w:ind w:left="1440" w:hanging="360"/>
+      </w:pPr>
+    </w:lvl>
+    <w:lvl w:ilvl="2" w:tentative="1">
+      <w:start w:val="1"/>
+      <w:numFmt w:val="decimal"/>
+      <w:lvlText w:val="%3."/>
+      <w:lvlJc w:val="left"/>
+      <w:pPr>
+        <w:tabs>
+          <w:tab w:val="num" w:pos="2160"/>
+        </w:tabs>
+        <w:ind w:left="2160" w:hanging="360"/>
+      </w:pPr>
+    </w:lvl>
+    <w:lvl w:ilvl="3" w:tentative="1">
+      <w:start w:val="1"/>
+      <w:numFmt w:val="decimal"/>
+      <w:lvlText w:val="%4."/>
+      <w:lvlJc w:val="left"/>
+      <w:pPr>
+        <w:tabs>
+          <w:tab w:val="num" w:pos="2880"/>
+        </w:tabs>
+        <w:ind w:left="2880" w:hanging="360"/>
+      </w:pPr>
+    </w:lvl>
+    <w:lvl w:ilvl="4" w:tentative="1">
+      <w:start w:val="1"/>
+      <w:numFmt w:val="decimal"/>
+      <w:lvlText w:val="%5."/>
+      <w:lvlJc w:val="left"/>
+      <w:pPr>
+        <w:tabs>
+          <w:tab w:val="num" w:pos="3600"/>
+        </w:tabs>
+        <w:ind w:left="3600" w:hanging="360"/>
+      </w:pPr>
+    </w:lvl>
+    <w:lvl w:ilvl="5" w:tentative="1">
+      <w:start w:val="1"/>
+      <w:numFmt w:val="decimal"/>
+      <w:lvlText w:val="%6."/>
+      <w:lvlJc w:val="left"/>
+      <w:pPr>
+        <w:tabs>
+          <w:tab w:val="num" w:pos="4320"/>
+        </w:tabs>
+        <w:ind w:left="4320" w:hanging="360"/>
+      </w:pPr>
+    </w:lvl>
+    <w:lvl w:ilvl="6" w:tentative="1">
+      <w:start w:val="1"/>
+      <w:numFmt w:val="decimal"/>
+      <w:lvlText w:val="%7."/>
+      <w:lvlJc w:val="left"/>
+      <w:pPr>
+        <w:tabs>
+          <w:tab w:val="num" w:pos="5040"/>
+        </w:tabs>
+        <w:ind w:left="5040" w:hanging="360"/>
+      </w:pPr>
+    </w:lvl>
+    <w:lvl w:ilvl="7" w:tentative="1">
+      <w:start w:val="1"/>
+      <w:numFmt w:val="decimal"/>
+      <w:lvlText w:val="%8."/>
+      <w:lvlJc w:val="left"/>
+      <w:pPr>
+        <w:tabs>
+          <w:tab w:val="num" w:pos="5760"/>
+        </w:tabs>
+        <w:ind w:left="5760" w:hanging="360"/>
+      </w:pPr>
+    </w:lvl>
+    <w:lvl w:ilvl="8" w:tentative="1">
+      <w:start w:val="1"/>
+      <w:numFmt w:val="decimal"/>
+      <w:lvlText w:val="%9."/>
+      <w:lvlJc w:val="left"/>
+      <w:pPr>
+        <w:tabs>
+          <w:tab w:val="num" w:pos="6480"/>
+        </w:tabs>
+        <w:ind w:left="6480" w:hanging="360"/>
+      </w:pPr>
+    </w:lvl>
+  </w:abstractNum>
+  <w:abstractNum w:abstractNumId="9" w15:restartNumberingAfterBreak="0">
+    <w:nsid w:val="4E4C795C"/>
+    <w:multiLevelType w:val="multilevel"/>
+    <w:tmpl w:val="45FAE0C4"/>
     <w:lvl w:ilvl="0">
       <w:start w:val="1"/>
       <w:numFmt w:val="bullet"/>
@@ -19165,10 +19074,10 @@
       </w:rPr>
     </w:lvl>
   </w:abstractNum>
-  <w:abstractNum w:abstractNumId="11" w15:restartNumberingAfterBreak="0">
-    <w:nsid w:val="6492088D"/>
+  <w:abstractNum w:abstractNumId="10" w15:restartNumberingAfterBreak="0">
+    <w:nsid w:val="5AF6487A"/>
     <w:multiLevelType w:val="multilevel"/>
-    <w:tmpl w:val="5DC4B610"/>
+    <w:tmpl w:val="6C3A7F46"/>
     <w:lvl w:ilvl="0">
       <w:start w:val="1"/>
       <w:numFmt w:val="bullet"/>
@@ -19314,10 +19223,10 @@
       </w:rPr>
     </w:lvl>
   </w:abstractNum>
-  <w:abstractNum w:abstractNumId="12" w15:restartNumberingAfterBreak="0">
-    <w:nsid w:val="68887322"/>
+  <w:abstractNum w:abstractNumId="11" w15:restartNumberingAfterBreak="0">
+    <w:nsid w:val="67752FA6"/>
     <w:multiLevelType w:val="multilevel"/>
-    <w:tmpl w:val="8646C50E"/>
+    <w:tmpl w:val="7FF42CB6"/>
     <w:lvl w:ilvl="0">
       <w:start w:val="1"/>
       <w:numFmt w:val="bullet"/>
@@ -19463,10 +19372,10 @@
       </w:rPr>
     </w:lvl>
   </w:abstractNum>
-  <w:abstractNum w:abstractNumId="13" w15:restartNumberingAfterBreak="0">
-    <w:nsid w:val="7561557F"/>
+  <w:abstractNum w:abstractNumId="12" w15:restartNumberingAfterBreak="0">
+    <w:nsid w:val="68A97948"/>
     <w:multiLevelType w:val="multilevel"/>
-    <w:tmpl w:val="4A2A934C"/>
+    <w:tmpl w:val="16E00812"/>
     <w:lvl w:ilvl="0">
       <w:start w:val="1"/>
       <w:numFmt w:val="decimal"/>
@@ -19576,10 +19485,123 @@
       </w:pPr>
     </w:lvl>
   </w:abstractNum>
+  <w:abstractNum w:abstractNumId="13" w15:restartNumberingAfterBreak="0">
+    <w:nsid w:val="6AA51307"/>
+    <w:multiLevelType w:val="multilevel"/>
+    <w:tmpl w:val="4492FD60"/>
+    <w:lvl w:ilvl="0">
+      <w:start w:val="1"/>
+      <w:numFmt w:val="decimal"/>
+      <w:lvlText w:val="%1."/>
+      <w:lvlJc w:val="left"/>
+      <w:pPr>
+        <w:tabs>
+          <w:tab w:val="num" w:pos="720"/>
+        </w:tabs>
+        <w:ind w:left="720" w:hanging="360"/>
+      </w:pPr>
+    </w:lvl>
+    <w:lvl w:ilvl="1" w:tentative="1">
+      <w:start w:val="1"/>
+      <w:numFmt w:val="decimal"/>
+      <w:lvlText w:val="%2."/>
+      <w:lvlJc w:val="left"/>
+      <w:pPr>
+        <w:tabs>
+          <w:tab w:val="num" w:pos="1440"/>
+        </w:tabs>
+        <w:ind w:left="1440" w:hanging="360"/>
+      </w:pPr>
+    </w:lvl>
+    <w:lvl w:ilvl="2" w:tentative="1">
+      <w:start w:val="1"/>
+      <w:numFmt w:val="decimal"/>
+      <w:lvlText w:val="%3."/>
+      <w:lvlJc w:val="left"/>
+      <w:pPr>
+        <w:tabs>
+          <w:tab w:val="num" w:pos="2160"/>
+        </w:tabs>
+        <w:ind w:left="2160" w:hanging="360"/>
+      </w:pPr>
+    </w:lvl>
+    <w:lvl w:ilvl="3" w:tentative="1">
+      <w:start w:val="1"/>
+      <w:numFmt w:val="decimal"/>
+      <w:lvlText w:val="%4."/>
+      <w:lvlJc w:val="left"/>
+      <w:pPr>
+        <w:tabs>
+          <w:tab w:val="num" w:pos="2880"/>
+        </w:tabs>
+        <w:ind w:left="2880" w:hanging="360"/>
+      </w:pPr>
+    </w:lvl>
+    <w:lvl w:ilvl="4" w:tentative="1">
+      <w:start w:val="1"/>
+      <w:numFmt w:val="decimal"/>
+      <w:lvlText w:val="%5."/>
+      <w:lvlJc w:val="left"/>
+      <w:pPr>
+        <w:tabs>
+          <w:tab w:val="num" w:pos="3600"/>
+        </w:tabs>
+        <w:ind w:left="3600" w:hanging="360"/>
+      </w:pPr>
+    </w:lvl>
+    <w:lvl w:ilvl="5" w:tentative="1">
+      <w:start w:val="1"/>
+      <w:numFmt w:val="decimal"/>
+      <w:lvlText w:val="%6."/>
+      <w:lvlJc w:val="left"/>
+      <w:pPr>
+        <w:tabs>
+          <w:tab w:val="num" w:pos="4320"/>
+        </w:tabs>
+        <w:ind w:left="4320" w:hanging="360"/>
+      </w:pPr>
+    </w:lvl>
+    <w:lvl w:ilvl="6" w:tentative="1">
+      <w:start w:val="1"/>
+      <w:numFmt w:val="decimal"/>
+      <w:lvlText w:val="%7."/>
+      <w:lvlJc w:val="left"/>
+      <w:pPr>
+        <w:tabs>
+          <w:tab w:val="num" w:pos="5040"/>
+        </w:tabs>
+        <w:ind w:left="5040" w:hanging="360"/>
+      </w:pPr>
+    </w:lvl>
+    <w:lvl w:ilvl="7" w:tentative="1">
+      <w:start w:val="1"/>
+      <w:numFmt w:val="decimal"/>
+      <w:lvlText w:val="%8."/>
+      <w:lvlJc w:val="left"/>
+      <w:pPr>
+        <w:tabs>
+          <w:tab w:val="num" w:pos="5760"/>
+        </w:tabs>
+        <w:ind w:left="5760" w:hanging="360"/>
+      </w:pPr>
+    </w:lvl>
+    <w:lvl w:ilvl="8" w:tentative="1">
+      <w:start w:val="1"/>
+      <w:numFmt w:val="decimal"/>
+      <w:lvlText w:val="%9."/>
+      <w:lvlJc w:val="left"/>
+      <w:pPr>
+        <w:tabs>
+          <w:tab w:val="num" w:pos="6480"/>
+        </w:tabs>
+        <w:ind w:left="6480" w:hanging="360"/>
+      </w:pPr>
+    </w:lvl>
+  </w:abstractNum>
   <w:abstractNum w:abstractNumId="14" w15:restartNumberingAfterBreak="0">
-    <w:nsid w:val="79660D83"/>
+    <w:nsid w:val="75922708"/>
     <w:multiLevelType w:val="multilevel"/>
-    <w:tmpl w:val="F8E4CD9A"/>
+    <w:tmpl w:val="4588E960"/>
     <w:lvl w:ilvl="0">
       <w:start w:val="1"/>
       <w:numFmt w:val="bullet"/>
@@ -19725,50 +19747,50 @@
       </w:rPr>
     </w:lvl>
   </w:abstractNum>
-  <w:num w:numId="1" w16cid:durableId="620263806">
+  <w:num w:numId="1" w16cid:durableId="95911293">
+    <w:abstractNumId w:val="4"/>
+  </w:num>
+  <w:num w:numId="2" w16cid:durableId="1924416002">
+    <w:abstractNumId w:val="12"/>
+  </w:num>
+  <w:num w:numId="3" w16cid:durableId="1199201592">
+    <w:abstractNumId w:val="2"/>
+  </w:num>
+  <w:num w:numId="4" w16cid:durableId="1694765451">
+    <w:abstractNumId w:val="14"/>
+  </w:num>
+  <w:num w:numId="5" w16cid:durableId="839348131">
+    <w:abstractNumId w:val="5"/>
+  </w:num>
+  <w:num w:numId="6" w16cid:durableId="784618915">
+    <w:abstractNumId w:val="0"/>
+  </w:num>
+  <w:num w:numId="7" w16cid:durableId="1221137874">
+    <w:abstractNumId w:val="1"/>
+  </w:num>
+  <w:num w:numId="8" w16cid:durableId="1971206530">
+    <w:abstractNumId w:val="8"/>
+  </w:num>
+  <w:num w:numId="9" w16cid:durableId="1676303169">
+    <w:abstractNumId w:val="11"/>
+  </w:num>
+  <w:num w:numId="10" w16cid:durableId="1692879625">
+    <w:abstractNumId w:val="7"/>
+  </w:num>
+  <w:num w:numId="11" w16cid:durableId="645857652">
     <w:abstractNumId w:val="6"/>
   </w:num>
-  <w:num w:numId="2" w16cid:durableId="274409744">
-    <w:abstractNumId w:val="4"/>
-  </w:num>
-  <w:num w:numId="3" w16cid:durableId="308679324">
-    <w:abstractNumId w:val="14"/>
-  </w:num>
-  <w:num w:numId="4" w16cid:durableId="1740519452">
-    <w:abstractNumId w:val="0"/>
-  </w:num>
-  <w:num w:numId="5" w16cid:durableId="596443250">
-    <w:abstractNumId w:val="12"/>
-  </w:num>
-  <w:num w:numId="6" w16cid:durableId="28604981">
-    <w:abstractNumId w:val="8"/>
-  </w:num>
-  <w:num w:numId="7" w16cid:durableId="1734035993">
-    <w:abstractNumId w:val="2"/>
-  </w:num>
-  <w:num w:numId="8" w16cid:durableId="924874598">
-    <w:abstractNumId w:val="13"/>
-  </w:num>
-  <w:num w:numId="9" w16cid:durableId="1793861422">
+  <w:num w:numId="12" w16cid:durableId="424500440">
     <w:abstractNumId w:val="10"/>
   </w:num>
-  <w:num w:numId="10" w16cid:durableId="5522483">
+  <w:num w:numId="13" w16cid:durableId="841243249">
+    <w:abstractNumId w:val="3"/>
+  </w:num>
+  <w:num w:numId="14" w16cid:durableId="938224164">
     <w:abstractNumId w:val="9"/>
   </w:num>
-  <w:num w:numId="11" w16cid:durableId="846332092">
-    <w:abstractNumId w:val="7"/>
-  </w:num>
-  <w:num w:numId="12" w16cid:durableId="2097094284">
-    <w:abstractNumId w:val="11"/>
-  </w:num>
-  <w:num w:numId="13" w16cid:durableId="1861233157">
-    <w:abstractNumId w:val="5"/>
-  </w:num>
-  <w:num w:numId="14" w16cid:durableId="811946626">
-    <w:abstractNumId w:val="1"/>
-  </w:num>
-  <w:num w:numId="15" w16cid:durableId="1534685411">
-    <w:abstractNumId w:val="3"/>
+  <w:num w:numId="15" w16cid:durableId="1808082800">
+    <w:abstractNumId w:val="13"/>
   </w:num>
 </w:numbering>
 </file>
@@ -20361,6 +20383,28 @@
       <w:spacing w:before="100" w:beforeAutospacing="1" w:after="100" w:afterAutospacing="1"/>
     </w:pPr>
   </w:style>
+  <w:style w:type="character" w:styleId="Hyperlink">
+    <w:name w:val="Hyperlink"/>
+    <w:basedOn w:val="DefaultParagraphFont"/>
+    <w:uiPriority w:val="99"/>
+    <w:semiHidden/>
+    <w:unhideWhenUsed/>
+    <w:rPr>
+      <w:color w:val="0000FF"/>
+      <w:u w:val="single"/>
+    </w:rPr>
+  </w:style>
+  <w:style w:type="character" w:styleId="FollowedHyperlink">
+    <w:name w:val="FollowedHyperlink"/>
+    <w:basedOn w:val="DefaultParagraphFont"/>
+    <w:uiPriority w:val="99"/>
+    <w:semiHidden/>
+    <w:unhideWhenUsed/>
+    <w:rPr>
+      <w:color w:val="800080"/>
+      <w:u w:val="single"/>
+    </w:rPr>
+  </w:style>
   <w:style w:type="paragraph" w:styleId="NormalWeb">
     <w:name w:val="Normal (Web)"/>
     <w:basedOn w:val="Normal"/>
@@ -20391,35 +20435,13 @@
       <w:iCs/>
     </w:rPr>
   </w:style>
-  <w:style w:type="character" w:styleId="Hyperlink">
-    <w:name w:val="Hyperlink"/>
-    <w:basedOn w:val="DefaultParagraphFont"/>
-    <w:uiPriority w:val="99"/>
-    <w:semiHidden/>
-    <w:unhideWhenUsed/>
-    <w:rPr>
-      <w:color w:val="0000FF"/>
-      <w:u w:val="single"/>
-    </w:rPr>
-  </w:style>
-  <w:style w:type="character" w:styleId="FollowedHyperlink">
-    <w:name w:val="FollowedHyperlink"/>
-    <w:basedOn w:val="DefaultParagraphFont"/>
-    <w:uiPriority w:val="99"/>
-    <w:semiHidden/>
-    <w:unhideWhenUsed/>
-    <w:rPr>
-      <w:color w:val="800080"/>
-      <w:u w:val="single"/>
-    </w:rPr>
-  </w:style>
   <w:style w:type="paragraph" w:styleId="Header">
     <w:name w:val="header"/>
     <w:basedOn w:val="Normal"/>
     <w:link w:val="HeaderChar"/>
     <w:uiPriority w:val="99"/>
     <w:unhideWhenUsed/>
-    <w:rsid w:val="00DC5942"/>
+    <w:rsid w:val="00583D2F"/>
     <w:pPr>
       <w:tabs>
         <w:tab w:val="center" w:pos="4680"/>
@@ -20432,7 +20454,7 @@
     <w:basedOn w:val="DefaultParagraphFont"/>
     <w:link w:val="Header"/>
     <w:uiPriority w:val="99"/>
-    <w:rsid w:val="00DC5942"/>
+    <w:rsid w:val="00583D2F"/>
     <w:rPr>
       <w:rFonts w:eastAsiaTheme="minorEastAsia"/>
       <w:sz w:val="24"/>
@@ -20445,7 +20467,7 @@
     <w:link w:val="FooterChar"/>
     <w:uiPriority w:val="99"/>
     <w:unhideWhenUsed/>
-    <w:rsid w:val="00DC5942"/>
+    <w:rsid w:val="00583D2F"/>
     <w:pPr>
       <w:tabs>
         <w:tab w:val="center" w:pos="4680"/>
@@ -20458,7 +20480,7 @@
     <w:basedOn w:val="DefaultParagraphFont"/>
     <w:link w:val="Footer"/>
     <w:uiPriority w:val="99"/>
-    <w:rsid w:val="00DC5942"/>
+    <w:rsid w:val="00583D2F"/>
     <w:rPr>
       <w:rFonts w:eastAsiaTheme="minorEastAsia"/>
       <w:sz w:val="24"/>
@@ -20471,7 +20493,7 @@
     <w:uiPriority w:val="99"/>
     <w:semiHidden/>
     <w:unhideWhenUsed/>
-    <w:rsid w:val="00DC5942"/>
+    <w:rsid w:val="00583D2F"/>
   </w:style>
 </w:styles>
 </file>

</xml_diff>

<commit_message>
Publish verified execution evidence
</commit_message>
<xml_diff>
--- a/report/CSA0312_Final_Assignment_Report.docx
+++ b/report/CSA0312_Final_Assignment_Report.docx
@@ -4012,24 +4012,51 @@
               <w:t xml:space="preserve">    return minimum</w:t>
             </w:r>
           </w:p>
+        </w:tc>
+      </w:tr>
+    </w:tbl>
+    <w:p>
+      <w:pPr>
+        <w:spacing w:after="40"/>
+      </w:pPr>
+    </w:p>
+    <w:tbl>
+      <w:tblPr>
+        <w:tblW w:type="auto" w:w="0"/>
+        <w:tblLayout w:type="fixed"/>
+        <w:tblLook w:firstColumn="1" w:firstRow="1" w:lastColumn="0" w:lastRow="0" w:noHBand="0" w:noVBand="1" w:val="04A0"/>
+        <w:tblBorders>
+          <w:top w:val="single" w:sz="6" w:space="0" w:color="000000"/>
+          <w:left w:val="single" w:sz="6" w:space="0" w:color="000000"/>
+          <w:bottom w:val="single" w:sz="6" w:space="0" w:color="000000"/>
+          <w:right w:val="single" w:sz="6" w:space="0" w:color="000000"/>
+          <w:insideH w:val="single" w:sz="6" w:space="0" w:color="000000"/>
+          <w:insideV w:val="single" w:sz="6" w:space="0" w:color="000000"/>
+        </w:tblBorders>
+      </w:tblPr>
+      <w:tblGrid>
+        <w:gridCol w:w="9936"/>
+      </w:tblGrid>
+      <w:tr>
+        <w:tc>
+          <w:tcPr>
+            <w:tcW w:type="dxa" w:w="10800"/>
+            <w:tcMar>
+              <w:top w:w="110" w:type="dxa"/>
+              <w:start w:w="140" w:type="dxa"/>
+              <w:bottom w:w="110" w:type="dxa"/>
+              <w:end w:w="140" w:type="dxa"/>
+            </w:tcMar>
+          </w:tcPr>
           <w:p>
             <w:pPr>
               <w:spacing w:after="0" w:line="240" w:lineRule="auto"/>
             </w:pPr>
             <w:r>
               <w:rPr>
-                <w:rFonts w:ascii="Consolas" w:hAnsi="Consolas" w:eastAsia="Consolas"/>
-                <w:b w:val="0"/>
-                <w:i w:val="0"/>
-                <w:color w:val="000000"/>
-                <w:sz w:val="18"/>
-              </w:rPr>
-            </w:r>
-          </w:p>
-          <w:p>
-            <w:pPr>
-              <w:spacing w:after="0" w:line="240" w:lineRule="auto"/>
-            </w:pPr>
+                <w:color w:val="000000"/>
+              </w:rPr>
+            </w:r>
             <w:r>
               <w:rPr>
                 <w:rFonts w:ascii="Consolas" w:hAnsi="Consolas" w:eastAsia="Consolas"/>
@@ -7254,6 +7281,22 @@
         <w:t>The deterministic benchmark uses 8,200 intersections and 21,000 logical bidirectional roads, represented internally by 42,000 directed edge records. Ten fixed source-to-destination queries were executed. The measured uncached average was approximately 2.95 ms per query and the worst observed query was 5.667 ms. Cached hits averaged approximately 0.00003 ms.</w:t>
       </w:r>
     </w:p>
+    <w:p>
+      <w:pPr>
+        <w:keepNext w:val="0"/>
+        <w:spacing w:before="0" w:after="120" w:line="259" w:lineRule="auto"/>
+      </w:pPr>
+      <w:r>
+        <w:rPr>
+          <w:rFonts w:ascii="Times New Roman" w:hAnsi="Times New Roman" w:eastAsia="Times New Roman"/>
+          <w:b w:val="0"/>
+          <w:i w:val="0"/>
+          <w:color w:val="000000"/>
+          <w:sz w:val="20"/>
+        </w:rPr>
+        <w:t>The recorded configuration was Windows 11 on an Intel Core Ultra 7 255H system with 31.4 GB usable RAM, using GCC 3.4.2 with -O2 optimisation.</w:t>
+      </w:r>
+    </w:p>
     <w:tbl>
       <w:tblPr>
         <w:tblW w:type="auto" w:w="0"/>
@@ -9219,6 +9262,365 @@
         <w:t>•</w:t>
         <w:tab/>
         <w:t>SDG 13 - Climate Action: adaptive routing is a practical response to road failures caused by floods, storms, fires and other climate-related emergencies.</w:t>
+      </w:r>
+    </w:p>
+    <w:p>
+      <w:pPr>
+        <w:keepNext/>
+        <w:spacing w:before="0" w:after="100" w:line="259" w:lineRule="auto"/>
+      </w:pPr>
+      <w:r>
+        <w:rPr>
+          <w:rFonts w:ascii="Times New Roman" w:hAnsi="Times New Roman" w:eastAsia="Times New Roman"/>
+          <w:b/>
+          <w:i w:val="0"/>
+          <w:color w:val="000000"/>
+          <w:sz w:val="28"/>
+        </w:rPr>
+        <w:t>Individual Technical Analysis</w:t>
+      </w:r>
+    </w:p>
+    <w:p>
+      <w:pPr>
+        <w:keepNext w:val="0"/>
+        <w:spacing w:before="0" w:after="120" w:line="259" w:lineRule="auto"/>
+        <w:ind w:firstLine="360"/>
+      </w:pPr>
+      <w:r>
+        <w:rPr>
+          <w:rFonts w:ascii="Times New Roman" w:hAnsi="Times New Roman" w:eastAsia="Times New Roman"/>
+          <w:b w:val="0"/>
+          <w:i w:val="0"/>
+          <w:color w:val="000000"/>
+          <w:sz w:val="24"/>
+        </w:rPr>
+        <w:t>I analysed the implementation as a dynamic shortest-path system rather than as a static map. The key design decision was selecting a HashMap-based adjacency list because the city is sparse: storing 21,000 logical roads is substantially more suitable than reserving an adjacency matrix for every possible pair of 8,200 intersections. I also traced how every road update changes Graph.version, making an older cached route stale and forcing a fresh Dijkstra computation when needed.</w:t>
+      </w:r>
+    </w:p>
+    <w:p>
+      <w:pPr>
+        <w:keepNext w:val="0"/>
+        <w:spacing w:before="0" w:after="120" w:line="259" w:lineRule="auto"/>
+        <w:ind w:firstLine="360"/>
+      </w:pPr>
+      <w:r>
+        <w:rPr>
+          <w:rFonts w:ascii="Times New Roman" w:hAnsi="Times New Roman" w:eastAsia="Times New Roman"/>
+          <w:b w:val="0"/>
+          <w:i w:val="0"/>
+          <w:color w:val="000000"/>
+          <w:sz w:val="24"/>
+        </w:rPr>
+        <w:t>The observed outputs support the design decisions. The test run confirms validation, route reconstruction, cache invalidation and cyclic-graph handling. The benchmark confirms that the binary heap keeps route searches far below the 200 ms requirement. Finally, the 30% road-failure result shows a realistic trade-off: selected evacuation centres remain reachable, while disconnected intersections are explicitly reported instead of producing an incorrect route.</w:t>
+      </w:r>
+    </w:p>
+    <w:p>
+      <w:pPr>
+        <w:keepNext/>
+        <w:pageBreakBefore/>
+        <w:spacing w:before="0" w:after="100" w:line="259" w:lineRule="auto"/>
+      </w:pPr>
+      <w:r>
+        <w:rPr>
+          <w:rFonts w:ascii="Times New Roman" w:hAnsi="Times New Roman" w:eastAsia="Times New Roman"/>
+          <w:b/>
+          <w:i w:val="0"/>
+          <w:color w:val="000000"/>
+          <w:sz w:val="28"/>
+        </w:rPr>
+        <w:t>Verified Execution Evidence</w:t>
+      </w:r>
+    </w:p>
+    <w:p>
+      <w:pPr>
+        <w:keepNext w:val="0"/>
+        <w:spacing w:before="0" w:after="120" w:line="259" w:lineRule="auto"/>
+      </w:pPr>
+      <w:r>
+        <w:rPr>
+          <w:rFonts w:ascii="Times New Roman" w:hAnsi="Times New Roman" w:eastAsia="Times New Roman"/>
+          <w:b w:val="0"/>
+          <w:i w:val="0"/>
+          <w:color w:val="000000"/>
+          <w:sz w:val="20"/>
+        </w:rPr>
+        <w:t>The following black-and-white captures are direct outputs from the verified Windows execution. Timing values can vary slightly between runs because of clock resolution, but all uncached queries remain far below the required 200 ms limit.</w:t>
+      </w:r>
+    </w:p>
+    <w:tbl>
+      <w:tblPr>
+        <w:tblW w:type="auto" w:w="0"/>
+        <w:tblLayout w:type="fixed"/>
+        <w:tblLook w:firstColumn="1" w:firstRow="1" w:lastColumn="0" w:lastRow="0" w:noHBand="0" w:noVBand="1" w:val="04A0"/>
+        <w:tblBorders>
+          <w:top w:val="single" w:sz="6" w:space="0" w:color="000000"/>
+          <w:left w:val="single" w:sz="6" w:space="0" w:color="000000"/>
+          <w:bottom w:val="single" w:sz="6" w:space="0" w:color="000000"/>
+          <w:right w:val="single" w:sz="6" w:space="0" w:color="000000"/>
+          <w:insideH w:val="single" w:sz="6" w:space="0" w:color="000000"/>
+          <w:insideV w:val="single" w:sz="6" w:space="0" w:color="000000"/>
+        </w:tblBorders>
+      </w:tblPr>
+      <w:tblGrid>
+        <w:gridCol w:w="9936"/>
+      </w:tblGrid>
+      <w:tr>
+        <w:tc>
+          <w:tcPr>
+            <w:tcW w:type="dxa" w:w="10800"/>
+            <w:tcMar>
+              <w:top w:w="90" w:type="dxa"/>
+              <w:start w:w="90" w:type="dxa"/>
+              <w:bottom w:w="90" w:type="dxa"/>
+              <w:end w:w="90" w:type="dxa"/>
+            </w:tcMar>
+          </w:tcPr>
+          <w:p>
+            <w:pPr>
+              <w:keepNext/>
+              <w:spacing w:after="0"/>
+              <w:jc w:val="center"/>
+            </w:pPr>
+            <w:r>
+              <w:rPr>
+                <w:color w:val="000000"/>
+              </w:rPr>
+              <w:drawing>
+                <wp:inline xmlns:a="http://schemas.openxmlformats.org/drawingml/2006/main" xmlns:pic="http://schemas.openxmlformats.org/drawingml/2006/picture">
+                  <wp:extent cx="5897880" cy="1443599"/>
+                  <wp:docPr id="1" name="Picture 1"/>
+                  <wp:cNvGraphicFramePr>
+                    <a:graphicFrameLocks noChangeAspect="1"/>
+                  </wp:cNvGraphicFramePr>
+                  <a:graphic>
+                    <a:graphicData uri="http://schemas.openxmlformats.org/drawingml/2006/picture">
+                      <pic:pic>
+                        <pic:nvPicPr>
+                          <pic:cNvPr id="0" name="verification_demo_and_tests.png"/>
+                          <pic:cNvPicPr/>
+                        </pic:nvPicPr>
+                        <pic:blipFill>
+                          <a:blip r:embed="rId9"/>
+                          <a:stretch>
+                            <a:fillRect/>
+                          </a:stretch>
+                        </pic:blipFill>
+                        <pic:spPr>
+                          <a:xfrm>
+                            <a:off x="0" y="0"/>
+                            <a:ext cx="5897880" cy="1443599"/>
+                          </a:xfrm>
+                          <a:prstGeom prst="rect"/>
+                        </pic:spPr>
+                      </pic:pic>
+                    </a:graphicData>
+                  </a:graphic>
+                </wp:inline>
+              </w:drawing>
+            </w:r>
+          </w:p>
+        </w:tc>
+      </w:tr>
+    </w:tbl>
+    <w:p>
+      <w:pPr>
+        <w:keepNext/>
+        <w:spacing w:before="20" w:after="120" w:line="259" w:lineRule="auto"/>
+        <w:jc w:val="center"/>
+      </w:pPr>
+      <w:r>
+        <w:rPr>
+          <w:rFonts w:ascii="Times New Roman" w:hAnsi="Times New Roman" w:eastAsia="Times New Roman"/>
+          <w:b w:val="0"/>
+          <w:i/>
+          <w:color w:val="000000"/>
+          <w:sz w:val="18"/>
+        </w:rPr>
+        <w:t>Figure 1. Demonstration output: multiple routes, unreachable and invalid-query handling, cache statistics, and 16/16 functional tests passed.</w:t>
+      </w:r>
+    </w:p>
+    <w:tbl>
+      <w:tblPr>
+        <w:tblW w:type="auto" w:w="0"/>
+        <w:tblLayout w:type="fixed"/>
+        <w:tblLook w:firstColumn="1" w:firstRow="1" w:lastColumn="0" w:lastRow="0" w:noHBand="0" w:noVBand="1" w:val="04A0"/>
+        <w:tblBorders>
+          <w:top w:val="single" w:sz="6" w:space="0" w:color="000000"/>
+          <w:left w:val="single" w:sz="6" w:space="0" w:color="000000"/>
+          <w:bottom w:val="single" w:sz="6" w:space="0" w:color="000000"/>
+          <w:right w:val="single" w:sz="6" w:space="0" w:color="000000"/>
+          <w:insideH w:val="single" w:sz="6" w:space="0" w:color="000000"/>
+          <w:insideV w:val="single" w:sz="6" w:space="0" w:color="000000"/>
+        </w:tblBorders>
+      </w:tblPr>
+      <w:tblGrid>
+        <w:gridCol w:w="9936"/>
+      </w:tblGrid>
+      <w:tr>
+        <w:tc>
+          <w:tcPr>
+            <w:tcW w:type="dxa" w:w="10800"/>
+            <w:tcMar>
+              <w:top w:w="90" w:type="dxa"/>
+              <w:start w:w="90" w:type="dxa"/>
+              <w:bottom w:w="90" w:type="dxa"/>
+              <w:end w:w="90" w:type="dxa"/>
+            </w:tcMar>
+          </w:tcPr>
+          <w:p>
+            <w:pPr>
+              <w:keepNext/>
+              <w:spacing w:after="0"/>
+              <w:jc w:val="center"/>
+            </w:pPr>
+            <w:r>
+              <w:rPr>
+                <w:color w:val="000000"/>
+              </w:rPr>
+              <w:drawing>
+                <wp:inline xmlns:a="http://schemas.openxmlformats.org/drawingml/2006/main" xmlns:pic="http://schemas.openxmlformats.org/drawingml/2006/picture">
+                  <wp:extent cx="5897880" cy="1090784"/>
+                  <wp:docPr id="2" name="Picture 2"/>
+                  <wp:cNvGraphicFramePr>
+                    <a:graphicFrameLocks noChangeAspect="1"/>
+                  </wp:cNvGraphicFramePr>
+                  <a:graphic>
+                    <a:graphicData uri="http://schemas.openxmlformats.org/drawingml/2006/picture">
+                      <pic:pic>
+                        <pic:nvPicPr>
+                          <pic:cNvPr id="0" name="verification_benchmark.png"/>
+                          <pic:cNvPicPr/>
+                        </pic:nvPicPr>
+                        <pic:blipFill>
+                          <a:blip r:embed="rId10"/>
+                          <a:stretch>
+                            <a:fillRect/>
+                          </a:stretch>
+                        </pic:blipFill>
+                        <pic:spPr>
+                          <a:xfrm>
+                            <a:off x="0" y="0"/>
+                            <a:ext cx="5897880" cy="1090784"/>
+                          </a:xfrm>
+                          <a:prstGeom prst="rect"/>
+                        </pic:spPr>
+                      </pic:pic>
+                    </a:graphicData>
+                  </a:graphic>
+                </wp:inline>
+              </w:drawing>
+            </w:r>
+          </w:p>
+        </w:tc>
+      </w:tr>
+    </w:tbl>
+    <w:p>
+      <w:pPr>
+        <w:keepNext/>
+        <w:spacing w:before="20" w:after="120" w:line="259" w:lineRule="auto"/>
+        <w:jc w:val="center"/>
+      </w:pPr>
+      <w:r>
+        <w:rPr>
+          <w:rFonts w:ascii="Times New Roman" w:hAnsi="Times New Roman" w:eastAsia="Times New Roman"/>
+          <w:b w:val="0"/>
+          <w:i/>
+          <w:color w:val="000000"/>
+          <w:sz w:val="18"/>
+        </w:rPr>
+        <w:t>Figure 2. Full-scale benchmark: deterministic city with 8,200 intersections, 21,000 logical roads and ten timed route queries.</w:t>
+      </w:r>
+    </w:p>
+    <w:tbl>
+      <w:tblPr>
+        <w:tblW w:type="auto" w:w="0"/>
+        <w:tblLayout w:type="fixed"/>
+        <w:tblLook w:firstColumn="1" w:firstRow="1" w:lastColumn="0" w:lastRow="0" w:noHBand="0" w:noVBand="1" w:val="04A0"/>
+        <w:tblBorders>
+          <w:top w:val="single" w:sz="6" w:space="0" w:color="000000"/>
+          <w:left w:val="single" w:sz="6" w:space="0" w:color="000000"/>
+          <w:bottom w:val="single" w:sz="6" w:space="0" w:color="000000"/>
+          <w:right w:val="single" w:sz="6" w:space="0" w:color="000000"/>
+          <w:insideH w:val="single" w:sz="6" w:space="0" w:color="000000"/>
+          <w:insideV w:val="single" w:sz="6" w:space="0" w:color="000000"/>
+        </w:tblBorders>
+      </w:tblPr>
+      <w:tblGrid>
+        <w:gridCol w:w="9936"/>
+      </w:tblGrid>
+      <w:tr>
+        <w:tc>
+          <w:tcPr>
+            <w:tcW w:type="dxa" w:w="10800"/>
+            <w:tcMar>
+              <w:top w:w="90" w:type="dxa"/>
+              <w:start w:w="90" w:type="dxa"/>
+              <w:bottom w:w="90" w:type="dxa"/>
+              <w:end w:w="90" w:type="dxa"/>
+            </w:tcMar>
+          </w:tcPr>
+          <w:p>
+            <w:pPr>
+              <w:keepNext/>
+              <w:spacing w:after="0"/>
+              <w:jc w:val="center"/>
+            </w:pPr>
+            <w:r>
+              <w:rPr>
+                <w:color w:val="000000"/>
+              </w:rPr>
+              <w:drawing>
+                <wp:inline xmlns:a="http://schemas.openxmlformats.org/drawingml/2006/main" xmlns:pic="http://schemas.openxmlformats.org/drawingml/2006/picture">
+                  <wp:extent cx="5897880" cy="332993"/>
+                  <wp:docPr id="3" name="Picture 3"/>
+                  <wp:cNvGraphicFramePr>
+                    <a:graphicFrameLocks noChangeAspect="1"/>
+                  </wp:cNvGraphicFramePr>
+                  <a:graphic>
+                    <a:graphicData uri="http://schemas.openxmlformats.org/drawingml/2006/picture">
+                      <pic:pic>
+                        <pic:nvPicPr>
+                          <pic:cNvPr id="0" name="verification_failure.png"/>
+                          <pic:cNvPicPr/>
+                        </pic:nvPicPr>
+                        <pic:blipFill>
+                          <a:blip r:embed="rId11"/>
+                          <a:stretch>
+                            <a:fillRect/>
+                          </a:stretch>
+                        </pic:blipFill>
+                        <pic:spPr>
+                          <a:xfrm>
+                            <a:off x="0" y="0"/>
+                            <a:ext cx="5897880" cy="332993"/>
+                          </a:xfrm>
+                          <a:prstGeom prst="rect"/>
+                        </pic:spPr>
+                      </pic:pic>
+                    </a:graphicData>
+                  </a:graphic>
+                </wp:inline>
+              </w:drawing>
+            </w:r>
+          </w:p>
+        </w:tc>
+      </w:tr>
+    </w:tbl>
+    <w:p>
+      <w:pPr>
+        <w:keepNext/>
+        <w:spacing w:before="20" w:after="120" w:line="259" w:lineRule="auto"/>
+        <w:jc w:val="center"/>
+      </w:pPr>
+      <w:r>
+        <w:rPr>
+          <w:rFonts w:ascii="Times New Roman" w:hAnsi="Times New Roman" w:eastAsia="Times New Roman"/>
+          <w:b w:val="0"/>
+          <w:i/>
+          <w:color w:val="000000"/>
+          <w:sz w:val="18"/>
+        </w:rPr>
+        <w:t>Figure 3. Road-failure experiment: exactly 6,300 of 21,000 logical roads were blocked and the analysis file was written.</w:t>
       </w:r>
     </w:p>
     <w:p>

</xml_diff>

<commit_message>
Improve report layout and clarify SDG 11 wording
Formatting-only pass on the answer document: tables now fit inside the
page margins, headings keep with their content, table rows no longer
split across pages, and the Test Cases and Results section starts on a
fresh page so its table is not chopped. The SDG 11 bullet is reworded
in plain language. No technical content, results or screenshots
changed.
</commit_message>
<xml_diff>
--- a/report/CSA0312_Final_Assignment_Report.docx
+++ b/report/CSA0312_Final_Assignment_Report.docx
@@ -5,6 +5,7 @@
     <w:p>
       <w:pPr>
         <w:pStyle w:val="Heading1"/>
+        <w:keepNext/>
         <w:spacing w:before="78" w:line="276" w:lineRule="auto"/>
         <w:ind w:left="4073" w:right="1032" w:hanging="1705"/>
       </w:pPr>
@@ -82,6 +83,7 @@
     </w:p>
     <w:p>
       <w:pPr>
+        <w:keepNext/>
         <w:spacing w:line="321" w:lineRule="exact"/>
         <w:ind w:left="720"/>
         <w:rPr>
@@ -312,6 +314,7 @@
       </w:tblGrid>
       <w:tr>
         <w:trPr>
+          <w:cantSplit/>
           <w:trHeight w:val="1309"/>
         </w:trPr>
         <w:tc>
@@ -396,6 +399,7 @@
       </w:tr>
       <w:tr>
         <w:trPr>
+          <w:cantSplit/>
           <w:trHeight w:val="3227"/>
         </w:trPr>
         <w:tc>
@@ -589,6 +593,7 @@
       </w:tr>
       <w:tr>
         <w:trPr>
+          <w:cantSplit/>
           <w:trHeight w:val="493"/>
         </w:trPr>
         <w:tc>
@@ -720,6 +725,7 @@
       </w:tr>
       <w:tr>
         <w:trPr>
+          <w:cantSplit/>
           <w:trHeight w:val="1082"/>
         </w:trPr>
         <w:tc>
@@ -963,6 +969,7 @@
     <w:p>
       <w:pPr>
         <w:pStyle w:val="Heading1"/>
+        <w:keepNext/>
         <w:ind w:left="0"/>
       </w:pPr>
       <w:r>
@@ -1266,6 +1273,7 @@
     <w:p>
       <w:pPr>
         <w:pStyle w:val="BodyText"/>
+        <w:keepNext/>
         <w:spacing w:before="52"/>
         <w:rPr>
           <w:b/>
@@ -1562,6 +1570,7 @@
     </w:p>
     <w:p>
       <w:pPr>
+        <w:keepNext/>
         <w:spacing w:after="160" w:line="259" w:lineRule="auto"/>
         <w:jc w:val="center"/>
       </w:pPr>
@@ -1576,7 +1585,7 @@
     </w:p>
     <w:tbl>
       <w:tblPr>
-        <w:tblW w:w="0" w:type="auto"/>
+        <w:tblW w:w="5000" w:type="pct"/>
         <w:tblBorders>
           <w:top w:val="single" w:sz="6" w:space="0" w:color="000000"/>
           <w:left w:val="single" w:sz="6" w:space="0" w:color="000000"/>
@@ -1585,19 +1594,21 @@
           <w:insideH w:val="single" w:sz="6" w:space="0" w:color="000000"/>
           <w:insideV w:val="single" w:sz="6" w:space="0" w:color="000000"/>
         </w:tblBorders>
-        <w:tblLayout w:type="fixed"/>
         <w:tblLook w:val="04A0" w:firstRow="1" w:lastRow="0" w:firstColumn="1" w:lastColumn="0" w:noHBand="0" w:noVBand="1"/>
       </w:tblPr>
       <w:tblGrid>
-        <w:gridCol w:w="2700"/>
-        <w:gridCol w:w="2700"/>
-        <w:gridCol w:w="4464"/>
-        <w:gridCol w:w="2700"/>
+        <w:gridCol w:w="2364"/>
+        <w:gridCol w:w="2364"/>
+        <w:gridCol w:w="3909"/>
+        <w:gridCol w:w="2363"/>
       </w:tblGrid>
       <w:tr>
-        <w:tc>
-          <w:tcPr>
-            <w:tcW w:w="2700" w:type="dxa"/>
+        <w:trPr>
+          <w:cantSplit/>
+        </w:trPr>
+        <w:tc>
+          <w:tcPr>
+            <w:tcW w:w="1074" w:type="pct"/>
             <w:tcMar>
               <w:top w:w="90" w:type="dxa"/>
               <w:left w:w="100" w:type="dxa"/>
@@ -1621,7 +1632,7 @@
         </w:tc>
         <w:tc>
           <w:tcPr>
-            <w:tcW w:w="2700" w:type="dxa"/>
+            <w:tcW w:w="1074" w:type="pct"/>
             <w:tcMar>
               <w:top w:w="90" w:type="dxa"/>
               <w:left w:w="100" w:type="dxa"/>
@@ -1645,7 +1656,7 @@
         </w:tc>
         <w:tc>
           <w:tcPr>
-            <w:tcW w:w="2700" w:type="dxa"/>
+            <w:tcW w:w="1777" w:type="pct"/>
             <w:tcMar>
               <w:top w:w="90" w:type="dxa"/>
               <w:left w:w="100" w:type="dxa"/>
@@ -1669,7 +1680,7 @@
         </w:tc>
         <w:tc>
           <w:tcPr>
-            <w:tcW w:w="2700" w:type="dxa"/>
+            <w:tcW w:w="1074" w:type="pct"/>
             <w:tcMar>
               <w:top w:w="90" w:type="dxa"/>
               <w:left w:w="100" w:type="dxa"/>
@@ -1693,9 +1704,12 @@
         </w:tc>
       </w:tr>
       <w:tr>
-        <w:tc>
-          <w:tcPr>
-            <w:tcW w:w="1944" w:type="dxa"/>
+        <w:trPr>
+          <w:cantSplit/>
+        </w:trPr>
+        <w:tc>
+          <w:tcPr>
+            <w:tcW w:w="1074" w:type="pct"/>
             <w:tcMar>
               <w:top w:w="90" w:type="dxa"/>
               <w:left w:w="100" w:type="dxa"/>
@@ -1715,7 +1729,7 @@
         </w:tc>
         <w:tc>
           <w:tcPr>
-            <w:tcW w:w="1944" w:type="dxa"/>
+            <w:tcW w:w="1074" w:type="pct"/>
             <w:tcMar>
               <w:top w:w="90" w:type="dxa"/>
               <w:left w:w="100" w:type="dxa"/>
@@ -1735,7 +1749,7 @@
         </w:tc>
         <w:tc>
           <w:tcPr>
-            <w:tcW w:w="4464" w:type="dxa"/>
+            <w:tcW w:w="1777" w:type="pct"/>
             <w:tcMar>
               <w:top w:w="90" w:type="dxa"/>
               <w:left w:w="100" w:type="dxa"/>
@@ -1763,7 +1777,7 @@
         </w:tc>
         <w:tc>
           <w:tcPr>
-            <w:tcW w:w="1584" w:type="dxa"/>
+            <w:tcW w:w="1074" w:type="pct"/>
             <w:tcMar>
               <w:top w:w="90" w:type="dxa"/>
               <w:left w:w="100" w:type="dxa"/>
@@ -1866,19 +1880,12 @@
           <w:color w:val="000000"/>
           <w:sz w:val="24"/>
         </w:rPr>
-        <w:t xml:space="preserve">A HashMap-based adjacency list is selected. With 8,200 intersections, the number of possible undirected pairs exceeds 33 million, whereas the test network contains only 21,000 roads. The network is therefore sparse. An adjacency matrix would reserve O(V^2) cells, most of which would be unused. The adjacency list stores only existing roads in O(V+E) space and allows Dijkstra to scan only the neighbours of the current intersection. The HashMap maps arbitrary intersection IDs to Vertex records in average O(1) </w:t>
-      </w:r>
-      <w:r>
-        <w:rPr>
-          <w:color w:val="000000"/>
-          <w:sz w:val="24"/>
-        </w:rPr>
-        <w:t>time.</w:t>
+        <w:t>A HashMap-based adjacency list is selected. With 8,200 intersections, the number of possible undirected pairs exceeds 33 million, whereas the test network contains only 21,000 roads. The network is therefore sparse. An adjacency matrix would reserve O(V^2) cells, most of which would be unused. The adjacency list stores only existing roads in O(V+E) space and allows Dijkstra to scan only the neighbours of the current intersection. The HashMap maps arbitrary intersection IDs to Vertex records in average O(1) time.</w:t>
       </w:r>
     </w:p>
     <w:tbl>
       <w:tblPr>
-        <w:tblW w:w="0" w:type="auto"/>
+        <w:tblW w:w="5000" w:type="pct"/>
         <w:tblBorders>
           <w:top w:val="single" w:sz="6" w:space="0" w:color="000000"/>
           <w:left w:val="single" w:sz="6" w:space="0" w:color="000000"/>
@@ -1887,18 +1894,20 @@
           <w:insideH w:val="single" w:sz="6" w:space="0" w:color="000000"/>
           <w:insideV w:val="single" w:sz="6" w:space="0" w:color="000000"/>
         </w:tblBorders>
-        <w:tblLayout w:type="fixed"/>
         <w:tblLook w:val="04A0" w:firstRow="1" w:lastRow="0" w:firstColumn="1" w:lastColumn="0" w:noHBand="0" w:noVBand="1"/>
       </w:tblPr>
       <w:tblGrid>
-        <w:gridCol w:w="3600"/>
-        <w:gridCol w:w="4752"/>
-        <w:gridCol w:w="3600"/>
+        <w:gridCol w:w="3313"/>
+        <w:gridCol w:w="4374"/>
+        <w:gridCol w:w="3313"/>
       </w:tblGrid>
       <w:tr>
-        <w:tc>
-          <w:tcPr>
-            <w:tcW w:w="3600" w:type="dxa"/>
+        <w:trPr>
+          <w:cantSplit/>
+        </w:trPr>
+        <w:tc>
+          <w:tcPr>
+            <w:tcW w:w="1506" w:type="pct"/>
             <w:tcMar>
               <w:top w:w="90" w:type="dxa"/>
               <w:left w:w="100" w:type="dxa"/>
@@ -1922,7 +1931,7 @@
         </w:tc>
         <w:tc>
           <w:tcPr>
-            <w:tcW w:w="3600" w:type="dxa"/>
+            <w:tcW w:w="1988" w:type="pct"/>
             <w:tcMar>
               <w:top w:w="90" w:type="dxa"/>
               <w:left w:w="100" w:type="dxa"/>
@@ -1946,7 +1955,7 @@
         </w:tc>
         <w:tc>
           <w:tcPr>
-            <w:tcW w:w="3600" w:type="dxa"/>
+            <w:tcW w:w="1506" w:type="pct"/>
             <w:tcMar>
               <w:top w:w="90" w:type="dxa"/>
               <w:left w:w="100" w:type="dxa"/>
@@ -1970,9 +1979,12 @@
         </w:tc>
       </w:tr>
       <w:tr>
-        <w:tc>
-          <w:tcPr>
-            <w:tcW w:w="2880" w:type="dxa"/>
+        <w:trPr>
+          <w:cantSplit/>
+        </w:trPr>
+        <w:tc>
+          <w:tcPr>
+            <w:tcW w:w="1506" w:type="pct"/>
             <w:tcMar>
               <w:top w:w="90" w:type="dxa"/>
               <w:left w:w="100" w:type="dxa"/>
@@ -1992,7 +2004,7 @@
         </w:tc>
         <w:tc>
           <w:tcPr>
-            <w:tcW w:w="4752" w:type="dxa"/>
+            <w:tcW w:w="1988" w:type="pct"/>
             <w:tcMar>
               <w:top w:w="90" w:type="dxa"/>
               <w:left w:w="100" w:type="dxa"/>
@@ -2012,7 +2024,7 @@
         </w:tc>
         <w:tc>
           <w:tcPr>
-            <w:tcW w:w="2160" w:type="dxa"/>
+            <w:tcW w:w="1506" w:type="pct"/>
             <w:tcMar>
               <w:top w:w="90" w:type="dxa"/>
               <w:left w:w="100" w:type="dxa"/>
@@ -2032,9 +2044,12 @@
         </w:tc>
       </w:tr>
       <w:tr>
-        <w:tc>
-          <w:tcPr>
-            <w:tcW w:w="2880" w:type="dxa"/>
+        <w:trPr>
+          <w:cantSplit/>
+        </w:trPr>
+        <w:tc>
+          <w:tcPr>
+            <w:tcW w:w="1506" w:type="pct"/>
             <w:tcMar>
               <w:top w:w="90" w:type="dxa"/>
               <w:left w:w="100" w:type="dxa"/>
@@ -2054,7 +2069,7 @@
         </w:tc>
         <w:tc>
           <w:tcPr>
-            <w:tcW w:w="4752" w:type="dxa"/>
+            <w:tcW w:w="1988" w:type="pct"/>
             <w:tcMar>
               <w:top w:w="90" w:type="dxa"/>
               <w:left w:w="100" w:type="dxa"/>
@@ -2074,7 +2089,7 @@
         </w:tc>
         <w:tc>
           <w:tcPr>
-            <w:tcW w:w="2160" w:type="dxa"/>
+            <w:tcW w:w="1506" w:type="pct"/>
             <w:tcMar>
               <w:top w:w="90" w:type="dxa"/>
               <w:left w:w="100" w:type="dxa"/>
@@ -2094,9 +2109,12 @@
         </w:tc>
       </w:tr>
       <w:tr>
-        <w:tc>
-          <w:tcPr>
-            <w:tcW w:w="2880" w:type="dxa"/>
+        <w:trPr>
+          <w:cantSplit/>
+        </w:trPr>
+        <w:tc>
+          <w:tcPr>
+            <w:tcW w:w="1506" w:type="pct"/>
             <w:tcMar>
               <w:top w:w="90" w:type="dxa"/>
               <w:left w:w="100" w:type="dxa"/>
@@ -2116,7 +2134,7 @@
         </w:tc>
         <w:tc>
           <w:tcPr>
-            <w:tcW w:w="4752" w:type="dxa"/>
+            <w:tcW w:w="1988" w:type="pct"/>
             <w:tcMar>
               <w:top w:w="90" w:type="dxa"/>
               <w:left w:w="100" w:type="dxa"/>
@@ -2136,7 +2154,7 @@
         </w:tc>
         <w:tc>
           <w:tcPr>
-            <w:tcW w:w="2160" w:type="dxa"/>
+            <w:tcW w:w="1506" w:type="pct"/>
             <w:tcMar>
               <w:top w:w="90" w:type="dxa"/>
               <w:left w:w="100" w:type="dxa"/>
@@ -2190,7 +2208,7 @@
     </w:p>
     <w:tbl>
       <w:tblPr>
-        <w:tblW w:w="0" w:type="auto"/>
+        <w:tblW w:w="5000" w:type="pct"/>
         <w:tblBorders>
           <w:top w:val="single" w:sz="6" w:space="0" w:color="000000"/>
           <w:left w:val="single" w:sz="6" w:space="0" w:color="000000"/>
@@ -2199,18 +2217,20 @@
           <w:insideH w:val="single" w:sz="6" w:space="0" w:color="000000"/>
           <w:insideV w:val="single" w:sz="6" w:space="0" w:color="000000"/>
         </w:tblBorders>
-        <w:tblLayout w:type="fixed"/>
         <w:tblLook w:val="04A0" w:firstRow="1" w:lastRow="0" w:firstColumn="1" w:lastColumn="0" w:noHBand="0" w:noVBand="1"/>
       </w:tblPr>
       <w:tblGrid>
-        <w:gridCol w:w="3600"/>
-        <w:gridCol w:w="3816"/>
-        <w:gridCol w:w="3744"/>
+        <w:gridCol w:w="3549"/>
+        <w:gridCol w:w="3762"/>
+        <w:gridCol w:w="3689"/>
       </w:tblGrid>
       <w:tr>
-        <w:tc>
-          <w:tcPr>
-            <w:tcW w:w="3600" w:type="dxa"/>
+        <w:trPr>
+          <w:cantSplit/>
+        </w:trPr>
+        <w:tc>
+          <w:tcPr>
+            <w:tcW w:w="1613" w:type="pct"/>
             <w:tcMar>
               <w:top w:w="90" w:type="dxa"/>
               <w:left w:w="100" w:type="dxa"/>
@@ -2234,7 +2254,7 @@
         </w:tc>
         <w:tc>
           <w:tcPr>
-            <w:tcW w:w="3600" w:type="dxa"/>
+            <w:tcW w:w="1710" w:type="pct"/>
             <w:tcMar>
               <w:top w:w="90" w:type="dxa"/>
               <w:left w:w="100" w:type="dxa"/>
@@ -2258,7 +2278,7 @@
         </w:tc>
         <w:tc>
           <w:tcPr>
-            <w:tcW w:w="3600" w:type="dxa"/>
+            <w:tcW w:w="1677" w:type="pct"/>
             <w:tcMar>
               <w:top w:w="90" w:type="dxa"/>
               <w:left w:w="100" w:type="dxa"/>
@@ -2282,9 +2302,12 @@
         </w:tc>
       </w:tr>
       <w:tr>
-        <w:tc>
-          <w:tcPr>
-            <w:tcW w:w="2232" w:type="dxa"/>
+        <w:trPr>
+          <w:cantSplit/>
+        </w:trPr>
+        <w:tc>
+          <w:tcPr>
+            <w:tcW w:w="1613" w:type="pct"/>
             <w:tcMar>
               <w:top w:w="90" w:type="dxa"/>
               <w:left w:w="100" w:type="dxa"/>
@@ -2304,7 +2327,7 @@
         </w:tc>
         <w:tc>
           <w:tcPr>
-            <w:tcW w:w="3816" w:type="dxa"/>
+            <w:tcW w:w="1710" w:type="pct"/>
             <w:tcMar>
               <w:top w:w="90" w:type="dxa"/>
               <w:left w:w="100" w:type="dxa"/>
@@ -2324,7 +2347,7 @@
         </w:tc>
         <w:tc>
           <w:tcPr>
-            <w:tcW w:w="3744" w:type="dxa"/>
+            <w:tcW w:w="1677" w:type="pct"/>
             <w:tcMar>
               <w:top w:w="90" w:type="dxa"/>
               <w:left w:w="100" w:type="dxa"/>
@@ -2344,9 +2367,12 @@
         </w:tc>
       </w:tr>
       <w:tr>
-        <w:tc>
-          <w:tcPr>
-            <w:tcW w:w="2232" w:type="dxa"/>
+        <w:trPr>
+          <w:cantSplit/>
+        </w:trPr>
+        <w:tc>
+          <w:tcPr>
+            <w:tcW w:w="1613" w:type="pct"/>
             <w:tcMar>
               <w:top w:w="90" w:type="dxa"/>
               <w:left w:w="100" w:type="dxa"/>
@@ -2366,7 +2392,7 @@
         </w:tc>
         <w:tc>
           <w:tcPr>
-            <w:tcW w:w="3816" w:type="dxa"/>
+            <w:tcW w:w="1710" w:type="pct"/>
             <w:tcMar>
               <w:top w:w="90" w:type="dxa"/>
               <w:left w:w="100" w:type="dxa"/>
@@ -2386,7 +2412,7 @@
         </w:tc>
         <w:tc>
           <w:tcPr>
-            <w:tcW w:w="3744" w:type="dxa"/>
+            <w:tcW w:w="1677" w:type="pct"/>
             <w:tcMar>
               <w:top w:w="90" w:type="dxa"/>
               <w:left w:w="100" w:type="dxa"/>
@@ -2406,9 +2432,12 @@
         </w:tc>
       </w:tr>
       <w:tr>
-        <w:tc>
-          <w:tcPr>
-            <w:tcW w:w="2232" w:type="dxa"/>
+        <w:trPr>
+          <w:cantSplit/>
+        </w:trPr>
+        <w:tc>
+          <w:tcPr>
+            <w:tcW w:w="1613" w:type="pct"/>
             <w:tcMar>
               <w:top w:w="90" w:type="dxa"/>
               <w:left w:w="100" w:type="dxa"/>
@@ -2428,7 +2457,7 @@
         </w:tc>
         <w:tc>
           <w:tcPr>
-            <w:tcW w:w="3816" w:type="dxa"/>
+            <w:tcW w:w="1710" w:type="pct"/>
             <w:tcMar>
               <w:top w:w="90" w:type="dxa"/>
               <w:left w:w="100" w:type="dxa"/>
@@ -2448,7 +2477,7 @@
         </w:tc>
         <w:tc>
           <w:tcPr>
-            <w:tcW w:w="3744" w:type="dxa"/>
+            <w:tcW w:w="1677" w:type="pct"/>
             <w:tcMar>
               <w:top w:w="90" w:type="dxa"/>
               <w:left w:w="100" w:type="dxa"/>
@@ -2468,9 +2497,12 @@
         </w:tc>
       </w:tr>
       <w:tr>
-        <w:tc>
-          <w:tcPr>
-            <w:tcW w:w="2232" w:type="dxa"/>
+        <w:trPr>
+          <w:cantSplit/>
+        </w:trPr>
+        <w:tc>
+          <w:tcPr>
+            <w:tcW w:w="1613" w:type="pct"/>
             <w:tcMar>
               <w:top w:w="90" w:type="dxa"/>
               <w:left w:w="100" w:type="dxa"/>
@@ -2490,7 +2522,7 @@
         </w:tc>
         <w:tc>
           <w:tcPr>
-            <w:tcW w:w="3816" w:type="dxa"/>
+            <w:tcW w:w="1710" w:type="pct"/>
             <w:tcMar>
               <w:top w:w="90" w:type="dxa"/>
               <w:left w:w="100" w:type="dxa"/>
@@ -2510,7 +2542,7 @@
         </w:tc>
         <w:tc>
           <w:tcPr>
-            <w:tcW w:w="3744" w:type="dxa"/>
+            <w:tcW w:w="1677" w:type="pct"/>
             <w:tcMar>
               <w:top w:w="90" w:type="dxa"/>
               <w:left w:w="100" w:type="dxa"/>
@@ -2530,9 +2562,12 @@
         </w:tc>
       </w:tr>
       <w:tr>
-        <w:tc>
-          <w:tcPr>
-            <w:tcW w:w="2232" w:type="dxa"/>
+        <w:trPr>
+          <w:cantSplit/>
+        </w:trPr>
+        <w:tc>
+          <w:tcPr>
+            <w:tcW w:w="1613" w:type="pct"/>
             <w:tcMar>
               <w:top w:w="90" w:type="dxa"/>
               <w:left w:w="100" w:type="dxa"/>
@@ -2552,7 +2587,7 @@
         </w:tc>
         <w:tc>
           <w:tcPr>
-            <w:tcW w:w="3816" w:type="dxa"/>
+            <w:tcW w:w="1710" w:type="pct"/>
             <w:tcMar>
               <w:top w:w="90" w:type="dxa"/>
               <w:left w:w="100" w:type="dxa"/>
@@ -2572,7 +2607,7 @@
         </w:tc>
         <w:tc>
           <w:tcPr>
-            <w:tcW w:w="3744" w:type="dxa"/>
+            <w:tcW w:w="1677" w:type="pct"/>
             <w:tcMar>
               <w:top w:w="90" w:type="dxa"/>
               <w:left w:w="100" w:type="dxa"/>
@@ -2592,9 +2627,12 @@
         </w:tc>
       </w:tr>
       <w:tr>
-        <w:tc>
-          <w:tcPr>
-            <w:tcW w:w="2232" w:type="dxa"/>
+        <w:trPr>
+          <w:cantSplit/>
+        </w:trPr>
+        <w:tc>
+          <w:tcPr>
+            <w:tcW w:w="1613" w:type="pct"/>
             <w:tcMar>
               <w:top w:w="90" w:type="dxa"/>
               <w:left w:w="100" w:type="dxa"/>
@@ -2614,7 +2652,7 @@
         </w:tc>
         <w:tc>
           <w:tcPr>
-            <w:tcW w:w="3816" w:type="dxa"/>
+            <w:tcW w:w="1710" w:type="pct"/>
             <w:tcMar>
               <w:top w:w="90" w:type="dxa"/>
               <w:left w:w="100" w:type="dxa"/>
@@ -2634,7 +2672,7 @@
         </w:tc>
         <w:tc>
           <w:tcPr>
-            <w:tcW w:w="3744" w:type="dxa"/>
+            <w:tcW w:w="1677" w:type="pct"/>
             <w:tcMar>
               <w:top w:w="90" w:type="dxa"/>
               <w:left w:w="100" w:type="dxa"/>
@@ -2654,9 +2692,12 @@
         </w:tc>
       </w:tr>
       <w:tr>
-        <w:tc>
-          <w:tcPr>
-            <w:tcW w:w="2232" w:type="dxa"/>
+        <w:trPr>
+          <w:cantSplit/>
+        </w:trPr>
+        <w:tc>
+          <w:tcPr>
+            <w:tcW w:w="1613" w:type="pct"/>
             <w:tcMar>
               <w:top w:w="90" w:type="dxa"/>
               <w:left w:w="100" w:type="dxa"/>
@@ -2676,7 +2717,7 @@
         </w:tc>
         <w:tc>
           <w:tcPr>
-            <w:tcW w:w="3816" w:type="dxa"/>
+            <w:tcW w:w="1710" w:type="pct"/>
             <w:tcMar>
               <w:top w:w="90" w:type="dxa"/>
               <w:left w:w="100" w:type="dxa"/>
@@ -2696,7 +2737,7 @@
         </w:tc>
         <w:tc>
           <w:tcPr>
-            <w:tcW w:w="3744" w:type="dxa"/>
+            <w:tcW w:w="1677" w:type="pct"/>
             <w:tcMar>
               <w:top w:w="90" w:type="dxa"/>
               <w:left w:w="100" w:type="dxa"/>
@@ -2716,9 +2757,12 @@
         </w:tc>
       </w:tr>
       <w:tr>
-        <w:tc>
-          <w:tcPr>
-            <w:tcW w:w="2232" w:type="dxa"/>
+        <w:trPr>
+          <w:cantSplit/>
+        </w:trPr>
+        <w:tc>
+          <w:tcPr>
+            <w:tcW w:w="1613" w:type="pct"/>
             <w:tcMar>
               <w:top w:w="90" w:type="dxa"/>
               <w:left w:w="100" w:type="dxa"/>
@@ -2738,7 +2782,7 @@
         </w:tc>
         <w:tc>
           <w:tcPr>
-            <w:tcW w:w="3816" w:type="dxa"/>
+            <w:tcW w:w="1710" w:type="pct"/>
             <w:tcMar>
               <w:top w:w="90" w:type="dxa"/>
               <w:left w:w="100" w:type="dxa"/>
@@ -2758,7 +2802,7 @@
         </w:tc>
         <w:tc>
           <w:tcPr>
-            <w:tcW w:w="3744" w:type="dxa"/>
+            <w:tcW w:w="1677" w:type="pct"/>
             <w:tcMar>
               <w:top w:w="90" w:type="dxa"/>
               <w:left w:w="100" w:type="dxa"/>
@@ -3865,7 +3909,7 @@
     </w:p>
     <w:tbl>
       <w:tblPr>
-        <w:tblW w:w="0" w:type="auto"/>
+        <w:tblW w:w="5000" w:type="pct"/>
         <w:tblBorders>
           <w:top w:val="single" w:sz="6" w:space="0" w:color="000000"/>
           <w:left w:val="single" w:sz="6" w:space="0" w:color="000000"/>
@@ -3874,18 +3918,20 @@
           <w:insideH w:val="single" w:sz="6" w:space="0" w:color="000000"/>
           <w:insideV w:val="single" w:sz="6" w:space="0" w:color="000000"/>
         </w:tblBorders>
-        <w:tblLayout w:type="fixed"/>
         <w:tblLook w:val="04A0" w:firstRow="1" w:lastRow="0" w:firstColumn="1" w:lastColumn="0" w:noHBand="0" w:noVBand="1"/>
       </w:tblPr>
       <w:tblGrid>
-        <w:gridCol w:w="3600"/>
-        <w:gridCol w:w="4680"/>
-        <w:gridCol w:w="3600"/>
+        <w:gridCol w:w="3333"/>
+        <w:gridCol w:w="4334"/>
+        <w:gridCol w:w="3333"/>
       </w:tblGrid>
       <w:tr>
-        <w:tc>
-          <w:tcPr>
-            <w:tcW w:w="3600" w:type="dxa"/>
+        <w:trPr>
+          <w:cantSplit/>
+        </w:trPr>
+        <w:tc>
+          <w:tcPr>
+            <w:tcW w:w="1515" w:type="pct"/>
             <w:tcMar>
               <w:top w:w="90" w:type="dxa"/>
               <w:left w:w="100" w:type="dxa"/>
@@ -3909,7 +3955,7 @@
         </w:tc>
         <w:tc>
           <w:tcPr>
-            <w:tcW w:w="3600" w:type="dxa"/>
+            <w:tcW w:w="1970" w:type="pct"/>
             <w:tcMar>
               <w:top w:w="90" w:type="dxa"/>
               <w:left w:w="100" w:type="dxa"/>
@@ -3933,7 +3979,7 @@
         </w:tc>
         <w:tc>
           <w:tcPr>
-            <w:tcW w:w="3600" w:type="dxa"/>
+            <w:tcW w:w="1515" w:type="pct"/>
             <w:tcMar>
               <w:top w:w="90" w:type="dxa"/>
               <w:left w:w="100" w:type="dxa"/>
@@ -3957,9 +4003,12 @@
         </w:tc>
       </w:tr>
       <w:tr>
-        <w:tc>
-          <w:tcPr>
-            <w:tcW w:w="2880" w:type="dxa"/>
+        <w:trPr>
+          <w:cantSplit/>
+        </w:trPr>
+        <w:tc>
+          <w:tcPr>
+            <w:tcW w:w="1515" w:type="pct"/>
             <w:tcMar>
               <w:top w:w="90" w:type="dxa"/>
               <w:left w:w="100" w:type="dxa"/>
@@ -3979,7 +4028,7 @@
         </w:tc>
         <w:tc>
           <w:tcPr>
-            <w:tcW w:w="4680" w:type="dxa"/>
+            <w:tcW w:w="1970" w:type="pct"/>
             <w:tcMar>
               <w:top w:w="90" w:type="dxa"/>
               <w:left w:w="100" w:type="dxa"/>
@@ -3999,7 +4048,7 @@
         </w:tc>
         <w:tc>
           <w:tcPr>
-            <w:tcW w:w="2232" w:type="dxa"/>
+            <w:tcW w:w="1515" w:type="pct"/>
             <w:tcMar>
               <w:top w:w="90" w:type="dxa"/>
               <w:left w:w="100" w:type="dxa"/>
@@ -4019,9 +4068,12 @@
         </w:tc>
       </w:tr>
       <w:tr>
-        <w:tc>
-          <w:tcPr>
-            <w:tcW w:w="2880" w:type="dxa"/>
+        <w:trPr>
+          <w:cantSplit/>
+        </w:trPr>
+        <w:tc>
+          <w:tcPr>
+            <w:tcW w:w="1515" w:type="pct"/>
             <w:tcMar>
               <w:top w:w="90" w:type="dxa"/>
               <w:left w:w="100" w:type="dxa"/>
@@ -4041,7 +4093,7 @@
         </w:tc>
         <w:tc>
           <w:tcPr>
-            <w:tcW w:w="4680" w:type="dxa"/>
+            <w:tcW w:w="1970" w:type="pct"/>
             <w:tcMar>
               <w:top w:w="90" w:type="dxa"/>
               <w:left w:w="100" w:type="dxa"/>
@@ -4061,7 +4113,7 @@
         </w:tc>
         <w:tc>
           <w:tcPr>
-            <w:tcW w:w="2232" w:type="dxa"/>
+            <w:tcW w:w="1515" w:type="pct"/>
             <w:tcMar>
               <w:top w:w="90" w:type="dxa"/>
               <w:left w:w="100" w:type="dxa"/>
@@ -4081,9 +4133,12 @@
         </w:tc>
       </w:tr>
       <w:tr>
-        <w:tc>
-          <w:tcPr>
-            <w:tcW w:w="2880" w:type="dxa"/>
+        <w:trPr>
+          <w:cantSplit/>
+        </w:trPr>
+        <w:tc>
+          <w:tcPr>
+            <w:tcW w:w="1515" w:type="pct"/>
             <w:tcMar>
               <w:top w:w="90" w:type="dxa"/>
               <w:left w:w="100" w:type="dxa"/>
@@ -4103,7 +4158,7 @@
         </w:tc>
         <w:tc>
           <w:tcPr>
-            <w:tcW w:w="4680" w:type="dxa"/>
+            <w:tcW w:w="1970" w:type="pct"/>
             <w:tcMar>
               <w:top w:w="90" w:type="dxa"/>
               <w:left w:w="100" w:type="dxa"/>
@@ -4123,7 +4178,7 @@
         </w:tc>
         <w:tc>
           <w:tcPr>
-            <w:tcW w:w="2232" w:type="dxa"/>
+            <w:tcW w:w="1515" w:type="pct"/>
             <w:tcMar>
               <w:top w:w="90" w:type="dxa"/>
               <w:left w:w="100" w:type="dxa"/>
@@ -4143,9 +4198,12 @@
         </w:tc>
       </w:tr>
       <w:tr>
-        <w:tc>
-          <w:tcPr>
-            <w:tcW w:w="2880" w:type="dxa"/>
+        <w:trPr>
+          <w:cantSplit/>
+        </w:trPr>
+        <w:tc>
+          <w:tcPr>
+            <w:tcW w:w="1515" w:type="pct"/>
             <w:tcMar>
               <w:top w:w="90" w:type="dxa"/>
               <w:left w:w="100" w:type="dxa"/>
@@ -4165,7 +4223,7 @@
         </w:tc>
         <w:tc>
           <w:tcPr>
-            <w:tcW w:w="4680" w:type="dxa"/>
+            <w:tcW w:w="1970" w:type="pct"/>
             <w:tcMar>
               <w:top w:w="90" w:type="dxa"/>
               <w:left w:w="100" w:type="dxa"/>
@@ -4185,7 +4243,7 @@
         </w:tc>
         <w:tc>
           <w:tcPr>
-            <w:tcW w:w="2232" w:type="dxa"/>
+            <w:tcW w:w="1515" w:type="pct"/>
             <w:tcMar>
               <w:top w:w="90" w:type="dxa"/>
               <w:left w:w="100" w:type="dxa"/>
@@ -4205,9 +4263,12 @@
         </w:tc>
       </w:tr>
       <w:tr>
-        <w:tc>
-          <w:tcPr>
-            <w:tcW w:w="2880" w:type="dxa"/>
+        <w:trPr>
+          <w:cantSplit/>
+        </w:trPr>
+        <w:tc>
+          <w:tcPr>
+            <w:tcW w:w="1515" w:type="pct"/>
             <w:tcMar>
               <w:top w:w="90" w:type="dxa"/>
               <w:left w:w="100" w:type="dxa"/>
@@ -4227,7 +4288,7 @@
         </w:tc>
         <w:tc>
           <w:tcPr>
-            <w:tcW w:w="4680" w:type="dxa"/>
+            <w:tcW w:w="1970" w:type="pct"/>
             <w:tcMar>
               <w:top w:w="90" w:type="dxa"/>
               <w:left w:w="100" w:type="dxa"/>
@@ -4247,7 +4308,7 @@
         </w:tc>
         <w:tc>
           <w:tcPr>
-            <w:tcW w:w="2232" w:type="dxa"/>
+            <w:tcW w:w="1515" w:type="pct"/>
             <w:tcMar>
               <w:top w:w="90" w:type="dxa"/>
               <w:left w:w="100" w:type="dxa"/>
@@ -4267,9 +4328,12 @@
         </w:tc>
       </w:tr>
       <w:tr>
-        <w:tc>
-          <w:tcPr>
-            <w:tcW w:w="2880" w:type="dxa"/>
+        <w:trPr>
+          <w:cantSplit/>
+        </w:trPr>
+        <w:tc>
+          <w:tcPr>
+            <w:tcW w:w="1515" w:type="pct"/>
             <w:tcMar>
               <w:top w:w="90" w:type="dxa"/>
               <w:left w:w="100" w:type="dxa"/>
@@ -4289,7 +4353,7 @@
         </w:tc>
         <w:tc>
           <w:tcPr>
-            <w:tcW w:w="4680" w:type="dxa"/>
+            <w:tcW w:w="1970" w:type="pct"/>
             <w:tcMar>
               <w:top w:w="90" w:type="dxa"/>
               <w:left w:w="100" w:type="dxa"/>
@@ -4309,7 +4373,7 @@
         </w:tc>
         <w:tc>
           <w:tcPr>
-            <w:tcW w:w="2232" w:type="dxa"/>
+            <w:tcW w:w="1515" w:type="pct"/>
             <w:tcMar>
               <w:top w:w="90" w:type="dxa"/>
               <w:left w:w="100" w:type="dxa"/>
@@ -4329,9 +4393,12 @@
         </w:tc>
       </w:tr>
       <w:tr>
-        <w:tc>
-          <w:tcPr>
-            <w:tcW w:w="2880" w:type="dxa"/>
+        <w:trPr>
+          <w:cantSplit/>
+        </w:trPr>
+        <w:tc>
+          <w:tcPr>
+            <w:tcW w:w="1515" w:type="pct"/>
             <w:tcMar>
               <w:top w:w="90" w:type="dxa"/>
               <w:left w:w="100" w:type="dxa"/>
@@ -4351,7 +4418,7 @@
         </w:tc>
         <w:tc>
           <w:tcPr>
-            <w:tcW w:w="4680" w:type="dxa"/>
+            <w:tcW w:w="1970" w:type="pct"/>
             <w:tcMar>
               <w:top w:w="90" w:type="dxa"/>
               <w:left w:w="100" w:type="dxa"/>
@@ -4371,7 +4438,7 @@
         </w:tc>
         <w:tc>
           <w:tcPr>
-            <w:tcW w:w="2232" w:type="dxa"/>
+            <w:tcW w:w="1515" w:type="pct"/>
             <w:tcMar>
               <w:top w:w="90" w:type="dxa"/>
               <w:left w:w="100" w:type="dxa"/>
@@ -4391,9 +4458,12 @@
         </w:tc>
       </w:tr>
       <w:tr>
-        <w:tc>
-          <w:tcPr>
-            <w:tcW w:w="2880" w:type="dxa"/>
+        <w:trPr>
+          <w:cantSplit/>
+        </w:trPr>
+        <w:tc>
+          <w:tcPr>
+            <w:tcW w:w="1515" w:type="pct"/>
             <w:tcMar>
               <w:top w:w="90" w:type="dxa"/>
               <w:left w:w="100" w:type="dxa"/>
@@ -4413,7 +4483,7 @@
         </w:tc>
         <w:tc>
           <w:tcPr>
-            <w:tcW w:w="4680" w:type="dxa"/>
+            <w:tcW w:w="1970" w:type="pct"/>
             <w:tcMar>
               <w:top w:w="90" w:type="dxa"/>
               <w:left w:w="100" w:type="dxa"/>
@@ -4433,7 +4503,7 @@
         </w:tc>
         <w:tc>
           <w:tcPr>
-            <w:tcW w:w="2232" w:type="dxa"/>
+            <w:tcW w:w="1515" w:type="pct"/>
             <w:tcMar>
               <w:top w:w="90" w:type="dxa"/>
               <w:left w:w="100" w:type="dxa"/>
@@ -4487,7 +4557,7 @@
     </w:p>
     <w:tbl>
       <w:tblPr>
-        <w:tblW w:w="0" w:type="auto"/>
+        <w:tblW w:w="5000" w:type="pct"/>
         <w:tblBorders>
           <w:top w:val="single" w:sz="6" w:space="0" w:color="000000"/>
           <w:left w:val="single" w:sz="6" w:space="0" w:color="000000"/>
@@ -4496,18 +4566,20 @@
           <w:insideH w:val="single" w:sz="6" w:space="0" w:color="000000"/>
           <w:insideV w:val="single" w:sz="6" w:space="0" w:color="000000"/>
         </w:tblBorders>
-        <w:tblLayout w:type="fixed"/>
         <w:tblLook w:val="04A0" w:firstRow="1" w:lastRow="0" w:firstColumn="1" w:lastColumn="0" w:noHBand="0" w:noVBand="1"/>
       </w:tblPr>
       <w:tblGrid>
-        <w:gridCol w:w="3600"/>
-        <w:gridCol w:w="4032"/>
-        <w:gridCol w:w="3600"/>
+        <w:gridCol w:w="3527"/>
+        <w:gridCol w:w="3949"/>
+        <w:gridCol w:w="3524"/>
       </w:tblGrid>
       <w:tr>
-        <w:tc>
-          <w:tcPr>
-            <w:tcW w:w="3600" w:type="dxa"/>
+        <w:trPr>
+          <w:cantSplit/>
+        </w:trPr>
+        <w:tc>
+          <w:tcPr>
+            <w:tcW w:w="1603" w:type="pct"/>
             <w:tcMar>
               <w:top w:w="90" w:type="dxa"/>
               <w:left w:w="100" w:type="dxa"/>
@@ -4531,7 +4603,7 @@
         </w:tc>
         <w:tc>
           <w:tcPr>
-            <w:tcW w:w="3600" w:type="dxa"/>
+            <w:tcW w:w="1795" w:type="pct"/>
             <w:tcMar>
               <w:top w:w="90" w:type="dxa"/>
               <w:left w:w="100" w:type="dxa"/>
@@ -4555,7 +4627,7 @@
         </w:tc>
         <w:tc>
           <w:tcPr>
-            <w:tcW w:w="3600" w:type="dxa"/>
+            <w:tcW w:w="1603" w:type="pct"/>
             <w:tcMar>
               <w:top w:w="90" w:type="dxa"/>
               <w:left w:w="100" w:type="dxa"/>
@@ -4579,9 +4651,12 @@
         </w:tc>
       </w:tr>
       <w:tr>
-        <w:tc>
-          <w:tcPr>
-            <w:tcW w:w="2232" w:type="dxa"/>
+        <w:trPr>
+          <w:cantSplit/>
+        </w:trPr>
+        <w:tc>
+          <w:tcPr>
+            <w:tcW w:w="1603" w:type="pct"/>
             <w:tcMar>
               <w:top w:w="90" w:type="dxa"/>
               <w:left w:w="100" w:type="dxa"/>
@@ -4601,7 +4676,7 @@
         </w:tc>
         <w:tc>
           <w:tcPr>
-            <w:tcW w:w="4032" w:type="dxa"/>
+            <w:tcW w:w="1795" w:type="pct"/>
             <w:tcMar>
               <w:top w:w="90" w:type="dxa"/>
               <w:left w:w="100" w:type="dxa"/>
@@ -4621,7 +4696,7 @@
         </w:tc>
         <w:tc>
           <w:tcPr>
-            <w:tcW w:w="3528" w:type="dxa"/>
+            <w:tcW w:w="1603" w:type="pct"/>
             <w:tcMar>
               <w:top w:w="90" w:type="dxa"/>
               <w:left w:w="100" w:type="dxa"/>
@@ -4641,9 +4716,12 @@
         </w:tc>
       </w:tr>
       <w:tr>
-        <w:tc>
-          <w:tcPr>
-            <w:tcW w:w="2232" w:type="dxa"/>
+        <w:trPr>
+          <w:cantSplit/>
+        </w:trPr>
+        <w:tc>
+          <w:tcPr>
+            <w:tcW w:w="1603" w:type="pct"/>
             <w:tcMar>
               <w:top w:w="90" w:type="dxa"/>
               <w:left w:w="100" w:type="dxa"/>
@@ -4663,7 +4741,7 @@
         </w:tc>
         <w:tc>
           <w:tcPr>
-            <w:tcW w:w="4032" w:type="dxa"/>
+            <w:tcW w:w="1795" w:type="pct"/>
             <w:tcMar>
               <w:top w:w="90" w:type="dxa"/>
               <w:left w:w="100" w:type="dxa"/>
@@ -4683,7 +4761,7 @@
         </w:tc>
         <w:tc>
           <w:tcPr>
-            <w:tcW w:w="3528" w:type="dxa"/>
+            <w:tcW w:w="1603" w:type="pct"/>
             <w:tcMar>
               <w:top w:w="90" w:type="dxa"/>
               <w:left w:w="100" w:type="dxa"/>
@@ -4703,9 +4781,12 @@
         </w:tc>
       </w:tr>
       <w:tr>
-        <w:tc>
-          <w:tcPr>
-            <w:tcW w:w="2232" w:type="dxa"/>
+        <w:trPr>
+          <w:cantSplit/>
+        </w:trPr>
+        <w:tc>
+          <w:tcPr>
+            <w:tcW w:w="1603" w:type="pct"/>
             <w:tcMar>
               <w:top w:w="90" w:type="dxa"/>
               <w:left w:w="100" w:type="dxa"/>
@@ -4725,7 +4806,7 @@
         </w:tc>
         <w:tc>
           <w:tcPr>
-            <w:tcW w:w="4032" w:type="dxa"/>
+            <w:tcW w:w="1795" w:type="pct"/>
             <w:tcMar>
               <w:top w:w="90" w:type="dxa"/>
               <w:left w:w="100" w:type="dxa"/>
@@ -4745,7 +4826,7 @@
         </w:tc>
         <w:tc>
           <w:tcPr>
-            <w:tcW w:w="3528" w:type="dxa"/>
+            <w:tcW w:w="1603" w:type="pct"/>
             <w:tcMar>
               <w:top w:w="90" w:type="dxa"/>
               <w:left w:w="100" w:type="dxa"/>
@@ -4765,9 +4846,12 @@
         </w:tc>
       </w:tr>
       <w:tr>
-        <w:tc>
-          <w:tcPr>
-            <w:tcW w:w="2232" w:type="dxa"/>
+        <w:trPr>
+          <w:cantSplit/>
+        </w:trPr>
+        <w:tc>
+          <w:tcPr>
+            <w:tcW w:w="1603" w:type="pct"/>
             <w:tcMar>
               <w:top w:w="90" w:type="dxa"/>
               <w:left w:w="100" w:type="dxa"/>
@@ -4787,7 +4871,7 @@
         </w:tc>
         <w:tc>
           <w:tcPr>
-            <w:tcW w:w="4032" w:type="dxa"/>
+            <w:tcW w:w="1795" w:type="pct"/>
             <w:tcMar>
               <w:top w:w="90" w:type="dxa"/>
               <w:left w:w="100" w:type="dxa"/>
@@ -4807,7 +4891,7 @@
         </w:tc>
         <w:tc>
           <w:tcPr>
-            <w:tcW w:w="3528" w:type="dxa"/>
+            <w:tcW w:w="1603" w:type="pct"/>
             <w:tcMar>
               <w:top w:w="90" w:type="dxa"/>
               <w:left w:w="100" w:type="dxa"/>
@@ -4827,9 +4911,12 @@
         </w:tc>
       </w:tr>
       <w:tr>
-        <w:tc>
-          <w:tcPr>
-            <w:tcW w:w="2232" w:type="dxa"/>
+        <w:trPr>
+          <w:cantSplit/>
+        </w:trPr>
+        <w:tc>
+          <w:tcPr>
+            <w:tcW w:w="1603" w:type="pct"/>
             <w:tcMar>
               <w:top w:w="90" w:type="dxa"/>
               <w:left w:w="100" w:type="dxa"/>
@@ -4849,7 +4936,7 @@
         </w:tc>
         <w:tc>
           <w:tcPr>
-            <w:tcW w:w="4032" w:type="dxa"/>
+            <w:tcW w:w="1795" w:type="pct"/>
             <w:tcMar>
               <w:top w:w="90" w:type="dxa"/>
               <w:left w:w="100" w:type="dxa"/>
@@ -4869,7 +4956,7 @@
         </w:tc>
         <w:tc>
           <w:tcPr>
-            <w:tcW w:w="3528" w:type="dxa"/>
+            <w:tcW w:w="1603" w:type="pct"/>
             <w:tcMar>
               <w:top w:w="90" w:type="dxa"/>
               <w:left w:w="100" w:type="dxa"/>
@@ -4889,9 +4976,12 @@
         </w:tc>
       </w:tr>
       <w:tr>
-        <w:tc>
-          <w:tcPr>
-            <w:tcW w:w="2232" w:type="dxa"/>
+        <w:trPr>
+          <w:cantSplit/>
+        </w:trPr>
+        <w:tc>
+          <w:tcPr>
+            <w:tcW w:w="1603" w:type="pct"/>
             <w:tcMar>
               <w:top w:w="90" w:type="dxa"/>
               <w:left w:w="100" w:type="dxa"/>
@@ -4911,7 +5001,7 @@
         </w:tc>
         <w:tc>
           <w:tcPr>
-            <w:tcW w:w="4032" w:type="dxa"/>
+            <w:tcW w:w="1795" w:type="pct"/>
             <w:tcMar>
               <w:top w:w="90" w:type="dxa"/>
               <w:left w:w="100" w:type="dxa"/>
@@ -4931,7 +5021,7 @@
         </w:tc>
         <w:tc>
           <w:tcPr>
-            <w:tcW w:w="3528" w:type="dxa"/>
+            <w:tcW w:w="1603" w:type="pct"/>
             <w:tcMar>
               <w:top w:w="90" w:type="dxa"/>
               <w:left w:w="100" w:type="dxa"/>
@@ -4951,9 +5041,12 @@
         </w:tc>
       </w:tr>
       <w:tr>
-        <w:tc>
-          <w:tcPr>
-            <w:tcW w:w="2232" w:type="dxa"/>
+        <w:trPr>
+          <w:cantSplit/>
+        </w:trPr>
+        <w:tc>
+          <w:tcPr>
+            <w:tcW w:w="1603" w:type="pct"/>
             <w:tcMar>
               <w:top w:w="90" w:type="dxa"/>
               <w:left w:w="100" w:type="dxa"/>
@@ -4973,7 +5066,7 @@
         </w:tc>
         <w:tc>
           <w:tcPr>
-            <w:tcW w:w="4032" w:type="dxa"/>
+            <w:tcW w:w="1795" w:type="pct"/>
             <w:tcMar>
               <w:top w:w="90" w:type="dxa"/>
               <w:left w:w="100" w:type="dxa"/>
@@ -4993,7 +5086,7 @@
         </w:tc>
         <w:tc>
           <w:tcPr>
-            <w:tcW w:w="3528" w:type="dxa"/>
+            <w:tcW w:w="1603" w:type="pct"/>
             <w:tcMar>
               <w:top w:w="90" w:type="dxa"/>
               <w:left w:w="100" w:type="dxa"/>
@@ -5047,7 +5140,7 @@
     </w:p>
     <w:tbl>
       <w:tblPr>
-        <w:tblW w:w="0" w:type="auto"/>
+        <w:tblW w:w="5000" w:type="pct"/>
         <w:tblBorders>
           <w:top w:val="single" w:sz="6" w:space="0" w:color="000000"/>
           <w:left w:val="single" w:sz="6" w:space="0" w:color="000000"/>
@@ -5056,18 +5149,20 @@
           <w:insideH w:val="single" w:sz="6" w:space="0" w:color="000000"/>
           <w:insideV w:val="single" w:sz="6" w:space="0" w:color="000000"/>
         </w:tblBorders>
-        <w:tblLayout w:type="fixed"/>
         <w:tblLook w:val="04A0" w:firstRow="1" w:lastRow="0" w:firstColumn="1" w:lastColumn="0" w:noHBand="0" w:noVBand="1"/>
       </w:tblPr>
       <w:tblGrid>
-        <w:gridCol w:w="3744"/>
-        <w:gridCol w:w="3600"/>
-        <w:gridCol w:w="3600"/>
+        <w:gridCol w:w="3764"/>
+        <w:gridCol w:w="3619"/>
+        <w:gridCol w:w="3617"/>
       </w:tblGrid>
       <w:tr>
-        <w:tc>
-          <w:tcPr>
-            <w:tcW w:w="3600" w:type="dxa"/>
+        <w:trPr>
+          <w:cantSplit/>
+        </w:trPr>
+        <w:tc>
+          <w:tcPr>
+            <w:tcW w:w="1711" w:type="pct"/>
             <w:tcMar>
               <w:top w:w="90" w:type="dxa"/>
               <w:left w:w="100" w:type="dxa"/>
@@ -5091,7 +5186,7 @@
         </w:tc>
         <w:tc>
           <w:tcPr>
-            <w:tcW w:w="3600" w:type="dxa"/>
+            <w:tcW w:w="1645" w:type="pct"/>
             <w:tcMar>
               <w:top w:w="90" w:type="dxa"/>
               <w:left w:w="100" w:type="dxa"/>
@@ -5115,7 +5210,7 @@
         </w:tc>
         <w:tc>
           <w:tcPr>
-            <w:tcW w:w="3600" w:type="dxa"/>
+            <w:tcW w:w="1645" w:type="pct"/>
             <w:tcMar>
               <w:top w:w="90" w:type="dxa"/>
               <w:left w:w="100" w:type="dxa"/>
@@ -5139,9 +5234,12 @@
         </w:tc>
       </w:tr>
       <w:tr>
-        <w:tc>
-          <w:tcPr>
-            <w:tcW w:w="3744" w:type="dxa"/>
+        <w:trPr>
+          <w:cantSplit/>
+        </w:trPr>
+        <w:tc>
+          <w:tcPr>
+            <w:tcW w:w="1711" w:type="pct"/>
             <w:tcMar>
               <w:top w:w="90" w:type="dxa"/>
               <w:left w:w="100" w:type="dxa"/>
@@ -5161,7 +5259,7 @@
         </w:tc>
         <w:tc>
           <w:tcPr>
-            <w:tcW w:w="3096" w:type="dxa"/>
+            <w:tcW w:w="1645" w:type="pct"/>
             <w:tcMar>
               <w:top w:w="90" w:type="dxa"/>
               <w:left w:w="100" w:type="dxa"/>
@@ -5181,7 +5279,7 @@
         </w:tc>
         <w:tc>
           <w:tcPr>
-            <w:tcW w:w="2952" w:type="dxa"/>
+            <w:tcW w:w="1645" w:type="pct"/>
             <w:tcMar>
               <w:top w:w="90" w:type="dxa"/>
               <w:left w:w="100" w:type="dxa"/>
@@ -5201,9 +5299,12 @@
         </w:tc>
       </w:tr>
       <w:tr>
-        <w:tc>
-          <w:tcPr>
-            <w:tcW w:w="3744" w:type="dxa"/>
+        <w:trPr>
+          <w:cantSplit/>
+        </w:trPr>
+        <w:tc>
+          <w:tcPr>
+            <w:tcW w:w="1711" w:type="pct"/>
             <w:tcMar>
               <w:top w:w="90" w:type="dxa"/>
               <w:left w:w="100" w:type="dxa"/>
@@ -5223,7 +5324,7 @@
         </w:tc>
         <w:tc>
           <w:tcPr>
-            <w:tcW w:w="3096" w:type="dxa"/>
+            <w:tcW w:w="1645" w:type="pct"/>
             <w:tcMar>
               <w:top w:w="90" w:type="dxa"/>
               <w:left w:w="100" w:type="dxa"/>
@@ -5243,7 +5344,7 @@
         </w:tc>
         <w:tc>
           <w:tcPr>
-            <w:tcW w:w="2952" w:type="dxa"/>
+            <w:tcW w:w="1645" w:type="pct"/>
             <w:tcMar>
               <w:top w:w="90" w:type="dxa"/>
               <w:left w:w="100" w:type="dxa"/>
@@ -5263,9 +5364,12 @@
         </w:tc>
       </w:tr>
       <w:tr>
-        <w:tc>
-          <w:tcPr>
-            <w:tcW w:w="3744" w:type="dxa"/>
+        <w:trPr>
+          <w:cantSplit/>
+        </w:trPr>
+        <w:tc>
+          <w:tcPr>
+            <w:tcW w:w="1711" w:type="pct"/>
             <w:tcMar>
               <w:top w:w="90" w:type="dxa"/>
               <w:left w:w="100" w:type="dxa"/>
@@ -5285,7 +5389,7 @@
         </w:tc>
         <w:tc>
           <w:tcPr>
-            <w:tcW w:w="3096" w:type="dxa"/>
+            <w:tcW w:w="1645" w:type="pct"/>
             <w:tcMar>
               <w:top w:w="90" w:type="dxa"/>
               <w:left w:w="100" w:type="dxa"/>
@@ -5305,7 +5409,7 @@
         </w:tc>
         <w:tc>
           <w:tcPr>
-            <w:tcW w:w="2952" w:type="dxa"/>
+            <w:tcW w:w="1645" w:type="pct"/>
             <w:tcMar>
               <w:top w:w="90" w:type="dxa"/>
               <w:left w:w="100" w:type="dxa"/>
@@ -5325,9 +5429,12 @@
         </w:tc>
       </w:tr>
       <w:tr>
-        <w:tc>
-          <w:tcPr>
-            <w:tcW w:w="3744" w:type="dxa"/>
+        <w:trPr>
+          <w:cantSplit/>
+        </w:trPr>
+        <w:tc>
+          <w:tcPr>
+            <w:tcW w:w="1711" w:type="pct"/>
             <w:tcMar>
               <w:top w:w="90" w:type="dxa"/>
               <w:left w:w="100" w:type="dxa"/>
@@ -5347,7 +5454,7 @@
         </w:tc>
         <w:tc>
           <w:tcPr>
-            <w:tcW w:w="3096" w:type="dxa"/>
+            <w:tcW w:w="1645" w:type="pct"/>
             <w:tcMar>
               <w:top w:w="90" w:type="dxa"/>
               <w:left w:w="100" w:type="dxa"/>
@@ -5367,7 +5474,7 @@
         </w:tc>
         <w:tc>
           <w:tcPr>
-            <w:tcW w:w="2952" w:type="dxa"/>
+            <w:tcW w:w="1645" w:type="pct"/>
             <w:tcMar>
               <w:top w:w="90" w:type="dxa"/>
               <w:left w:w="100" w:type="dxa"/>
@@ -5387,9 +5494,12 @@
         </w:tc>
       </w:tr>
       <w:tr>
-        <w:tc>
-          <w:tcPr>
-            <w:tcW w:w="3744" w:type="dxa"/>
+        <w:trPr>
+          <w:cantSplit/>
+        </w:trPr>
+        <w:tc>
+          <w:tcPr>
+            <w:tcW w:w="1711" w:type="pct"/>
             <w:tcMar>
               <w:top w:w="90" w:type="dxa"/>
               <w:left w:w="100" w:type="dxa"/>
@@ -5409,7 +5519,7 @@
         </w:tc>
         <w:tc>
           <w:tcPr>
-            <w:tcW w:w="3096" w:type="dxa"/>
+            <w:tcW w:w="1645" w:type="pct"/>
             <w:tcMar>
               <w:top w:w="90" w:type="dxa"/>
               <w:left w:w="100" w:type="dxa"/>
@@ -5429,7 +5539,7 @@
         </w:tc>
         <w:tc>
           <w:tcPr>
-            <w:tcW w:w="2952" w:type="dxa"/>
+            <w:tcW w:w="1645" w:type="pct"/>
             <w:tcMar>
               <w:top w:w="90" w:type="dxa"/>
               <w:left w:w="100" w:type="dxa"/>
@@ -5449,9 +5559,12 @@
         </w:tc>
       </w:tr>
       <w:tr>
-        <w:tc>
-          <w:tcPr>
-            <w:tcW w:w="3744" w:type="dxa"/>
+        <w:trPr>
+          <w:cantSplit/>
+        </w:trPr>
+        <w:tc>
+          <w:tcPr>
+            <w:tcW w:w="1711" w:type="pct"/>
             <w:tcMar>
               <w:top w:w="90" w:type="dxa"/>
               <w:left w:w="100" w:type="dxa"/>
@@ -5471,7 +5584,7 @@
         </w:tc>
         <w:tc>
           <w:tcPr>
-            <w:tcW w:w="3096" w:type="dxa"/>
+            <w:tcW w:w="1645" w:type="pct"/>
             <w:tcMar>
               <w:top w:w="90" w:type="dxa"/>
               <w:left w:w="100" w:type="dxa"/>
@@ -5491,7 +5604,7 @@
         </w:tc>
         <w:tc>
           <w:tcPr>
-            <w:tcW w:w="2952" w:type="dxa"/>
+            <w:tcW w:w="1645" w:type="pct"/>
             <w:tcMar>
               <w:top w:w="90" w:type="dxa"/>
               <w:left w:w="100" w:type="dxa"/>
@@ -5511,9 +5624,12 @@
         </w:tc>
       </w:tr>
       <w:tr>
-        <w:tc>
-          <w:tcPr>
-            <w:tcW w:w="3744" w:type="dxa"/>
+        <w:trPr>
+          <w:cantSplit/>
+        </w:trPr>
+        <w:tc>
+          <w:tcPr>
+            <w:tcW w:w="1711" w:type="pct"/>
             <w:tcMar>
               <w:top w:w="90" w:type="dxa"/>
               <w:left w:w="100" w:type="dxa"/>
@@ -5533,7 +5649,7 @@
         </w:tc>
         <w:tc>
           <w:tcPr>
-            <w:tcW w:w="3096" w:type="dxa"/>
+            <w:tcW w:w="1645" w:type="pct"/>
             <w:tcMar>
               <w:top w:w="90" w:type="dxa"/>
               <w:left w:w="100" w:type="dxa"/>
@@ -5553,7 +5669,7 @@
         </w:tc>
         <w:tc>
           <w:tcPr>
-            <w:tcW w:w="2952" w:type="dxa"/>
+            <w:tcW w:w="1645" w:type="pct"/>
             <w:tcMar>
               <w:top w:w="90" w:type="dxa"/>
               <w:left w:w="100" w:type="dxa"/>
@@ -5573,9 +5689,12 @@
         </w:tc>
       </w:tr>
       <w:tr>
-        <w:tc>
-          <w:tcPr>
-            <w:tcW w:w="3744" w:type="dxa"/>
+        <w:trPr>
+          <w:cantSplit/>
+        </w:trPr>
+        <w:tc>
+          <w:tcPr>
+            <w:tcW w:w="1711" w:type="pct"/>
             <w:tcMar>
               <w:top w:w="90" w:type="dxa"/>
               <w:left w:w="100" w:type="dxa"/>
@@ -5595,7 +5714,7 @@
         </w:tc>
         <w:tc>
           <w:tcPr>
-            <w:tcW w:w="3096" w:type="dxa"/>
+            <w:tcW w:w="1645" w:type="pct"/>
             <w:tcMar>
               <w:top w:w="90" w:type="dxa"/>
               <w:left w:w="100" w:type="dxa"/>
@@ -5615,7 +5734,7 @@
         </w:tc>
         <w:tc>
           <w:tcPr>
-            <w:tcW w:w="2952" w:type="dxa"/>
+            <w:tcW w:w="1645" w:type="pct"/>
             <w:tcMar>
               <w:top w:w="90" w:type="dxa"/>
               <w:left w:w="100" w:type="dxa"/>
@@ -5739,6 +5858,9 @@
         <w:gridCol w:w="5400"/>
       </w:tblGrid>
       <w:tr>
+        <w:trPr>
+          <w:cantSplit/>
+        </w:trPr>
         <w:tc>
           <w:tcPr>
             <w:tcW w:w="5400" w:type="dxa"/>
@@ -5789,6 +5911,9 @@
         </w:tc>
       </w:tr>
       <w:tr>
+        <w:trPr>
+          <w:cantSplit/>
+        </w:trPr>
         <w:tc>
           <w:tcPr>
             <w:tcW w:w="4464" w:type="dxa"/>
@@ -5831,6 +5956,9 @@
         </w:tc>
       </w:tr>
       <w:tr>
+        <w:trPr>
+          <w:cantSplit/>
+        </w:trPr>
         <w:tc>
           <w:tcPr>
             <w:tcW w:w="4464" w:type="dxa"/>
@@ -5873,6 +6001,9 @@
         </w:tc>
       </w:tr>
       <w:tr>
+        <w:trPr>
+          <w:cantSplit/>
+        </w:trPr>
         <w:tc>
           <w:tcPr>
             <w:tcW w:w="4464" w:type="dxa"/>
@@ -5922,6 +6053,9 @@
         </w:tc>
       </w:tr>
       <w:tr>
+        <w:trPr>
+          <w:cantSplit/>
+        </w:trPr>
         <w:tc>
           <w:tcPr>
             <w:tcW w:w="4464" w:type="dxa"/>
@@ -5964,6 +6098,9 @@
         </w:tc>
       </w:tr>
       <w:tr>
+        <w:trPr>
+          <w:cantSplit/>
+        </w:trPr>
         <w:tc>
           <w:tcPr>
             <w:tcW w:w="4464" w:type="dxa"/>
@@ -6006,6 +6143,9 @@
         </w:tc>
       </w:tr>
       <w:tr>
+        <w:trPr>
+          <w:cantSplit/>
+        </w:trPr>
         <w:tc>
           <w:tcPr>
             <w:tcW w:w="4464" w:type="dxa"/>
@@ -6095,7 +6235,7 @@
     </w:p>
     <w:tbl>
       <w:tblPr>
-        <w:tblW w:w="0" w:type="auto"/>
+        <w:tblW w:w="5000" w:type="pct"/>
         <w:tblBorders>
           <w:top w:val="single" w:sz="6" w:space="0" w:color="000000"/>
           <w:left w:val="single" w:sz="6" w:space="0" w:color="000000"/>
@@ -6104,18 +6244,20 @@
           <w:insideH w:val="single" w:sz="6" w:space="0" w:color="000000"/>
           <w:insideV w:val="single" w:sz="6" w:space="0" w:color="000000"/>
         </w:tblBorders>
-        <w:tblLayout w:type="fixed"/>
         <w:tblLook w:val="04A0" w:firstRow="1" w:lastRow="0" w:firstColumn="1" w:lastColumn="0" w:noHBand="0" w:noVBand="1"/>
       </w:tblPr>
       <w:tblGrid>
-        <w:gridCol w:w="4032"/>
-        <w:gridCol w:w="3600"/>
-        <w:gridCol w:w="3600"/>
+        <w:gridCol w:w="3949"/>
+        <w:gridCol w:w="3527"/>
+        <w:gridCol w:w="3524"/>
       </w:tblGrid>
       <w:tr>
-        <w:tc>
-          <w:tcPr>
-            <w:tcW w:w="3600" w:type="dxa"/>
+        <w:trPr>
+          <w:cantSplit/>
+        </w:trPr>
+        <w:tc>
+          <w:tcPr>
+            <w:tcW w:w="1795" w:type="pct"/>
             <w:tcMar>
               <w:top w:w="90" w:type="dxa"/>
               <w:left w:w="100" w:type="dxa"/>
@@ -6139,7 +6281,7 @@
         </w:tc>
         <w:tc>
           <w:tcPr>
-            <w:tcW w:w="3600" w:type="dxa"/>
+            <w:tcW w:w="1603" w:type="pct"/>
             <w:tcMar>
               <w:top w:w="90" w:type="dxa"/>
               <w:left w:w="100" w:type="dxa"/>
@@ -6163,7 +6305,7 @@
         </w:tc>
         <w:tc>
           <w:tcPr>
-            <w:tcW w:w="3600" w:type="dxa"/>
+            <w:tcW w:w="1603" w:type="pct"/>
             <w:tcMar>
               <w:top w:w="90" w:type="dxa"/>
               <w:left w:w="100" w:type="dxa"/>
@@ -6187,9 +6329,12 @@
         </w:tc>
       </w:tr>
       <w:tr>
-        <w:tc>
-          <w:tcPr>
-            <w:tcW w:w="4032" w:type="dxa"/>
+        <w:trPr>
+          <w:cantSplit/>
+        </w:trPr>
+        <w:tc>
+          <w:tcPr>
+            <w:tcW w:w="1795" w:type="pct"/>
             <w:tcMar>
               <w:top w:w="90" w:type="dxa"/>
               <w:left w:w="100" w:type="dxa"/>
@@ -6209,7 +6354,7 @@
         </w:tc>
         <w:tc>
           <w:tcPr>
-            <w:tcW w:w="2736" w:type="dxa"/>
+            <w:tcW w:w="1603" w:type="pct"/>
             <w:tcMar>
               <w:top w:w="90" w:type="dxa"/>
               <w:left w:w="100" w:type="dxa"/>
@@ -6229,7 +6374,7 @@
         </w:tc>
         <w:tc>
           <w:tcPr>
-            <w:tcW w:w="3024" w:type="dxa"/>
+            <w:tcW w:w="1603" w:type="pct"/>
             <w:tcMar>
               <w:top w:w="90" w:type="dxa"/>
               <w:left w:w="100" w:type="dxa"/>
@@ -6249,9 +6394,12 @@
         </w:tc>
       </w:tr>
       <w:tr>
-        <w:tc>
-          <w:tcPr>
-            <w:tcW w:w="4032" w:type="dxa"/>
+        <w:trPr>
+          <w:cantSplit/>
+        </w:trPr>
+        <w:tc>
+          <w:tcPr>
+            <w:tcW w:w="1795" w:type="pct"/>
             <w:tcMar>
               <w:top w:w="90" w:type="dxa"/>
               <w:left w:w="100" w:type="dxa"/>
@@ -6271,7 +6419,7 @@
         </w:tc>
         <w:tc>
           <w:tcPr>
-            <w:tcW w:w="2736" w:type="dxa"/>
+            <w:tcW w:w="1603" w:type="pct"/>
             <w:tcMar>
               <w:top w:w="90" w:type="dxa"/>
               <w:left w:w="100" w:type="dxa"/>
@@ -6291,7 +6439,7 @@
         </w:tc>
         <w:tc>
           <w:tcPr>
-            <w:tcW w:w="3024" w:type="dxa"/>
+            <w:tcW w:w="1603" w:type="pct"/>
             <w:tcMar>
               <w:top w:w="90" w:type="dxa"/>
               <w:left w:w="100" w:type="dxa"/>
@@ -6311,9 +6459,12 @@
         </w:tc>
       </w:tr>
       <w:tr>
-        <w:tc>
-          <w:tcPr>
-            <w:tcW w:w="4032" w:type="dxa"/>
+        <w:trPr>
+          <w:cantSplit/>
+        </w:trPr>
+        <w:tc>
+          <w:tcPr>
+            <w:tcW w:w="1795" w:type="pct"/>
             <w:tcMar>
               <w:top w:w="90" w:type="dxa"/>
               <w:left w:w="100" w:type="dxa"/>
@@ -6333,7 +6484,7 @@
         </w:tc>
         <w:tc>
           <w:tcPr>
-            <w:tcW w:w="2736" w:type="dxa"/>
+            <w:tcW w:w="1603" w:type="pct"/>
             <w:tcMar>
               <w:top w:w="90" w:type="dxa"/>
               <w:left w:w="100" w:type="dxa"/>
@@ -6353,7 +6504,7 @@
         </w:tc>
         <w:tc>
           <w:tcPr>
-            <w:tcW w:w="3024" w:type="dxa"/>
+            <w:tcW w:w="1603" w:type="pct"/>
             <w:tcMar>
               <w:top w:w="90" w:type="dxa"/>
               <w:left w:w="100" w:type="dxa"/>
@@ -6373,9 +6524,12 @@
         </w:tc>
       </w:tr>
       <w:tr>
-        <w:tc>
-          <w:tcPr>
-            <w:tcW w:w="4032" w:type="dxa"/>
+        <w:trPr>
+          <w:cantSplit/>
+        </w:trPr>
+        <w:tc>
+          <w:tcPr>
+            <w:tcW w:w="1795" w:type="pct"/>
             <w:tcMar>
               <w:top w:w="90" w:type="dxa"/>
               <w:left w:w="100" w:type="dxa"/>
@@ -6395,7 +6549,7 @@
         </w:tc>
         <w:tc>
           <w:tcPr>
-            <w:tcW w:w="2736" w:type="dxa"/>
+            <w:tcW w:w="1603" w:type="pct"/>
             <w:tcMar>
               <w:top w:w="90" w:type="dxa"/>
               <w:left w:w="100" w:type="dxa"/>
@@ -6415,7 +6569,7 @@
         </w:tc>
         <w:tc>
           <w:tcPr>
-            <w:tcW w:w="3024" w:type="dxa"/>
+            <w:tcW w:w="1603" w:type="pct"/>
             <w:tcMar>
               <w:top w:w="90" w:type="dxa"/>
               <w:left w:w="100" w:type="dxa"/>
@@ -6435,9 +6589,12 @@
         </w:tc>
       </w:tr>
       <w:tr>
-        <w:tc>
-          <w:tcPr>
-            <w:tcW w:w="4032" w:type="dxa"/>
+        <w:trPr>
+          <w:cantSplit/>
+        </w:trPr>
+        <w:tc>
+          <w:tcPr>
+            <w:tcW w:w="1795" w:type="pct"/>
             <w:tcMar>
               <w:top w:w="90" w:type="dxa"/>
               <w:left w:w="100" w:type="dxa"/>
@@ -6457,7 +6614,7 @@
         </w:tc>
         <w:tc>
           <w:tcPr>
-            <w:tcW w:w="2736" w:type="dxa"/>
+            <w:tcW w:w="1603" w:type="pct"/>
             <w:tcMar>
               <w:top w:w="90" w:type="dxa"/>
               <w:left w:w="100" w:type="dxa"/>
@@ -6477,7 +6634,7 @@
         </w:tc>
         <w:tc>
           <w:tcPr>
-            <w:tcW w:w="3024" w:type="dxa"/>
+            <w:tcW w:w="1603" w:type="pct"/>
             <w:tcMar>
               <w:top w:w="90" w:type="dxa"/>
               <w:left w:w="100" w:type="dxa"/>
@@ -6497,9 +6654,12 @@
         </w:tc>
       </w:tr>
       <w:tr>
-        <w:tc>
-          <w:tcPr>
-            <w:tcW w:w="4032" w:type="dxa"/>
+        <w:trPr>
+          <w:cantSplit/>
+        </w:trPr>
+        <w:tc>
+          <w:tcPr>
+            <w:tcW w:w="1795" w:type="pct"/>
             <w:tcMar>
               <w:top w:w="90" w:type="dxa"/>
               <w:left w:w="100" w:type="dxa"/>
@@ -6519,7 +6679,7 @@
         </w:tc>
         <w:tc>
           <w:tcPr>
-            <w:tcW w:w="2736" w:type="dxa"/>
+            <w:tcW w:w="1603" w:type="pct"/>
             <w:tcMar>
               <w:top w:w="90" w:type="dxa"/>
               <w:left w:w="100" w:type="dxa"/>
@@ -6539,7 +6699,7 @@
         </w:tc>
         <w:tc>
           <w:tcPr>
-            <w:tcW w:w="3024" w:type="dxa"/>
+            <w:tcW w:w="1603" w:type="pct"/>
             <w:tcMar>
               <w:top w:w="90" w:type="dxa"/>
               <w:left w:w="100" w:type="dxa"/>
@@ -6580,6 +6740,7 @@
     <w:p>
       <w:pPr>
         <w:keepNext/>
+        <w:pageBreakBefore/>
         <w:spacing w:after="100" w:line="259" w:lineRule="auto"/>
       </w:pPr>
       <w:r>
@@ -6593,7 +6754,7 @@
     </w:p>
     <w:tbl>
       <w:tblPr>
-        <w:tblW w:w="0" w:type="auto"/>
+        <w:tblW w:w="5000" w:type="pct"/>
         <w:tblBorders>
           <w:top w:val="single" w:sz="6" w:space="0" w:color="000000"/>
           <w:left w:val="single" w:sz="6" w:space="0" w:color="000000"/>
@@ -6602,18 +6763,20 @@
           <w:insideH w:val="single" w:sz="6" w:space="0" w:color="000000"/>
           <w:insideV w:val="single" w:sz="6" w:space="0" w:color="000000"/>
         </w:tblBorders>
-        <w:tblLayout w:type="fixed"/>
         <w:tblLook w:val="04A0" w:firstRow="1" w:lastRow="0" w:firstColumn="1" w:lastColumn="0" w:noHBand="0" w:noVBand="1"/>
       </w:tblPr>
       <w:tblGrid>
-        <w:gridCol w:w="3600"/>
-        <w:gridCol w:w="5760"/>
-        <w:gridCol w:w="3600"/>
+        <w:gridCol w:w="3056"/>
+        <w:gridCol w:w="4888"/>
+        <w:gridCol w:w="3056"/>
       </w:tblGrid>
       <w:tr>
-        <w:tc>
-          <w:tcPr>
-            <w:tcW w:w="3600" w:type="dxa"/>
+        <w:trPr>
+          <w:cantSplit/>
+        </w:trPr>
+        <w:tc>
+          <w:tcPr>
+            <w:tcW w:w="1389" w:type="pct"/>
             <w:tcMar>
               <w:top w:w="90" w:type="dxa"/>
               <w:left w:w="100" w:type="dxa"/>
@@ -6637,7 +6800,7 @@
         </w:tc>
         <w:tc>
           <w:tcPr>
-            <w:tcW w:w="3600" w:type="dxa"/>
+            <w:tcW w:w="2222" w:type="pct"/>
             <w:tcMar>
               <w:top w:w="90" w:type="dxa"/>
               <w:left w:w="100" w:type="dxa"/>
@@ -6661,7 +6824,7 @@
         </w:tc>
         <w:tc>
           <w:tcPr>
-            <w:tcW w:w="3600" w:type="dxa"/>
+            <w:tcW w:w="1389" w:type="pct"/>
             <w:tcMar>
               <w:top w:w="90" w:type="dxa"/>
               <w:left w:w="100" w:type="dxa"/>
@@ -6685,9 +6848,12 @@
         </w:tc>
       </w:tr>
       <w:tr>
-        <w:tc>
-          <w:tcPr>
-            <w:tcW w:w="2304" w:type="dxa"/>
+        <w:trPr>
+          <w:cantSplit/>
+        </w:trPr>
+        <w:tc>
+          <w:tcPr>
+            <w:tcW w:w="1389" w:type="pct"/>
             <w:tcMar>
               <w:top w:w="90" w:type="dxa"/>
               <w:left w:w="100" w:type="dxa"/>
@@ -6707,7 +6873,7 @@
         </w:tc>
         <w:tc>
           <w:tcPr>
-            <w:tcW w:w="5760" w:type="dxa"/>
+            <w:tcW w:w="2222" w:type="pct"/>
             <w:tcMar>
               <w:top w:w="90" w:type="dxa"/>
               <w:left w:w="100" w:type="dxa"/>
@@ -6727,7 +6893,7 @@
         </w:tc>
         <w:tc>
           <w:tcPr>
-            <w:tcW w:w="1728" w:type="dxa"/>
+            <w:tcW w:w="1389" w:type="pct"/>
             <w:tcMar>
               <w:top w:w="90" w:type="dxa"/>
               <w:left w:w="100" w:type="dxa"/>
@@ -6747,9 +6913,12 @@
         </w:tc>
       </w:tr>
       <w:tr>
-        <w:tc>
-          <w:tcPr>
-            <w:tcW w:w="2304" w:type="dxa"/>
+        <w:trPr>
+          <w:cantSplit/>
+        </w:trPr>
+        <w:tc>
+          <w:tcPr>
+            <w:tcW w:w="1389" w:type="pct"/>
             <w:tcMar>
               <w:top w:w="90" w:type="dxa"/>
               <w:left w:w="100" w:type="dxa"/>
@@ -6769,7 +6938,7 @@
         </w:tc>
         <w:tc>
           <w:tcPr>
-            <w:tcW w:w="5760" w:type="dxa"/>
+            <w:tcW w:w="2222" w:type="pct"/>
             <w:tcMar>
               <w:top w:w="90" w:type="dxa"/>
               <w:left w:w="100" w:type="dxa"/>
@@ -6789,7 +6958,7 @@
         </w:tc>
         <w:tc>
           <w:tcPr>
-            <w:tcW w:w="1728" w:type="dxa"/>
+            <w:tcW w:w="1389" w:type="pct"/>
             <w:tcMar>
               <w:top w:w="90" w:type="dxa"/>
               <w:left w:w="100" w:type="dxa"/>
@@ -6809,9 +6978,12 @@
         </w:tc>
       </w:tr>
       <w:tr>
-        <w:tc>
-          <w:tcPr>
-            <w:tcW w:w="2304" w:type="dxa"/>
+        <w:trPr>
+          <w:cantSplit/>
+        </w:trPr>
+        <w:tc>
+          <w:tcPr>
+            <w:tcW w:w="1389" w:type="pct"/>
             <w:tcMar>
               <w:top w:w="90" w:type="dxa"/>
               <w:left w:w="100" w:type="dxa"/>
@@ -6831,7 +7003,7 @@
         </w:tc>
         <w:tc>
           <w:tcPr>
-            <w:tcW w:w="5760" w:type="dxa"/>
+            <w:tcW w:w="2222" w:type="pct"/>
             <w:tcMar>
               <w:top w:w="90" w:type="dxa"/>
               <w:left w:w="100" w:type="dxa"/>
@@ -6851,7 +7023,7 @@
         </w:tc>
         <w:tc>
           <w:tcPr>
-            <w:tcW w:w="1728" w:type="dxa"/>
+            <w:tcW w:w="1389" w:type="pct"/>
             <w:tcMar>
               <w:top w:w="90" w:type="dxa"/>
               <w:left w:w="100" w:type="dxa"/>
@@ -6871,9 +7043,12 @@
         </w:tc>
       </w:tr>
       <w:tr>
-        <w:tc>
-          <w:tcPr>
-            <w:tcW w:w="2304" w:type="dxa"/>
+        <w:trPr>
+          <w:cantSplit/>
+        </w:trPr>
+        <w:tc>
+          <w:tcPr>
+            <w:tcW w:w="1389" w:type="pct"/>
             <w:tcMar>
               <w:top w:w="90" w:type="dxa"/>
               <w:left w:w="100" w:type="dxa"/>
@@ -6893,7 +7068,7 @@
         </w:tc>
         <w:tc>
           <w:tcPr>
-            <w:tcW w:w="5760" w:type="dxa"/>
+            <w:tcW w:w="2222" w:type="pct"/>
             <w:tcMar>
               <w:top w:w="90" w:type="dxa"/>
               <w:left w:w="100" w:type="dxa"/>
@@ -6913,7 +7088,7 @@
         </w:tc>
         <w:tc>
           <w:tcPr>
-            <w:tcW w:w="1728" w:type="dxa"/>
+            <w:tcW w:w="1389" w:type="pct"/>
             <w:tcMar>
               <w:top w:w="90" w:type="dxa"/>
               <w:left w:w="100" w:type="dxa"/>
@@ -6933,9 +7108,12 @@
         </w:tc>
       </w:tr>
       <w:tr>
-        <w:tc>
-          <w:tcPr>
-            <w:tcW w:w="2304" w:type="dxa"/>
+        <w:trPr>
+          <w:cantSplit/>
+        </w:trPr>
+        <w:tc>
+          <w:tcPr>
+            <w:tcW w:w="1389" w:type="pct"/>
             <w:tcMar>
               <w:top w:w="90" w:type="dxa"/>
               <w:left w:w="100" w:type="dxa"/>
@@ -6955,7 +7133,7 @@
         </w:tc>
         <w:tc>
           <w:tcPr>
-            <w:tcW w:w="5760" w:type="dxa"/>
+            <w:tcW w:w="2222" w:type="pct"/>
             <w:tcMar>
               <w:top w:w="90" w:type="dxa"/>
               <w:left w:w="100" w:type="dxa"/>
@@ -6975,7 +7153,7 @@
         </w:tc>
         <w:tc>
           <w:tcPr>
-            <w:tcW w:w="1728" w:type="dxa"/>
+            <w:tcW w:w="1389" w:type="pct"/>
             <w:tcMar>
               <w:top w:w="90" w:type="dxa"/>
               <w:left w:w="100" w:type="dxa"/>
@@ -6995,9 +7173,12 @@
         </w:tc>
       </w:tr>
       <w:tr>
-        <w:tc>
-          <w:tcPr>
-            <w:tcW w:w="2304" w:type="dxa"/>
+        <w:trPr>
+          <w:cantSplit/>
+        </w:trPr>
+        <w:tc>
+          <w:tcPr>
+            <w:tcW w:w="1389" w:type="pct"/>
             <w:tcMar>
               <w:top w:w="90" w:type="dxa"/>
               <w:left w:w="100" w:type="dxa"/>
@@ -7017,7 +7198,7 @@
         </w:tc>
         <w:tc>
           <w:tcPr>
-            <w:tcW w:w="5760" w:type="dxa"/>
+            <w:tcW w:w="2222" w:type="pct"/>
             <w:tcMar>
               <w:top w:w="90" w:type="dxa"/>
               <w:left w:w="100" w:type="dxa"/>
@@ -7037,7 +7218,7 @@
         </w:tc>
         <w:tc>
           <w:tcPr>
-            <w:tcW w:w="1728" w:type="dxa"/>
+            <w:tcW w:w="1389" w:type="pct"/>
             <w:tcMar>
               <w:top w:w="90" w:type="dxa"/>
               <w:left w:w="100" w:type="dxa"/>
@@ -7057,9 +7238,12 @@
         </w:tc>
       </w:tr>
       <w:tr>
-        <w:tc>
-          <w:tcPr>
-            <w:tcW w:w="2304" w:type="dxa"/>
+        <w:trPr>
+          <w:cantSplit/>
+        </w:trPr>
+        <w:tc>
+          <w:tcPr>
+            <w:tcW w:w="1389" w:type="pct"/>
             <w:tcMar>
               <w:top w:w="90" w:type="dxa"/>
               <w:left w:w="100" w:type="dxa"/>
@@ -7079,7 +7263,7 @@
         </w:tc>
         <w:tc>
           <w:tcPr>
-            <w:tcW w:w="5760" w:type="dxa"/>
+            <w:tcW w:w="2222" w:type="pct"/>
             <w:tcMar>
               <w:top w:w="90" w:type="dxa"/>
               <w:left w:w="100" w:type="dxa"/>
@@ -7099,7 +7283,7 @@
         </w:tc>
         <w:tc>
           <w:tcPr>
-            <w:tcW w:w="1728" w:type="dxa"/>
+            <w:tcW w:w="1389" w:type="pct"/>
             <w:tcMar>
               <w:top w:w="90" w:type="dxa"/>
               <w:left w:w="100" w:type="dxa"/>
@@ -7172,13 +7356,6 @@
           <w:sz w:val="24"/>
         </w:rPr>
         <w:tab/>
-      </w:r>
-      <w:r>
-        <w:rPr>
-          <w:rFonts w:ascii="Times New Roman" w:eastAsia="Times New Roman" w:hAnsi="Times New Roman"/>
-          <w:color w:val="000000"/>
-          <w:sz w:val="24"/>
-        </w:rPr>
         <w:t>SDG 9 - Industry, Innovation and Infrastructure: the system is resilient infrastructure software that remains responsive as road conditions change.</w:t>
       </w:r>
     </w:p>
@@ -7203,7 +7380,23 @@
           <w:sz w:val="24"/>
         </w:rPr>
         <w:tab/>
-        <w:t>SDG 11 - Sustainable Cities and Communities: it supports disaster-aware evacuation, rerouting and identification of unreachable neighbourhoods.</w:t>
+      </w:r>
+      <w:r>
+        <w:rPr>
+          <w:rFonts w:ascii="Times New Roman" w:eastAsia="Times New Roman" w:hAnsi="Times New Roman"/>
+          <w:b/>
+          <w:color w:val="000000"/>
+          <w:sz w:val="24"/>
+        </w:rPr>
+        <w:t>SDG 11:</w:t>
+      </w:r>
+      <w:r>
+        <w:rPr>
+          <w:rFonts w:ascii="Times New Roman" w:eastAsia="Times New Roman" w:hAnsi="Times New Roman"/>
+          <w:color w:val="000000"/>
+          <w:sz w:val="24"/>
+        </w:rPr>
+        <w:t xml:space="preserve"> This project connects to safer city planning because it shows how an evacuation system can reroute people when roads are blocked and can identify areas that become unreachable.</w:t>
       </w:r>
     </w:p>
     <w:p>
@@ -7701,6 +7894,7 @@
       </w:tblGrid>
       <w:tr>
         <w:trPr>
+          <w:cantSplit/>
           <w:trHeight w:val="2027"/>
         </w:trPr>
         <w:tc>
@@ -8082,6 +8276,7 @@
       </w:tr>
       <w:tr>
         <w:trPr>
+          <w:cantSplit/>
           <w:trHeight w:val="2027"/>
         </w:trPr>
         <w:tc>
@@ -8313,6 +8508,7 @@
       </w:tr>
       <w:tr>
         <w:trPr>
+          <w:cantSplit/>
           <w:trHeight w:val="2027"/>
         </w:trPr>
         <w:tc>
@@ -8552,6 +8748,7 @@
       </w:tr>
       <w:tr>
         <w:trPr>
+          <w:cantSplit/>
           <w:trHeight w:val="2027"/>
         </w:trPr>
         <w:tc>
@@ -8791,6 +8988,7 @@
       </w:tr>
       <w:tr>
         <w:trPr>
+          <w:cantSplit/>
           <w:trHeight w:val="2027"/>
         </w:trPr>
         <w:tc>
@@ -9023,6 +9221,7 @@
       </w:tr>
       <w:tr>
         <w:trPr>
+          <w:cantSplit/>
           <w:trHeight w:val="2027"/>
         </w:trPr>
         <w:tc>
@@ -9247,6 +9446,7 @@
       </w:tr>
       <w:tr>
         <w:trPr>
+          <w:cantSplit/>
           <w:trHeight w:val="2027"/>
         </w:trPr>
         <w:tc>
@@ -9473,6 +9673,7 @@
     <w:p>
       <w:pPr>
         <w:pStyle w:val="Heading1"/>
+        <w:keepNext/>
         <w:spacing w:before="320"/>
         <w:rPr>
           <w:spacing w:val="-2"/>
@@ -9512,6 +9713,7 @@
     <w:p>
       <w:pPr>
         <w:pStyle w:val="Heading1"/>
+        <w:keepNext/>
         <w:numPr>
           <w:ilvl w:val="0"/>
           <w:numId w:val="3"/>
@@ -9537,6 +9739,7 @@
     <w:p>
       <w:pPr>
         <w:pStyle w:val="Heading1"/>
+        <w:keepNext/>
         <w:numPr>
           <w:ilvl w:val="0"/>
           <w:numId w:val="3"/>
@@ -9562,6 +9765,7 @@
     <w:p>
       <w:pPr>
         <w:pStyle w:val="Heading1"/>
+        <w:keepNext/>
         <w:numPr>
           <w:ilvl w:val="0"/>
           <w:numId w:val="3"/>
@@ -9587,6 +9791,7 @@
     <w:p>
       <w:pPr>
         <w:pStyle w:val="Heading1"/>
+        <w:keepNext/>
         <w:numPr>
           <w:ilvl w:val="0"/>
           <w:numId w:val="3"/>
@@ -9612,6 +9817,7 @@
     <w:p>
       <w:pPr>
         <w:pStyle w:val="Heading1"/>
+        <w:keepNext/>
         <w:numPr>
           <w:ilvl w:val="0"/>
           <w:numId w:val="3"/>
@@ -9637,6 +9843,7 @@
     <w:p>
       <w:pPr>
         <w:pStyle w:val="Heading1"/>
+        <w:keepNext/>
         <w:numPr>
           <w:ilvl w:val="0"/>
           <w:numId w:val="3"/>
@@ -9662,6 +9869,7 @@
     <w:p>
       <w:pPr>
         <w:pStyle w:val="Heading1"/>
+        <w:keepNext/>
         <w:numPr>
           <w:ilvl w:val="0"/>
           <w:numId w:val="3"/>
@@ -9687,6 +9895,7 @@
     <w:p>
       <w:pPr>
         <w:pStyle w:val="Heading1"/>
+        <w:keepNext/>
         <w:numPr>
           <w:ilvl w:val="0"/>
           <w:numId w:val="3"/>

</xml_diff>